<commit_message>
docs: aligner rapport PFE et README sur l'intégration Google Meet réelle
Le README et le rapport décrivaient encore le lien Google Meet comme un
lien de démonstration alors que l'intégration réelle (événement Google
Calendar + lien Meet authentique) est implémentée et testée de bout en
bout. Met aussi à jour le nombre de tests (101 -> 108) et documente le
bug de nesting webhook n8n .body découvert et corrigé au passage.

Co-Authored-By: Claude Sonnet 5 <noreply@anthropic.com>
</commit_message>
<xml_diff>
--- a/Rapport-PFE/Rapport_PFE_Bargaoui_Haythem.docx
+++ b/Rapport-PFE/Rapport_PFE_Bargaoui_Haythem.docx
@@ -520,6 +520,9 @@
           <w:szCs w:val="24"/>
         </w:rPr>
         <w:sectPr>
+          <w:headerReference w:type="even" r:id="rId10"/>
+          <w:headerReference w:type="default" r:id="rId11"/>
+          <w:headerReference w:type="first" r:id="rId12"/>
           <w:pgSz w:w="11906" w:h="16838"/>
           <w:pgMar w:top="426" w:right="720" w:bottom="720" w:left="720" w:header="708" w:footer="708" w:gutter="0"/>
           <w:cols w:space="708"/>
@@ -805,7 +808,7 @@
         <w:pStyle w:val="Titre1"/>
         <w:jc w:val="center"/>
       </w:pPr>
-      <w:bookmarkStart w:id="0" w:name="_Toc237795281"/>
+      <w:bookmarkStart w:id="0" w:name="_Toc238461611"/>
       <w:r>
         <w:t>Table des matières</w:t>
       </w:r>
@@ -855,7 +858,7 @@
         <w:rPr>
           <w:noProof/>
         </w:rPr>
-        <w:instrText xml:space="preserve"> PAGEREF _Toc237795281 \h </w:instrText>
+        <w:instrText xml:space="preserve"> PAGEREF _Toc238461611 \h </w:instrText>
       </w:r>
       <w:r>
         <w:rPr>
@@ -916,7 +919,7 @@
         <w:rPr>
           <w:noProof/>
         </w:rPr>
-        <w:instrText xml:space="preserve"> PAGEREF _Toc237795282 \h </w:instrText>
+        <w:instrText xml:space="preserve"> PAGEREF _Toc238461612 \h </w:instrText>
       </w:r>
       <w:r>
         <w:rPr>
@@ -977,7 +980,7 @@
         <w:rPr>
           <w:noProof/>
         </w:rPr>
-        <w:instrText xml:space="preserve"> PAGEREF _Toc237795283 \h </w:instrText>
+        <w:instrText xml:space="preserve"> PAGEREF _Toc238461613 \h </w:instrText>
       </w:r>
       <w:r>
         <w:rPr>
@@ -1038,7 +1041,7 @@
         <w:rPr>
           <w:noProof/>
         </w:rPr>
-        <w:instrText xml:space="preserve"> PAGEREF _Toc237795284 \h </w:instrText>
+        <w:instrText xml:space="preserve"> PAGEREF _Toc238461614 \h </w:instrText>
       </w:r>
       <w:r>
         <w:rPr>
@@ -1099,7 +1102,7 @@
         <w:rPr>
           <w:noProof/>
         </w:rPr>
-        <w:instrText xml:space="preserve"> PAGEREF _Toc237795285 \h </w:instrText>
+        <w:instrText xml:space="preserve"> PAGEREF _Toc238461615 \h </w:instrText>
       </w:r>
       <w:r>
         <w:rPr>
@@ -1160,7 +1163,7 @@
         <w:rPr>
           <w:noProof/>
         </w:rPr>
-        <w:instrText xml:space="preserve"> PAGEREF _Toc237795286 \h </w:instrText>
+        <w:instrText xml:space="preserve"> PAGEREF _Toc238461616 \h </w:instrText>
       </w:r>
       <w:r>
         <w:rPr>
@@ -1221,7 +1224,7 @@
         <w:rPr>
           <w:noProof/>
         </w:rPr>
-        <w:instrText xml:space="preserve"> PAGEREF _Toc237795287 \h </w:instrText>
+        <w:instrText xml:space="preserve"> PAGEREF _Toc238461617 \h </w:instrText>
       </w:r>
       <w:r>
         <w:rPr>
@@ -1282,7 +1285,7 @@
         <w:rPr>
           <w:noProof/>
         </w:rPr>
-        <w:instrText xml:space="preserve"> PAGEREF _Toc237795288 \h </w:instrText>
+        <w:instrText xml:space="preserve"> PAGEREF _Toc238461618 \h </w:instrText>
       </w:r>
       <w:r>
         <w:rPr>
@@ -1343,7 +1346,7 @@
         <w:rPr>
           <w:noProof/>
         </w:rPr>
-        <w:instrText xml:space="preserve"> PAGEREF _Toc237795289 \h </w:instrText>
+        <w:instrText xml:space="preserve"> PAGEREF _Toc238461619 \h </w:instrText>
       </w:r>
       <w:r>
         <w:rPr>
@@ -1404,7 +1407,7 @@
         <w:rPr>
           <w:noProof/>
         </w:rPr>
-        <w:instrText xml:space="preserve"> PAGEREF _Toc237795290 \h </w:instrText>
+        <w:instrText xml:space="preserve"> PAGEREF _Toc238461620 \h </w:instrText>
       </w:r>
       <w:r>
         <w:rPr>
@@ -1465,7 +1468,7 @@
         <w:rPr>
           <w:noProof/>
         </w:rPr>
-        <w:instrText xml:space="preserve"> PAGEREF _Toc237795291 \h </w:instrText>
+        <w:instrText xml:space="preserve"> PAGEREF _Toc238461621 \h </w:instrText>
       </w:r>
       <w:r>
         <w:rPr>
@@ -1526,7 +1529,7 @@
         <w:rPr>
           <w:noProof/>
         </w:rPr>
-        <w:instrText xml:space="preserve"> PAGEREF _Toc237795292 \h </w:instrText>
+        <w:instrText xml:space="preserve"> PAGEREF _Toc238461622 \h </w:instrText>
       </w:r>
       <w:r>
         <w:rPr>
@@ -1587,7 +1590,7 @@
         <w:rPr>
           <w:noProof/>
         </w:rPr>
-        <w:instrText xml:space="preserve"> PAGEREF _Toc237795293 \h </w:instrText>
+        <w:instrText xml:space="preserve"> PAGEREF _Toc238461623 \h </w:instrText>
       </w:r>
       <w:r>
         <w:rPr>
@@ -1648,7 +1651,7 @@
         <w:rPr>
           <w:noProof/>
         </w:rPr>
-        <w:instrText xml:space="preserve"> PAGEREF _Toc237795294 \h </w:instrText>
+        <w:instrText xml:space="preserve"> PAGEREF _Toc238461624 \h </w:instrText>
       </w:r>
       <w:r>
         <w:rPr>
@@ -1709,7 +1712,7 @@
         <w:rPr>
           <w:noProof/>
         </w:rPr>
-        <w:instrText xml:space="preserve"> PAGEREF _Toc237795295 \h </w:instrText>
+        <w:instrText xml:space="preserve"> PAGEREF _Toc238461625 \h </w:instrText>
       </w:r>
       <w:r>
         <w:rPr>
@@ -1770,7 +1773,7 @@
         <w:rPr>
           <w:noProof/>
         </w:rPr>
-        <w:instrText xml:space="preserve"> PAGEREF _Toc237795296 \h </w:instrText>
+        <w:instrText xml:space="preserve"> PAGEREF _Toc238461626 \h </w:instrText>
       </w:r>
       <w:r>
         <w:rPr>
@@ -1831,7 +1834,7 @@
         <w:rPr>
           <w:noProof/>
         </w:rPr>
-        <w:instrText xml:space="preserve"> PAGEREF _Toc237795297 \h </w:instrText>
+        <w:instrText xml:space="preserve"> PAGEREF _Toc238461627 \h </w:instrText>
       </w:r>
       <w:r>
         <w:rPr>
@@ -1892,7 +1895,7 @@
         <w:rPr>
           <w:noProof/>
         </w:rPr>
-        <w:instrText xml:space="preserve"> PAGEREF _Toc237795298 \h </w:instrText>
+        <w:instrText xml:space="preserve"> PAGEREF _Toc238461628 \h </w:instrText>
       </w:r>
       <w:r>
         <w:rPr>
@@ -1953,7 +1956,7 @@
         <w:rPr>
           <w:noProof/>
         </w:rPr>
-        <w:instrText xml:space="preserve"> PAGEREF _Toc237795299 \h </w:instrText>
+        <w:instrText xml:space="preserve"> PAGEREF _Toc238461629 \h </w:instrText>
       </w:r>
       <w:r>
         <w:rPr>
@@ -2014,7 +2017,7 @@
         <w:rPr>
           <w:noProof/>
         </w:rPr>
-        <w:instrText xml:space="preserve"> PAGEREF _Toc237795300 \h </w:instrText>
+        <w:instrText xml:space="preserve"> PAGEREF _Toc238461630 \h </w:instrText>
       </w:r>
       <w:r>
         <w:rPr>
@@ -2075,7 +2078,7 @@
         <w:rPr>
           <w:noProof/>
         </w:rPr>
-        <w:instrText xml:space="preserve"> PAGEREF _Toc237795301 \h </w:instrText>
+        <w:instrText xml:space="preserve"> PAGEREF _Toc238461631 \h </w:instrText>
       </w:r>
       <w:r>
         <w:rPr>
@@ -2136,7 +2139,7 @@
         <w:rPr>
           <w:noProof/>
         </w:rPr>
-        <w:instrText xml:space="preserve"> PAGEREF _Toc237795302 \h </w:instrText>
+        <w:instrText xml:space="preserve"> PAGEREF _Toc238461632 \h </w:instrText>
       </w:r>
       <w:r>
         <w:rPr>
@@ -2197,7 +2200,7 @@
         <w:rPr>
           <w:noProof/>
         </w:rPr>
-        <w:instrText xml:space="preserve"> PAGEREF _Toc237795303 \h </w:instrText>
+        <w:instrText xml:space="preserve"> PAGEREF _Toc238461633 \h </w:instrText>
       </w:r>
       <w:r>
         <w:rPr>
@@ -2258,7 +2261,7 @@
         <w:rPr>
           <w:noProof/>
         </w:rPr>
-        <w:instrText xml:space="preserve"> PAGEREF _Toc237795304 \h </w:instrText>
+        <w:instrText xml:space="preserve"> PAGEREF _Toc238461634 \h </w:instrText>
       </w:r>
       <w:r>
         <w:rPr>
@@ -2319,7 +2322,7 @@
         <w:rPr>
           <w:noProof/>
         </w:rPr>
-        <w:instrText xml:space="preserve"> PAGEREF _Toc237795305 \h </w:instrText>
+        <w:instrText xml:space="preserve"> PAGEREF _Toc238461635 \h </w:instrText>
       </w:r>
       <w:r>
         <w:rPr>
@@ -2380,7 +2383,7 @@
         <w:rPr>
           <w:noProof/>
         </w:rPr>
-        <w:instrText xml:space="preserve"> PAGEREF _Toc237795306 \h </w:instrText>
+        <w:instrText xml:space="preserve"> PAGEREF _Toc238461636 \h </w:instrText>
       </w:r>
       <w:r>
         <w:rPr>
@@ -2441,7 +2444,7 @@
         <w:rPr>
           <w:noProof/>
         </w:rPr>
-        <w:instrText xml:space="preserve"> PAGEREF _Toc237795307 \h </w:instrText>
+        <w:instrText xml:space="preserve"> PAGEREF _Toc238461637 \h </w:instrText>
       </w:r>
       <w:r>
         <w:rPr>
@@ -2484,6 +2487,7 @@
         <w:rPr>
           <w:noProof/>
         </w:rPr>
+        <w:lastRenderedPageBreak/>
         <w:t>2.3.2 Côté client — Angular</w:t>
       </w:r>
       <w:r>
@@ -2502,7 +2506,7 @@
         <w:rPr>
           <w:noProof/>
         </w:rPr>
-        <w:instrText xml:space="preserve"> PAGEREF _Toc237795308 \h </w:instrText>
+        <w:instrText xml:space="preserve"> PAGEREF _Toc238461638 \h </w:instrText>
       </w:r>
       <w:r>
         <w:rPr>
@@ -2563,7 +2567,7 @@
         <w:rPr>
           <w:noProof/>
         </w:rPr>
-        <w:instrText xml:space="preserve"> PAGEREF _Toc237795309 \h </w:instrText>
+        <w:instrText xml:space="preserve"> PAGEREF _Toc238461639 \h </w:instrText>
       </w:r>
       <w:r>
         <w:rPr>
@@ -2624,7 +2628,7 @@
         <w:rPr>
           <w:noProof/>
         </w:rPr>
-        <w:instrText xml:space="preserve"> PAGEREF _Toc237795310 \h </w:instrText>
+        <w:instrText xml:space="preserve"> PAGEREF _Toc238461640 \h </w:instrText>
       </w:r>
       <w:r>
         <w:rPr>
@@ -2685,7 +2689,7 @@
         <w:rPr>
           <w:noProof/>
         </w:rPr>
-        <w:instrText xml:space="preserve"> PAGEREF _Toc237795311 \h </w:instrText>
+        <w:instrText xml:space="preserve"> PAGEREF _Toc238461641 \h </w:instrText>
       </w:r>
       <w:r>
         <w:rPr>
@@ -2746,7 +2750,7 @@
         <w:rPr>
           <w:noProof/>
         </w:rPr>
-        <w:instrText xml:space="preserve"> PAGEREF _Toc237795312 \h </w:instrText>
+        <w:instrText xml:space="preserve"> PAGEREF _Toc238461642 \h </w:instrText>
       </w:r>
       <w:r>
         <w:rPr>
@@ -2807,7 +2811,7 @@
         <w:rPr>
           <w:noProof/>
         </w:rPr>
-        <w:instrText xml:space="preserve"> PAGEREF _Toc237795313 \h </w:instrText>
+        <w:instrText xml:space="preserve"> PAGEREF _Toc238461643 \h </w:instrText>
       </w:r>
       <w:r>
         <w:rPr>
@@ -2868,7 +2872,7 @@
         <w:rPr>
           <w:noProof/>
         </w:rPr>
-        <w:instrText xml:space="preserve"> PAGEREF _Toc237795314 \h </w:instrText>
+        <w:instrText xml:space="preserve"> PAGEREF _Toc238461644 \h </w:instrText>
       </w:r>
       <w:r>
         <w:rPr>
@@ -2929,7 +2933,7 @@
         <w:rPr>
           <w:noProof/>
         </w:rPr>
-        <w:instrText xml:space="preserve"> PAGEREF _Toc237795315 \h </w:instrText>
+        <w:instrText xml:space="preserve"> PAGEREF _Toc238461645 \h </w:instrText>
       </w:r>
       <w:r>
         <w:rPr>
@@ -2990,7 +2994,7 @@
         <w:rPr>
           <w:noProof/>
         </w:rPr>
-        <w:instrText xml:space="preserve"> PAGEREF _Toc237795316 \h </w:instrText>
+        <w:instrText xml:space="preserve"> PAGEREF _Toc238461646 \h </w:instrText>
       </w:r>
       <w:r>
         <w:rPr>
@@ -3051,7 +3055,7 @@
         <w:rPr>
           <w:noProof/>
         </w:rPr>
-        <w:instrText xml:space="preserve"> PAGEREF _Toc237795317 \h </w:instrText>
+        <w:instrText xml:space="preserve"> PAGEREF _Toc238461647 \h </w:instrText>
       </w:r>
       <w:r>
         <w:rPr>
@@ -3112,7 +3116,7 @@
         <w:rPr>
           <w:noProof/>
         </w:rPr>
-        <w:instrText xml:space="preserve"> PAGEREF _Toc237795318 \h </w:instrText>
+        <w:instrText xml:space="preserve"> PAGEREF _Toc238461648 \h </w:instrText>
       </w:r>
       <w:r>
         <w:rPr>
@@ -3173,7 +3177,7 @@
         <w:rPr>
           <w:noProof/>
         </w:rPr>
-        <w:instrText xml:space="preserve"> PAGEREF _Toc237795319 \h </w:instrText>
+        <w:instrText xml:space="preserve"> PAGEREF _Toc238461649 \h </w:instrText>
       </w:r>
       <w:r>
         <w:rPr>
@@ -3234,7 +3238,7 @@
         <w:rPr>
           <w:noProof/>
         </w:rPr>
-        <w:instrText xml:space="preserve"> PAGEREF _Toc237795320 \h </w:instrText>
+        <w:instrText xml:space="preserve"> PAGEREF _Toc238461650 \h </w:instrText>
       </w:r>
       <w:r>
         <w:rPr>
@@ -3295,7 +3299,7 @@
         <w:rPr>
           <w:noProof/>
         </w:rPr>
-        <w:instrText xml:space="preserve"> PAGEREF _Toc237795321 \h </w:instrText>
+        <w:instrText xml:space="preserve"> PAGEREF _Toc238461651 \h </w:instrText>
       </w:r>
       <w:r>
         <w:rPr>
@@ -3356,7 +3360,7 @@
         <w:rPr>
           <w:noProof/>
         </w:rPr>
-        <w:instrText xml:space="preserve"> PAGEREF _Toc237795322 \h </w:instrText>
+        <w:instrText xml:space="preserve"> PAGEREF _Toc238461652 \h </w:instrText>
       </w:r>
       <w:r>
         <w:rPr>
@@ -3417,7 +3421,7 @@
         <w:rPr>
           <w:noProof/>
         </w:rPr>
-        <w:instrText xml:space="preserve"> PAGEREF _Toc237795323 \h </w:instrText>
+        <w:instrText xml:space="preserve"> PAGEREF _Toc238461653 \h </w:instrText>
       </w:r>
       <w:r>
         <w:rPr>
@@ -3478,7 +3482,7 @@
         <w:rPr>
           <w:noProof/>
         </w:rPr>
-        <w:instrText xml:space="preserve"> PAGEREF _Toc237795324 \h </w:instrText>
+        <w:instrText xml:space="preserve"> PAGEREF _Toc238461654 \h </w:instrText>
       </w:r>
       <w:r>
         <w:rPr>
@@ -3539,7 +3543,7 @@
         <w:rPr>
           <w:noProof/>
         </w:rPr>
-        <w:instrText xml:space="preserve"> PAGEREF _Toc237795325 \h </w:instrText>
+        <w:instrText xml:space="preserve"> PAGEREF _Toc238461655 \h </w:instrText>
       </w:r>
       <w:r>
         <w:rPr>
@@ -3600,7 +3604,7 @@
         <w:rPr>
           <w:noProof/>
         </w:rPr>
-        <w:instrText xml:space="preserve"> PAGEREF _Toc237795326 \h </w:instrText>
+        <w:instrText xml:space="preserve"> PAGEREF _Toc238461656 \h </w:instrText>
       </w:r>
       <w:r>
         <w:rPr>
@@ -3661,7 +3665,7 @@
         <w:rPr>
           <w:noProof/>
         </w:rPr>
-        <w:instrText xml:space="preserve"> PAGEREF _Toc237795327 \h </w:instrText>
+        <w:instrText xml:space="preserve"> PAGEREF _Toc238461657 \h </w:instrText>
       </w:r>
       <w:r>
         <w:rPr>
@@ -3722,7 +3726,7 @@
         <w:rPr>
           <w:noProof/>
         </w:rPr>
-        <w:instrText xml:space="preserve"> PAGEREF _Toc237795328 \h </w:instrText>
+        <w:instrText xml:space="preserve"> PAGEREF _Toc238461658 \h </w:instrText>
       </w:r>
       <w:r>
         <w:rPr>
@@ -3783,7 +3787,7 @@
         <w:rPr>
           <w:noProof/>
         </w:rPr>
-        <w:instrText xml:space="preserve"> PAGEREF _Toc237795329 \h </w:instrText>
+        <w:instrText xml:space="preserve"> PAGEREF _Toc238461659 \h </w:instrText>
       </w:r>
       <w:r>
         <w:rPr>
@@ -3844,7 +3848,7 @@
         <w:rPr>
           <w:noProof/>
         </w:rPr>
-        <w:instrText xml:space="preserve"> PAGEREF _Toc237795330 \h </w:instrText>
+        <w:instrText xml:space="preserve"> PAGEREF _Toc238461660 \h </w:instrText>
       </w:r>
       <w:r>
         <w:rPr>
@@ -3905,7 +3909,7 @@
         <w:rPr>
           <w:noProof/>
         </w:rPr>
-        <w:instrText xml:space="preserve"> PAGEREF _Toc237795331 \h </w:instrText>
+        <w:instrText xml:space="preserve"> PAGEREF _Toc238461661 \h </w:instrText>
       </w:r>
       <w:r>
         <w:rPr>
@@ -3966,7 +3970,7 @@
         <w:rPr>
           <w:noProof/>
         </w:rPr>
-        <w:instrText xml:space="preserve"> PAGEREF _Toc237795332 \h </w:instrText>
+        <w:instrText xml:space="preserve"> PAGEREF _Toc238461662 \h </w:instrText>
       </w:r>
       <w:r>
         <w:rPr>
@@ -4027,7 +4031,7 @@
         <w:rPr>
           <w:noProof/>
         </w:rPr>
-        <w:instrText xml:space="preserve"> PAGEREF _Toc237795333 \h </w:instrText>
+        <w:instrText xml:space="preserve"> PAGEREF _Toc238461663 \h </w:instrText>
       </w:r>
       <w:r>
         <w:rPr>
@@ -4088,7 +4092,7 @@
         <w:rPr>
           <w:noProof/>
         </w:rPr>
-        <w:instrText xml:space="preserve"> PAGEREF _Toc237795334 \h </w:instrText>
+        <w:instrText xml:space="preserve"> PAGEREF _Toc238461664 \h </w:instrText>
       </w:r>
       <w:r>
         <w:rPr>
@@ -4149,7 +4153,7 @@
         <w:rPr>
           <w:noProof/>
         </w:rPr>
-        <w:instrText xml:space="preserve"> PAGEREF _Toc237795335 \h </w:instrText>
+        <w:instrText xml:space="preserve"> PAGEREF _Toc238461665 \h </w:instrText>
       </w:r>
       <w:r>
         <w:rPr>
@@ -4210,7 +4214,7 @@
         <w:rPr>
           <w:noProof/>
         </w:rPr>
-        <w:instrText xml:space="preserve"> PAGEREF _Toc237795336 \h </w:instrText>
+        <w:instrText xml:space="preserve"> PAGEREF _Toc238461666 \h </w:instrText>
       </w:r>
       <w:r>
         <w:rPr>
@@ -4253,6 +4257,7 @@
         <w:rPr>
           <w:noProof/>
         </w:rPr>
+        <w:lastRenderedPageBreak/>
         <w:t>4.5 Difficultés rencontrées et solutions apportées</w:t>
       </w:r>
       <w:r>
@@ -4271,7 +4276,7 @@
         <w:rPr>
           <w:noProof/>
         </w:rPr>
-        <w:instrText xml:space="preserve"> PAGEREF _Toc237795337 \h </w:instrText>
+        <w:instrText xml:space="preserve"> PAGEREF _Toc238461667 \h </w:instrText>
       </w:r>
       <w:r>
         <w:rPr>
@@ -4332,7 +4337,7 @@
         <w:rPr>
           <w:noProof/>
         </w:rPr>
-        <w:instrText xml:space="preserve"> PAGEREF _Toc237795338 \h </w:instrText>
+        <w:instrText xml:space="preserve"> PAGEREF _Toc238461668 \h </w:instrText>
       </w:r>
       <w:r>
         <w:rPr>
@@ -4393,7 +4398,7 @@
         <w:rPr>
           <w:noProof/>
         </w:rPr>
-        <w:instrText xml:space="preserve"> PAGEREF _Toc237795339 \h </w:instrText>
+        <w:instrText xml:space="preserve"> PAGEREF _Toc238461669 \h </w:instrText>
       </w:r>
       <w:r>
         <w:rPr>
@@ -4454,7 +4459,7 @@
         <w:rPr>
           <w:noProof/>
         </w:rPr>
-        <w:instrText xml:space="preserve"> PAGEREF _Toc237795340 \h </w:instrText>
+        <w:instrText xml:space="preserve"> PAGEREF _Toc238461670 \h </w:instrText>
       </w:r>
       <w:r>
         <w:rPr>
@@ -4515,7 +4520,7 @@
         <w:rPr>
           <w:noProof/>
         </w:rPr>
-        <w:instrText xml:space="preserve"> PAGEREF _Toc237795341 \h </w:instrText>
+        <w:instrText xml:space="preserve"> PAGEREF _Toc238461671 \h </w:instrText>
       </w:r>
       <w:r>
         <w:rPr>
@@ -4576,7 +4581,7 @@
         <w:rPr>
           <w:noProof/>
         </w:rPr>
-        <w:instrText xml:space="preserve"> PAGEREF _Toc237795342 \h </w:instrText>
+        <w:instrText xml:space="preserve"> PAGEREF _Toc238461672 \h </w:instrText>
       </w:r>
       <w:r>
         <w:rPr>
@@ -4637,7 +4642,7 @@
         <w:rPr>
           <w:noProof/>
         </w:rPr>
-        <w:instrText xml:space="preserve"> PAGEREF _Toc237795343 \h </w:instrText>
+        <w:instrText xml:space="preserve"> PAGEREF _Toc238461673 \h </w:instrText>
       </w:r>
       <w:r>
         <w:rPr>
@@ -4698,7 +4703,7 @@
         <w:rPr>
           <w:noProof/>
         </w:rPr>
-        <w:instrText xml:space="preserve"> PAGEREF _Toc237795344 \h </w:instrText>
+        <w:instrText xml:space="preserve"> PAGEREF _Toc238461674 \h </w:instrText>
       </w:r>
       <w:r>
         <w:rPr>
@@ -4759,7 +4764,7 @@
         <w:rPr>
           <w:noProof/>
         </w:rPr>
-        <w:instrText xml:space="preserve"> PAGEREF _Toc237795345 \h </w:instrText>
+        <w:instrText xml:space="preserve"> PAGEREF _Toc238461675 \h </w:instrText>
       </w:r>
       <w:r>
         <w:rPr>
@@ -4820,7 +4825,68 @@
         <w:rPr>
           <w:noProof/>
         </w:rPr>
-        <w:instrText xml:space="preserve"> PAGEREF _Toc237795346 \h </w:instrText>
+        <w:instrText xml:space="preserve"> PAGEREF _Toc238461676 \h </w:instrText>
+      </w:r>
+      <w:r>
+        <w:rPr>
+          <w:noProof/>
+        </w:rPr>
+      </w:r>
+      <w:r>
+        <w:rPr>
+          <w:noProof/>
+        </w:rPr>
+        <w:fldChar w:fldCharType="separate"/>
+      </w:r>
+      <w:r>
+        <w:rPr>
+          <w:noProof/>
+        </w:rPr>
+        <w:t>42</w:t>
+      </w:r>
+      <w:r>
+        <w:rPr>
+          <w:noProof/>
+        </w:rPr>
+        <w:fldChar w:fldCharType="end"/>
+      </w:r>
+    </w:p>
+    <w:p>
+      <w:pPr>
+        <w:pStyle w:val="TM3"/>
+        <w:tabs>
+          <w:tab w:val="right" w:leader="dot" w:pos="10456"/>
+        </w:tabs>
+        <w:rPr>
+          <w:rFonts w:asciiTheme="minorHAnsi" w:eastAsiaTheme="minorEastAsia" w:hAnsiTheme="minorHAnsi" w:cstheme="minorBidi"/>
+          <w:noProof/>
+          <w:lang w:eastAsia="fr-FR"/>
+          <w14:ligatures w14:val="standardContextual"/>
+        </w:rPr>
+      </w:pPr>
+      <w:r>
+        <w:rPr>
+          <w:noProof/>
+        </w:rPr>
+        <w:t>4.5.10 Fiabiliser l'intégration Google Meet et le format des webhooks n8n</w:t>
+      </w:r>
+      <w:r>
+        <w:rPr>
+          <w:noProof/>
+        </w:rPr>
+        <w:tab/>
+      </w:r>
+      <w:r>
+        <w:rPr>
+          <w:noProof/>
+        </w:rPr>
+        <w:fldChar w:fldCharType="begin"/>
+      </w:r>
+      <w:r>
+        <w:rPr>
+          <w:noProof/>
+        </w:rPr>
+        <w:instrText xml:space="preserve"> PAGEREF _Toc238461677 \h </w:instrText>
       </w:r>
       <w:r>
         <w:rPr>
@@ -4881,7 +4947,7 @@
         <w:rPr>
           <w:noProof/>
         </w:rPr>
-        <w:instrText xml:space="preserve"> PAGEREF _Toc237795347 \h </w:instrText>
+        <w:instrText xml:space="preserve"> PAGEREF _Toc238461678 \h </w:instrText>
       </w:r>
       <w:r>
         <w:rPr>
@@ -4898,7 +4964,7 @@
         <w:rPr>
           <w:noProof/>
         </w:rPr>
-        <w:t>42</w:t>
+        <w:t>43</w:t>
       </w:r>
       <w:r>
         <w:rPr>
@@ -4942,7 +5008,7 @@
         <w:rPr>
           <w:noProof/>
         </w:rPr>
-        <w:instrText xml:space="preserve"> PAGEREF _Toc237795348 \h </w:instrText>
+        <w:instrText xml:space="preserve"> PAGEREF _Toc238461679 \h </w:instrText>
       </w:r>
       <w:r>
         <w:rPr>
@@ -5003,7 +5069,7 @@
         <w:rPr>
           <w:noProof/>
         </w:rPr>
-        <w:instrText xml:space="preserve"> PAGEREF _Toc237795349 \h </w:instrText>
+        <w:instrText xml:space="preserve"> PAGEREF _Toc238461680 \h </w:instrText>
       </w:r>
       <w:r>
         <w:rPr>
@@ -5064,7 +5130,7 @@
         <w:rPr>
           <w:noProof/>
         </w:rPr>
-        <w:instrText xml:space="preserve"> PAGEREF _Toc237795350 \h </w:instrText>
+        <w:instrText xml:space="preserve"> PAGEREF _Toc238461681 \h </w:instrText>
       </w:r>
       <w:r>
         <w:rPr>
@@ -5125,7 +5191,7 @@
         <w:rPr>
           <w:noProof/>
         </w:rPr>
-        <w:instrText xml:space="preserve"> PAGEREF _Toc237795351 \h </w:instrText>
+        <w:instrText xml:space="preserve"> PAGEREF _Toc238461682 \h </w:instrText>
       </w:r>
       <w:r>
         <w:rPr>
@@ -5186,7 +5252,7 @@
         <w:rPr>
           <w:noProof/>
         </w:rPr>
-        <w:instrText xml:space="preserve"> PAGEREF _Toc237795352 \h </w:instrText>
+        <w:instrText xml:space="preserve"> PAGEREF _Toc238461683 \h </w:instrText>
       </w:r>
       <w:r>
         <w:rPr>
@@ -5229,7 +5295,7 @@
       <w:pPr>
         <w:pStyle w:val="Titre1"/>
       </w:pPr>
-      <w:bookmarkStart w:id="1" w:name="_Toc237795282"/>
+      <w:bookmarkStart w:id="1" w:name="_Toc238461612"/>
       <w:r>
         <w:t>Liste des figures</w:t>
       </w:r>
@@ -5558,7 +5624,7 @@
       <w:pPr>
         <w:pStyle w:val="Titre1"/>
       </w:pPr>
-      <w:bookmarkStart w:id="2" w:name="_Toc237795283"/>
+      <w:bookmarkStart w:id="2" w:name="_Toc238461613"/>
       <w:r>
         <w:t>Liste des tableaux</w:t>
       </w:r>
@@ -5622,7 +5688,7 @@
         <w:pStyle w:val="Titre1"/>
         <w:jc w:val="center"/>
       </w:pPr>
-      <w:bookmarkStart w:id="3" w:name="_Toc237795284"/>
+      <w:bookmarkStart w:id="3" w:name="_Toc238461614"/>
       <w:r>
         <w:t>Introduction Générale</w:t>
       </w:r>
@@ -5655,7 +5721,7 @@
       <w:pPr>
         <w:pStyle w:val="Titre1"/>
       </w:pPr>
-      <w:bookmarkStart w:id="4" w:name="_Toc237795285"/>
+      <w:bookmarkStart w:id="4" w:name="_Toc238461615"/>
       <w:r>
         <w:t>Chapitre 1 : Cadre Général du Projet</w:t>
       </w:r>
@@ -5670,7 +5736,7 @@
       <w:pPr>
         <w:pStyle w:val="Titre2"/>
       </w:pPr>
-      <w:bookmarkStart w:id="5" w:name="_Toc237795286"/>
+      <w:bookmarkStart w:id="5" w:name="_Toc238461616"/>
       <w:r>
         <w:t>1.1 Introduction</w:t>
       </w:r>
@@ -5685,7 +5751,7 @@
       <w:pPr>
         <w:pStyle w:val="Titre2"/>
       </w:pPr>
-      <w:bookmarkStart w:id="6" w:name="_Toc237795287"/>
+      <w:bookmarkStart w:id="6" w:name="_Toc238461617"/>
       <w:r>
         <w:t>1.2 Présentation de l'organisme d'accueil</w:t>
       </w:r>
@@ -5695,7 +5761,7 @@
       <w:pPr>
         <w:pStyle w:val="Titre3"/>
       </w:pPr>
-      <w:bookmarkStart w:id="7" w:name="_Toc237795288"/>
+      <w:bookmarkStart w:id="7" w:name="_Toc238461618"/>
       <w:r>
         <w:t>1.2.1 Le groupe Sopra Steria</w:t>
       </w:r>
@@ -5710,7 +5776,7 @@
       <w:pPr>
         <w:pStyle w:val="Titre3"/>
       </w:pPr>
-      <w:bookmarkStart w:id="8" w:name="_Toc237795289"/>
+      <w:bookmarkStart w:id="8" w:name="_Toc238461619"/>
       <w:r>
         <w:t>1.2.2 Sopra HR Software</w:t>
       </w:r>
@@ -5730,7 +5796,7 @@
       <w:pPr>
         <w:pStyle w:val="Titre2"/>
       </w:pPr>
-      <w:bookmarkStart w:id="9" w:name="_Toc237795290"/>
+      <w:bookmarkStart w:id="9" w:name="_Toc238461620"/>
       <w:r>
         <w:t>1.3 Étude de l'existant</w:t>
       </w:r>
@@ -5798,6 +5864,7 @@
         </w:numPr>
       </w:pPr>
       <w:r>
+        <w:lastRenderedPageBreak/>
         <w:t>Aucune notification automatique n'informait les candidats de l'état d'avancement de leur candidature, ce qui pouvait nuire à leur expérience et à l'image de l'entreprise.</w:t>
       </w:r>
     </w:p>
@@ -5817,7 +5884,7 @@
       <w:pPr>
         <w:pStyle w:val="Titre2"/>
       </w:pPr>
-      <w:bookmarkStart w:id="10" w:name="_Toc237795291"/>
+      <w:bookmarkStart w:id="10" w:name="_Toc238461621"/>
       <w:r>
         <w:t>1.4 Critique de l'existant et problématique</w:t>
       </w:r>
@@ -5837,7 +5904,7 @@
       <w:pPr>
         <w:pStyle w:val="Titre2"/>
       </w:pPr>
-      <w:bookmarkStart w:id="11" w:name="_Toc237795292"/>
+      <w:bookmarkStart w:id="11" w:name="_Toc238461622"/>
       <w:r>
         <w:t>1.5 Objectifs du projet</w:t>
       </w:r>
@@ -5924,7 +5991,7 @@
       <w:pPr>
         <w:pStyle w:val="Titre2"/>
       </w:pPr>
-      <w:bookmarkStart w:id="12" w:name="_Toc237795293"/>
+      <w:bookmarkStart w:id="12" w:name="_Toc238461623"/>
       <w:r>
         <w:t>1.6 Présentation de la solution proposée : JOB4YOU</w:t>
       </w:r>
@@ -5944,6 +6011,7 @@
         </w:numPr>
       </w:pPr>
       <w:r>
+        <w:lastRenderedPageBreak/>
         <w:t>Le Candidat, qui peut consulter les offres d'emploi publiées, soumettre une candidature accompagnée de son CV, et suivre l'état d'avancement de son dossier.</w:t>
       </w:r>
     </w:p>
@@ -5992,7 +6060,7 @@
       <w:pPr>
         <w:pStyle w:val="Titre2"/>
       </w:pPr>
-      <w:bookmarkStart w:id="13" w:name="_Toc237795294"/>
+      <w:bookmarkStart w:id="13" w:name="_Toc238461624"/>
       <w:r>
         <w:t>1.7 Méthodologie de travail adoptée</w:t>
       </w:r>
@@ -6012,7 +6080,7 @@
       <w:pPr>
         <w:pStyle w:val="Titre2"/>
       </w:pPr>
-      <w:bookmarkStart w:id="14" w:name="_Toc237795295"/>
+      <w:bookmarkStart w:id="14" w:name="_Toc238461625"/>
       <w:r>
         <w:t>1.8 Planification du projet</w:t>
       </w:r>
@@ -6344,7 +6412,14 @@
               <w:rPr>
                 <w:sz w:val="21"/>
               </w:rPr>
-              <w:t>Gestion des entretiens et des feedbacks, scoring IA, agents n8n, notifications e-mail, tableau Kanban</w:t>
+              <w:t xml:space="preserve">Gestion des entretiens et des feedbacks, scoring IA, agents n8n, </w:t>
+            </w:r>
+            <w:r>
+              <w:rPr>
+                <w:sz w:val="21"/>
+              </w:rPr>
+              <w:lastRenderedPageBreak/>
+              <w:t>notifications e-mail, tableau Kanban</w:t>
             </w:r>
           </w:p>
         </w:tc>
@@ -6364,6 +6439,7 @@
               <w:rPr>
                 <w:sz w:val="21"/>
               </w:rPr>
+              <w:lastRenderedPageBreak/>
               <w:t>Tests, corrections et finalisation</w:t>
             </w:r>
           </w:p>
@@ -6412,7 +6488,7 @@
       <w:pPr>
         <w:pStyle w:val="Titre2"/>
       </w:pPr>
-      <w:bookmarkStart w:id="15" w:name="_Toc237795296"/>
+      <w:bookmarkStart w:id="15" w:name="_Toc238461626"/>
       <w:r>
         <w:t>1.9 Conclusion</w:t>
       </w:r>
@@ -6435,7 +6511,7 @@
       <w:pPr>
         <w:pStyle w:val="Titre1"/>
       </w:pPr>
-      <w:bookmarkStart w:id="16" w:name="_Toc237795297"/>
+      <w:bookmarkStart w:id="16" w:name="_Toc238461627"/>
       <w:r>
         <w:t>Chapitre 2 : Analyse et Spécification des Besoins</w:t>
       </w:r>
@@ -6450,7 +6526,7 @@
       <w:pPr>
         <w:pStyle w:val="Titre2"/>
       </w:pPr>
-      <w:bookmarkStart w:id="17" w:name="_Toc237795298"/>
+      <w:bookmarkStart w:id="17" w:name="_Toc238461628"/>
       <w:r>
         <w:t>2.1 Introduction</w:t>
       </w:r>
@@ -6465,7 +6541,7 @@
       <w:pPr>
         <w:pStyle w:val="Titre2"/>
       </w:pPr>
-      <w:bookmarkStart w:id="18" w:name="_Toc237795299"/>
+      <w:bookmarkStart w:id="18" w:name="_Toc238461629"/>
       <w:r>
         <w:t>2.2 Étude fonctionnelle</w:t>
       </w:r>
@@ -6475,7 +6551,7 @@
       <w:pPr>
         <w:pStyle w:val="Titre3"/>
       </w:pPr>
-      <w:bookmarkStart w:id="19" w:name="_Toc237795300"/>
+      <w:bookmarkStart w:id="19" w:name="_Toc238461630"/>
       <w:r>
         <w:t>2.2.1 Identification des acteurs du système</w:t>
       </w:r>
@@ -7164,6 +7240,7 @@
               <w:rPr>
                 <w:sz w:val="21"/>
               </w:rPr>
+              <w:lastRenderedPageBreak/>
               <w:t>Gérer les utilisateurs et les rôles</w:t>
             </w:r>
           </w:p>
@@ -7436,7 +7513,7 @@
       <w:pPr>
         <w:pStyle w:val="Titre3"/>
       </w:pPr>
-      <w:bookmarkStart w:id="20" w:name="_Toc237795301"/>
+      <w:bookmarkStart w:id="20" w:name="_Toc238461631"/>
       <w:r>
         <w:t>2.2.2 Identification des besoins fonctionnels</w:t>
       </w:r>
@@ -7576,6 +7653,7 @@
         </w:numPr>
       </w:pPr>
       <w:r>
+        <w:lastRenderedPageBreak/>
         <w:t>Matching inverse (« Job idéal ») : un visiteur peut déposer son CV sans postuler à une offre précise ; le système le compare aux offres actives et lui suggère les plus pertinentes avec un score de compatibilité.</w:t>
       </w:r>
     </w:p>
@@ -7583,7 +7661,7 @@
       <w:pPr>
         <w:pStyle w:val="Titre3"/>
       </w:pPr>
-      <w:bookmarkStart w:id="21" w:name="_Toc237795302"/>
+      <w:bookmarkStart w:id="21" w:name="_Toc238461632"/>
       <w:r>
         <w:t>2.2.3 Identification des besoins non fonctionnels</w:t>
       </w:r>
@@ -7670,7 +7748,7 @@
       <w:pPr>
         <w:pStyle w:val="Titre3"/>
       </w:pPr>
-      <w:bookmarkStart w:id="22" w:name="_Toc237795303"/>
+      <w:bookmarkStart w:id="22" w:name="_Toc238461633"/>
       <w:r>
         <w:t>2.2.4 Diagramme de cas d'utilisation</w:t>
       </w:r>
@@ -7690,9 +7768,10 @@
         <w:rPr>
           <w:noProof/>
         </w:rPr>
+        <w:lastRenderedPageBreak/>
         <w:pict w14:anchorId="502D5C14">
           <v:shape id="Image 2" o:spid="_x0000_i1026" type="#_x0000_t75" style="width:300pt;height:647.4pt;visibility:visible;mso-wrap-style:square">
-            <v:imagedata r:id="rId10" o:title=""/>
+            <v:imagedata r:id="rId13" o:title=""/>
             <o:lock v:ext="edit" aspectratio="f"/>
           </v:shape>
         </w:pict>
@@ -7719,7 +7798,7 @@
       <w:pPr>
         <w:pStyle w:val="Titre3"/>
       </w:pPr>
-      <w:bookmarkStart w:id="23" w:name="_Toc237795304"/>
+      <w:bookmarkStart w:id="23" w:name="_Toc238461634"/>
       <w:r>
         <w:t>2.2.5 Description textuelle de quelques cas d'utilisation</w:t>
       </w:r>
@@ -7773,6 +7852,7 @@
                 <w:b/>
                 <w:sz w:val="21"/>
               </w:rPr>
+              <w:lastRenderedPageBreak/>
               <w:t>Élément</w:t>
             </w:r>
           </w:p>
@@ -8106,7 +8186,7 @@
       <w:pPr>
         <w:pStyle w:val="Titre3"/>
       </w:pPr>
-      <w:bookmarkStart w:id="24" w:name="_Toc237795305"/>
+      <w:bookmarkStart w:id="24" w:name="_Toc238461635"/>
       <w:r>
         <w:t>2.2.6 Diagramme de séquence système</w:t>
       </w:r>
@@ -8127,7 +8207,7 @@
         </w:rPr>
         <w:pict w14:anchorId="0BD5B398">
           <v:shape id="Image 3" o:spid="_x0000_i1027" type="#_x0000_t75" style="width:429.6pt;height:195.6pt;visibility:visible;mso-wrap-style:square">
-            <v:imagedata r:id="rId11" o:title=""/>
+            <v:imagedata r:id="rId14" o:title=""/>
           </v:shape>
         </w:pict>
       </w:r>
@@ -8153,7 +8233,7 @@
       <w:pPr>
         <w:pStyle w:val="Titre2"/>
       </w:pPr>
-      <w:bookmarkStart w:id="25" w:name="_Toc237795306"/>
+      <w:bookmarkStart w:id="25" w:name="_Toc238461636"/>
       <w:r>
         <w:t>2.3 Étude technique</w:t>
       </w:r>
@@ -8163,7 +8243,7 @@
       <w:pPr>
         <w:pStyle w:val="Titre3"/>
       </w:pPr>
-      <w:bookmarkStart w:id="26" w:name="_Toc237795307"/>
+      <w:bookmarkStart w:id="26" w:name="_Toc238461637"/>
       <w:r>
         <w:t>2.3.1 Architecture physique</w:t>
       </w:r>
@@ -8171,7 +8251,14 @@
     </w:p>
     <w:p>
       <w:r>
-        <w:t>La plateforme s'organise en architecture distribuée par couches, comme le montre la figure suivante : un frontend Angular [3], [13] consommé par le navigateur, un backend Spring Boot [1], [12] exposant des API REST sécurisées, une base de données PostgreSQL [4], et un serveur n8n [7] responsable de l'automatisation — scoring IA via l'API Cohere [6], notifications, et une intégration Google Calendar limitée à ce stade à un lien de démonstration.</w:t>
+        <w:t xml:space="preserve">La plateforme s'organise en architecture distribuée par couches, comme le montre la figure suivante : un frontend Angular [3], [13] consommé par le navigateur, un backend Spring Boot [1], [12] exposant des API REST sécurisées, une base de données PostgreSQL [4], et un serveur n8n [7] responsable de l'automatisation — scoring IA via l'API </w:t>
+      </w:r>
+      <w:r>
+        <w:lastRenderedPageBreak/>
+        <w:t xml:space="preserve">Cohere [6], notifications, et </w:t>
+      </w:r>
+      <w:r>
+        <w:t>une intégration réelle avec Google Calendar, qui crée l’événement et génère automatiquement le lien Google Meet correspondant.</w:t>
       </w:r>
     </w:p>
     <w:p>
@@ -8184,7 +8271,7 @@
         </w:rPr>
         <w:pict w14:anchorId="470F3FC0">
           <v:shape id="Image 4" o:spid="_x0000_i1028" type="#_x0000_t75" style="width:420pt;height:92.4pt;visibility:visible;mso-wrap-style:square">
-            <v:imagedata r:id="rId12" o:title=""/>
+            <v:imagedata r:id="rId15" o:title=""/>
           </v:shape>
         </w:pict>
       </w:r>
@@ -8210,7 +8297,7 @@
       <w:pPr>
         <w:pStyle w:val="Titre3"/>
       </w:pPr>
-      <w:bookmarkStart w:id="27" w:name="_Toc237795308"/>
+      <w:bookmarkStart w:id="27" w:name="_Toc238461638"/>
       <w:r>
         <w:t>2.3.2 Côté client — Angular</w:t>
       </w:r>
@@ -8225,7 +8312,7 @@
       <w:pPr>
         <w:pStyle w:val="Titre3"/>
       </w:pPr>
-      <w:bookmarkStart w:id="28" w:name="_Toc237795309"/>
+      <w:bookmarkStart w:id="28" w:name="_Toc238461639"/>
       <w:r>
         <w:t>2.3.3 Côté serveur — Spring Boot</w:t>
       </w:r>
@@ -8240,7 +8327,7 @@
       <w:pPr>
         <w:pStyle w:val="Titre3"/>
       </w:pPr>
-      <w:bookmarkStart w:id="29" w:name="_Toc237795310"/>
+      <w:bookmarkStart w:id="29" w:name="_Toc238461640"/>
       <w:r>
         <w:t>2.3.4 La sécurité — Spring Security et JWT</w:t>
       </w:r>
@@ -8255,7 +8342,7 @@
       <w:pPr>
         <w:pStyle w:val="Titre2"/>
       </w:pPr>
-      <w:bookmarkStart w:id="30" w:name="_Toc237795311"/>
+      <w:bookmarkStart w:id="30" w:name="_Toc238461641"/>
       <w:r>
         <w:t>2.4 Conclusion</w:t>
       </w:r>
@@ -8278,7 +8365,7 @@
       <w:pPr>
         <w:pStyle w:val="Titre1"/>
       </w:pPr>
-      <w:bookmarkStart w:id="31" w:name="_Toc237795312"/>
+      <w:bookmarkStart w:id="31" w:name="_Toc238461642"/>
       <w:r>
         <w:t>Chapitre 3 : Conception</w:t>
       </w:r>
@@ -8293,7 +8380,7 @@
       <w:pPr>
         <w:pStyle w:val="Titre2"/>
       </w:pPr>
-      <w:bookmarkStart w:id="32" w:name="_Toc237795313"/>
+      <w:bookmarkStart w:id="32" w:name="_Toc238461643"/>
       <w:r>
         <w:t>3.1 Introduction</w:t>
       </w:r>
@@ -8308,7 +8395,7 @@
       <w:pPr>
         <w:pStyle w:val="Titre2"/>
       </w:pPr>
-      <w:bookmarkStart w:id="33" w:name="_Toc237795314"/>
+      <w:bookmarkStart w:id="33" w:name="_Toc238461644"/>
       <w:r>
         <w:t>3.2 Diagramme des paquetages</w:t>
       </w:r>
@@ -8329,7 +8416,7 @@
         </w:rPr>
         <w:pict w14:anchorId="73EFB9F8">
           <v:shape id="Image 5" o:spid="_x0000_i1029" type="#_x0000_t75" style="width:429.6pt;height:226.8pt;visibility:visible;mso-wrap-style:square">
-            <v:imagedata r:id="rId13" o:title=""/>
+            <v:imagedata r:id="rId16" o:title=""/>
           </v:shape>
         </w:pict>
       </w:r>
@@ -8360,7 +8447,7 @@
       <w:pPr>
         <w:pStyle w:val="Titre2"/>
       </w:pPr>
-      <w:bookmarkStart w:id="34" w:name="_Toc237795315"/>
+      <w:bookmarkStart w:id="34" w:name="_Toc238461645"/>
       <w:r>
         <w:t>3.3 Diagramme de classes global</w:t>
       </w:r>
@@ -8374,12 +8461,12 @@
     <w:p>
       <w:pPr>
         <w:sectPr>
-          <w:headerReference w:type="even" r:id="rId14"/>
-          <w:headerReference w:type="default" r:id="rId15"/>
-          <w:footerReference w:type="even" r:id="rId16"/>
-          <w:footerReference w:type="default" r:id="rId17"/>
-          <w:headerReference w:type="first" r:id="rId18"/>
-          <w:footerReference w:type="first" r:id="rId19"/>
+          <w:headerReference w:type="even" r:id="rId17"/>
+          <w:headerReference w:type="default" r:id="rId18"/>
+          <w:footerReference w:type="even" r:id="rId19"/>
+          <w:footerReference w:type="default" r:id="rId20"/>
+          <w:headerReference w:type="first" r:id="rId21"/>
+          <w:footerReference w:type="first" r:id="rId22"/>
           <w:pgSz w:w="11906" w:h="16838"/>
           <w:pgMar w:top="426" w:right="720" w:bottom="720" w:left="720" w:header="708" w:footer="708" w:gutter="0"/>
           <w:cols w:space="708"/>
@@ -8395,9 +8482,10 @@
         <w:rPr>
           <w:noProof/>
         </w:rPr>
+        <w:lastRenderedPageBreak/>
         <w:pict w14:anchorId="598E410F">
           <v:shape id="Image 6" o:spid="_x0000_i1030" type="#_x0000_t75" style="width:724.8pt;height:202.8pt;visibility:visible;mso-wrap-style:square">
-            <v:imagedata r:id="rId20" o:title=""/>
+            <v:imagedata r:id="rId23" o:title=""/>
           </v:shape>
         </w:pict>
       </w:r>
@@ -8432,6 +8520,7 @@
     </w:p>
     <w:p>
       <w:r>
+        <w:lastRenderedPageBreak/>
         <w:t>Ce modèle fait ressortir plusieurs relations structurantes : un candidat dépose au plus un CV et peut passer par plusieurs entretiens, chacun pouvant donner lieu à un ou plusieurs feedbacks rédigés par un utilisateur (manager ou RH). Une offre d'emploi, rattachée à un département, reçoit plusieurs candidatures. Quant à la classe User, elle centralise l'identité des utilisateurs internes (RH, managers, administrateurs) et porte, via la classe Role, un système de rôles multiples pour une gestion fine des permissions.</w:t>
       </w:r>
     </w:p>
@@ -8439,7 +8528,7 @@
       <w:pPr>
         <w:pStyle w:val="Titre2"/>
       </w:pPr>
-      <w:bookmarkStart w:id="35" w:name="_Toc237795316"/>
+      <w:bookmarkStart w:id="35" w:name="_Toc238461646"/>
       <w:r>
         <w:t>3.4 Diagrammes de séquence objet</w:t>
       </w:r>
@@ -8454,7 +8543,7 @@
       <w:pPr>
         <w:pStyle w:val="Titre3"/>
       </w:pPr>
-      <w:bookmarkStart w:id="36" w:name="_Toc237795317"/>
+      <w:bookmarkStart w:id="36" w:name="_Toc238461647"/>
       <w:r>
         <w:t>3.4.1 Planifier un entretien</w:t>
       </w:r>
@@ -8470,7 +8559,7 @@
         </w:rPr>
         <w:pict w14:anchorId="259C4FBE">
           <v:shape id="Image 7" o:spid="_x0000_i1031" type="#_x0000_t75" style="width:445.2pt;height:222.6pt;visibility:visible;mso-wrap-style:square">
-            <v:imagedata r:id="rId21" o:title=""/>
+            <v:imagedata r:id="rId24" o:title=""/>
           </v:shape>
         </w:pict>
       </w:r>
@@ -8501,8 +8590,9 @@
       <w:pPr>
         <w:pStyle w:val="Titre3"/>
       </w:pPr>
-      <w:bookmarkStart w:id="37" w:name="_Toc237795318"/>
-      <w:r>
+      <w:bookmarkStart w:id="37" w:name="_Toc238461648"/>
+      <w:r>
+        <w:lastRenderedPageBreak/>
         <w:t>3.4.2 Décision finale de recrutement</w:t>
       </w:r>
       <w:bookmarkEnd w:id="37"/>
@@ -8517,7 +8607,7 @@
         </w:rPr>
         <w:pict w14:anchorId="52C8B92C">
           <v:shape id="Image 8" o:spid="_x0000_i1032" type="#_x0000_t75" style="width:444.6pt;height:210.6pt;visibility:visible;mso-wrap-style:square">
-            <v:imagedata r:id="rId22" o:title=""/>
+            <v:imagedata r:id="rId25" o:title=""/>
           </v:shape>
         </w:pict>
       </w:r>
@@ -8548,7 +8638,7 @@
       <w:pPr>
         <w:pStyle w:val="Titre2"/>
       </w:pPr>
-      <w:bookmarkStart w:id="38" w:name="_Toc237795319"/>
+      <w:bookmarkStart w:id="38" w:name="_Toc238461649"/>
       <w:r>
         <w:t>3.5 Diagramme d'états — Cycle de vie d'une candidature</w:t>
       </w:r>
@@ -8567,9 +8657,10 @@
         <w:rPr>
           <w:noProof/>
         </w:rPr>
+        <w:lastRenderedPageBreak/>
         <w:pict w14:anchorId="51AEDC00">
           <v:shape id="Image 9" o:spid="_x0000_i1033" type="#_x0000_t75" style="width:400.2pt;height:487.2pt;visibility:visible;mso-wrap-style:square">
-            <v:imagedata r:id="rId23" o:title=""/>
+            <v:imagedata r:id="rId26" o:title=""/>
           </v:shape>
         </w:pict>
       </w:r>
@@ -8603,6 +8694,7 @@
     </w:p>
     <w:p>
       <w:r>
+        <w:lastRenderedPageBreak/>
         <w:t>Le cheminement d'une candidature à travers le scoring IA peut se résumer ainsi : CV candidat → extraction du texte du CV → agent n8n (CV Parser) → appel de l'API Cohere → analyse sémantique et scoring → score global sur 100 → orientation automatique vers CV_REVIEWED (score supérieur ou égal à 60) ou AUTO_REJECTED (score inférieur à 60) → validation humaine possible, le RH ou l'Administrateur pouvant corriger le score via le mécanisme de surcharge.</w:t>
       </w:r>
     </w:p>
@@ -8610,7 +8702,7 @@
       <w:pPr>
         <w:pStyle w:val="Titre2"/>
       </w:pPr>
-      <w:bookmarkStart w:id="39" w:name="_Toc237795320"/>
+      <w:bookmarkStart w:id="39" w:name="_Toc238461650"/>
       <w:r>
         <w:t>3.6 Conception de la base de données</w:t>
       </w:r>
@@ -8645,9 +8737,10 @@
         <w:rPr>
           <w:noProof/>
         </w:rPr>
+        <w:lastRenderedPageBreak/>
         <w:pict w14:anchorId="302CA6EE">
           <v:shape id="Image 10" o:spid="_x0000_i1034" type="#_x0000_t75" style="width:680.4pt;height:443.4pt;visibility:visible;mso-wrap-style:square">
-            <v:imagedata r:id="rId24" o:title=""/>
+            <v:imagedata r:id="rId27" o:title=""/>
           </v:shape>
         </w:pict>
       </w:r>
@@ -8684,8 +8777,9 @@
       <w:pPr>
         <w:pStyle w:val="Titre2"/>
       </w:pPr>
-      <w:bookmarkStart w:id="40" w:name="_Toc237795321"/>
-      <w:r>
+      <w:bookmarkStart w:id="40" w:name="_Toc238461651"/>
+      <w:r>
+        <w:lastRenderedPageBreak/>
         <w:t>3.7 Diagramme de déploiement</w:t>
       </w:r>
       <w:bookmarkEnd w:id="40"/>
@@ -8705,7 +8799,7 @@
         </w:rPr>
         <w:pict w14:anchorId="7C6F7E72">
           <v:shape id="Image 11" o:spid="_x0000_i1035" type="#_x0000_t75" style="width:380.4pt;height:385.2pt;visibility:visible;mso-wrap-style:square">
-            <v:imagedata r:id="rId25" o:title=""/>
+            <v:imagedata r:id="rId28" o:title=""/>
           </v:shape>
         </w:pict>
       </w:r>
@@ -8729,14 +8823,17 @@
     <w:p/>
     <w:p>
       <w:r>
-        <w:t>Le frontend Angular et le backend Spring Boot tournent sur des serveurs distincts et communiquent via des API REST sécurisées par JWT. Le backend s'appuie sur une base de données PostgreSQL dédiée et déclenche, via des webhooks HTTP, les agents d'automatisation n8n — lesquels sollicitent à leur tour les services externes : API Cohere pour le scoring IA, Google Calendar pour la planification (lien de démonstration à ce stade), et serveur SMTP pour les notifications.</w:t>
+        <w:t xml:space="preserve">Le frontend Angular et le backend Spring Boot tournent sur des serveurs distincts et communiquent via des API REST sécurisées par JWT. Le backend s'appuie sur une base de données PostgreSQL dédiée et déclenche, via des webhooks HTTP, les agents d'automatisation n8n — lesquels sollicitent à leur tour les services externes : API Cohere pour le scoring IA, </w:t>
+      </w:r>
+      <w:r>
+        <w:t>Google Calendar pour la création réelle de l’événement et du lien Google Meet lors de la planification, et serveur SMTP pour les notifications.</w:t>
       </w:r>
     </w:p>
     <w:p>
       <w:pPr>
         <w:pStyle w:val="Titre2"/>
       </w:pPr>
-      <w:bookmarkStart w:id="41" w:name="_Toc237795322"/>
+      <w:bookmarkStart w:id="41" w:name="_Toc238461652"/>
       <w:r>
         <w:t>3.8 Diagramme de composants</w:t>
       </w:r>
@@ -8755,9 +8852,10 @@
         <w:rPr>
           <w:noProof/>
         </w:rPr>
+        <w:lastRenderedPageBreak/>
         <w:pict w14:anchorId="29E43F6E">
           <v:shape id="Image 12" o:spid="_x0000_i1036" type="#_x0000_t75" style="width:440.4pt;height:395.4pt;visibility:visible;mso-wrap-style:square">
-            <v:imagedata r:id="rId26" o:title=""/>
+            <v:imagedata r:id="rId29" o:title=""/>
           </v:shape>
         </w:pict>
       </w:r>
@@ -8788,7 +8886,7 @@
       <w:pPr>
         <w:pStyle w:val="Titre2"/>
       </w:pPr>
-      <w:bookmarkStart w:id="42" w:name="_Toc237795323"/>
+      <w:bookmarkStart w:id="42" w:name="_Toc238461653"/>
       <w:r>
         <w:t>3.9 Conclusion</w:t>
       </w:r>
@@ -8811,7 +8909,7 @@
       <w:pPr>
         <w:pStyle w:val="Titre1"/>
       </w:pPr>
-      <w:bookmarkStart w:id="43" w:name="_Toc237795324"/>
+      <w:bookmarkStart w:id="43" w:name="_Toc238461654"/>
       <w:r>
         <w:t>Chapitre 4 : Réalisation</w:t>
       </w:r>
@@ -8826,7 +8924,7 @@
       <w:pPr>
         <w:pStyle w:val="Titre2"/>
       </w:pPr>
-      <w:bookmarkStart w:id="44" w:name="_Toc237795325"/>
+      <w:bookmarkStart w:id="44" w:name="_Toc238461655"/>
       <w:r>
         <w:t>4.1 Introduction</w:t>
       </w:r>
@@ -8841,7 +8939,7 @@
       <w:pPr>
         <w:pStyle w:val="Titre2"/>
       </w:pPr>
-      <w:bookmarkStart w:id="45" w:name="_Toc237795326"/>
+      <w:bookmarkStart w:id="45" w:name="_Toc238461656"/>
       <w:r>
         <w:t>4.2 Environnement de travail</w:t>
       </w:r>
@@ -8851,7 +8949,7 @@
       <w:pPr>
         <w:pStyle w:val="Titre3"/>
       </w:pPr>
-      <w:bookmarkStart w:id="46" w:name="_Toc237795327"/>
+      <w:bookmarkStart w:id="46" w:name="_Toc238461657"/>
       <w:r>
         <w:t>4.2.1 Environnement matériel</w:t>
       </w:r>
@@ -8866,7 +8964,7 @@
       <w:pPr>
         <w:pStyle w:val="Titre3"/>
       </w:pPr>
-      <w:bookmarkStart w:id="47" w:name="_Toc237795328"/>
+      <w:bookmarkStart w:id="47" w:name="_Toc238461658"/>
       <w:r>
         <w:t>4.2.2 Environnement logiciel</w:t>
       </w:r>
@@ -8982,6 +9080,7 @@
         </w:numPr>
       </w:pPr>
       <w:r>
+        <w:lastRenderedPageBreak/>
         <w:t>Build et gestion de dépendances : Maven pour le backend, npm pour le frontend.</w:t>
       </w:r>
     </w:p>
@@ -8989,7 +9088,7 @@
       <w:pPr>
         <w:pStyle w:val="Titre3"/>
       </w:pPr>
-      <w:bookmarkStart w:id="48" w:name="_Toc237795329"/>
+      <w:bookmarkStart w:id="48" w:name="_Toc238461659"/>
       <w:r>
         <w:t>4.2.3 Autres</w:t>
       </w:r>
@@ -9004,7 +9103,7 @@
       <w:pPr>
         <w:pStyle w:val="Titre3"/>
       </w:pPr>
-      <w:bookmarkStart w:id="49" w:name="_Toc237795330"/>
+      <w:bookmarkStart w:id="49" w:name="_Toc238461660"/>
       <w:r>
         <w:t>4.2.4 Sécurité applicative</w:t>
       </w:r>
@@ -9019,7 +9118,7 @@
       <w:pPr>
         <w:pStyle w:val="Titre2"/>
       </w:pPr>
-      <w:bookmarkStart w:id="50" w:name="_Toc237795331"/>
+      <w:bookmarkStart w:id="50" w:name="_Toc238461661"/>
       <w:r>
         <w:t>4.3 Interfaces graphiques de l'application</w:t>
       </w:r>
@@ -9040,117 +9139,6 @@
         </w:rPr>
         <w:pict w14:anchorId="650581FA">
           <v:shape id="Image 13" o:spid="_x0000_i1037" type="#_x0000_t75" style="width:420pt;height:249.6pt;visibility:visible;mso-wrap-style:square">
-            <v:imagedata r:id="rId27" o:title=""/>
-          </v:shape>
-        </w:pict>
-      </w:r>
-    </w:p>
-    <w:p>
-      <w:pPr>
-        <w:jc w:val="center"/>
-        <w:rPr>
-          <w:i/>
-          <w:sz w:val="21"/>
-        </w:rPr>
-      </w:pPr>
-      <w:r>
-        <w:rPr>
-          <w:i/>
-          <w:sz w:val="21"/>
-        </w:rPr>
-        <w:t>Figure 4.1 : Page d'accueil publique — recherche d'offres d'emploi</w:t>
-      </w:r>
-    </w:p>
-    <w:p/>
-    <w:p>
-      <w:r>
-        <w:t>Accessible sans authentification, la page d'accueil permet à tout visiteur de rechercher une offre par mot-clé et par localisation, et met en avant les offres publiées les plus récentes.</w:t>
-      </w:r>
-    </w:p>
-    <w:p>
-      <w:pPr>
-        <w:jc w:val="center"/>
-      </w:pPr>
-      <w:r>
-        <w:rPr>
-          <w:noProof/>
-        </w:rPr>
-        <w:pict w14:anchorId="5BF0AF37">
-          <v:shape id="Image 14" o:spid="_x0000_i1038" type="#_x0000_t75" style="width:349.8pt;height:207.6pt;visibility:visible;mso-wrap-style:square">
-            <v:imagedata r:id="rId28" o:title=""/>
-          </v:shape>
-        </w:pict>
-      </w:r>
-    </w:p>
-    <w:p>
-      <w:pPr>
-        <w:jc w:val="center"/>
-        <w:rPr>
-          <w:i/>
-          <w:sz w:val="21"/>
-        </w:rPr>
-      </w:pPr>
-      <w:r>
-        <w:rPr>
-          <w:i/>
-          <w:sz w:val="21"/>
-        </w:rPr>
-        <w:t>Figure 4.2 : Page de connexion</w:t>
-      </w:r>
-    </w:p>
-    <w:p/>
-    <w:p>
-      <w:r>
-        <w:t>L'authentification se fait par nom d'utilisateur et mot de passe ; le jeton JWT renvoyé par le backend sécurise ensuite l'ensemble des requêtes vers l'API.</w:t>
-      </w:r>
-    </w:p>
-    <w:p>
-      <w:pPr>
-        <w:jc w:val="center"/>
-      </w:pPr>
-      <w:r>
-        <w:rPr>
-          <w:noProof/>
-        </w:rPr>
-        <w:pict w14:anchorId="1EEBD083">
-          <v:shape id="Image 15" o:spid="_x0000_i1039" type="#_x0000_t75" style="width:420pt;height:249.6pt;visibility:visible;mso-wrap-style:square">
-            <v:imagedata r:id="rId29" o:title=""/>
-          </v:shape>
-        </w:pict>
-      </w:r>
-    </w:p>
-    <w:p>
-      <w:pPr>
-        <w:jc w:val="center"/>
-        <w:rPr>
-          <w:i/>
-          <w:sz w:val="21"/>
-        </w:rPr>
-      </w:pPr>
-      <w:r>
-        <w:rPr>
-          <w:i/>
-          <w:sz w:val="21"/>
-        </w:rPr>
-        <w:t>Figure 4.3 : Gestion des offres d'emploi (espace RH)</w:t>
-      </w:r>
-    </w:p>
-    <w:p/>
-    <w:p>
-      <w:r>
-        <w:t>Le Responsable RH crée, modifie et suit ici le statut de chaque offre d'emploi (active, fermée, expirée) ; la bascule en « expirée » se fait automatiquement une fois la date limite dépassée.</w:t>
-      </w:r>
-    </w:p>
-    <w:p>
-      <w:pPr>
-        <w:jc w:val="center"/>
-      </w:pPr>
-      <w:r>
-        <w:rPr>
-          <w:noProof/>
-        </w:rPr>
-        <w:pict w14:anchorId="131B476D">
-          <v:shape id="Image 16" o:spid="_x0000_i1040" type="#_x0000_t75" style="width:420pt;height:249.6pt;visibility:visible;mso-wrap-style:square">
             <v:imagedata r:id="rId30" o:title=""/>
           </v:shape>
         </w:pict>
@@ -9169,13 +9157,14 @@
           <w:i/>
           <w:sz w:val="21"/>
         </w:rPr>
-        <w:t>Figure 4.4 : Gestion des candidats — vue liste avec score IA</w:t>
+        <w:t>Figure 4.1 : Page d'accueil publique — recherche d'offres d'emploi</w:t>
       </w:r>
     </w:p>
     <w:p/>
     <w:p>
       <w:r>
-        <w:t>Pour chaque dossier, la liste des candidats affiche le statut courant, le score calculé par l'agent IA, ainsi qu'un ensemble d'actions rapides (changement de statut, envoi d'e-mail, consultation, suppression).</w:t>
+        <w:lastRenderedPageBreak/>
+        <w:t>Accessible sans authentification, la page d'accueil permet à tout visiteur de rechercher une offre par mot-clé et par localisation, et met en avant les offres publiées les plus récentes.</w:t>
       </w:r>
     </w:p>
     <w:p>
@@ -9186,8 +9175,8 @@
         <w:rPr>
           <w:noProof/>
         </w:rPr>
-        <w:pict w14:anchorId="0B44AC1E">
-          <v:shape id="Image 17" o:spid="_x0000_i1041" type="#_x0000_t75" style="width:420pt;height:249.6pt;visibility:visible;mso-wrap-style:square">
+        <w:pict w14:anchorId="5BF0AF37">
+          <v:shape id="Image 14" o:spid="_x0000_i1038" type="#_x0000_t75" style="width:349.8pt;height:207.6pt;visibility:visible;mso-wrap-style:square">
             <v:imagedata r:id="rId31" o:title=""/>
           </v:shape>
         </w:pict>
@@ -9206,13 +9195,13 @@
           <w:i/>
           <w:sz w:val="21"/>
         </w:rPr>
-        <w:t>Figure 4.5 : Modification d'un dossier candidat</w:t>
+        <w:t>Figure 4.2 : Page de connexion</w:t>
       </w:r>
     </w:p>
     <w:p/>
     <w:p>
       <w:r>
-        <w:t>Le RH corrige ici les informations d'un candidat (coordonnées, lettre de motivation, statut, offre associée) via le formulaire de modification ; la fiche de consultation associée regroupe le CV, l'analyse IA détaillée (scores technique, communication, adéquation séniorité) et l'historique des actions des agents n8n sur ce dossier.</w:t>
+        <w:t>L'authentification se fait par nom d'utilisateur et mot de passe ; le jeton JWT renvoyé par le backend sécurise ensuite l'ensemble des requêtes vers l'API.</w:t>
       </w:r>
     </w:p>
     <w:p>
@@ -9223,8 +9212,8 @@
         <w:rPr>
           <w:noProof/>
         </w:rPr>
-        <w:pict w14:anchorId="3DE79FED">
-          <v:shape id="Image 18" o:spid="_x0000_i1042" type="#_x0000_t75" style="width:420pt;height:249.6pt;visibility:visible;mso-wrap-style:square">
+        <w:pict w14:anchorId="1EEBD083">
+          <v:shape id="Image 15" o:spid="_x0000_i1039" type="#_x0000_t75" style="width:420pt;height:249.6pt;visibility:visible;mso-wrap-style:square">
             <v:imagedata r:id="rId32" o:title=""/>
           </v:shape>
         </w:pict>
@@ -9243,13 +9232,13 @@
           <w:i/>
           <w:sz w:val="21"/>
         </w:rPr>
-        <w:t>Figure 4.6 : Tableau Kanban du pipeline de recrutement</w:t>
+        <w:t>Figure 4.3 : Gestion des offres d'emploi (espace RH)</w:t>
       </w:r>
     </w:p>
     <w:p/>
     <w:p>
       <w:r>
-        <w:t>Le tableau Kanban donne une vue synthétique et interactive de toutes les candidatures réparties par statut ; glisser une carte d'une colonne à une autre déclenche automatiquement la mise à jour du statut, sous réserve des garde-fous métier décrits au chapitre 3 pour les décisions finales.</w:t>
+        <w:t>Le Responsable RH crée, modifie et suit ici le statut de chaque offre d'emploi (active, fermée, expirée) ; la bascule en « expirée » se fait automatiquement une fois la date limite dépassée.</w:t>
       </w:r>
     </w:p>
     <w:p>
@@ -9260,8 +9249,9 @@
         <w:rPr>
           <w:noProof/>
         </w:rPr>
-        <w:pict w14:anchorId="61C2271E">
-          <v:shape id="Image 19" o:spid="_x0000_i1043" type="#_x0000_t75" style="width:420pt;height:249.6pt;visibility:visible;mso-wrap-style:square">
+        <w:lastRenderedPageBreak/>
+        <w:pict w14:anchorId="131B476D">
+          <v:shape id="Image 16" o:spid="_x0000_i1040" type="#_x0000_t75" style="width:420pt;height:249.6pt;visibility:visible;mso-wrap-style:square">
             <v:imagedata r:id="rId33" o:title=""/>
           </v:shape>
         </w:pict>
@@ -9280,13 +9270,13 @@
           <w:i/>
           <w:sz w:val="21"/>
         </w:rPr>
-        <w:t>Figure 4.7 : Gestion des entretiens</w:t>
+        <w:t>Figure 4.4 : Gestion des candidats — vue liste avec score IA</w:t>
       </w:r>
     </w:p>
     <w:p/>
     <w:p>
       <w:r>
-        <w:t>On planifie, filtre et suit ici les entretiens (type, date, interviewer, statut), avec des actions contextuelles comme le démarrage, l'annulation, la reprogrammation ou l'ajout d'un feedback une fois l'entretien terminé.</w:t>
+        <w:t>Pour chaque dossier, la liste des candidats affiche le statut courant, le score calculé par l'agent IA, ainsi qu'un ensemble d'actions rapides (changement de statut, envoi d'e-mail, consultation, suppression).</w:t>
       </w:r>
     </w:p>
     <w:p>
@@ -9297,8 +9287,8 @@
         <w:rPr>
           <w:noProof/>
         </w:rPr>
-        <w:pict w14:anchorId="4A63A72C">
-          <v:shape id="Image 20" o:spid="_x0000_i1044" type="#_x0000_t75" style="width:420pt;height:249.6pt;visibility:visible;mso-wrap-style:square">
+        <w:pict w14:anchorId="0B44AC1E">
+          <v:shape id="Image 17" o:spid="_x0000_i1041" type="#_x0000_t75" style="width:420pt;height:249.6pt;visibility:visible;mso-wrap-style:square">
             <v:imagedata r:id="rId34" o:title=""/>
           </v:shape>
         </w:pict>
@@ -9317,13 +9307,17 @@
           <w:i/>
           <w:sz w:val="21"/>
         </w:rPr>
-        <w:t>Figure 4.8 : Gestion des feedbacks</w:t>
+        <w:t>Figure 4.5 : Modification d'un dossier candidat</w:t>
       </w:r>
     </w:p>
     <w:p/>
     <w:p>
       <w:r>
-        <w:t>Les feedbacks saisis par les managers sont centralisés ici, avec une étape de validation par le RH avant transmission au candidat.</w:t>
+        <w:t xml:space="preserve">Le RH corrige ici les informations d'un candidat (coordonnées, lettre de motivation, statut, offre associée) via le formulaire de modification ; la fiche de consultation associée regroupe le CV, </w:t>
+      </w:r>
+      <w:r>
+        <w:lastRenderedPageBreak/>
+        <w:t>l'analyse IA détaillée (scores technique, communication, adéquation séniorité) et l'historique des actions des agents n8n sur ce dossier.</w:t>
       </w:r>
     </w:p>
     <w:p>
@@ -9334,8 +9328,8 @@
         <w:rPr>
           <w:noProof/>
         </w:rPr>
-        <w:pict w14:anchorId="1C64D113">
-          <v:shape id="Image 21" o:spid="_x0000_i1045" type="#_x0000_t75" style="width:420pt;height:249.6pt;visibility:visible;mso-wrap-style:square">
+        <w:pict w14:anchorId="3DE79FED">
+          <v:shape id="Image 18" o:spid="_x0000_i1042" type="#_x0000_t75" style="width:420pt;height:249.6pt;visibility:visible;mso-wrap-style:square">
             <v:imagedata r:id="rId35" o:title=""/>
           </v:shape>
         </w:pict>
@@ -9354,13 +9348,13 @@
           <w:i/>
           <w:sz w:val="21"/>
         </w:rPr>
-        <w:t>Figure 4.9 : Gestion des utilisateurs et des rôles (espace Administrateur)</w:t>
+        <w:t>Figure 4.6 : Tableau Kanban du pipeline de recrutement</w:t>
       </w:r>
     </w:p>
     <w:p/>
     <w:p>
       <w:r>
-        <w:t>L'administrateur y gère l'ensemble des comptes de la plateforme, leurs rôles, ainsi que leur rattachement à un département ou une famille de métier.</w:t>
+        <w:t>Le tableau Kanban donne une vue synthétique et interactive de toutes les candidatures réparties par statut ; glisser une carte d'une colonne à une autre déclenche automatiquement la mise à jour du statut, sous réserve des garde-fous métier décrits au chapitre 3 pour les décisions finales.</w:t>
       </w:r>
     </w:p>
     <w:p>
@@ -9371,8 +9365,8 @@
         <w:rPr>
           <w:noProof/>
         </w:rPr>
-        <w:pict w14:anchorId="30680820">
-          <v:shape id="Image 22" o:spid="_x0000_i1046" type="#_x0000_t75" style="width:420pt;height:249.6pt;visibility:visible;mso-wrap-style:square">
+        <w:pict w14:anchorId="61C2271E">
+          <v:shape id="Image 19" o:spid="_x0000_i1043" type="#_x0000_t75" style="width:420pt;height:249.6pt;visibility:visible;mso-wrap-style:square">
             <v:imagedata r:id="rId36" o:title=""/>
           </v:shape>
         </w:pict>
@@ -9391,13 +9385,14 @@
           <w:i/>
           <w:sz w:val="21"/>
         </w:rPr>
-        <w:t>Figure 4.10 : Paramétrage du scoring IA par famille de métier</w:t>
+        <w:t>Figure 4.7 : Gestion des entretiens</w:t>
       </w:r>
     </w:p>
     <w:p/>
     <w:p>
       <w:r>
-        <w:t>Réservée à l'administrateur, cette interface permet d'ajuster la pondération (technique / communication / séniorité) que l'agent IA utilise pour calculer le score de chaque candidature, selon la famille de métier et le niveau de séniorité de l'offre.</w:t>
+        <w:lastRenderedPageBreak/>
+        <w:t>On planifie, filtre et suit ici les entretiens (type, date, interviewer, statut), avec des actions contextuelles comme le démarrage, l'annulation, la reprogrammation ou l'ajout d'un feedback une fois l'entretien terminé.</w:t>
       </w:r>
     </w:p>
     <w:p>
@@ -9408,8 +9403,8 @@
         <w:rPr>
           <w:noProof/>
         </w:rPr>
-        <w:pict w14:anchorId="66625CE5">
-          <v:shape id="Image 23" o:spid="_x0000_i1047" type="#_x0000_t75" style="width:420pt;height:249.6pt;visibility:visible;mso-wrap-style:square">
+        <w:pict w14:anchorId="4A63A72C">
+          <v:shape id="Image 20" o:spid="_x0000_i1044" type="#_x0000_t75" style="width:420pt;height:249.6pt;visibility:visible;mso-wrap-style:square">
             <v:imagedata r:id="rId37" o:title=""/>
           </v:shape>
         </w:pict>
@@ -9428,12 +9423,125 @@
           <w:i/>
           <w:sz w:val="21"/>
         </w:rPr>
+        <w:t>Figure 4.8 : Gestion des feedbacks</w:t>
+      </w:r>
+    </w:p>
+    <w:p/>
+    <w:p>
+      <w:r>
+        <w:t>Les feedbacks saisis par les managers sont centralisés ici, avec une étape de validation par le RH avant transmission au candidat.</w:t>
+      </w:r>
+    </w:p>
+    <w:p>
+      <w:pPr>
+        <w:jc w:val="center"/>
+      </w:pPr>
+      <w:r>
+        <w:rPr>
+          <w:noProof/>
+        </w:rPr>
+        <w:pict w14:anchorId="1C64D113">
+          <v:shape id="Image 21" o:spid="_x0000_i1045" type="#_x0000_t75" style="width:420pt;height:249.6pt;visibility:visible;mso-wrap-style:square">
+            <v:imagedata r:id="rId38" o:title=""/>
+          </v:shape>
+        </w:pict>
+      </w:r>
+    </w:p>
+    <w:p>
+      <w:pPr>
+        <w:jc w:val="center"/>
+        <w:rPr>
+          <w:i/>
+          <w:sz w:val="21"/>
+        </w:rPr>
+      </w:pPr>
+      <w:r>
+        <w:rPr>
+          <w:i/>
+          <w:sz w:val="21"/>
+        </w:rPr>
+        <w:t>Figure 4.9 : Gestion des utilisateurs et des rôles (espace Administrateur)</w:t>
+      </w:r>
+    </w:p>
+    <w:p/>
+    <w:p>
+      <w:r>
+        <w:lastRenderedPageBreak/>
+        <w:t>L'administrateur y gère l'ensemble des comptes de la plateforme, leurs rôles, ainsi que leur rattachement à un département ou une famille de métier.</w:t>
+      </w:r>
+    </w:p>
+    <w:p>
+      <w:pPr>
+        <w:jc w:val="center"/>
+      </w:pPr>
+      <w:r>
+        <w:rPr>
+          <w:noProof/>
+        </w:rPr>
+        <w:pict w14:anchorId="30680820">
+          <v:shape id="Image 22" o:spid="_x0000_i1046" type="#_x0000_t75" style="width:420pt;height:249.6pt;visibility:visible;mso-wrap-style:square">
+            <v:imagedata r:id="rId39" o:title=""/>
+          </v:shape>
+        </w:pict>
+      </w:r>
+    </w:p>
+    <w:p>
+      <w:pPr>
+        <w:jc w:val="center"/>
+        <w:rPr>
+          <w:i/>
+          <w:sz w:val="21"/>
+        </w:rPr>
+      </w:pPr>
+      <w:r>
+        <w:rPr>
+          <w:i/>
+          <w:sz w:val="21"/>
+        </w:rPr>
+        <w:t>Figure 4.10 : Paramétrage du scoring IA par famille de métier</w:t>
+      </w:r>
+    </w:p>
+    <w:p/>
+    <w:p>
+      <w:r>
+        <w:t>Réservée à l'administrateur, cette interface permet d'ajuster la pondération (technique / communication / séniorité) que l'agent IA utilise pour calculer le score de chaque candidature, selon la famille de métier et le niveau de séniorité de l'offre.</w:t>
+      </w:r>
+    </w:p>
+    <w:p>
+      <w:pPr>
+        <w:jc w:val="center"/>
+      </w:pPr>
+      <w:r>
+        <w:rPr>
+          <w:noProof/>
+        </w:rPr>
+        <w:pict w14:anchorId="66625CE5">
+          <v:shape id="Image 23" o:spid="_x0000_i1047" type="#_x0000_t75" style="width:420pt;height:249.6pt;visibility:visible;mso-wrap-style:square">
+            <v:imagedata r:id="rId40" o:title=""/>
+          </v:shape>
+        </w:pict>
+      </w:r>
+    </w:p>
+    <w:p>
+      <w:pPr>
+        <w:jc w:val="center"/>
+        <w:rPr>
+          <w:i/>
+          <w:sz w:val="21"/>
+        </w:rPr>
+      </w:pPr>
+      <w:r>
+        <w:rPr>
+          <w:i/>
+          <w:sz w:val="21"/>
+        </w:rPr>
         <w:t>Figure 4.11 : Journal d'audit</w:t>
       </w:r>
     </w:p>
     <w:p/>
     <w:p>
       <w:r>
+        <w:lastRenderedPageBreak/>
         <w:t>Le journal d'audit trace tous les changements de statut significatifs, initiés manuellement par un utilisateur ou automatiquement par le système (agents n8n), ce qui garantit la traçabilité de chaque décision prise sur un dossier.</w:t>
       </w:r>
     </w:p>
@@ -9446,7 +9554,7 @@
       <w:pPr>
         <w:pStyle w:val="Titre2"/>
       </w:pPr>
-      <w:bookmarkStart w:id="51" w:name="_Toc237795332"/>
+      <w:bookmarkStart w:id="51" w:name="_Toc238461662"/>
       <w:r>
         <w:t>4.4 Tests</w:t>
       </w:r>
@@ -9456,7 +9564,7 @@
       <w:pPr>
         <w:pStyle w:val="Titre3"/>
       </w:pPr>
-      <w:bookmarkStart w:id="52" w:name="_Toc237795333"/>
+      <w:bookmarkStart w:id="52" w:name="_Toc238461663"/>
       <w:r>
         <w:t>4.4.1 Tests unitaires (JUnit 5 / Mockito)</w:t>
       </w:r>
@@ -9685,8 +9793,9 @@
       <w:pPr>
         <w:pStyle w:val="Titre3"/>
       </w:pPr>
-      <w:bookmarkStart w:id="53" w:name="_Toc237795334"/>
-      <w:r>
+      <w:bookmarkStart w:id="53" w:name="_Toc238461664"/>
+      <w:r>
+        <w:lastRenderedPageBreak/>
         <w:t>4.4.2 Tests fonctionnels manuels</w:t>
       </w:r>
       <w:bookmarkEnd w:id="53"/>
@@ -10569,7 +10678,14 @@
               <w:rPr>
                 <w:sz w:val="21"/>
               </w:rPr>
-              <w:t>Le dossier quitte la liste active sans rechargement et reste filtrable</w:t>
+              <w:t xml:space="preserve">Le dossier quitte la liste active sans rechargement et reste </w:t>
+            </w:r>
+            <w:r>
+              <w:rPr>
+                <w:sz w:val="21"/>
+              </w:rPr>
+              <w:lastRenderedPageBreak/>
+              <w:t>filtrable</w:t>
             </w:r>
           </w:p>
         </w:tc>
@@ -10587,6 +10703,7 @@
               <w:rPr>
                 <w:sz w:val="21"/>
               </w:rPr>
+              <w:lastRenderedPageBreak/>
               <w:t>OK</w:t>
             </w:r>
           </w:p>
@@ -10710,7 +10827,7 @@
       <w:pPr>
         <w:pStyle w:val="Titre3"/>
       </w:pPr>
-      <w:bookmarkStart w:id="54" w:name="_Toc237795335"/>
+      <w:bookmarkStart w:id="54" w:name="_Toc238461665"/>
       <w:r>
         <w:t>4.4.3 Tests des API avec Postman et Swagger</w:t>
       </w:r>
@@ -10725,7 +10842,7 @@
       <w:pPr>
         <w:pStyle w:val="Titre3"/>
       </w:pPr>
-      <w:bookmarkStart w:id="55" w:name="_Toc237795336"/>
+      <w:bookmarkStart w:id="55" w:name="_Toc238461666"/>
       <w:r>
         <w:t>4.4.4 Vérification de bout en bout</w:t>
       </w:r>
@@ -10740,7 +10857,7 @@
       <w:pPr>
         <w:pStyle w:val="Titre2"/>
       </w:pPr>
-      <w:bookmarkStart w:id="56" w:name="_Toc237795337"/>
+      <w:bookmarkStart w:id="56" w:name="_Toc238461667"/>
       <w:r>
         <w:t>4.5 Difficultés rencontrées et solutions apportées</w:t>
       </w:r>
@@ -10755,7 +10872,7 @@
       <w:pPr>
         <w:pStyle w:val="Titre3"/>
       </w:pPr>
-      <w:bookmarkStart w:id="57" w:name="_Toc237795338"/>
+      <w:bookmarkStart w:id="57" w:name="_Toc238461668"/>
       <w:r>
         <w:t>4.5.1 Notification incomplète des managers</w:t>
       </w:r>
@@ -10773,8 +10890,9 @@
       <w:pPr>
         <w:pStyle w:val="Titre3"/>
       </w:pPr>
-      <w:bookmarkStart w:id="58" w:name="_Toc237795339"/>
-      <w:r>
+      <w:bookmarkStart w:id="58" w:name="_Toc238461669"/>
+      <w:r>
+        <w:lastRenderedPageBreak/>
         <w:t>4.5.2 Distinguer un rejet RH d'un rejet manager</w:t>
       </w:r>
       <w:bookmarkEnd w:id="58"/>
@@ -10788,7 +10906,7 @@
       <w:pPr>
         <w:pStyle w:val="Titre3"/>
       </w:pPr>
-      <w:bookmarkStart w:id="59" w:name="_Toc237795340"/>
+      <w:bookmarkStart w:id="59" w:name="_Toc238461670"/>
       <w:r>
         <w:t>4.5.3 Cohérence des transitions de statut</w:t>
       </w:r>
@@ -10803,7 +10921,7 @@
       <w:pPr>
         <w:pStyle w:val="Titre3"/>
       </w:pPr>
-      <w:bookmarkStart w:id="60" w:name="_Toc237795341"/>
+      <w:bookmarkStart w:id="60" w:name="_Toc238461671"/>
       <w:r>
         <w:t>4.5.4 Filtrage incomplet des routes de lecture pour les managers</w:t>
       </w:r>
@@ -10818,7 +10936,7 @@
       <w:pPr>
         <w:pStyle w:val="Titre3"/>
       </w:pPr>
-      <w:bookmarkStart w:id="61" w:name="_Toc237795342"/>
+      <w:bookmarkStart w:id="61" w:name="_Toc238461672"/>
       <w:r>
         <w:t>4.5.5 Solliciter le manager au bon moment du processus</w:t>
       </w:r>
@@ -10836,7 +10954,7 @@
       <w:pPr>
         <w:pStyle w:val="Titre3"/>
       </w:pPr>
-      <w:bookmarkStart w:id="62" w:name="_Toc237795343"/>
+      <w:bookmarkStart w:id="62" w:name="_Toc238461673"/>
       <w:r>
         <w:t>4.5.6 Pertinence du matching Job idéal</w:t>
       </w:r>
@@ -10847,14 +10965,18 @@
         <w:jc w:val="both"/>
       </w:pPr>
       <w:r>
-        <w:t>La fonctionnalité de matching inverse, par laquelle un visiteur dépose son CV et le système lui suggère les offres les plus proches, retournait des résultats peu pertinents : un profil DevOps se voyait par exemple proposer des postes de développement backend. L'analyse a révélé deux causes : le score ne tenait compte que des compétences requises, en ignorant l'intitulé de l'offre, et le jeu de données comportait de nombreuses annonces en double qui saturaient le lot soumis à l'IA. J'ai corrigé les deux points en combinant, dans le score, l'intitulé de l'offre (pondéré à 60 %) et les compétences (40 %), et en dédupliquant les offres identiques avant l'appel à l'IA. Chaque profil (Java, DevOps, ProdOps, QA) ressort désormais sur les offres qui lui correspondent réellement.</w:t>
+        <w:t xml:space="preserve">La fonctionnalité de matching inverse, par laquelle un visiteur dépose son CV et le système lui suggère les offres les plus proches, retournait des résultats peu pertinents : un profil DevOps se voyait par exemple proposer des postes de développement backend. L'analyse a révélé deux causes : </w:t>
+      </w:r>
+      <w:r>
+        <w:lastRenderedPageBreak/>
+        <w:t>le score ne tenait compte que des compétences requises, en ignorant l'intitulé de l'offre, et le jeu de données comportait de nombreuses annonces en double qui saturaient le lot soumis à l'IA. J'ai corrigé les deux points en combinant, dans le score, l'intitulé de l'offre (pondéré à 60 %) et les compétences (40 %), et en dédupliquant les offres identiques avant l'appel à l'IA. Chaque profil (Java, DevOps, ProdOps, QA) ressort désormais sur les offres qui lui correspondent réellement.</w:t>
       </w:r>
     </w:p>
     <w:p>
       <w:pPr>
         <w:pStyle w:val="Titre3"/>
       </w:pPr>
-      <w:bookmarkStart w:id="63" w:name="_Toc237795344"/>
+      <w:bookmarkStart w:id="63" w:name="_Toc238461674"/>
       <w:r>
         <w:t>4.5.7 Traitement distinct des candidatures retirées</w:t>
       </w:r>
@@ -10878,7 +11000,7 @@
       <w:pPr>
         <w:pStyle w:val="Titre3"/>
       </w:pPr>
-      <w:bookmarkStart w:id="64" w:name="_Toc237795345"/>
+      <w:bookmarkStart w:id="64" w:name="_Toc238461675"/>
       <w:r>
         <w:t>4.5.8 Entretien téléphonique RH obligatoire avant acceptation</w:t>
       </w:r>
@@ -10896,7 +11018,7 @@
       <w:pPr>
         <w:pStyle w:val="Titre3"/>
       </w:pPr>
-      <w:bookmarkStart w:id="65" w:name="_Toc237795346"/>
+      <w:bookmarkStart w:id="65" w:name="_Toc238461676"/>
       <w:r>
         <w:t>4.5.9 Découplage entre planification d'entretien et statut du candidat</w:t>
       </w:r>
@@ -10912,17 +11034,39 @@
     </w:p>
     <w:p>
       <w:pPr>
+        <w:pStyle w:val="Titre3"/>
+      </w:pPr>
+      <w:bookmarkStart w:id="66" w:name="_Toc238461677"/>
+      <w:r>
+        <w:t>4.5.10 Fiabiliser l'intégration Google Meet et le format des webhooks n8n</w:t>
+      </w:r>
+      <w:bookmarkEnd w:id="66"/>
+    </w:p>
+    <w:p>
+      <w:r>
+        <w:t xml:space="preserve">Le lien Google Meet envoyé aux candidats et aux managers reposait initialement sur une valeur fictive, générée côté n8n sans appel réel à l'API Google Calendar - une limitation assumée à ce stade du développement. En remplaçant ce mécanisme par une véritable création d'événement Google Calendar (avec génération automatique du lien Meet), un problème plus ancien est remonté : le noeud Webhook de n8n imbrique le corps réel de la requête POST sous un champ body, alors que le workflow lisait les données à la racine. Ce défaut, antérieur à cette évolution, cassait silencieusement </w:t>
+      </w:r>
+      <w:r>
+        <w:lastRenderedPageBreak/>
+        <w:t>à la fois le routage de l'agent d'entretien et, potentiellement, celui de l'agent de décision finale. Je l'ai corrigé aux trois endroits concernés, puis validé le nouveau flux de bout en bout : création réelle de l'événement, ajout des participants, envoi de l'e-mail de convocation, et sauvegarde du lien via un point d'API dédié. Pour que cet appel à n8n reste fiable même en cas d'indisponibilité passagère, le backend s'appuie sur une file d'attente interne (outbox) : chaque déclenchement est journalisé, puis retenté automatiquement à intervalles croissants en cas d'échec, jusqu'à un nombre de tentatives limité, ce qui évite de perdre un événement sans pour autant bloquer la requête initiale.</w:t>
+      </w:r>
+    </w:p>
+    <w:p>
+      <w:pPr>
         <w:pStyle w:val="Titre2"/>
       </w:pPr>
-      <w:bookmarkStart w:id="66" w:name="_Toc237795347"/>
+      <w:bookmarkStart w:id="67" w:name="_Toc238461678"/>
       <w:r>
         <w:t>4.6 Protection des données et éthique de l'IA</w:t>
       </w:r>
-      <w:bookmarkEnd w:id="66"/>
-    </w:p>
-    <w:p>
-      <w:r>
-        <w:t>La plateforme manipule des données à caractère personnel : identité, coordonnées, CV et évaluations des candidats. Plusieurs principes ont guidé leur traitement. L'accès aux dossiers est strictement contrôlé selon le rôle de l'utilisateur, comme détaillé au tableau de la section 2.2.1 : un manager ne voit que les candidatures de son périmètre, seuls RH et Administrateur disposant d'une vue d'ensemble. Les mots de passe sont hachés (section 4.2.4), et chaque action sensible sur un dossier candidat est journalisée dans le journal d'audit avec l'identité de son auteur et un horodatage — de quoi retracer qui a consulté ou modifié un dossier donné.</w:t>
+      <w:bookmarkEnd w:id="67"/>
+    </w:p>
+    <w:p>
+      <w:r>
+        <w:t xml:space="preserve">La plateforme manipule des données à caractère personnel : identité, coordonnées, CV et évaluations des candidats. Plusieurs principes ont guidé leur traitement. L'accès aux dossiers est strictement contrôlé selon le rôle de l'utilisateur, comme détaillé au tableau de la section 2.2.1 : un manager ne voit que les candidatures de son périmètre, seuls RH et Administrateur disposant d'une vue d'ensemble. Les mots de passe sont hachés (section 4.2.4), et chaque action sensible sur un dossier candidat est journalisée dans le journal d'audit avec l'identité de son auteur et un horodatage — </w:t>
+      </w:r>
+      <w:r>
+        <w:t>de quoi retracer qui a consulté ou modifié un dossier donné. Plusieurs protections techniques complètent ce socle : une limitation du nombre de tentatives de connexion pour freiner les attaques par force brute, une validation du contenu réel de chaque fichier déposé (au-delà de la simple extension déclarée) pour bloquer un upload malveillant, et un garde-fou contre les redirections internes non autorisées sur le point d'API utilisé pour tester la connectivité des webhooks n8n.</w:t>
       </w:r>
     </w:p>
     <w:p>
@@ -10948,11 +11092,11 @@
       <w:pPr>
         <w:pStyle w:val="Titre2"/>
       </w:pPr>
-      <w:bookmarkStart w:id="67" w:name="_Toc237795348"/>
+      <w:bookmarkStart w:id="68" w:name="_Toc238461679"/>
       <w:r>
         <w:t>4.7 Bilan des fonctionnalités réalisées</w:t>
       </w:r>
-      <w:bookmarkEnd w:id="67"/>
+      <w:bookmarkEnd w:id="68"/>
     </w:p>
     <w:p>
       <w:r>
@@ -10972,6 +11116,7 @@
           <w:i/>
           <w:sz w:val="21"/>
         </w:rPr>
+        <w:lastRenderedPageBreak/>
         <w:t>Tableau 4.2 : Bilan des fonctionnalités réalisées</w:t>
       </w:r>
     </w:p>
@@ -11210,7 +11355,7 @@
               <w:rPr>
                 <w:sz w:val="21"/>
               </w:rPr>
-              <w:t>Gestion des entretiens (planification, statuts, rappels)</w:t>
+              <w:t>Gestion des entretiens (planification, statuts, rappels, lien Google Meet réel généré automatiquement)</w:t>
             </w:r>
           </w:p>
         </w:tc>
@@ -11587,11 +11732,11 @@
       <w:pPr>
         <w:pStyle w:val="Titre2"/>
       </w:pPr>
-      <w:bookmarkStart w:id="68" w:name="_Toc237795349"/>
+      <w:bookmarkStart w:id="69" w:name="_Toc238461680"/>
       <w:r>
         <w:t>4.8 Conclusion</w:t>
       </w:r>
-      <w:bookmarkEnd w:id="68"/>
+      <w:bookmarkEnd w:id="69"/>
     </w:p>
     <w:p>
       <w:r>
@@ -11611,11 +11756,11 @@
         <w:pStyle w:val="Titre1"/>
         <w:jc w:val="center"/>
       </w:pPr>
-      <w:bookmarkStart w:id="69" w:name="_Toc237795350"/>
+      <w:bookmarkStart w:id="70" w:name="_Toc238461681"/>
       <w:r>
         <w:t>Conclusion Générale et Perspectives</w:t>
       </w:r>
-      <w:bookmarkEnd w:id="69"/>
+      <w:bookmarkEnd w:id="70"/>
     </w:p>
     <w:p>
       <w:r>
@@ -11659,11 +11804,11 @@
       <w:pPr>
         <w:pStyle w:val="Titre1"/>
       </w:pPr>
-      <w:bookmarkStart w:id="70" w:name="_Toc237795351"/>
+      <w:bookmarkStart w:id="71" w:name="_Toc238461682"/>
       <w:r>
         <w:t>Bibliographie</w:t>
       </w:r>
-      <w:bookmarkEnd w:id="70"/>
+      <w:bookmarkEnd w:id="71"/>
     </w:p>
     <w:p>
       <w:pPr>
@@ -11887,11 +12032,11 @@
       <w:pPr>
         <w:pStyle w:val="Titre1"/>
       </w:pPr>
-      <w:bookmarkStart w:id="71" w:name="_Toc237795352"/>
+      <w:bookmarkStart w:id="72" w:name="_Toc238461683"/>
       <w:r>
         <w:t>Glossaire</w:t>
       </w:r>
-      <w:bookmarkEnd w:id="71"/>
+      <w:bookmarkEnd w:id="72"/>
     </w:p>
     <w:p>
       <w:pPr>
@@ -12204,6 +12349,36 @@
     <w:pPr>
       <w:pStyle w:val="En-tte"/>
     </w:pPr>
+  </w:p>
+</w:hdr>
+</file>
+
+<file path=word/header2.xml><?xml version="1.0" encoding="utf-8"?>
+<w:hdr xmlns:wpc="http://schemas.microsoft.com/office/word/2010/wordprocessingCanvas" xmlns:cx="http://schemas.microsoft.com/office/drawing/2014/chartex" xmlns:cx1="http://schemas.microsoft.com/office/drawing/2015/9/8/chartex" xmlns:cx2="http://schemas.microsoft.com/office/drawing/2015/10/21/chartex" xmlns:cx3="http://schemas.microsoft.com/office/drawing/2016/5/9/chartex" xmlns:cx4="http://schemas.microsoft.com/office/drawing/2016/5/10/chartex" xmlns:cx5="http://schemas.microsoft.com/office/drawing/2016/5/11/chartex" xmlns:cx6="http://schemas.microsoft.com/office/drawing/2016/5/12/chartex" xmlns:cx7="http://schemas.microsoft.com/office/drawing/2016/5/13/chartex" xmlns:cx8="http://schemas.microsoft.com/office/drawing/2016/5/14/chartex" xmlns:mc="http://schemas.openxmlformats.org/markup-compatibility/2006" xmlns:aink="http://schemas.microsoft.com/office/drawing/2016/ink" xmlns:am3d="http://schemas.microsoft.com/office/drawing/2017/model3d" xmlns:o="urn:schemas-microsoft-com:office:office" xmlns:oel="http://schemas.microsoft.com/office/2019/extlst" xmlns:r="http://schemas.openxmlformats.org/officeDocument/2006/relationships" xmlns:m="http://schemas.openxmlformats.org/officeDocument/2006/math" xmlns:v="urn:schemas-microsoft-com:vml" xmlns:wp14="http://schemas.microsoft.com/office/word/2010/wordprocessingDrawing" xmlns:wp="http://schemas.openxmlformats.org/drawingml/2006/wordprocessingDrawing" xmlns:w10="urn:schemas-microsoft-com:office:word" xmlns:w="http://schemas.openxmlformats.org/wordprocessingml/2006/main" xmlns:w14="http://schemas.microsoft.com/office/word/2010/wordml" xmlns:w15="http://schemas.microsoft.com/office/word/2012/wordml" xmlns:w16cei="http://schemas.microsoft.com/office/word/2026/wordml/cei" xmlns:w16cex="http://schemas.microsoft.com/office/word/2018/wordml/cex" xmlns:w16cid="http://schemas.microsoft.com/office/word/2016/wordml/cid" xmlns:w16="http://schemas.microsoft.com/office/word/2018/wordml" xmlns:w16du="http://schemas.microsoft.com/office/word/2023/wordml/word16du" xmlns:w16sdtdh="http://schemas.microsoft.com/office/word/2020/wordml/sdtdatahash" xmlns:w16sdtfl="http://schemas.microsoft.com/office/word/2024/wordml/sdtformatlock" xmlns:w16se="http://schemas.microsoft.com/office/word/2015/wordml/symex" xmlns:wpg="http://schemas.microsoft.com/office/word/2010/wordprocessingGroup" xmlns:wpi="http://schemas.microsoft.com/office/word/2010/wordprocessingInk" xmlns:wne="http://schemas.microsoft.com/office/word/2006/wordml" xmlns:wps="http://schemas.microsoft.com/office/word/2010/wordprocessingShape" mc:Ignorable="w14 w15 w16se w16cid w16 w16cex w16sdtdh w16sdtfl w16du wp14">
+  <w:p>
+    <w:pPr>
+      <w:pStyle w:val="En-tte"/>
+    </w:pPr>
+  </w:p>
+</w:hdr>
+</file>
+
+<file path=word/header3.xml><?xml version="1.0" encoding="utf-8"?>
+<w:hdr xmlns:wpc="http://schemas.microsoft.com/office/word/2010/wordprocessingCanvas" xmlns:cx="http://schemas.microsoft.com/office/drawing/2014/chartex" xmlns:cx1="http://schemas.microsoft.com/office/drawing/2015/9/8/chartex" xmlns:cx2="http://schemas.microsoft.com/office/drawing/2015/10/21/chartex" xmlns:cx3="http://schemas.microsoft.com/office/drawing/2016/5/9/chartex" xmlns:cx4="http://schemas.microsoft.com/office/drawing/2016/5/10/chartex" xmlns:cx5="http://schemas.microsoft.com/office/drawing/2016/5/11/chartex" xmlns:cx6="http://schemas.microsoft.com/office/drawing/2016/5/12/chartex" xmlns:cx7="http://schemas.microsoft.com/office/drawing/2016/5/13/chartex" xmlns:cx8="http://schemas.microsoft.com/office/drawing/2016/5/14/chartex" xmlns:mc="http://schemas.openxmlformats.org/markup-compatibility/2006" xmlns:aink="http://schemas.microsoft.com/office/drawing/2016/ink" xmlns:am3d="http://schemas.microsoft.com/office/drawing/2017/model3d" xmlns:o="urn:schemas-microsoft-com:office:office" xmlns:oel="http://schemas.microsoft.com/office/2019/extlst" xmlns:r="http://schemas.openxmlformats.org/officeDocument/2006/relationships" xmlns:m="http://schemas.openxmlformats.org/officeDocument/2006/math" xmlns:v="urn:schemas-microsoft-com:vml" xmlns:wp14="http://schemas.microsoft.com/office/word/2010/wordprocessingDrawing" xmlns:wp="http://schemas.openxmlformats.org/drawingml/2006/wordprocessingDrawing" xmlns:w10="urn:schemas-microsoft-com:office:word" xmlns:w="http://schemas.openxmlformats.org/wordprocessingml/2006/main" xmlns:w14="http://schemas.microsoft.com/office/word/2010/wordml" xmlns:w15="http://schemas.microsoft.com/office/word/2012/wordml" xmlns:w16cei="http://schemas.microsoft.com/office/word/2026/wordml/cei" xmlns:w16cex="http://schemas.microsoft.com/office/word/2018/wordml/cex" xmlns:w16cid="http://schemas.microsoft.com/office/word/2016/wordml/cid" xmlns:w16="http://schemas.microsoft.com/office/word/2018/wordml" xmlns:w16du="http://schemas.microsoft.com/office/word/2023/wordml/word16du" xmlns:w16sdtdh="http://schemas.microsoft.com/office/word/2020/wordml/sdtdatahash" xmlns:w16sdtfl="http://schemas.microsoft.com/office/word/2024/wordml/sdtformatlock" xmlns:w16se="http://schemas.microsoft.com/office/word/2015/wordml/symex" xmlns:wpg="http://schemas.microsoft.com/office/word/2010/wordprocessingGroup" xmlns:wpi="http://schemas.microsoft.com/office/word/2010/wordprocessingInk" xmlns:wne="http://schemas.microsoft.com/office/word/2006/wordml" xmlns:wps="http://schemas.microsoft.com/office/word/2010/wordprocessingShape" mc:Ignorable="w14 w15 w16se w16cid w16 w16cex w16sdtdh w16sdtfl w16du wp14">
+  <w:p>
+    <w:pPr>
+      <w:pStyle w:val="En-tte"/>
+    </w:pPr>
+  </w:p>
+</w:hdr>
+</file>
+
+<file path=word/header4.xml><?xml version="1.0" encoding="utf-8"?>
+<w:hdr xmlns:wpc="http://schemas.microsoft.com/office/word/2010/wordprocessingCanvas" xmlns:cx="http://schemas.microsoft.com/office/drawing/2014/chartex" xmlns:cx1="http://schemas.microsoft.com/office/drawing/2015/9/8/chartex" xmlns:cx2="http://schemas.microsoft.com/office/drawing/2015/10/21/chartex" xmlns:cx3="http://schemas.microsoft.com/office/drawing/2016/5/9/chartex" xmlns:cx4="http://schemas.microsoft.com/office/drawing/2016/5/10/chartex" xmlns:cx5="http://schemas.microsoft.com/office/drawing/2016/5/11/chartex" xmlns:cx6="http://schemas.microsoft.com/office/drawing/2016/5/12/chartex" xmlns:cx7="http://schemas.microsoft.com/office/drawing/2016/5/13/chartex" xmlns:cx8="http://schemas.microsoft.com/office/drawing/2016/5/14/chartex" xmlns:mc="http://schemas.openxmlformats.org/markup-compatibility/2006" xmlns:aink="http://schemas.microsoft.com/office/drawing/2016/ink" xmlns:am3d="http://schemas.microsoft.com/office/drawing/2017/model3d" xmlns:o="urn:schemas-microsoft-com:office:office" xmlns:oel="http://schemas.microsoft.com/office/2019/extlst" xmlns:r="http://schemas.openxmlformats.org/officeDocument/2006/relationships" xmlns:m="http://schemas.openxmlformats.org/officeDocument/2006/math" xmlns:v="urn:schemas-microsoft-com:vml" xmlns:wp14="http://schemas.microsoft.com/office/word/2010/wordprocessingDrawing" xmlns:wp="http://schemas.openxmlformats.org/drawingml/2006/wordprocessingDrawing" xmlns:w10="urn:schemas-microsoft-com:office:word" xmlns:w="http://schemas.openxmlformats.org/wordprocessingml/2006/main" xmlns:w14="http://schemas.microsoft.com/office/word/2010/wordml" xmlns:w15="http://schemas.microsoft.com/office/word/2012/wordml" xmlns:w16cei="http://schemas.microsoft.com/office/word/2026/wordml/cei" xmlns:w16cex="http://schemas.microsoft.com/office/word/2018/wordml/cex" xmlns:w16cid="http://schemas.microsoft.com/office/word/2016/wordml/cid" xmlns:w16="http://schemas.microsoft.com/office/word/2018/wordml" xmlns:w16du="http://schemas.microsoft.com/office/word/2023/wordml/word16du" xmlns:w16sdtdh="http://schemas.microsoft.com/office/word/2020/wordml/sdtdatahash" xmlns:w16sdtfl="http://schemas.microsoft.com/office/word/2024/wordml/sdtformatlock" xmlns:w16se="http://schemas.microsoft.com/office/word/2015/wordml/symex" xmlns:wpg="http://schemas.microsoft.com/office/word/2010/wordprocessingGroup" xmlns:wpi="http://schemas.microsoft.com/office/word/2010/wordprocessingInk" xmlns:wne="http://schemas.microsoft.com/office/word/2006/wordml" xmlns:wps="http://schemas.microsoft.com/office/word/2010/wordprocessingShape" mc:Ignorable="w14 w15 w16se w16cid w16 w16cex w16sdtdh w16sdtfl w16du wp14">
+  <w:p>
+    <w:pPr>
+      <w:pStyle w:val="En-tte"/>
+    </w:pPr>
     <w:r>
       <w:rPr>
         <w:noProof/>
@@ -12248,7 +12423,7 @@
 </w:hdr>
 </file>
 
-<file path=word/header2.xml><?xml version="1.0" encoding="utf-8"?>
+<file path=word/header5.xml><?xml version="1.0" encoding="utf-8"?>
 <w:hdr xmlns:wpc="http://schemas.microsoft.com/office/word/2010/wordprocessingCanvas" xmlns:cx="http://schemas.microsoft.com/office/drawing/2014/chartex" xmlns:cx1="http://schemas.microsoft.com/office/drawing/2015/9/8/chartex" xmlns:cx2="http://schemas.microsoft.com/office/drawing/2015/10/21/chartex" xmlns:cx3="http://schemas.microsoft.com/office/drawing/2016/5/9/chartex" xmlns:cx4="http://schemas.microsoft.com/office/drawing/2016/5/10/chartex" xmlns:cx5="http://schemas.microsoft.com/office/drawing/2016/5/11/chartex" xmlns:cx6="http://schemas.microsoft.com/office/drawing/2016/5/12/chartex" xmlns:cx7="http://schemas.microsoft.com/office/drawing/2016/5/13/chartex" xmlns:cx8="http://schemas.microsoft.com/office/drawing/2016/5/14/chartex" xmlns:mc="http://schemas.openxmlformats.org/markup-compatibility/2006" xmlns:aink="http://schemas.microsoft.com/office/drawing/2016/ink" xmlns:am3d="http://schemas.microsoft.com/office/drawing/2017/model3d" xmlns:o="urn:schemas-microsoft-com:office:office" xmlns:oel="http://schemas.microsoft.com/office/2019/extlst" xmlns:r="http://schemas.openxmlformats.org/officeDocument/2006/relationships" xmlns:m="http://schemas.openxmlformats.org/officeDocument/2006/math" xmlns:v="urn:schemas-microsoft-com:vml" xmlns:wp14="http://schemas.microsoft.com/office/word/2010/wordprocessingDrawing" xmlns:wp="http://schemas.openxmlformats.org/drawingml/2006/wordprocessingDrawing" xmlns:w10="urn:schemas-microsoft-com:office:word" xmlns:w="http://schemas.openxmlformats.org/wordprocessingml/2006/main" xmlns:w14="http://schemas.microsoft.com/office/word/2010/wordml" xmlns:w15="http://schemas.microsoft.com/office/word/2012/wordml" xmlns:w16cei="http://schemas.microsoft.com/office/word/2026/wordml/cei" xmlns:w16cex="http://schemas.microsoft.com/office/word/2018/wordml/cex" xmlns:w16cid="http://schemas.microsoft.com/office/word/2016/wordml/cid" xmlns:w16="http://schemas.microsoft.com/office/word/2018/wordml" xmlns:w16du="http://schemas.microsoft.com/office/word/2023/wordml/word16du" xmlns:w16sdtdh="http://schemas.microsoft.com/office/word/2020/wordml/sdtdatahash" xmlns:w16sdtfl="http://schemas.microsoft.com/office/word/2024/wordml/sdtformatlock" xmlns:w16se="http://schemas.microsoft.com/office/word/2015/wordml/symex" xmlns:wpg="http://schemas.microsoft.com/office/word/2010/wordprocessingGroup" xmlns:wpi="http://schemas.microsoft.com/office/word/2010/wordprocessingInk" xmlns:wne="http://schemas.microsoft.com/office/word/2006/wordml" xmlns:wps="http://schemas.microsoft.com/office/word/2010/wordprocessingShape" mc:Ignorable="w14 w15 w16se w16cid w16 w16cex w16sdtdh w16sdtfl w16du wp14">
   <w:p>
     <w:pPr>
@@ -12298,7 +12473,7 @@
 </w:hdr>
 </file>
 
-<file path=word/header3.xml><?xml version="1.0" encoding="utf-8"?>
+<file path=word/header6.xml><?xml version="1.0" encoding="utf-8"?>
 <w:hdr xmlns:wpc="http://schemas.microsoft.com/office/word/2010/wordprocessingCanvas" xmlns:cx="http://schemas.microsoft.com/office/drawing/2014/chartex" xmlns:cx1="http://schemas.microsoft.com/office/drawing/2015/9/8/chartex" xmlns:cx2="http://schemas.microsoft.com/office/drawing/2015/10/21/chartex" xmlns:cx3="http://schemas.microsoft.com/office/drawing/2016/5/9/chartex" xmlns:cx4="http://schemas.microsoft.com/office/drawing/2016/5/10/chartex" xmlns:cx5="http://schemas.microsoft.com/office/drawing/2016/5/11/chartex" xmlns:cx6="http://schemas.microsoft.com/office/drawing/2016/5/12/chartex" xmlns:cx7="http://schemas.microsoft.com/office/drawing/2016/5/13/chartex" xmlns:cx8="http://schemas.microsoft.com/office/drawing/2016/5/14/chartex" xmlns:mc="http://schemas.openxmlformats.org/markup-compatibility/2006" xmlns:aink="http://schemas.microsoft.com/office/drawing/2016/ink" xmlns:am3d="http://schemas.microsoft.com/office/drawing/2017/model3d" xmlns:o="urn:schemas-microsoft-com:office:office" xmlns:oel="http://schemas.microsoft.com/office/2019/extlst" xmlns:r="http://schemas.openxmlformats.org/officeDocument/2006/relationships" xmlns:m="http://schemas.openxmlformats.org/officeDocument/2006/math" xmlns:v="urn:schemas-microsoft-com:vml" xmlns:wp14="http://schemas.microsoft.com/office/word/2010/wordprocessingDrawing" xmlns:wp="http://schemas.openxmlformats.org/drawingml/2006/wordprocessingDrawing" xmlns:w10="urn:schemas-microsoft-com:office:word" xmlns:w="http://schemas.openxmlformats.org/wordprocessingml/2006/main" xmlns:w14="http://schemas.microsoft.com/office/word/2010/wordml" xmlns:w15="http://schemas.microsoft.com/office/word/2012/wordml" xmlns:w16cei="http://schemas.microsoft.com/office/word/2026/wordml/cei" xmlns:w16cex="http://schemas.microsoft.com/office/word/2018/wordml/cex" xmlns:w16cid="http://schemas.microsoft.com/office/word/2016/wordml/cid" xmlns:w16="http://schemas.microsoft.com/office/word/2018/wordml" xmlns:w16du="http://schemas.microsoft.com/office/word/2023/wordml/word16du" xmlns:w16sdtdh="http://schemas.microsoft.com/office/word/2020/wordml/sdtdatahash" xmlns:w16sdtfl="http://schemas.microsoft.com/office/word/2024/wordml/sdtformatlock" xmlns:w16se="http://schemas.microsoft.com/office/word/2015/wordml/symex" xmlns:wpg="http://schemas.microsoft.com/office/word/2010/wordprocessingGroup" xmlns:wpi="http://schemas.microsoft.com/office/word/2010/wordprocessingInk" xmlns:wne="http://schemas.microsoft.com/office/word/2006/wordml" xmlns:wps="http://schemas.microsoft.com/office/word/2010/wordprocessingShape" mc:Ignorable="w14 w15 w16se w16cid w16 w16cex w16sdtdh w16sdtfl w16du wp14">
   <w:p>
     <w:pPr>

</xml_diff>

<commit_message>
feat: assistant conversationnel candidat (chatbot IA via OpenRouter)
Ajoute un chatbot pour les candidats connectes : repond en langage
naturel sur le suivi de leurs propres candidatures (statut, entretiens,
feedback envoye) et sur le fonctionnement general de la plateforme
(offres, Job ideal, retrait de candidature), via le modele stealth/ox-alpha
sur OpenRouter. Le contexte transmis au modele exclut structurellement
les champs internes (score IA, notes RH, identite de l'intervieweur),
et le prompt systeme resiste aux tentatives d'injection - valide par
des tests manuels de bout en bout (backend + widget flottant Angular).

Met egalement a jour le rapport PFE (chapitre Realisation) pour
documenter cette nouvelle fonctionnalite.

Co-Authored-By: Claude Sonnet 5 <noreply@anthropic.com>
</commit_message>
<xml_diff>
--- a/Rapport-PFE/Rapport_PFE_Bargaoui_Haythem.docx
+++ b/Rapport-PFE/Rapport_PFE_Bargaoui_Haythem.docx
@@ -9022,6 +9022,10 @@
       <w:r>
         <w:t>Automatisation et IA : n8n (agents d'automatisation par webhooks), API Cohere (scoring IA des CV).</w:t>
       </w:r>
+      <w:r>
+        <w:rPr/>
+        <w:t xml:space="preserve"> Assistant conversationnel candidat : API OpenRouter (modèle stealth/ox-alpha, format compatible OpenAI).</w:t>
+      </w:r>
     </w:p>
     <w:p>
       <w:pPr>
@@ -9548,6 +9552,24 @@
     <w:p>
       <w:r>
         <w:t>J'ai aussi donné à chaque manager une page « Mon calendrier », en lecture seule, qui regroupe ses entretiens du mois et ses trois prochains rendez-vous ; les données y sont filtrées côté serveur selon son département, sa famille de métier ou son affectation directe, le même cloisonnement que pour la liste des dossiers candidats.</w:t>
+      </w:r>
+    </w:p>
+    <w:p>
+      <w:pPr/>
+    </w:p>
+    <w:p>
+      <w:pPr/>
+      <w:r>
+        <w:t>Figure 4.12 : Assistant conversationnel candidat (chatbot)</w:t>
+      </w:r>
+    </w:p>
+    <w:p>
+      <w:pPr/>
+    </w:p>
+    <w:p>
+      <w:pPr/>
+      <w:r>
+        <w:t>Disponible uniquement pour un candidat authentifié, ce widget flottant permet de poser des questions en langage naturel sur le suivi de ses propres candidatures ou sur le fonctionnement général de la plateforme (offres, Job idéal, retrait de candidature, etc.). Les réponses sont générées par un modèle de raisonnement (stealth/ox-alpha, via l'API OpenRouter) à partir d'un contexte constitué uniquement des données réelles du candidat connecté ; les champs internes (score IA, notes RH, identité de l'intervieweur) sont explicitement exclus de ce contexte et ne peuvent donc pas être révélés, y compris face à une tentative d'injection de prompt.</w:t>
       </w:r>
     </w:p>
     <w:p>
@@ -10821,6 +10843,134 @@
           </w:p>
         </w:tc>
       </w:tr>
+      <w:tr>
+        <w:tc>
+          <w:tcPr>
+            <w:tcW w:type="dxa" w:w="3070"/>
+          </w:tcPr>
+          <w:p>
+            <w:r>
+              <w:t>Question du chatbot sur le statut réel d'une candidature</w:t>
+            </w:r>
+          </w:p>
+        </w:tc>
+        <w:tc>
+          <w:tcPr>
+            <w:tcW w:type="dxa" w:w="3069"/>
+          </w:tcPr>
+          <w:p>
+            <w:r>
+              <w:t>Réponse conforme aux données réelles en base, sans invention</w:t>
+            </w:r>
+          </w:p>
+        </w:tc>
+        <w:tc>
+          <w:tcPr>
+            <w:tcW w:type="dxa" w:w="3067"/>
+          </w:tcPr>
+          <w:p>
+            <w:r>
+              <w:t>OK</w:t>
+            </w:r>
+          </w:p>
+        </w:tc>
+      </w:tr>
+      <w:tr>
+        <w:tc>
+          <w:tcPr>
+            <w:tcW w:type="dxa" w:w="3070"/>
+          </w:tcPr>
+          <w:p>
+            <w:r>
+              <w:t>Demande du score IA ou de l'identité de l'intervieweur au chatbot</w:t>
+            </w:r>
+          </w:p>
+        </w:tc>
+        <w:tc>
+          <w:tcPr>
+            <w:tcW w:type="dxa" w:w="3069"/>
+          </w:tcPr>
+          <w:p>
+            <w:r>
+              <w:t>Refus poli, aucune donnée interne révélée</w:t>
+            </w:r>
+          </w:p>
+        </w:tc>
+        <w:tc>
+          <w:tcPr>
+            <w:tcW w:type="dxa" w:w="3067"/>
+          </w:tcPr>
+          <w:p>
+            <w:r>
+              <w:t>OK</w:t>
+            </w:r>
+          </w:p>
+        </w:tc>
+      </w:tr>
+      <w:tr>
+        <w:tc>
+          <w:tcPr>
+            <w:tcW w:type="dxa" w:w="3070"/>
+          </w:tcPr>
+          <w:p>
+            <w:r>
+              <w:t>Tentative d'injection de prompt sur le chatbot (« ignore tes instructions... »)</w:t>
+            </w:r>
+          </w:p>
+        </w:tc>
+        <w:tc>
+          <w:tcPr>
+            <w:tcW w:type="dxa" w:w="3069"/>
+          </w:tcPr>
+          <w:p>
+            <w:r>
+              <w:t>Le contexte système n'est pas divulgué, le rôle de l'assistant est conservé</w:t>
+            </w:r>
+          </w:p>
+        </w:tc>
+        <w:tc>
+          <w:tcPr>
+            <w:tcW w:type="dxa" w:w="3067"/>
+          </w:tcPr>
+          <w:p>
+            <w:r>
+              <w:t>OK</w:t>
+            </w:r>
+          </w:p>
+        </w:tc>
+      </w:tr>
+      <w:tr>
+        <w:tc>
+          <w:tcPr>
+            <w:tcW w:type="dxa" w:w="3070"/>
+          </w:tcPr>
+          <w:p>
+            <w:r>
+              <w:t>Appel du point d'entrée du chatbot sans jeton JWT</w:t>
+            </w:r>
+          </w:p>
+        </w:tc>
+        <w:tc>
+          <w:tcPr>
+            <w:tcW w:type="dxa" w:w="3069"/>
+          </w:tcPr>
+          <w:p>
+            <w:r>
+              <w:t>Erreur 401, accès refusé</w:t>
+            </w:r>
+          </w:p>
+        </w:tc>
+        <w:tc>
+          <w:tcPr>
+            <w:tcW w:type="dxa" w:w="3067"/>
+          </w:tcPr>
+          <w:p>
+            <w:r>
+              <w:t>OK</w:t>
+            </w:r>
+          </w:p>
+        </w:tc>
+      </w:tr>
     </w:tbl>
     <w:p/>
     <w:p>
@@ -11053,6 +11203,20 @@
     </w:p>
     <w:p>
       <w:pPr>
+        <w:pStyle w:val="Titre3"/>
+      </w:pPr>
+      <w:r>
+        <w:t>4.5.11 Cloisonnement des données dans le chatbot candidat</w:t>
+      </w:r>
+    </w:p>
+    <w:p>
+      <w:pPr/>
+      <w:r>
+        <w:t>L'ajout d'un assistant conversationnel candidat posait un risque spécifique : un modèle de langage peut, si on le laisse faire, être incité par un utilisateur malveillant à révéler des informations qu'il ne devrait pas partager, y compris celles qu'on lui a explicitement fournies en contexte. J'ai donc construit le contexte transmis au modèle en excluant dès la source, avant même l'appel à l'IA, le score et le résumé générés par l'agent de scoring, la correction manuelle du RH, l'identité de l'intervieweur et les notes internes d'entretien — ces champs ne quittent jamais le backend vers le prompt. Le message système impose en complément au modèle de ne répondre qu'à partir de ce contexte filtré, d'ignorer toute instruction contraire glissée dans la question du candidat, et de ne jamais reproduire ce contexte mot pour mot. Ces deux niveaux de protection — filtrage des données à la source, puis consignes du prompt système — ont été validés par des tests manuels explicites : demande directe du score, de l'identité de l'intervieweur, et tentative d'injection de prompt (« ignore tes instructions précédentes... ») ; dans les trois cas, l'assistant refuse poliment sans jamais divulguer l'information protégée.</w:t>
+      </w:r>
+    </w:p>
+    <w:p>
+      <w:pPr>
         <w:pStyle w:val="Titre2"/>
       </w:pPr>
       <w:bookmarkStart w:id="67" w:name="_Toc238461678"/>
@@ -11086,6 +11250,12 @@
       </w:r>
       <w:r>
         <w:t>Ces limites justifient le maintien systématique d'une validation humaine et d'une traçabilité complète des décisions prises. La conception du processus de recrutement doit aussi tenir compte des principes de diversité et d'inclusion, afin de limiter les risques de discrimination dans des processus de sélection automatisés [14]. Par ailleurs, les captures d'écran présentées dans ce rapport (section 4.3) utilisent des données de test fictives ou anonymisées, à l'exception de quelques comptes de démonstration que j'ai moi-même créés à des fins de test.</w:t>
+      </w:r>
+    </w:p>
+    <w:p>
+      <w:pPr/>
+      <w:r>
+        <w:t>Le chatbot candidat introduit en fin de projet (section 4.5.11) applique les mêmes principes : il ne s'appuie que sur les données de candidature du candidat connecté, dérivées côté serveur à partir du jeton JWT plutôt que d'un identifiant transmis par le client, et exclut structurellement les champs à usage interne (score IA, notes RH, identité de l'intervieweur) du contexte envoyé au modèle de langage.</w:t>
       </w:r>
     </w:p>
     <w:p>
@@ -11721,6 +11891,28 @@
               <w:rPr>
                 <w:sz w:val="21"/>
               </w:rPr>
+              <w:t>Réalisée</w:t>
+            </w:r>
+          </w:p>
+        </w:tc>
+      </w:tr>
+      <w:tr>
+        <w:tc>
+          <w:tcPr>
+            <w:tcW w:type="dxa" w:w="4603"/>
+          </w:tcPr>
+          <w:p>
+            <w:r>
+              <w:t>Assistant conversationnel candidat (chatbot IA via OpenRouter, connaissance des candidatures réelles et de la plateforme)</w:t>
+            </w:r>
+          </w:p>
+        </w:tc>
+        <w:tc>
+          <w:tcPr>
+            <w:tcW w:type="dxa" w:w="4603"/>
+          </w:tcPr>
+          <w:p>
+            <w:r>
               <w:t>Réalisée</w:t>
             </w:r>
           </w:p>

</xml_diff>

<commit_message>
docs: ajouter 2 diagrammes de sequence objet (analyse IA du CV, routage manager)
Ajoute en 3.4.3/3.4.4 deux diagrammes de sequence objet manquants,
generes avec PlantUML (meme style visuel que les diagrammes existants)
et derives du code source reel : N8nService.triggerAgent1CvParser,
CandidateController/saveAiScore pour l'analyse IA du CV via n8n et
Cohere ; ManagerRoutingService.resolveManagerEmails (departement ->
famille de metier -> repli manuel) pour le routage et la notification
des managers a l'entree en evaluation technique.

Renumerote en consequence les figures 3.5-3.8 (-> 3.7-3.10) et met a
jour la Table des matieres, la Liste des figures et la Liste des
tableaux avec les vraies pages calculees via Word (les deux diagrammes
deja existants, Planifier un entretien et Decision finale, ont ete
verifies : ils couvrent deja n8n/Google Meet/audit, pas d'enrichissement
necessaire).

Co-Authored-By: Claude Sonnet 5 <noreply@anthropic.com>
</commit_message>
<xml_diff>
--- a/Rapport-PFE/Rapport_PFE_Bargaoui_Haythem.docx
+++ b/Rapport-PFE/Rapport_PFE_Bargaoui_Haythem.docx
@@ -520,9 +520,6 @@
           <w:szCs w:val="24"/>
         </w:rPr>
         <w:sectPr>
-          <w:headerReference w:type="even" r:id="rId10"/>
-          <w:headerReference w:type="default" r:id="rId11"/>
-          <w:headerReference w:type="first" r:id="rId12"/>
           <w:pgSz w:w="11906" w:h="16838"/>
           <w:pgMar w:top="426" w:right="720" w:bottom="720" w:left="720" w:header="708" w:footer="708" w:gutter="0"/>
           <w:cols w:space="708"/>
@@ -808,7 +805,7 @@
         <w:pStyle w:val="Titre1"/>
         <w:jc w:val="center"/>
       </w:pPr>
-      <w:bookmarkStart w:id="0" w:name="_Toc238461611"/>
+      <w:bookmarkStart w:id="0" w:name="_Toc238477274"/>
       <w:r>
         <w:t>Table des matières</w:t>
       </w:r>
@@ -858,7 +855,7 @@
         <w:rPr>
           <w:noProof/>
         </w:rPr>
-        <w:instrText xml:space="preserve"> PAGEREF _Toc238461611 \h </w:instrText>
+        <w:instrText xml:space="preserve"> PAGEREF _Toc238477274 \h </w:instrText>
       </w:r>
       <w:r>
         <w:rPr>
@@ -919,7 +916,7 @@
         <w:rPr>
           <w:noProof/>
         </w:rPr>
-        <w:instrText xml:space="preserve"> PAGEREF _Toc238461612 \h </w:instrText>
+        <w:instrText xml:space="preserve"> PAGEREF _Toc238477275 \h </w:instrText>
       </w:r>
       <w:r>
         <w:rPr>
@@ -980,7 +977,7 @@
         <w:rPr>
           <w:noProof/>
         </w:rPr>
-        <w:instrText xml:space="preserve"> PAGEREF _Toc238461613 \h </w:instrText>
+        <w:instrText xml:space="preserve"> PAGEREF _Toc238477276 \h </w:instrText>
       </w:r>
       <w:r>
         <w:rPr>
@@ -1041,7 +1038,7 @@
         <w:rPr>
           <w:noProof/>
         </w:rPr>
-        <w:instrText xml:space="preserve"> PAGEREF _Toc238461614 \h </w:instrText>
+        <w:instrText xml:space="preserve"> PAGEREF _Toc238477277 \h </w:instrText>
       </w:r>
       <w:r>
         <w:rPr>
@@ -1102,7 +1099,7 @@
         <w:rPr>
           <w:noProof/>
         </w:rPr>
-        <w:instrText xml:space="preserve"> PAGEREF _Toc238461615 \h </w:instrText>
+        <w:instrText xml:space="preserve"> PAGEREF _Toc238477278 \h </w:instrText>
       </w:r>
       <w:r>
         <w:rPr>
@@ -1163,7 +1160,7 @@
         <w:rPr>
           <w:noProof/>
         </w:rPr>
-        <w:instrText xml:space="preserve"> PAGEREF _Toc238461616 \h </w:instrText>
+        <w:instrText xml:space="preserve"> PAGEREF _Toc238477279 \h </w:instrText>
       </w:r>
       <w:r>
         <w:rPr>
@@ -1224,7 +1221,7 @@
         <w:rPr>
           <w:noProof/>
         </w:rPr>
-        <w:instrText xml:space="preserve"> PAGEREF _Toc238461617 \h </w:instrText>
+        <w:instrText xml:space="preserve"> PAGEREF _Toc238477280 \h </w:instrText>
       </w:r>
       <w:r>
         <w:rPr>
@@ -1285,7 +1282,7 @@
         <w:rPr>
           <w:noProof/>
         </w:rPr>
-        <w:instrText xml:space="preserve"> PAGEREF _Toc238461618 \h </w:instrText>
+        <w:instrText xml:space="preserve"> PAGEREF _Toc238477281 \h </w:instrText>
       </w:r>
       <w:r>
         <w:rPr>
@@ -1346,7 +1343,7 @@
         <w:rPr>
           <w:noProof/>
         </w:rPr>
-        <w:instrText xml:space="preserve"> PAGEREF _Toc238461619 \h </w:instrText>
+        <w:instrText xml:space="preserve"> PAGEREF _Toc238477282 \h </w:instrText>
       </w:r>
       <w:r>
         <w:rPr>
@@ -1407,7 +1404,7 @@
         <w:rPr>
           <w:noProof/>
         </w:rPr>
-        <w:instrText xml:space="preserve"> PAGEREF _Toc238461620 \h </w:instrText>
+        <w:instrText xml:space="preserve"> PAGEREF _Toc238477283 \h </w:instrText>
       </w:r>
       <w:r>
         <w:rPr>
@@ -1468,7 +1465,7 @@
         <w:rPr>
           <w:noProof/>
         </w:rPr>
-        <w:instrText xml:space="preserve"> PAGEREF _Toc238461621 \h </w:instrText>
+        <w:instrText xml:space="preserve"> PAGEREF _Toc238477284 \h </w:instrText>
       </w:r>
       <w:r>
         <w:rPr>
@@ -1529,7 +1526,7 @@
         <w:rPr>
           <w:noProof/>
         </w:rPr>
-        <w:instrText xml:space="preserve"> PAGEREF _Toc238461622 \h </w:instrText>
+        <w:instrText xml:space="preserve"> PAGEREF _Toc238477285 \h </w:instrText>
       </w:r>
       <w:r>
         <w:rPr>
@@ -1590,7 +1587,7 @@
         <w:rPr>
           <w:noProof/>
         </w:rPr>
-        <w:instrText xml:space="preserve"> PAGEREF _Toc238461623 \h </w:instrText>
+        <w:instrText xml:space="preserve"> PAGEREF _Toc238477286 \h </w:instrText>
       </w:r>
       <w:r>
         <w:rPr>
@@ -1651,7 +1648,7 @@
         <w:rPr>
           <w:noProof/>
         </w:rPr>
-        <w:instrText xml:space="preserve"> PAGEREF _Toc238461624 \h </w:instrText>
+        <w:instrText xml:space="preserve"> PAGEREF _Toc238477287 \h </w:instrText>
       </w:r>
       <w:r>
         <w:rPr>
@@ -1712,7 +1709,7 @@
         <w:rPr>
           <w:noProof/>
         </w:rPr>
-        <w:instrText xml:space="preserve"> PAGEREF _Toc238461625 \h </w:instrText>
+        <w:instrText xml:space="preserve"> PAGEREF _Toc238477288 \h </w:instrText>
       </w:r>
       <w:r>
         <w:rPr>
@@ -1773,7 +1770,7 @@
         <w:rPr>
           <w:noProof/>
         </w:rPr>
-        <w:instrText xml:space="preserve"> PAGEREF _Toc238461626 \h </w:instrText>
+        <w:instrText xml:space="preserve"> PAGEREF _Toc238477289 \h </w:instrText>
       </w:r>
       <w:r>
         <w:rPr>
@@ -1834,7 +1831,7 @@
         <w:rPr>
           <w:noProof/>
         </w:rPr>
-        <w:instrText xml:space="preserve"> PAGEREF _Toc238461627 \h </w:instrText>
+        <w:instrText xml:space="preserve"> PAGEREF _Toc238477290 \h </w:instrText>
       </w:r>
       <w:r>
         <w:rPr>
@@ -1895,7 +1892,7 @@
         <w:rPr>
           <w:noProof/>
         </w:rPr>
-        <w:instrText xml:space="preserve"> PAGEREF _Toc238461628 \h </w:instrText>
+        <w:instrText xml:space="preserve"> PAGEREF _Toc238477291 \h </w:instrText>
       </w:r>
       <w:r>
         <w:rPr>
@@ -1956,7 +1953,7 @@
         <w:rPr>
           <w:noProof/>
         </w:rPr>
-        <w:instrText xml:space="preserve"> PAGEREF _Toc238461629 \h </w:instrText>
+        <w:instrText xml:space="preserve"> PAGEREF _Toc238477292 \h </w:instrText>
       </w:r>
       <w:r>
         <w:rPr>
@@ -2017,7 +2014,7 @@
         <w:rPr>
           <w:noProof/>
         </w:rPr>
-        <w:instrText xml:space="preserve"> PAGEREF _Toc238461630 \h </w:instrText>
+        <w:instrText xml:space="preserve"> PAGEREF _Toc238477293 \h </w:instrText>
       </w:r>
       <w:r>
         <w:rPr>
@@ -2078,7 +2075,7 @@
         <w:rPr>
           <w:noProof/>
         </w:rPr>
-        <w:instrText xml:space="preserve"> PAGEREF _Toc238461631 \h </w:instrText>
+        <w:instrText xml:space="preserve"> PAGEREF _Toc238477294 \h </w:instrText>
       </w:r>
       <w:r>
         <w:rPr>
@@ -2139,7 +2136,7 @@
         <w:rPr>
           <w:noProof/>
         </w:rPr>
-        <w:instrText xml:space="preserve"> PAGEREF _Toc238461632 \h </w:instrText>
+        <w:instrText xml:space="preserve"> PAGEREF _Toc238477295 \h </w:instrText>
       </w:r>
       <w:r>
         <w:rPr>
@@ -2200,7 +2197,7 @@
         <w:rPr>
           <w:noProof/>
         </w:rPr>
-        <w:instrText xml:space="preserve"> PAGEREF _Toc238461633 \h </w:instrText>
+        <w:instrText xml:space="preserve"> PAGEREF _Toc238477296 \h </w:instrText>
       </w:r>
       <w:r>
         <w:rPr>
@@ -2261,7 +2258,7 @@
         <w:rPr>
           <w:noProof/>
         </w:rPr>
-        <w:instrText xml:space="preserve"> PAGEREF _Toc238461634 \h </w:instrText>
+        <w:instrText xml:space="preserve"> PAGEREF _Toc238477297 \h </w:instrText>
       </w:r>
       <w:r>
         <w:rPr>
@@ -2322,7 +2319,7 @@
         <w:rPr>
           <w:noProof/>
         </w:rPr>
-        <w:instrText xml:space="preserve"> PAGEREF _Toc238461635 \h </w:instrText>
+        <w:instrText xml:space="preserve"> PAGEREF _Toc238477298 \h </w:instrText>
       </w:r>
       <w:r>
         <w:rPr>
@@ -2383,7 +2380,7 @@
         <w:rPr>
           <w:noProof/>
         </w:rPr>
-        <w:instrText xml:space="preserve"> PAGEREF _Toc238461636 \h </w:instrText>
+        <w:instrText xml:space="preserve"> PAGEREF _Toc238477299 \h </w:instrText>
       </w:r>
       <w:r>
         <w:rPr>
@@ -2444,7 +2441,7 @@
         <w:rPr>
           <w:noProof/>
         </w:rPr>
-        <w:instrText xml:space="preserve"> PAGEREF _Toc238461637 \h </w:instrText>
+        <w:instrText xml:space="preserve"> PAGEREF _Toc238477300 \h </w:instrText>
       </w:r>
       <w:r>
         <w:rPr>
@@ -2506,7 +2503,7 @@
         <w:rPr>
           <w:noProof/>
         </w:rPr>
-        <w:instrText xml:space="preserve"> PAGEREF _Toc238461638 \h </w:instrText>
+        <w:instrText xml:space="preserve"> PAGEREF _Toc238477301 \h </w:instrText>
       </w:r>
       <w:r>
         <w:rPr>
@@ -2567,7 +2564,7 @@
         <w:rPr>
           <w:noProof/>
         </w:rPr>
-        <w:instrText xml:space="preserve"> PAGEREF _Toc238461639 \h </w:instrText>
+        <w:instrText xml:space="preserve"> PAGEREF _Toc238477302 \h </w:instrText>
       </w:r>
       <w:r>
         <w:rPr>
@@ -2628,7 +2625,7 @@
         <w:rPr>
           <w:noProof/>
         </w:rPr>
-        <w:instrText xml:space="preserve"> PAGEREF _Toc238461640 \h </w:instrText>
+        <w:instrText xml:space="preserve"> PAGEREF _Toc238477303 \h </w:instrText>
       </w:r>
       <w:r>
         <w:rPr>
@@ -2689,7 +2686,7 @@
         <w:rPr>
           <w:noProof/>
         </w:rPr>
-        <w:instrText xml:space="preserve"> PAGEREF _Toc238461641 \h </w:instrText>
+        <w:instrText xml:space="preserve"> PAGEREF _Toc238477304 \h </w:instrText>
       </w:r>
       <w:r>
         <w:rPr>
@@ -2750,7 +2747,7 @@
         <w:rPr>
           <w:noProof/>
         </w:rPr>
-        <w:instrText xml:space="preserve"> PAGEREF _Toc238461642 \h </w:instrText>
+        <w:instrText xml:space="preserve"> PAGEREF _Toc238477305 \h </w:instrText>
       </w:r>
       <w:r>
         <w:rPr>
@@ -2811,7 +2808,7 @@
         <w:rPr>
           <w:noProof/>
         </w:rPr>
-        <w:instrText xml:space="preserve"> PAGEREF _Toc238461643 \h </w:instrText>
+        <w:instrText xml:space="preserve"> PAGEREF _Toc238477306 \h </w:instrText>
       </w:r>
       <w:r>
         <w:rPr>
@@ -2872,7 +2869,7 @@
         <w:rPr>
           <w:noProof/>
         </w:rPr>
-        <w:instrText xml:space="preserve"> PAGEREF _Toc238461644 \h </w:instrText>
+        <w:instrText xml:space="preserve"> PAGEREF _Toc238477307 \h </w:instrText>
       </w:r>
       <w:r>
         <w:rPr>
@@ -2933,7 +2930,7 @@
         <w:rPr>
           <w:noProof/>
         </w:rPr>
-        <w:instrText xml:space="preserve"> PAGEREF _Toc238461645 \h </w:instrText>
+        <w:instrText xml:space="preserve"> PAGEREF _Toc238477308 \h </w:instrText>
       </w:r>
       <w:r>
         <w:rPr>
@@ -2994,7 +2991,7 @@
         <w:rPr>
           <w:noProof/>
         </w:rPr>
-        <w:instrText xml:space="preserve"> PAGEREF _Toc238461646 \h </w:instrText>
+        <w:instrText xml:space="preserve"> PAGEREF _Toc238477309 \h </w:instrText>
       </w:r>
       <w:r>
         <w:rPr>
@@ -3055,7 +3052,7 @@
         <w:rPr>
           <w:noProof/>
         </w:rPr>
-        <w:instrText xml:space="preserve"> PAGEREF _Toc238461647 \h </w:instrText>
+        <w:instrText xml:space="preserve"> PAGEREF _Toc238477310 \h </w:instrText>
       </w:r>
       <w:r>
         <w:rPr>
@@ -3116,7 +3113,7 @@
         <w:rPr>
           <w:noProof/>
         </w:rPr>
-        <w:instrText xml:space="preserve"> PAGEREF _Toc238461648 \h </w:instrText>
+        <w:instrText xml:space="preserve"> PAGEREF _Toc238477311 \h </w:instrText>
       </w:r>
       <w:r>
         <w:rPr>
@@ -3134,6 +3131,128 @@
           <w:noProof/>
         </w:rPr>
         <w:t>25</w:t>
+      </w:r>
+      <w:r>
+        <w:rPr>
+          <w:noProof/>
+        </w:rPr>
+        <w:fldChar w:fldCharType="end"/>
+      </w:r>
+    </w:p>
+    <w:p>
+      <w:pPr>
+        <w:pStyle w:val="TM3"/>
+        <w:tabs>
+          <w:tab w:val="right" w:leader="dot" w:pos="10456"/>
+        </w:tabs>
+        <w:rPr>
+          <w:rFonts w:asciiTheme="minorHAnsi" w:eastAsiaTheme="minorEastAsia" w:hAnsiTheme="minorHAnsi" w:cstheme="minorBidi"/>
+          <w:noProof/>
+          <w:lang w:eastAsia="fr-FR"/>
+          <w14:ligatures w14:val="standardContextual"/>
+        </w:rPr>
+      </w:pPr>
+      <w:r>
+        <w:rPr>
+          <w:noProof/>
+        </w:rPr>
+        <w:t>3.4.3 Analyse IA du CV (extraction, scoring via n8n et Cohere)</w:t>
+      </w:r>
+      <w:r>
+        <w:rPr>
+          <w:noProof/>
+        </w:rPr>
+        <w:tab/>
+      </w:r>
+      <w:r>
+        <w:rPr>
+          <w:noProof/>
+        </w:rPr>
+        <w:fldChar w:fldCharType="begin"/>
+      </w:r>
+      <w:r>
+        <w:rPr>
+          <w:noProof/>
+        </w:rPr>
+        <w:instrText xml:space="preserve"> PAGEREF _Toc238477312 \h </w:instrText>
+      </w:r>
+      <w:r>
+        <w:rPr>
+          <w:noProof/>
+        </w:rPr>
+      </w:r>
+      <w:r>
+        <w:rPr>
+          <w:noProof/>
+        </w:rPr>
+        <w:fldChar w:fldCharType="separate"/>
+      </w:r>
+      <w:r>
+        <w:rPr>
+          <w:noProof/>
+        </w:rPr>
+        <w:t>25</w:t>
+      </w:r>
+      <w:r>
+        <w:rPr>
+          <w:noProof/>
+        </w:rPr>
+        <w:fldChar w:fldCharType="end"/>
+      </w:r>
+    </w:p>
+    <w:p>
+      <w:pPr>
+        <w:pStyle w:val="TM3"/>
+        <w:tabs>
+          <w:tab w:val="right" w:leader="dot" w:pos="10456"/>
+        </w:tabs>
+        <w:rPr>
+          <w:rFonts w:asciiTheme="minorHAnsi" w:eastAsiaTheme="minorEastAsia" w:hAnsiTheme="minorHAnsi" w:cstheme="minorBidi"/>
+          <w:noProof/>
+          <w:lang w:eastAsia="fr-FR"/>
+          <w14:ligatures w14:val="standardContextual"/>
+        </w:rPr>
+      </w:pPr>
+      <w:r>
+        <w:rPr>
+          <w:noProof/>
+        </w:rPr>
+        <w:t>3.4.4 Passage en évaluation technique — routage et notification des managers</w:t>
+      </w:r>
+      <w:r>
+        <w:rPr>
+          <w:noProof/>
+        </w:rPr>
+        <w:tab/>
+      </w:r>
+      <w:r>
+        <w:rPr>
+          <w:noProof/>
+        </w:rPr>
+        <w:fldChar w:fldCharType="begin"/>
+      </w:r>
+      <w:r>
+        <w:rPr>
+          <w:noProof/>
+        </w:rPr>
+        <w:instrText xml:space="preserve"> PAGEREF _Toc238477313 \h </w:instrText>
+      </w:r>
+      <w:r>
+        <w:rPr>
+          <w:noProof/>
+        </w:rPr>
+      </w:r>
+      <w:r>
+        <w:rPr>
+          <w:noProof/>
+        </w:rPr>
+        <w:fldChar w:fldCharType="separate"/>
+      </w:r>
+      <w:r>
+        <w:rPr>
+          <w:noProof/>
+        </w:rPr>
+        <w:t>26</w:t>
       </w:r>
       <w:r>
         <w:rPr>
@@ -3177,7 +3296,7 @@
         <w:rPr>
           <w:noProof/>
         </w:rPr>
-        <w:instrText xml:space="preserve"> PAGEREF _Toc238461649 \h </w:instrText>
+        <w:instrText xml:space="preserve"> PAGEREF _Toc238477314 \h </w:instrText>
       </w:r>
       <w:r>
         <w:rPr>
@@ -3194,7 +3313,7 @@
         <w:rPr>
           <w:noProof/>
         </w:rPr>
-        <w:t>25</w:t>
+        <w:t>27</w:t>
       </w:r>
       <w:r>
         <w:rPr>
@@ -3238,7 +3357,7 @@
         <w:rPr>
           <w:noProof/>
         </w:rPr>
-        <w:instrText xml:space="preserve"> PAGEREF _Toc238461650 \h </w:instrText>
+        <w:instrText xml:space="preserve"> PAGEREF _Toc238477315 \h </w:instrText>
       </w:r>
       <w:r>
         <w:rPr>
@@ -3255,7 +3374,7 @@
         <w:rPr>
           <w:noProof/>
         </w:rPr>
-        <w:t>27</w:t>
+        <w:t>28</w:t>
       </w:r>
       <w:r>
         <w:rPr>
@@ -3299,7 +3418,7 @@
         <w:rPr>
           <w:noProof/>
         </w:rPr>
-        <w:instrText xml:space="preserve"> PAGEREF _Toc238461651 \h </w:instrText>
+        <w:instrText xml:space="preserve"> PAGEREF _Toc238477316 \h </w:instrText>
       </w:r>
       <w:r>
         <w:rPr>
@@ -3316,7 +3435,7 @@
         <w:rPr>
           <w:noProof/>
         </w:rPr>
-        <w:t>29</w:t>
+        <w:t>30</w:t>
       </w:r>
       <w:r>
         <w:rPr>
@@ -3360,7 +3479,7 @@
         <w:rPr>
           <w:noProof/>
         </w:rPr>
-        <w:instrText xml:space="preserve"> PAGEREF _Toc238461652 \h </w:instrText>
+        <w:instrText xml:space="preserve"> PAGEREF _Toc238477317 \h </w:instrText>
       </w:r>
       <w:r>
         <w:rPr>
@@ -3377,7 +3496,7 @@
         <w:rPr>
           <w:noProof/>
         </w:rPr>
-        <w:t>29</w:t>
+        <w:t>30</w:t>
       </w:r>
       <w:r>
         <w:rPr>
@@ -3421,7 +3540,7 @@
         <w:rPr>
           <w:noProof/>
         </w:rPr>
-        <w:instrText xml:space="preserve"> PAGEREF _Toc238461653 \h </w:instrText>
+        <w:instrText xml:space="preserve"> PAGEREF _Toc238477318 \h </w:instrText>
       </w:r>
       <w:r>
         <w:rPr>
@@ -3438,7 +3557,7 @@
         <w:rPr>
           <w:noProof/>
         </w:rPr>
-        <w:t>30</w:t>
+        <w:t>31</w:t>
       </w:r>
       <w:r>
         <w:rPr>
@@ -3482,7 +3601,7 @@
         <w:rPr>
           <w:noProof/>
         </w:rPr>
-        <w:instrText xml:space="preserve"> PAGEREF _Toc238461654 \h </w:instrText>
+        <w:instrText xml:space="preserve"> PAGEREF _Toc238477319 \h </w:instrText>
       </w:r>
       <w:r>
         <w:rPr>
@@ -3499,7 +3618,7 @@
         <w:rPr>
           <w:noProof/>
         </w:rPr>
-        <w:t>31</w:t>
+        <w:t>32</w:t>
       </w:r>
       <w:r>
         <w:rPr>
@@ -3543,7 +3662,7 @@
         <w:rPr>
           <w:noProof/>
         </w:rPr>
-        <w:instrText xml:space="preserve"> PAGEREF _Toc238461655 \h </w:instrText>
+        <w:instrText xml:space="preserve"> PAGEREF _Toc238477320 \h </w:instrText>
       </w:r>
       <w:r>
         <w:rPr>
@@ -3560,7 +3679,7 @@
         <w:rPr>
           <w:noProof/>
         </w:rPr>
-        <w:t>31</w:t>
+        <w:t>32</w:t>
       </w:r>
       <w:r>
         <w:rPr>
@@ -3604,7 +3723,7 @@
         <w:rPr>
           <w:noProof/>
         </w:rPr>
-        <w:instrText xml:space="preserve"> PAGEREF _Toc238461656 \h </w:instrText>
+        <w:instrText xml:space="preserve"> PAGEREF _Toc238477321 \h </w:instrText>
       </w:r>
       <w:r>
         <w:rPr>
@@ -3621,7 +3740,7 @@
         <w:rPr>
           <w:noProof/>
         </w:rPr>
-        <w:t>31</w:t>
+        <w:t>32</w:t>
       </w:r>
       <w:r>
         <w:rPr>
@@ -3665,7 +3784,7 @@
         <w:rPr>
           <w:noProof/>
         </w:rPr>
-        <w:instrText xml:space="preserve"> PAGEREF _Toc238461657 \h </w:instrText>
+        <w:instrText xml:space="preserve"> PAGEREF _Toc238477322 \h </w:instrText>
       </w:r>
       <w:r>
         <w:rPr>
@@ -3682,7 +3801,7 @@
         <w:rPr>
           <w:noProof/>
         </w:rPr>
-        <w:t>31</w:t>
+        <w:t>32</w:t>
       </w:r>
       <w:r>
         <w:rPr>
@@ -3726,7 +3845,7 @@
         <w:rPr>
           <w:noProof/>
         </w:rPr>
-        <w:instrText xml:space="preserve"> PAGEREF _Toc238461658 \h </w:instrText>
+        <w:instrText xml:space="preserve"> PAGEREF _Toc238477323 \h </w:instrText>
       </w:r>
       <w:r>
         <w:rPr>
@@ -3743,7 +3862,7 @@
         <w:rPr>
           <w:noProof/>
         </w:rPr>
-        <w:t>31</w:t>
+        <w:t>32</w:t>
       </w:r>
       <w:r>
         <w:rPr>
@@ -3787,7 +3906,7 @@
         <w:rPr>
           <w:noProof/>
         </w:rPr>
-        <w:instrText xml:space="preserve"> PAGEREF _Toc238461659 \h </w:instrText>
+        <w:instrText xml:space="preserve"> PAGEREF _Toc238477324 \h </w:instrText>
       </w:r>
       <w:r>
         <w:rPr>
@@ -3804,7 +3923,7 @@
         <w:rPr>
           <w:noProof/>
         </w:rPr>
-        <w:t>32</w:t>
+        <w:t>33</w:t>
       </w:r>
       <w:r>
         <w:rPr>
@@ -3848,7 +3967,7 @@
         <w:rPr>
           <w:noProof/>
         </w:rPr>
-        <w:instrText xml:space="preserve"> PAGEREF _Toc238461660 \h </w:instrText>
+        <w:instrText xml:space="preserve"> PAGEREF _Toc238477325 \h </w:instrText>
       </w:r>
       <w:r>
         <w:rPr>
@@ -3865,7 +3984,7 @@
         <w:rPr>
           <w:noProof/>
         </w:rPr>
-        <w:t>32</w:t>
+        <w:t>33</w:t>
       </w:r>
       <w:r>
         <w:rPr>
@@ -3909,7 +4028,7 @@
         <w:rPr>
           <w:noProof/>
         </w:rPr>
-        <w:instrText xml:space="preserve"> PAGEREF _Toc238461661 \h </w:instrText>
+        <w:instrText xml:space="preserve"> PAGEREF _Toc238477326 \h </w:instrText>
       </w:r>
       <w:r>
         <w:rPr>
@@ -3926,7 +4045,7 @@
         <w:rPr>
           <w:noProof/>
         </w:rPr>
-        <w:t>32</w:t>
+        <w:t>33</w:t>
       </w:r>
       <w:r>
         <w:rPr>
@@ -3970,7 +4089,7 @@
         <w:rPr>
           <w:noProof/>
         </w:rPr>
-        <w:instrText xml:space="preserve"> PAGEREF _Toc238461662 \h </w:instrText>
+        <w:instrText xml:space="preserve"> PAGEREF _Toc238477327 \h </w:instrText>
       </w:r>
       <w:r>
         <w:rPr>
@@ -3987,7 +4106,7 @@
         <w:rPr>
           <w:noProof/>
         </w:rPr>
-        <w:t>38</w:t>
+        <w:t>39</w:t>
       </w:r>
       <w:r>
         <w:rPr>
@@ -4031,7 +4150,7 @@
         <w:rPr>
           <w:noProof/>
         </w:rPr>
-        <w:instrText xml:space="preserve"> PAGEREF _Toc238461663 \h </w:instrText>
+        <w:instrText xml:space="preserve"> PAGEREF _Toc238477328 \h </w:instrText>
       </w:r>
       <w:r>
         <w:rPr>
@@ -4048,7 +4167,7 @@
         <w:rPr>
           <w:noProof/>
         </w:rPr>
-        <w:t>38</w:t>
+        <w:t>39</w:t>
       </w:r>
       <w:r>
         <w:rPr>
@@ -4092,7 +4211,7 @@
         <w:rPr>
           <w:noProof/>
         </w:rPr>
-        <w:instrText xml:space="preserve"> PAGEREF _Toc238461664 \h </w:instrText>
+        <w:instrText xml:space="preserve"> PAGEREF _Toc238477329 \h </w:instrText>
       </w:r>
       <w:r>
         <w:rPr>
@@ -4109,7 +4228,7 @@
         <w:rPr>
           <w:noProof/>
         </w:rPr>
-        <w:t>39</w:t>
+        <w:t>40</w:t>
       </w:r>
       <w:r>
         <w:rPr>
@@ -4135,6 +4254,7 @@
         <w:rPr>
           <w:noProof/>
         </w:rPr>
+        <w:lastRenderedPageBreak/>
         <w:t>4.4.3 Tests des API avec Postman et Swagger</w:t>
       </w:r>
       <w:r>
@@ -4153,7 +4273,7 @@
         <w:rPr>
           <w:noProof/>
         </w:rPr>
-        <w:instrText xml:space="preserve"> PAGEREF _Toc238461665 \h </w:instrText>
+        <w:instrText xml:space="preserve"> PAGEREF _Toc238477330 \h </w:instrText>
       </w:r>
       <w:r>
         <w:rPr>
@@ -4170,7 +4290,7 @@
         <w:rPr>
           <w:noProof/>
         </w:rPr>
-        <w:t>40</w:t>
+        <w:t>41</w:t>
       </w:r>
       <w:r>
         <w:rPr>
@@ -4214,7 +4334,7 @@
         <w:rPr>
           <w:noProof/>
         </w:rPr>
-        <w:instrText xml:space="preserve"> PAGEREF _Toc238461666 \h </w:instrText>
+        <w:instrText xml:space="preserve"> PAGEREF _Toc238477331 \h </w:instrText>
       </w:r>
       <w:r>
         <w:rPr>
@@ -4231,7 +4351,7 @@
         <w:rPr>
           <w:noProof/>
         </w:rPr>
-        <w:t>40</w:t>
+        <w:t>41</w:t>
       </w:r>
       <w:r>
         <w:rPr>
@@ -4257,7 +4377,6 @@
         <w:rPr>
           <w:noProof/>
         </w:rPr>
-        <w:lastRenderedPageBreak/>
         <w:t>4.5 Difficultés rencontrées et solutions apportées</w:t>
       </w:r>
       <w:r>
@@ -4276,7 +4395,7 @@
         <w:rPr>
           <w:noProof/>
         </w:rPr>
-        <w:instrText xml:space="preserve"> PAGEREF _Toc238461667 \h </w:instrText>
+        <w:instrText xml:space="preserve"> PAGEREF _Toc238477332 \h </w:instrText>
       </w:r>
       <w:r>
         <w:rPr>
@@ -4293,7 +4412,7 @@
         <w:rPr>
           <w:noProof/>
         </w:rPr>
-        <w:t>40</w:t>
+        <w:t>42</w:t>
       </w:r>
       <w:r>
         <w:rPr>
@@ -4337,7 +4456,7 @@
         <w:rPr>
           <w:noProof/>
         </w:rPr>
-        <w:instrText xml:space="preserve"> PAGEREF _Toc238461668 \h </w:instrText>
+        <w:instrText xml:space="preserve"> PAGEREF _Toc238477333 \h </w:instrText>
       </w:r>
       <w:r>
         <w:rPr>
@@ -4354,7 +4473,7 @@
         <w:rPr>
           <w:noProof/>
         </w:rPr>
-        <w:t>40</w:t>
+        <w:t>42</w:t>
       </w:r>
       <w:r>
         <w:rPr>
@@ -4398,7 +4517,7 @@
         <w:rPr>
           <w:noProof/>
         </w:rPr>
-        <w:instrText xml:space="preserve"> PAGEREF _Toc238461669 \h </w:instrText>
+        <w:instrText xml:space="preserve"> PAGEREF _Toc238477334 \h </w:instrText>
       </w:r>
       <w:r>
         <w:rPr>
@@ -4415,7 +4534,7 @@
         <w:rPr>
           <w:noProof/>
         </w:rPr>
-        <w:t>41</w:t>
+        <w:t>42</w:t>
       </w:r>
       <w:r>
         <w:rPr>
@@ -4459,7 +4578,7 @@
         <w:rPr>
           <w:noProof/>
         </w:rPr>
-        <w:instrText xml:space="preserve"> PAGEREF _Toc238461670 \h </w:instrText>
+        <w:instrText xml:space="preserve"> PAGEREF _Toc238477335 \h </w:instrText>
       </w:r>
       <w:r>
         <w:rPr>
@@ -4476,7 +4595,7 @@
         <w:rPr>
           <w:noProof/>
         </w:rPr>
-        <w:t>41</w:t>
+        <w:t>42</w:t>
       </w:r>
       <w:r>
         <w:rPr>
@@ -4520,7 +4639,7 @@
         <w:rPr>
           <w:noProof/>
         </w:rPr>
-        <w:instrText xml:space="preserve"> PAGEREF _Toc238461671 \h </w:instrText>
+        <w:instrText xml:space="preserve"> PAGEREF _Toc238477336 \h </w:instrText>
       </w:r>
       <w:r>
         <w:rPr>
@@ -4537,7 +4656,7 @@
         <w:rPr>
           <w:noProof/>
         </w:rPr>
-        <w:t>41</w:t>
+        <w:t>43</w:t>
       </w:r>
       <w:r>
         <w:rPr>
@@ -4581,7 +4700,7 @@
         <w:rPr>
           <w:noProof/>
         </w:rPr>
-        <w:instrText xml:space="preserve"> PAGEREF _Toc238461672 \h </w:instrText>
+        <w:instrText xml:space="preserve"> PAGEREF _Toc238477337 \h </w:instrText>
       </w:r>
       <w:r>
         <w:rPr>
@@ -4598,7 +4717,7 @@
         <w:rPr>
           <w:noProof/>
         </w:rPr>
-        <w:t>41</w:t>
+        <w:t>43</w:t>
       </w:r>
       <w:r>
         <w:rPr>
@@ -4642,7 +4761,7 @@
         <w:rPr>
           <w:noProof/>
         </w:rPr>
-        <w:instrText xml:space="preserve"> PAGEREF _Toc238461673 \h </w:instrText>
+        <w:instrText xml:space="preserve"> PAGEREF _Toc238477338 \h </w:instrText>
       </w:r>
       <w:r>
         <w:rPr>
@@ -4659,7 +4778,7 @@
         <w:rPr>
           <w:noProof/>
         </w:rPr>
-        <w:t>41</w:t>
+        <w:t>43</w:t>
       </w:r>
       <w:r>
         <w:rPr>
@@ -4703,7 +4822,7 @@
         <w:rPr>
           <w:noProof/>
         </w:rPr>
-        <w:instrText xml:space="preserve"> PAGEREF _Toc238461674 \h </w:instrText>
+        <w:instrText xml:space="preserve"> PAGEREF _Toc238477339 \h </w:instrText>
       </w:r>
       <w:r>
         <w:rPr>
@@ -4720,7 +4839,7 @@
         <w:rPr>
           <w:noProof/>
         </w:rPr>
-        <w:t>42</w:t>
+        <w:t>43</w:t>
       </w:r>
       <w:r>
         <w:rPr>
@@ -4764,7 +4883,7 @@
         <w:rPr>
           <w:noProof/>
         </w:rPr>
-        <w:instrText xml:space="preserve"> PAGEREF _Toc238461675 \h </w:instrText>
+        <w:instrText xml:space="preserve"> PAGEREF _Toc238477340 \h </w:instrText>
       </w:r>
       <w:r>
         <w:rPr>
@@ -4781,7 +4900,7 @@
         <w:rPr>
           <w:noProof/>
         </w:rPr>
-        <w:t>42</w:t>
+        <w:t>43</w:t>
       </w:r>
       <w:r>
         <w:rPr>
@@ -4825,7 +4944,7 @@
         <w:rPr>
           <w:noProof/>
         </w:rPr>
-        <w:instrText xml:space="preserve"> PAGEREF _Toc238461676 \h </w:instrText>
+        <w:instrText xml:space="preserve"> PAGEREF _Toc238477341 \h </w:instrText>
       </w:r>
       <w:r>
         <w:rPr>
@@ -4842,7 +4961,7 @@
         <w:rPr>
           <w:noProof/>
         </w:rPr>
-        <w:t>42</w:t>
+        <w:t>44</w:t>
       </w:r>
       <w:r>
         <w:rPr>
@@ -4886,7 +5005,7 @@
         <w:rPr>
           <w:noProof/>
         </w:rPr>
-        <w:instrText xml:space="preserve"> PAGEREF _Toc238461677 \h </w:instrText>
+        <w:instrText xml:space="preserve"> PAGEREF _Toc238477342 \h </w:instrText>
       </w:r>
       <w:r>
         <w:rPr>
@@ -4903,7 +5022,68 @@
         <w:rPr>
           <w:noProof/>
         </w:rPr>
-        <w:t>42</w:t>
+        <w:t>44</w:t>
+      </w:r>
+      <w:r>
+        <w:rPr>
+          <w:noProof/>
+        </w:rPr>
+        <w:fldChar w:fldCharType="end"/>
+      </w:r>
+    </w:p>
+    <w:p>
+      <w:pPr>
+        <w:pStyle w:val="TM3"/>
+        <w:tabs>
+          <w:tab w:val="right" w:leader="dot" w:pos="10456"/>
+        </w:tabs>
+        <w:rPr>
+          <w:rFonts w:asciiTheme="minorHAnsi" w:eastAsiaTheme="minorEastAsia" w:hAnsiTheme="minorHAnsi" w:cstheme="minorBidi"/>
+          <w:noProof/>
+          <w:lang w:eastAsia="fr-FR"/>
+          <w14:ligatures w14:val="standardContextual"/>
+        </w:rPr>
+      </w:pPr>
+      <w:r>
+        <w:rPr>
+          <w:noProof/>
+        </w:rPr>
+        <w:t>4.5.11 Cloisonnement des données dans le chatbot candidat</w:t>
+      </w:r>
+      <w:r>
+        <w:rPr>
+          <w:noProof/>
+        </w:rPr>
+        <w:tab/>
+      </w:r>
+      <w:r>
+        <w:rPr>
+          <w:noProof/>
+        </w:rPr>
+        <w:fldChar w:fldCharType="begin"/>
+      </w:r>
+      <w:r>
+        <w:rPr>
+          <w:noProof/>
+        </w:rPr>
+        <w:instrText xml:space="preserve"> PAGEREF _Toc238477343 \h </w:instrText>
+      </w:r>
+      <w:r>
+        <w:rPr>
+          <w:noProof/>
+        </w:rPr>
+      </w:r>
+      <w:r>
+        <w:rPr>
+          <w:noProof/>
+        </w:rPr>
+        <w:fldChar w:fldCharType="separate"/>
+      </w:r>
+      <w:r>
+        <w:rPr>
+          <w:noProof/>
+        </w:rPr>
+        <w:t>44</w:t>
       </w:r>
       <w:r>
         <w:rPr>
@@ -4947,7 +5127,7 @@
         <w:rPr>
           <w:noProof/>
         </w:rPr>
-        <w:instrText xml:space="preserve"> PAGEREF _Toc238461678 \h </w:instrText>
+        <w:instrText xml:space="preserve"> PAGEREF _Toc238477344 \h </w:instrText>
       </w:r>
       <w:r>
         <w:rPr>
@@ -4964,7 +5144,7 @@
         <w:rPr>
           <w:noProof/>
         </w:rPr>
-        <w:t>43</w:t>
+        <w:t>45</w:t>
       </w:r>
       <w:r>
         <w:rPr>
@@ -5008,7 +5188,7 @@
         <w:rPr>
           <w:noProof/>
         </w:rPr>
-        <w:instrText xml:space="preserve"> PAGEREF _Toc238461679 \h </w:instrText>
+        <w:instrText xml:space="preserve"> PAGEREF _Toc238477345 \h </w:instrText>
       </w:r>
       <w:r>
         <w:rPr>
@@ -5025,7 +5205,7 @@
         <w:rPr>
           <w:noProof/>
         </w:rPr>
-        <w:t>43</w:t>
+        <w:t>45</w:t>
       </w:r>
       <w:r>
         <w:rPr>
@@ -5069,7 +5249,7 @@
         <w:rPr>
           <w:noProof/>
         </w:rPr>
-        <w:instrText xml:space="preserve"> PAGEREF _Toc238461680 \h </w:instrText>
+        <w:instrText xml:space="preserve"> PAGEREF _Toc238477346 \h </w:instrText>
       </w:r>
       <w:r>
         <w:rPr>
@@ -5086,7 +5266,7 @@
         <w:rPr>
           <w:noProof/>
         </w:rPr>
-        <w:t>44</w:t>
+        <w:t>46</w:t>
       </w:r>
       <w:r>
         <w:rPr>
@@ -5130,7 +5310,7 @@
         <w:rPr>
           <w:noProof/>
         </w:rPr>
-        <w:instrText xml:space="preserve"> PAGEREF _Toc238461681 \h </w:instrText>
+        <w:instrText xml:space="preserve"> PAGEREF _Toc238477347 \h </w:instrText>
       </w:r>
       <w:r>
         <w:rPr>
@@ -5147,7 +5327,7 @@
         <w:rPr>
           <w:noProof/>
         </w:rPr>
-        <w:t>45</w:t>
+        <w:t>47</w:t>
       </w:r>
       <w:r>
         <w:rPr>
@@ -5191,7 +5371,7 @@
         <w:rPr>
           <w:noProof/>
         </w:rPr>
-        <w:instrText xml:space="preserve"> PAGEREF _Toc238461682 \h </w:instrText>
+        <w:instrText xml:space="preserve"> PAGEREF _Toc238477348 \h </w:instrText>
       </w:r>
       <w:r>
         <w:rPr>
@@ -5208,7 +5388,7 @@
         <w:rPr>
           <w:noProof/>
         </w:rPr>
-        <w:t>46</w:t>
+        <w:t>48</w:t>
       </w:r>
       <w:r>
         <w:rPr>
@@ -5252,7 +5432,7 @@
         <w:rPr>
           <w:noProof/>
         </w:rPr>
-        <w:instrText xml:space="preserve"> PAGEREF _Toc238461683 \h </w:instrText>
+        <w:instrText xml:space="preserve"> PAGEREF _Toc238477349 \h </w:instrText>
       </w:r>
       <w:r>
         <w:rPr>
@@ -5269,7 +5449,7 @@
         <w:rPr>
           <w:noProof/>
         </w:rPr>
-        <w:t>47</w:t>
+        <w:t>49</w:t>
       </w:r>
       <w:r>
         <w:rPr>
@@ -5295,7 +5475,7 @@
       <w:pPr>
         <w:pStyle w:val="Titre1"/>
       </w:pPr>
-      <w:bookmarkStart w:id="1" w:name="_Toc238461612"/>
+      <w:bookmarkStart w:id="1" w:name="_Toc238477275"/>
       <w:r>
         <w:t>Liste des figures</w:t>
       </w:r>
@@ -5308,10 +5488,7 @@
         </w:tabs>
       </w:pPr>
       <w:r>
-        <w:t xml:space="preserve">Figure 2.1 : Diagramme de </w:t>
-      </w:r>
-      <w:r>
-        <w:t>cas d’utilisation global</w:t>
+        <w:t>Figure 2.1 : Diagramme de cas d’utilisation global</w:t>
       </w:r>
       <w:r>
         <w:tab/>
@@ -5409,10 +5586,12 @@
         </w:tabs>
       </w:pPr>
       <w:r>
-        <w:t>Figure 3.5 : Diagramme d'états du cycle de vie d'une candidature</w:t>
+        <w:t>Figure 3.5 : Diagramme de séquence objet — Analyse IA du CV</w:t>
       </w:r>
       <w:r>
         <w:tab/>
+      </w:r>
+      <w:r>
         <w:t>26</w:t>
       </w:r>
     </w:p>
@@ -5423,11 +5602,13 @@
         </w:tabs>
       </w:pPr>
       <w:r>
-        <w:t>Figure 3.6 : Schéma relationnel de la base de données PostgreSQL</w:t>
+        <w:t>Figure 3.6 : Diagramme de séquence objet — Routage et notification des managers</w:t>
       </w:r>
       <w:r>
         <w:tab/>
-        <w:t>28</w:t>
+      </w:r>
+      <w:r>
+        <w:t>26</w:t>
       </w:r>
     </w:p>
     <w:p>
@@ -5437,11 +5618,13 @@
         </w:tabs>
       </w:pPr>
       <w:r>
-        <w:t>Figure 3.7 : Diagramme de déploiement de la plateforme JOB4YOU</w:t>
+        <w:t>Figure 3.7 : Diagramme d'états du cycle de vie d'une candidature</w:t>
       </w:r>
       <w:r>
         <w:tab/>
-        <w:t>29</w:t>
+      </w:r>
+      <w:r>
+        <w:t>27</w:t>
       </w:r>
     </w:p>
     <w:p>
@@ -5451,11 +5634,13 @@
         </w:tabs>
       </w:pPr>
       <w:r>
-        <w:t>Figure 3.8 : Diagramme de composants de la plateforme JOB4YOU</w:t>
+        <w:t>Figure 3.8 : Schéma relationnel de la base de données PostgreSQL</w:t>
       </w:r>
       <w:r>
         <w:tab/>
-        <w:t>30</w:t>
+      </w:r>
+      <w:r>
+        <w:t>29</w:t>
       </w:r>
     </w:p>
     <w:p>
@@ -5465,11 +5650,13 @@
         </w:tabs>
       </w:pPr>
       <w:r>
-        <w:t>Figure 4.1 : Page d'accueil publique — recherche d'offres d'emploi</w:t>
+        <w:t>Figure 3.9 : Diagramme de déploiement de la plateforme JOB4YOU</w:t>
       </w:r>
       <w:r>
         <w:tab/>
-        <w:t>32</w:t>
+      </w:r>
+      <w:r>
+        <w:t>30</w:t>
       </w:r>
     </w:p>
     <w:p>
@@ -5479,11 +5666,13 @@
         </w:tabs>
       </w:pPr>
       <w:r>
-        <w:t>Figure 4.2 : Page de connexion</w:t>
+        <w:t>Figure 3.10 : Diagramme de composants de la plateforme JOB4YOU</w:t>
       </w:r>
       <w:r>
         <w:tab/>
-        <w:t>33</w:t>
+      </w:r>
+      <w:r>
+        <w:t>31</w:t>
       </w:r>
     </w:p>
     <w:p>
@@ -5493,10 +5682,12 @@
         </w:tabs>
       </w:pPr>
       <w:r>
-        <w:t>Figure 4.3 : Gestion des offres d'emploi (espace RH)</w:t>
+        <w:t>Figure 4.1 : Page d'accueil publique — recherche d'offres d'emploi</w:t>
       </w:r>
       <w:r>
         <w:tab/>
+      </w:r>
+      <w:r>
         <w:t>33</w:t>
       </w:r>
     </w:p>
@@ -5507,10 +5698,12 @@
         </w:tabs>
       </w:pPr>
       <w:r>
-        <w:t>Figure 4.4 : Gestion des candidats — vue liste avec score IA</w:t>
+        <w:t>Figure 4.2 : Page de connexion</w:t>
       </w:r>
       <w:r>
         <w:tab/>
+      </w:r>
+      <w:r>
         <w:t>34</w:t>
       </w:r>
     </w:p>
@@ -5521,10 +5714,12 @@
         </w:tabs>
       </w:pPr>
       <w:r>
-        <w:t>Figure 4.5 : Modification d'un dossier candidat</w:t>
+        <w:t>Figure 4.3 : Gestion des offres d'emploi (espace RH)</w:t>
       </w:r>
       <w:r>
         <w:tab/>
+      </w:r>
+      <w:r>
         <w:t>34</w:t>
       </w:r>
     </w:p>
@@ -5535,10 +5730,12 @@
         </w:tabs>
       </w:pPr>
       <w:r>
-        <w:t>Figure 4.6 : Tableau Kanban du pipeline de recrutement</w:t>
+        <w:t>Figure 4.4 : Gestion des candidats — vue liste avec score IA</w:t>
       </w:r>
       <w:r>
         <w:tab/>
+      </w:r>
+      <w:r>
         <w:t>35</w:t>
       </w:r>
     </w:p>
@@ -5549,10 +5746,12 @@
         </w:tabs>
       </w:pPr>
       <w:r>
-        <w:t>Figure 4.7 : Gestion des entretiens</w:t>
+        <w:t>Figure 4.5 : Modification d'un dossier candidat</w:t>
       </w:r>
       <w:r>
         <w:tab/>
+      </w:r>
+      <w:r>
         <w:t>35</w:t>
       </w:r>
     </w:p>
@@ -5563,10 +5762,12 @@
         </w:tabs>
       </w:pPr>
       <w:r>
-        <w:t>Figure 4.8 : Gestion des feedbacks</w:t>
+        <w:t>Figure 4.6 : Tableau Kanban du pipeline de recrutement</w:t>
       </w:r>
       <w:r>
         <w:tab/>
+      </w:r>
+      <w:r>
         <w:t>36</w:t>
       </w:r>
     </w:p>
@@ -5577,10 +5778,12 @@
         </w:tabs>
       </w:pPr>
       <w:r>
-        <w:t>Figure 4.9 : Gestion des utilisateurs et des rôles (espace Administrateur)</w:t>
+        <w:t>Figure 4.7 : Gestion des entretiens</w:t>
       </w:r>
       <w:r>
         <w:tab/>
+      </w:r>
+      <w:r>
         <w:t>36</w:t>
       </w:r>
     </w:p>
@@ -5591,10 +5794,12 @@
         </w:tabs>
       </w:pPr>
       <w:r>
-        <w:t>Figure 4.10 : Paramétrage du scoring IA par famille de métier</w:t>
+        <w:t>Figure 4.8 : Gestion des feedbacks</w:t>
       </w:r>
       <w:r>
         <w:tab/>
+      </w:r>
+      <w:r>
         <w:t>37</w:t>
       </w:r>
     </w:p>
@@ -5605,30 +5810,14 @@
         </w:tabs>
       </w:pPr>
       <w:r>
-        <w:t>Figure 4.11 : Journal d'audit</w:t>
+        <w:t>Figure 4.9 : Gestion des utilisateurs et des rôles (espace Administrateur)</w:t>
       </w:r>
       <w:r>
         <w:tab/>
+      </w:r>
+      <w:r>
         <w:t>37</w:t>
       </w:r>
-    </w:p>
-    <w:p>
-      <w:pPr>
-        <w:spacing w:line="278" w:lineRule="auto"/>
-      </w:pPr>
-      <w:r>
-        <w:br w:type="page"/>
-      </w:r>
-    </w:p>
-    <w:p>
-      <w:pPr>
-        <w:pStyle w:val="Titre1"/>
-      </w:pPr>
-      <w:bookmarkStart w:id="2" w:name="_Toc238461613"/>
-      <w:r>
-        <w:t>Liste des tableaux</w:t>
-      </w:r>
-      <w:bookmarkEnd w:id="2"/>
     </w:p>
     <w:p>
       <w:pPr>
@@ -5637,11 +5826,13 @@
         </w:tabs>
       </w:pPr>
       <w:r>
-        <w:t>Tableau 2.1 : Matrice des responsabilités par rôle</w:t>
+        <w:t>Figure 4.10 : Paramétrage du scoring IA par famille de métier</w:t>
       </w:r>
       <w:r>
         <w:tab/>
-        <w:t>16</w:t>
+      </w:r>
+      <w:r>
+        <w:t>38</w:t>
       </w:r>
     </w:p>
     <w:p>
@@ -5651,14 +5842,13 @@
         </w:tabs>
       </w:pPr>
       <w:r>
-        <w:t xml:space="preserve">Tableau 4.1 : </w:t>
-      </w:r>
-      <w:r>
-        <w:t>Synthèse des tests fonctionnels réalisés</w:t>
+        <w:t>Figure 4.11 : Journal d'audit</w:t>
       </w:r>
       <w:r>
         <w:tab/>
-        <w:t>39</w:t>
+      </w:r>
+      <w:r>
+        <w:t>38</w:t>
       </w:r>
     </w:p>
     <w:p>
@@ -5668,11 +5858,80 @@
         </w:tabs>
       </w:pPr>
       <w:r>
+        <w:t>Figure 4.12 : Assistant conversationnel candidat (chatbot)</w:t>
+      </w:r>
+      <w:r>
+        <w:tab/>
+      </w:r>
+      <w:r>
+        <w:t>39</w:t>
+      </w:r>
+    </w:p>
+    <w:p>
+      <w:pPr>
+        <w:spacing w:line="278" w:lineRule="auto"/>
+      </w:pPr>
+      <w:r>
+        <w:br w:type="page"/>
+      </w:r>
+    </w:p>
+    <w:p>
+      <w:pPr>
+        <w:pStyle w:val="Titre1"/>
+      </w:pPr>
+      <w:bookmarkStart w:id="2" w:name="_Toc238477276"/>
+      <w:r>
+        <w:t>Liste des tableaux</w:t>
+      </w:r>
+      <w:bookmarkEnd w:id="2"/>
+    </w:p>
+    <w:p>
+      <w:pPr>
+        <w:tabs>
+          <w:tab w:val="right" w:leader="dot" w:pos="8600"/>
+        </w:tabs>
+      </w:pPr>
+      <w:r>
+        <w:t>Tableau 2.1 : Matrice des responsabilités par rôle</w:t>
+      </w:r>
+      <w:r>
+        <w:tab/>
+        <w:t>16</w:t>
+      </w:r>
+    </w:p>
+    <w:p>
+      <w:pPr>
+        <w:tabs>
+          <w:tab w:val="right" w:leader="dot" w:pos="8600"/>
+        </w:tabs>
+      </w:pPr>
+      <w:r>
+        <w:t xml:space="preserve">Tableau 4.1 : </w:t>
+      </w:r>
+      <w:r>
+        <w:t>Synthèse des tests fonctionnels réalisés</w:t>
+      </w:r>
+      <w:r>
+        <w:tab/>
+      </w:r>
+      <w:r>
+        <w:t>40</w:t>
+      </w:r>
+    </w:p>
+    <w:p>
+      <w:pPr>
+        <w:tabs>
+          <w:tab w:val="right" w:leader="dot" w:pos="8600"/>
+        </w:tabs>
+      </w:pPr>
+      <w:r>
         <w:t>Tableau 4.2 : Bilan des fonctionnalités réalisées</w:t>
       </w:r>
       <w:r>
         <w:tab/>
-        <w:t>43</w:t>
+      </w:r>
+      <w:r>
+        <w:t>46</w:t>
       </w:r>
     </w:p>
     <w:p>
@@ -5688,7 +5947,7 @@
         <w:pStyle w:val="Titre1"/>
         <w:jc w:val="center"/>
       </w:pPr>
-      <w:bookmarkStart w:id="3" w:name="_Toc238461614"/>
+      <w:bookmarkStart w:id="3" w:name="_Toc238477277"/>
       <w:r>
         <w:t>Introduction Générale</w:t>
       </w:r>
@@ -5721,7 +5980,7 @@
       <w:pPr>
         <w:pStyle w:val="Titre1"/>
       </w:pPr>
-      <w:bookmarkStart w:id="4" w:name="_Toc238461615"/>
+      <w:bookmarkStart w:id="4" w:name="_Toc238477278"/>
       <w:r>
         <w:t>Chapitre 1 : Cadre Général du Projet</w:t>
       </w:r>
@@ -5736,7 +5995,7 @@
       <w:pPr>
         <w:pStyle w:val="Titre2"/>
       </w:pPr>
-      <w:bookmarkStart w:id="5" w:name="_Toc238461616"/>
+      <w:bookmarkStart w:id="5" w:name="_Toc238477279"/>
       <w:r>
         <w:t>1.1 Introduction</w:t>
       </w:r>
@@ -5751,7 +6010,7 @@
       <w:pPr>
         <w:pStyle w:val="Titre2"/>
       </w:pPr>
-      <w:bookmarkStart w:id="6" w:name="_Toc238461617"/>
+      <w:bookmarkStart w:id="6" w:name="_Toc238477280"/>
       <w:r>
         <w:t>1.2 Présentation de l'organisme d'accueil</w:t>
       </w:r>
@@ -5761,7 +6020,7 @@
       <w:pPr>
         <w:pStyle w:val="Titre3"/>
       </w:pPr>
-      <w:bookmarkStart w:id="7" w:name="_Toc238461618"/>
+      <w:bookmarkStart w:id="7" w:name="_Toc238477281"/>
       <w:r>
         <w:t>1.2.1 Le groupe Sopra Steria</w:t>
       </w:r>
@@ -5776,7 +6035,7 @@
       <w:pPr>
         <w:pStyle w:val="Titre3"/>
       </w:pPr>
-      <w:bookmarkStart w:id="8" w:name="_Toc238461619"/>
+      <w:bookmarkStart w:id="8" w:name="_Toc238477282"/>
       <w:r>
         <w:t>1.2.2 Sopra HR Software</w:t>
       </w:r>
@@ -5796,7 +6055,7 @@
       <w:pPr>
         <w:pStyle w:val="Titre2"/>
       </w:pPr>
-      <w:bookmarkStart w:id="9" w:name="_Toc238461620"/>
+      <w:bookmarkStart w:id="9" w:name="_Toc238477283"/>
       <w:r>
         <w:t>1.3 Étude de l'existant</w:t>
       </w:r>
@@ -5884,7 +6143,7 @@
       <w:pPr>
         <w:pStyle w:val="Titre2"/>
       </w:pPr>
-      <w:bookmarkStart w:id="10" w:name="_Toc238461621"/>
+      <w:bookmarkStart w:id="10" w:name="_Toc238477284"/>
       <w:r>
         <w:t>1.4 Critique de l'existant et problématique</w:t>
       </w:r>
@@ -5904,7 +6163,7 @@
       <w:pPr>
         <w:pStyle w:val="Titre2"/>
       </w:pPr>
-      <w:bookmarkStart w:id="11" w:name="_Toc238461622"/>
+      <w:bookmarkStart w:id="11" w:name="_Toc238477285"/>
       <w:r>
         <w:t>1.5 Objectifs du projet</w:t>
       </w:r>
@@ -5991,7 +6250,7 @@
       <w:pPr>
         <w:pStyle w:val="Titre2"/>
       </w:pPr>
-      <w:bookmarkStart w:id="12" w:name="_Toc238461623"/>
+      <w:bookmarkStart w:id="12" w:name="_Toc238477286"/>
       <w:r>
         <w:t>1.6 Présentation de la solution proposée : JOB4YOU</w:t>
       </w:r>
@@ -6060,7 +6319,7 @@
       <w:pPr>
         <w:pStyle w:val="Titre2"/>
       </w:pPr>
-      <w:bookmarkStart w:id="13" w:name="_Toc238461624"/>
+      <w:bookmarkStart w:id="13" w:name="_Toc238477287"/>
       <w:r>
         <w:t>1.7 Méthodologie de travail adoptée</w:t>
       </w:r>
@@ -6080,7 +6339,7 @@
       <w:pPr>
         <w:pStyle w:val="Titre2"/>
       </w:pPr>
-      <w:bookmarkStart w:id="14" w:name="_Toc238461625"/>
+      <w:bookmarkStart w:id="14" w:name="_Toc238477288"/>
       <w:r>
         <w:t>1.8 Planification du projet</w:t>
       </w:r>
@@ -6488,7 +6747,7 @@
       <w:pPr>
         <w:pStyle w:val="Titre2"/>
       </w:pPr>
-      <w:bookmarkStart w:id="15" w:name="_Toc238461626"/>
+      <w:bookmarkStart w:id="15" w:name="_Toc238477289"/>
       <w:r>
         <w:t>1.9 Conclusion</w:t>
       </w:r>
@@ -6511,7 +6770,7 @@
       <w:pPr>
         <w:pStyle w:val="Titre1"/>
       </w:pPr>
-      <w:bookmarkStart w:id="16" w:name="_Toc238461627"/>
+      <w:bookmarkStart w:id="16" w:name="_Toc238477290"/>
       <w:r>
         <w:t>Chapitre 2 : Analyse et Spécification des Besoins</w:t>
       </w:r>
@@ -6526,7 +6785,7 @@
       <w:pPr>
         <w:pStyle w:val="Titre2"/>
       </w:pPr>
-      <w:bookmarkStart w:id="17" w:name="_Toc238461628"/>
+      <w:bookmarkStart w:id="17" w:name="_Toc238477291"/>
       <w:r>
         <w:t>2.1 Introduction</w:t>
       </w:r>
@@ -6541,7 +6800,7 @@
       <w:pPr>
         <w:pStyle w:val="Titre2"/>
       </w:pPr>
-      <w:bookmarkStart w:id="18" w:name="_Toc238461629"/>
+      <w:bookmarkStart w:id="18" w:name="_Toc238477292"/>
       <w:r>
         <w:t>2.2 Étude fonctionnelle</w:t>
       </w:r>
@@ -6551,7 +6810,7 @@
       <w:pPr>
         <w:pStyle w:val="Titre3"/>
       </w:pPr>
-      <w:bookmarkStart w:id="19" w:name="_Toc238461630"/>
+      <w:bookmarkStart w:id="19" w:name="_Toc238477293"/>
       <w:r>
         <w:t>2.2.1 Identification des acteurs du système</w:t>
       </w:r>
@@ -7513,7 +7772,7 @@
       <w:pPr>
         <w:pStyle w:val="Titre3"/>
       </w:pPr>
-      <w:bookmarkStart w:id="20" w:name="_Toc238461631"/>
+      <w:bookmarkStart w:id="20" w:name="_Toc238477294"/>
       <w:r>
         <w:t>2.2.2 Identification des besoins fonctionnels</w:t>
       </w:r>
@@ -7661,7 +7920,7 @@
       <w:pPr>
         <w:pStyle w:val="Titre3"/>
       </w:pPr>
-      <w:bookmarkStart w:id="21" w:name="_Toc238461632"/>
+      <w:bookmarkStart w:id="21" w:name="_Toc238477295"/>
       <w:r>
         <w:t>2.2.3 Identification des besoins non fonctionnels</w:t>
       </w:r>
@@ -7748,7 +8007,7 @@
       <w:pPr>
         <w:pStyle w:val="Titre3"/>
       </w:pPr>
-      <w:bookmarkStart w:id="22" w:name="_Toc238461633"/>
+      <w:bookmarkStart w:id="22" w:name="_Toc238477296"/>
       <w:r>
         <w:t>2.2.4 Diagramme de cas d'utilisation</w:t>
       </w:r>
@@ -7771,7 +8030,7 @@
         <w:lastRenderedPageBreak/>
         <w:pict w14:anchorId="502D5C14">
           <v:shape id="Image 2" o:spid="_x0000_i1026" type="#_x0000_t75" style="width:300pt;height:647.4pt;visibility:visible;mso-wrap-style:square">
-            <v:imagedata r:id="rId13" o:title=""/>
+            <v:imagedata r:id="rId10" o:title=""/>
             <o:lock v:ext="edit" aspectratio="f"/>
           </v:shape>
         </w:pict>
@@ -7798,7 +8057,7 @@
       <w:pPr>
         <w:pStyle w:val="Titre3"/>
       </w:pPr>
-      <w:bookmarkStart w:id="23" w:name="_Toc238461634"/>
+      <w:bookmarkStart w:id="23" w:name="_Toc238477297"/>
       <w:r>
         <w:t>2.2.5 Description textuelle de quelques cas d'utilisation</w:t>
       </w:r>
@@ -8186,7 +8445,7 @@
       <w:pPr>
         <w:pStyle w:val="Titre3"/>
       </w:pPr>
-      <w:bookmarkStart w:id="24" w:name="_Toc238461635"/>
+      <w:bookmarkStart w:id="24" w:name="_Toc238477298"/>
       <w:r>
         <w:t>2.2.6 Diagramme de séquence système</w:t>
       </w:r>
@@ -8207,7 +8466,7 @@
         </w:rPr>
         <w:pict w14:anchorId="0BD5B398">
           <v:shape id="Image 3" o:spid="_x0000_i1027" type="#_x0000_t75" style="width:429.6pt;height:195.6pt;visibility:visible;mso-wrap-style:square">
-            <v:imagedata r:id="rId14" o:title=""/>
+            <v:imagedata r:id="rId11" o:title=""/>
           </v:shape>
         </w:pict>
       </w:r>
@@ -8233,7 +8492,7 @@
       <w:pPr>
         <w:pStyle w:val="Titre2"/>
       </w:pPr>
-      <w:bookmarkStart w:id="25" w:name="_Toc238461636"/>
+      <w:bookmarkStart w:id="25" w:name="_Toc238477299"/>
       <w:r>
         <w:t>2.3 Étude technique</w:t>
       </w:r>
@@ -8243,7 +8502,7 @@
       <w:pPr>
         <w:pStyle w:val="Titre3"/>
       </w:pPr>
-      <w:bookmarkStart w:id="26" w:name="_Toc238461637"/>
+      <w:bookmarkStart w:id="26" w:name="_Toc238477300"/>
       <w:r>
         <w:t>2.3.1 Architecture physique</w:t>
       </w:r>
@@ -8271,7 +8530,7 @@
         </w:rPr>
         <w:pict w14:anchorId="470F3FC0">
           <v:shape id="Image 4" o:spid="_x0000_i1028" type="#_x0000_t75" style="width:420pt;height:92.4pt;visibility:visible;mso-wrap-style:square">
-            <v:imagedata r:id="rId15" o:title=""/>
+            <v:imagedata r:id="rId12" o:title=""/>
           </v:shape>
         </w:pict>
       </w:r>
@@ -8297,7 +8556,7 @@
       <w:pPr>
         <w:pStyle w:val="Titre3"/>
       </w:pPr>
-      <w:bookmarkStart w:id="27" w:name="_Toc238461638"/>
+      <w:bookmarkStart w:id="27" w:name="_Toc238477301"/>
       <w:r>
         <w:t>2.3.2 Côté client — Angular</w:t>
       </w:r>
@@ -8312,7 +8571,7 @@
       <w:pPr>
         <w:pStyle w:val="Titre3"/>
       </w:pPr>
-      <w:bookmarkStart w:id="28" w:name="_Toc238461639"/>
+      <w:bookmarkStart w:id="28" w:name="_Toc238477302"/>
       <w:r>
         <w:t>2.3.3 Côté serveur — Spring Boot</w:t>
       </w:r>
@@ -8327,7 +8586,7 @@
       <w:pPr>
         <w:pStyle w:val="Titre3"/>
       </w:pPr>
-      <w:bookmarkStart w:id="29" w:name="_Toc238461640"/>
+      <w:bookmarkStart w:id="29" w:name="_Toc238477303"/>
       <w:r>
         <w:t>2.3.4 La sécurité — Spring Security et JWT</w:t>
       </w:r>
@@ -8342,7 +8601,7 @@
       <w:pPr>
         <w:pStyle w:val="Titre2"/>
       </w:pPr>
-      <w:bookmarkStart w:id="30" w:name="_Toc238461641"/>
+      <w:bookmarkStart w:id="30" w:name="_Toc238477304"/>
       <w:r>
         <w:t>2.4 Conclusion</w:t>
       </w:r>
@@ -8365,7 +8624,7 @@
       <w:pPr>
         <w:pStyle w:val="Titre1"/>
       </w:pPr>
-      <w:bookmarkStart w:id="31" w:name="_Toc238461642"/>
+      <w:bookmarkStart w:id="31" w:name="_Toc238477305"/>
       <w:r>
         <w:t>Chapitre 3 : Conception</w:t>
       </w:r>
@@ -8380,7 +8639,7 @@
       <w:pPr>
         <w:pStyle w:val="Titre2"/>
       </w:pPr>
-      <w:bookmarkStart w:id="32" w:name="_Toc238461643"/>
+      <w:bookmarkStart w:id="32" w:name="_Toc238477306"/>
       <w:r>
         <w:t>3.1 Introduction</w:t>
       </w:r>
@@ -8395,7 +8654,7 @@
       <w:pPr>
         <w:pStyle w:val="Titre2"/>
       </w:pPr>
-      <w:bookmarkStart w:id="33" w:name="_Toc238461644"/>
+      <w:bookmarkStart w:id="33" w:name="_Toc238477307"/>
       <w:r>
         <w:t>3.2 Diagramme des paquetages</w:t>
       </w:r>
@@ -8416,7 +8675,7 @@
         </w:rPr>
         <w:pict w14:anchorId="73EFB9F8">
           <v:shape id="Image 5" o:spid="_x0000_i1029" type="#_x0000_t75" style="width:429.6pt;height:226.8pt;visibility:visible;mso-wrap-style:square">
-            <v:imagedata r:id="rId16" o:title=""/>
+            <v:imagedata r:id="rId13" o:title=""/>
           </v:shape>
         </w:pict>
       </w:r>
@@ -8447,7 +8706,7 @@
       <w:pPr>
         <w:pStyle w:val="Titre2"/>
       </w:pPr>
-      <w:bookmarkStart w:id="34" w:name="_Toc238461645"/>
+      <w:bookmarkStart w:id="34" w:name="_Toc238477308"/>
       <w:r>
         <w:t>3.3 Diagramme de classes global</w:t>
       </w:r>
@@ -8461,12 +8720,12 @@
     <w:p>
       <w:pPr>
         <w:sectPr>
-          <w:headerReference w:type="even" r:id="rId17"/>
-          <w:headerReference w:type="default" r:id="rId18"/>
-          <w:footerReference w:type="even" r:id="rId19"/>
-          <w:footerReference w:type="default" r:id="rId20"/>
-          <w:headerReference w:type="first" r:id="rId21"/>
-          <w:footerReference w:type="first" r:id="rId22"/>
+          <w:headerReference w:type="even" r:id="rId14"/>
+          <w:headerReference w:type="default" r:id="rId15"/>
+          <w:footerReference w:type="even" r:id="rId16"/>
+          <w:footerReference w:type="default" r:id="rId17"/>
+          <w:headerReference w:type="first" r:id="rId18"/>
+          <w:footerReference w:type="first" r:id="rId19"/>
           <w:pgSz w:w="11906" w:h="16838"/>
           <w:pgMar w:top="426" w:right="720" w:bottom="720" w:left="720" w:header="708" w:footer="708" w:gutter="0"/>
           <w:cols w:space="708"/>
@@ -8485,7 +8744,7 @@
         <w:lastRenderedPageBreak/>
         <w:pict w14:anchorId="598E410F">
           <v:shape id="Image 6" o:spid="_x0000_i1030" type="#_x0000_t75" style="width:724.8pt;height:202.8pt;visibility:visible;mso-wrap-style:square">
-            <v:imagedata r:id="rId23" o:title=""/>
+            <v:imagedata r:id="rId20" o:title=""/>
           </v:shape>
         </w:pict>
       </w:r>
@@ -8528,7 +8787,7 @@
       <w:pPr>
         <w:pStyle w:val="Titre2"/>
       </w:pPr>
-      <w:bookmarkStart w:id="35" w:name="_Toc238461646"/>
+      <w:bookmarkStart w:id="35" w:name="_Toc238477309"/>
       <w:r>
         <w:t>3.4 Diagrammes de séquence objet</w:t>
       </w:r>
@@ -8536,14 +8795,14 @@
     </w:p>
     <w:p>
       <w:r>
-        <w:t>Les deux diagrammes qui suivent détaillent, au niveau objet, deux scénarios clés du processus de recrutement : la planification d'un entretien et la décision finale de recrutement.</w:t>
+        <w:t>Les quatre diagrammes qui suivent détaillent, au niveau objet, deux scénarios clés du processus de recrutement : la planification d'un entretien et la décision finale de recrutement.</w:t>
       </w:r>
     </w:p>
     <w:p>
       <w:pPr>
         <w:pStyle w:val="Titre3"/>
       </w:pPr>
-      <w:bookmarkStart w:id="36" w:name="_Toc238461647"/>
+      <w:bookmarkStart w:id="36" w:name="_Toc238477310"/>
       <w:r>
         <w:t>3.4.1 Planifier un entretien</w:t>
       </w:r>
@@ -8559,7 +8818,7 @@
         </w:rPr>
         <w:pict w14:anchorId="259C4FBE">
           <v:shape id="Image 7" o:spid="_x0000_i1031" type="#_x0000_t75" style="width:445.2pt;height:222.6pt;visibility:visible;mso-wrap-style:square">
-            <v:imagedata r:id="rId24" o:title=""/>
+            <v:imagedata r:id="rId21" o:title=""/>
           </v:shape>
         </w:pict>
       </w:r>
@@ -8590,7 +8849,7 @@
       <w:pPr>
         <w:pStyle w:val="Titre3"/>
       </w:pPr>
-      <w:bookmarkStart w:id="37" w:name="_Toc238461648"/>
+      <w:bookmarkStart w:id="37" w:name="_Toc238477311"/>
       <w:r>
         <w:lastRenderedPageBreak/>
         <w:t>3.4.2 Décision finale de recrutement</w:t>
@@ -8607,6 +8866,197 @@
         </w:rPr>
         <w:pict w14:anchorId="52C8B92C">
           <v:shape id="Image 8" o:spid="_x0000_i1032" type="#_x0000_t75" style="width:444.6pt;height:210.6pt;visibility:visible;mso-wrap-style:square">
+            <v:imagedata r:id="rId22" o:title=""/>
+          </v:shape>
+        </w:pict>
+      </w:r>
+    </w:p>
+    <w:p>
+      <w:pPr>
+        <w:jc w:val="center"/>
+        <w:rPr>
+          <w:i/>
+          <w:sz w:val="21"/>
+        </w:rPr>
+      </w:pPr>
+      <w:r>
+        <w:rPr>
+          <w:i/>
+          <w:sz w:val="21"/>
+        </w:rPr>
+        <w:t>Figure 3.4 : Diagramme de séquence objet — Décision finale de recrutement</w:t>
+      </w:r>
+    </w:p>
+    <w:p/>
+    <w:p>
+      <w:r>
+        <w:t>Ce second diagramme illustre un autre garde-fou central de l'application : qu'elle soit prise par un manager ou par le RH, la décision finale (acceptation ou refus) ne peut s'appliquer que si le dossier a déjà été validé par le RH (statut CV_REVIEWED ou ultérieur) — ce qui empêche qu'une candidature soit acceptée ou refusée sans revue administrative préalable.</w:t>
+      </w:r>
+    </w:p>
+    <w:p>
+      <w:pPr>
+        <w:pStyle w:val="Titre3"/>
+      </w:pPr>
+      <w:bookmarkStart w:id="38" w:name="_Toc238477312"/>
+      <w:r>
+        <w:t>3.4.3 Analyse IA du CV (extraction, scoring via n8n et Cohere)</w:t>
+      </w:r>
+      <w:bookmarkEnd w:id="38"/>
+    </w:p>
+    <w:p/>
+    <w:p>
+      <w:pPr>
+        <w:jc w:val="center"/>
+      </w:pPr>
+      <w:r>
+        <w:rPr>
+          <w:noProof/>
+        </w:rPr>
+        <w:drawing>
+          <wp:inline distT="0" distB="0" distL="0" distR="0" wp14:anchorId="70D01C73" wp14:editId="7AE05D0A">
+            <wp:extent cx="5760000" cy="3574115"/>
+            <wp:effectExtent l="0" t="0" r="0" b="0"/>
+            <wp:docPr id="1" name="Picture 1"/>
+            <wp:cNvGraphicFramePr>
+              <a:graphicFrameLocks xmlns:a="http://schemas.openxmlformats.org/drawingml/2006/main" noChangeAspect="1"/>
+            </wp:cNvGraphicFramePr>
+            <a:graphic xmlns:a="http://schemas.openxmlformats.org/drawingml/2006/main">
+              <a:graphicData uri="http://schemas.openxmlformats.org/drawingml/2006/picture">
+                <pic:pic xmlns:pic="http://schemas.openxmlformats.org/drawingml/2006/picture">
+                  <pic:nvPicPr>
+                    <pic:cNvPr id="0" name="image.png"/>
+                    <pic:cNvPicPr/>
+                  </pic:nvPicPr>
+                  <pic:blipFill>
+                    <a:blip r:embed="rId23"/>
+                    <a:stretch>
+                      <a:fillRect/>
+                    </a:stretch>
+                  </pic:blipFill>
+                  <pic:spPr>
+                    <a:xfrm>
+                      <a:off x="0" y="0"/>
+                      <a:ext cx="5760000" cy="3574115"/>
+                    </a:xfrm>
+                    <a:prstGeom prst="rect">
+                      <a:avLst/>
+                    </a:prstGeom>
+                  </pic:spPr>
+                </pic:pic>
+              </a:graphicData>
+            </a:graphic>
+          </wp:inline>
+        </w:drawing>
+      </w:r>
+    </w:p>
+    <w:p/>
+    <w:p>
+      <w:r>
+        <w:t>Figure 3.5 : Diagramme de séquence objet — Analyse IA du CV</w:t>
+      </w:r>
+    </w:p>
+    <w:p/>
+    <w:p>
+      <w:r>
+        <w:t>Ce diagramme détaille, au niveau objet, le cheminement décrit textuellement en section 3.5 : dès l'enregistrement de la candidature (statut APPLIED), le texte du CV est extrait puis un webhook n8n déclenche l'analyse asynchrone par l'agent CV Parser, qui interroge l'API Cohere et renvoie un score par chaîne de rappel (PATCH /api/candidates/{id}/ai-score). Le statut bascule ensuite automatiquement vers CV_REVIEWED ou AUTO_REJECTED selon le seuil configuré, sans intervention humaine à ce stade.</w:t>
+      </w:r>
+    </w:p>
+    <w:p/>
+    <w:p>
+      <w:pPr>
+        <w:pStyle w:val="Titre3"/>
+      </w:pPr>
+      <w:bookmarkStart w:id="39" w:name="_Toc238477313"/>
+      <w:r>
+        <w:t>3.4.4 Passage en évaluation technique — routage et notification des managers</w:t>
+      </w:r>
+      <w:bookmarkEnd w:id="39"/>
+    </w:p>
+    <w:p/>
+    <w:p>
+      <w:pPr>
+        <w:jc w:val="center"/>
+      </w:pPr>
+      <w:r>
+        <w:rPr>
+          <w:noProof/>
+        </w:rPr>
+        <w:drawing>
+          <wp:inline distT="0" distB="0" distL="0" distR="0" wp14:anchorId="0C5E43BE" wp14:editId="17599449">
+            <wp:extent cx="5760000" cy="3167819"/>
+            <wp:effectExtent l="0" t="0" r="0" b="0"/>
+            <wp:docPr id="2" name="Picture 2"/>
+            <wp:cNvGraphicFramePr>
+              <a:graphicFrameLocks xmlns:a="http://schemas.openxmlformats.org/drawingml/2006/main" noChangeAspect="1"/>
+            </wp:cNvGraphicFramePr>
+            <a:graphic xmlns:a="http://schemas.openxmlformats.org/drawingml/2006/main">
+              <a:graphicData uri="http://schemas.openxmlformats.org/drawingml/2006/picture">
+                <pic:pic xmlns:pic="http://schemas.openxmlformats.org/drawingml/2006/picture">
+                  <pic:nvPicPr>
+                    <pic:cNvPr id="0" name="image.png"/>
+                    <pic:cNvPicPr/>
+                  </pic:nvPicPr>
+                  <pic:blipFill>
+                    <a:blip r:embed="rId24"/>
+                    <a:stretch>
+                      <a:fillRect/>
+                    </a:stretch>
+                  </pic:blipFill>
+                  <pic:spPr>
+                    <a:xfrm>
+                      <a:off x="0" y="0"/>
+                      <a:ext cx="5760000" cy="3167819"/>
+                    </a:xfrm>
+                    <a:prstGeom prst="rect">
+                      <a:avLst/>
+                    </a:prstGeom>
+                  </pic:spPr>
+                </pic:pic>
+              </a:graphicData>
+            </a:graphic>
+          </wp:inline>
+        </w:drawing>
+      </w:r>
+    </w:p>
+    <w:p/>
+    <w:p>
+      <w:r>
+        <w:t>Figure 3.6 : Diagramme de séquence objet — Routage et notification des managers</w:t>
+      </w:r>
+    </w:p>
+    <w:p/>
+    <w:p>
+      <w:r>
+        <w:t>Ce diagramme illustre le mécanisme de routage automatique décrit en section 4.5.5 : lorsqu'un dossier passe en évaluation technique, ManagerRoutingService résout les managers destinataires par priorité — d'abord par département de l'offre, à défaut par famille de métier, et en dernier recours via l'e-mail manager saisi manuellement sur l'offre. Chaque manager résolu reçoit ensuite une notification via l'agent n8n dédié.</w:t>
+      </w:r>
+    </w:p>
+    <w:p/>
+    <w:p>
+      <w:pPr>
+        <w:pStyle w:val="Titre2"/>
+      </w:pPr>
+      <w:bookmarkStart w:id="40" w:name="_Toc238477314"/>
+      <w:r>
+        <w:lastRenderedPageBreak/>
+        <w:t>3.5 Diagramme d'états — Cycle de vie d'une candidature</w:t>
+      </w:r>
+      <w:bookmarkEnd w:id="40"/>
+    </w:p>
+    <w:p>
+      <w:r>
+        <w:t>Tout au long du processus de recrutement, le statut d'un candidat évolue selon une machine à états précise, représentée ci-dessous. Cette modélisation garantit la cohérence des transitions et sert de référence pour l'implémentation des contrôles métier côté backend.</w:t>
+      </w:r>
+    </w:p>
+    <w:p>
+      <w:pPr>
+        <w:jc w:val="center"/>
+      </w:pPr>
+      <w:r>
+        <w:rPr>
+          <w:noProof/>
+        </w:rPr>
+        <w:pict w14:anchorId="51AEDC00">
+          <v:shape id="Image 9" o:spid="_x0000_i1033" type="#_x0000_t75" style="width:400.2pt;height:487.2pt;visibility:visible;mso-wrap-style:square">
             <v:imagedata r:id="rId25" o:title=""/>
           </v:shape>
         </w:pict>
@@ -8625,88 +9075,35 @@
           <w:i/>
           <w:sz w:val="21"/>
         </w:rPr>
-        <w:t>Figure 3.4 : Diagramme de séquence objet — Décision finale de recrutement</w:t>
+        <w:t>Figure 3.7 : Diagramme d'états du cycle de vie d'une candidature</w:t>
       </w:r>
     </w:p>
     <w:p/>
     <w:p>
       <w:r>
-        <w:t>Ce second diagramme illustre un autre garde-fou central de l'application : qu'elle soit prise par un manager ou par le RH, la décision finale (acceptation ou refus) ne peut s'appliquer que si le dossier a déjà été validé par le RH (statut CV_REVIEWED ou ultérieur) — ce qui empêche qu'une candidature soit acceptée ou refusée sans revue administrative préalable.</w:t>
+        <w:t>On y distingue notamment un embranchement automatique piloté par le score de l'analyse IA — statut CV_REVIEWED si le score atteint le seuil de 60/100, AUTO_REJECTED sinon — ainsi que des états terminaux (HIRED, MANAGER_REJECTED, AUTO_REJECTED, WITHDRAWN), au-delà desquels l'interface d'administration n'autorise plus aucune modification du statut.</w:t>
+      </w:r>
+    </w:p>
+    <w:p>
+      <w:r>
+        <w:lastRenderedPageBreak/>
+        <w:t>Ce rejet automatique n'a rien de définitif, ni d'entièrement hors de contrôle humain : à tout moment, le RH ou l'Administrateur peut corriger manuellement le score d'un candidat via un mécanisme de surcharge (manualScore), qui exige une justification et journalise systématiquement la correction dans l'audit. Le score IA joue ainsi un rôle de filtre de présélection assisté — pas celui d'une autorité décisionnelle autonome.</w:t>
+      </w:r>
+    </w:p>
+    <w:p>
+      <w:r>
+        <w:t>Le cheminement d'une candidature à travers le scoring IA peut se résumer ainsi : CV candidat → extraction du texte du CV → agent n8n (CV Parser) → appel de l'API Cohere → analyse sémantique et scoring → score global sur 100 → orientation automatique vers CV_REVIEWED (score supérieur ou égal à 60) ou AUTO_REJECTED (score inférieur à 60) → validation humaine possible, le RH ou l'Administrateur pouvant corriger le score via le mécanisme de surcharge.</w:t>
       </w:r>
     </w:p>
     <w:p>
       <w:pPr>
         <w:pStyle w:val="Titre2"/>
       </w:pPr>
-      <w:bookmarkStart w:id="38" w:name="_Toc238461649"/>
-      <w:r>
-        <w:t>3.5 Diagramme d'états — Cycle de vie d'une candidature</w:t>
-      </w:r>
-      <w:bookmarkEnd w:id="38"/>
-    </w:p>
-    <w:p>
-      <w:r>
-        <w:t>Tout au long du processus de recrutement, le statut d'un candidat évolue selon une machine à états précise, représentée ci-dessous. Cette modélisation garantit la cohérence des transitions et sert de référence pour l'implémentation des contrôles métier côté backend.</w:t>
-      </w:r>
-    </w:p>
-    <w:p>
-      <w:pPr>
-        <w:jc w:val="center"/>
-      </w:pPr>
-      <w:r>
-        <w:rPr>
-          <w:noProof/>
-        </w:rPr>
-        <w:lastRenderedPageBreak/>
-        <w:pict w14:anchorId="51AEDC00">
-          <v:shape id="Image 9" o:spid="_x0000_i1033" type="#_x0000_t75" style="width:400.2pt;height:487.2pt;visibility:visible;mso-wrap-style:square">
-            <v:imagedata r:id="rId26" o:title=""/>
-          </v:shape>
-        </w:pict>
-      </w:r>
-    </w:p>
-    <w:p>
-      <w:pPr>
-        <w:jc w:val="center"/>
-        <w:rPr>
-          <w:i/>
-          <w:sz w:val="21"/>
-        </w:rPr>
-      </w:pPr>
-      <w:r>
-        <w:rPr>
-          <w:i/>
-          <w:sz w:val="21"/>
-        </w:rPr>
-        <w:t>Figure 3.5 : Diagramme d'états du cycle de vie d'une candidature</w:t>
-      </w:r>
-    </w:p>
-    <w:p/>
-    <w:p>
-      <w:r>
-        <w:t>On y distingue notamment un embranchement automatique piloté par le score de l'analyse IA — statut CV_REVIEWED si le score atteint le seuil de 60/100, AUTO_REJECTED sinon — ainsi que des états terminaux (HIRED, MANAGER_REJECTED, AUTO_REJECTED, WITHDRAWN), au-delà desquels l'interface d'administration n'autorise plus aucune modification du statut.</w:t>
-      </w:r>
-    </w:p>
-    <w:p>
-      <w:r>
-        <w:t>Ce rejet automatique n'a rien de définitif, ni d'entièrement hors de contrôle humain : à tout moment, le RH ou l'Administrateur peut corriger manuellement le score d'un candidat via un mécanisme de surcharge (manualScore), qui exige une justification et journalise systématiquement la correction dans l'audit. Le score IA joue ainsi un rôle de filtre de présélection assisté — pas celui d'une autorité décisionnelle autonome.</w:t>
-      </w:r>
-    </w:p>
-    <w:p>
-      <w:r>
-        <w:lastRenderedPageBreak/>
-        <w:t>Le cheminement d'une candidature à travers le scoring IA peut se résumer ainsi : CV candidat → extraction du texte du CV → agent n8n (CV Parser) → appel de l'API Cohere → analyse sémantique et scoring → score global sur 100 → orientation automatique vers CV_REVIEWED (score supérieur ou égal à 60) ou AUTO_REJECTED (score inférieur à 60) → validation humaine possible, le RH ou l'Administrateur pouvant corriger le score via le mécanisme de surcharge.</w:t>
-      </w:r>
-    </w:p>
-    <w:p>
-      <w:pPr>
-        <w:pStyle w:val="Titre2"/>
-      </w:pPr>
-      <w:bookmarkStart w:id="39" w:name="_Toc238461650"/>
+      <w:bookmarkStart w:id="41" w:name="_Toc238477315"/>
       <w:r>
         <w:t>3.6 Conception de la base de données</w:t>
       </w:r>
-      <w:bookmarkEnd w:id="39"/>
+      <w:bookmarkEnd w:id="41"/>
     </w:p>
     <w:p>
       <w:r>
@@ -8740,7 +9137,7 @@
         <w:lastRenderedPageBreak/>
         <w:pict w14:anchorId="302CA6EE">
           <v:shape id="Image 10" o:spid="_x0000_i1034" type="#_x0000_t75" style="width:680.4pt;height:443.4pt;visibility:visible;mso-wrap-style:square">
-            <v:imagedata r:id="rId27" o:title=""/>
+            <v:imagedata r:id="rId26" o:title=""/>
           </v:shape>
         </w:pict>
       </w:r>
@@ -8758,7 +9155,7 @@
           <w:i/>
           <w:sz w:val="21"/>
         </w:rPr>
-        <w:t>Figure 3.6 : Schéma relationnel de la base de données PostgreSQL</w:t>
+        <w:t>Figure 3.8 : Schéma relationnel de la base de données PostgreSQL</w:t>
       </w:r>
     </w:p>
     <w:p>
@@ -8777,12 +9174,12 @@
       <w:pPr>
         <w:pStyle w:val="Titre2"/>
       </w:pPr>
-      <w:bookmarkStart w:id="40" w:name="_Toc238461651"/>
+      <w:bookmarkStart w:id="42" w:name="_Toc238477316"/>
       <w:r>
         <w:lastRenderedPageBreak/>
         <w:t>3.7 Diagramme de déploiement</w:t>
       </w:r>
-      <w:bookmarkEnd w:id="40"/>
+      <w:bookmarkEnd w:id="42"/>
     </w:p>
     <w:p>
       <w:r>
@@ -8799,6 +9196,62 @@
         </w:rPr>
         <w:pict w14:anchorId="7C6F7E72">
           <v:shape id="Image 11" o:spid="_x0000_i1035" type="#_x0000_t75" style="width:380.4pt;height:385.2pt;visibility:visible;mso-wrap-style:square">
+            <v:imagedata r:id="rId27" o:title=""/>
+          </v:shape>
+        </w:pict>
+      </w:r>
+    </w:p>
+    <w:p>
+      <w:pPr>
+        <w:jc w:val="center"/>
+        <w:rPr>
+          <w:i/>
+          <w:sz w:val="21"/>
+        </w:rPr>
+      </w:pPr>
+      <w:r>
+        <w:rPr>
+          <w:i/>
+          <w:sz w:val="21"/>
+        </w:rPr>
+        <w:t>Figure 3.9 : Diagramme de déploiement de la plateforme JOB4YOU</w:t>
+      </w:r>
+    </w:p>
+    <w:p/>
+    <w:p>
+      <w:r>
+        <w:t xml:space="preserve">Le frontend Angular et le backend Spring Boot tournent sur des serveurs distincts et communiquent via des API REST sécurisées par JWT. Le backend s'appuie sur une base de données PostgreSQL dédiée et déclenche, via des webhooks HTTP, les agents d'automatisation n8n — lesquels sollicitent à leur tour les services externes : API Cohere pour le scoring IA, </w:t>
+      </w:r>
+      <w:r>
+        <w:t>Google Calendar pour la création réelle de l’événement et du lien Google Meet lors de la planification, et serveur SMTP pour les notifications.</w:t>
+      </w:r>
+    </w:p>
+    <w:p>
+      <w:pPr>
+        <w:pStyle w:val="Titre2"/>
+      </w:pPr>
+      <w:bookmarkStart w:id="43" w:name="_Toc238477317"/>
+      <w:r>
+        <w:t>3.8 Diagramme de composants</w:t>
+      </w:r>
+      <w:bookmarkEnd w:id="43"/>
+    </w:p>
+    <w:p>
+      <w:r>
+        <w:t>Le diagramme ci-dessous détaille l'organisation interne du backend en composants logiciels, ainsi que leurs dépendances.</w:t>
+      </w:r>
+    </w:p>
+    <w:p>
+      <w:pPr>
+        <w:jc w:val="center"/>
+      </w:pPr>
+      <w:r>
+        <w:rPr>
+          <w:noProof/>
+        </w:rPr>
+        <w:lastRenderedPageBreak/>
+        <w:pict w14:anchorId="29E43F6E">
+          <v:shape id="Image 12" o:spid="_x0000_i1036" type="#_x0000_t75" style="width:440.4pt;height:395.4pt;visibility:visible;mso-wrap-style:square">
             <v:imagedata r:id="rId28" o:title=""/>
           </v:shape>
         </w:pict>
@@ -8817,143 +9270,87 @@
           <w:i/>
           <w:sz w:val="21"/>
         </w:rPr>
-        <w:t>Figure 3.7 : Diagramme de déploiement de la plateforme JOB4YOU</w:t>
+        <w:t>Figure 3.10 : Diagramme de composants de la plateforme JOB4YOU</w:t>
       </w:r>
     </w:p>
     <w:p/>
     <w:p>
       <w:r>
-        <w:t xml:space="preserve">Le frontend Angular et le backend Spring Boot tournent sur des serveurs distincts et communiquent via des API REST sécurisées par JWT. Le backend s'appuie sur une base de données PostgreSQL dédiée et déclenche, via des webhooks HTTP, les agents d'automatisation n8n — lesquels sollicitent à leur tour les services externes : API Cohere pour le scoring IA, </w:t>
-      </w:r>
-      <w:r>
-        <w:t>Google Calendar pour la création réelle de l’événement et du lien Google Meet lors de la planification, et serveur SMTP pour les notifications.</w:t>
+        <w:t>Chaque service métier (Candidate, Interview, Feedback, JobOffer) s'appuie sur la couche de repositories Spring Data JPA pour la persistance, et sur le service d'audit pour tracer les actions sensibles. Le service Candidate délègue le calcul du score au service de scoring IA, tandis que Candidate et Interview déclenchent chacun les agents n8n compétents via des webhooks.</w:t>
       </w:r>
     </w:p>
     <w:p>
       <w:pPr>
         <w:pStyle w:val="Titre2"/>
       </w:pPr>
-      <w:bookmarkStart w:id="41" w:name="_Toc238461652"/>
-      <w:r>
-        <w:t>3.8 Diagramme de composants</w:t>
-      </w:r>
-      <w:bookmarkEnd w:id="41"/>
-    </w:p>
-    <w:p>
-      <w:r>
-        <w:t>Le diagramme ci-dessous détaille l'organisation interne du backend en composants logiciels, ainsi que leurs dépendances.</w:t>
-      </w:r>
-    </w:p>
-    <w:p>
-      <w:pPr>
-        <w:jc w:val="center"/>
-      </w:pPr>
-      <w:r>
-        <w:rPr>
-          <w:noProof/>
-        </w:rPr>
-        <w:lastRenderedPageBreak/>
-        <w:pict w14:anchorId="29E43F6E">
-          <v:shape id="Image 12" o:spid="_x0000_i1036" type="#_x0000_t75" style="width:440.4pt;height:395.4pt;visibility:visible;mso-wrap-style:square">
-            <v:imagedata r:id="rId29" o:title=""/>
-          </v:shape>
-        </w:pict>
-      </w:r>
-    </w:p>
-    <w:p>
-      <w:pPr>
-        <w:jc w:val="center"/>
-        <w:rPr>
-          <w:i/>
-          <w:sz w:val="21"/>
-        </w:rPr>
-      </w:pPr>
-      <w:r>
-        <w:rPr>
-          <w:i/>
-          <w:sz w:val="21"/>
-        </w:rPr>
-        <w:t>Figure 3.8 : Diagramme de composants de la plateforme JOB4YOU</w:t>
-      </w:r>
-    </w:p>
-    <w:p/>
-    <w:p>
-      <w:r>
-        <w:t>Chaque service métier (Candidate, Interview, Feedback, JobOffer) s'appuie sur la couche de repositories Spring Data JPA pour la persistance, et sur le service d'audit pour tracer les actions sensibles. Le service Candidate délègue le calcul du score au service de scoring IA, tandis que Candidate et Interview déclenchent chacun les agents n8n compétents via des webhooks.</w:t>
+      <w:bookmarkStart w:id="44" w:name="_Toc238477318"/>
+      <w:r>
+        <w:t>3.9 Conclusion</w:t>
+      </w:r>
+      <w:bookmarkEnd w:id="44"/>
+    </w:p>
+    <w:p>
+      <w:r>
+        <w:t>Ces modèles — paquetages, classes, séquences, états, base de données, déploiement et composants — forment ensemble le plan directeur qui a guidé chaque ligne de code écrite par la suite. Reste à voir comment ce plan s'est concrètement traduit en une application fonctionnelle : c'est l'objet du chapitre suivant.</w:t>
+      </w:r>
+    </w:p>
+    <w:p>
+      <w:pPr>
+        <w:spacing w:line="278" w:lineRule="auto"/>
+      </w:pPr>
+      <w:r>
+        <w:br w:type="page"/>
+      </w:r>
+    </w:p>
+    <w:p>
+      <w:pPr>
+        <w:pStyle w:val="Titre1"/>
+      </w:pPr>
+      <w:bookmarkStart w:id="45" w:name="_Toc238477319"/>
+      <w:r>
+        <w:t>Chapitre 4 : Réalisation</w:t>
+      </w:r>
+      <w:bookmarkEnd w:id="45"/>
+    </w:p>
+    <w:p>
+      <w:r>
+        <w:t>Ce dernier chapitre est celui où la conception prend enfin forme concrète. J'y présente l'environnement de travail utilisé, les interfaces réellement développées et fonctionnelles, la démarche de test suivie, ainsi que certaines difficultés rencontrées en cours de route et la façon dont je les ai résolues.</w:t>
       </w:r>
     </w:p>
     <w:p>
       <w:pPr>
         <w:pStyle w:val="Titre2"/>
       </w:pPr>
-      <w:bookmarkStart w:id="42" w:name="_Toc238461653"/>
-      <w:r>
-        <w:t>3.9 Conclusion</w:t>
-      </w:r>
-      <w:bookmarkEnd w:id="42"/>
-    </w:p>
-    <w:p>
-      <w:r>
-        <w:t>Ces modèles — paquetages, classes, séquences, états, base de données, déploiement et composants — forment ensemble le plan directeur qui a guidé chaque ligne de code écrite par la suite. Reste à voir comment ce plan s'est concrètement traduit en une application fonctionnelle : c'est l'objet du chapitre suivant.</w:t>
-      </w:r>
-    </w:p>
-    <w:p>
-      <w:pPr>
-        <w:spacing w:line="278" w:lineRule="auto"/>
-      </w:pPr>
-      <w:r>
-        <w:br w:type="page"/>
-      </w:r>
-    </w:p>
-    <w:p>
-      <w:pPr>
-        <w:pStyle w:val="Titre1"/>
-      </w:pPr>
-      <w:bookmarkStart w:id="43" w:name="_Toc238461654"/>
-      <w:r>
-        <w:t>Chapitre 4 : Réalisation</w:t>
-      </w:r>
-      <w:bookmarkEnd w:id="43"/>
-    </w:p>
-    <w:p>
-      <w:r>
-        <w:t>Ce dernier chapitre est celui où la conception prend enfin forme concrète. J'y présente l'environnement de travail utilisé, les interfaces réellement développées et fonctionnelles, la démarche de test suivie, ainsi que certaines difficultés rencontrées en cours de route et la façon dont je les ai résolues.</w:t>
+      <w:bookmarkStart w:id="46" w:name="_Toc238477320"/>
+      <w:r>
+        <w:t>4.1 Introduction</w:t>
+      </w:r>
+      <w:bookmarkEnd w:id="46"/>
+    </w:p>
+    <w:p>
+      <w:r>
+        <w:t>Toutes les captures d'écran qui suivent proviennent de l'application en fonctionnement, pas de maquettes : chaque interface présentée a été testée et utilisée pendant le stage.</w:t>
       </w:r>
     </w:p>
     <w:p>
       <w:pPr>
         <w:pStyle w:val="Titre2"/>
       </w:pPr>
-      <w:bookmarkStart w:id="44" w:name="_Toc238461655"/>
-      <w:r>
-        <w:t>4.1 Introduction</w:t>
-      </w:r>
-      <w:bookmarkEnd w:id="44"/>
-    </w:p>
-    <w:p>
-      <w:r>
-        <w:t>Toutes les captures d'écran qui suivent proviennent de l'application en fonctionnement, pas de maquettes : chaque interface présentée a été testée et utilisée pendant le stage.</w:t>
-      </w:r>
-    </w:p>
-    <w:p>
-      <w:pPr>
-        <w:pStyle w:val="Titre2"/>
-      </w:pPr>
-      <w:bookmarkStart w:id="45" w:name="_Toc238461656"/>
+      <w:bookmarkStart w:id="47" w:name="_Toc238477321"/>
       <w:r>
         <w:t>4.2 Environnement de travail</w:t>
       </w:r>
-      <w:bookmarkEnd w:id="45"/>
+      <w:bookmarkEnd w:id="47"/>
     </w:p>
     <w:p>
       <w:pPr>
         <w:pStyle w:val="Titre3"/>
       </w:pPr>
-      <w:bookmarkStart w:id="46" w:name="_Toc238461657"/>
+      <w:bookmarkStart w:id="48" w:name="_Toc238477322"/>
       <w:r>
         <w:t>4.2.1 Environnement matériel</w:t>
       </w:r>
-      <w:bookmarkEnd w:id="46"/>
+      <w:bookmarkEnd w:id="48"/>
     </w:p>
     <w:p>
       <w:r>
@@ -8964,11 +9361,11 @@
       <w:pPr>
         <w:pStyle w:val="Titre3"/>
       </w:pPr>
-      <w:bookmarkStart w:id="47" w:name="_Toc238461658"/>
+      <w:bookmarkStart w:id="49" w:name="_Toc238477323"/>
       <w:r>
         <w:t>4.2.2 Environnement logiciel</w:t>
       </w:r>
-      <w:bookmarkEnd w:id="47"/>
+      <w:bookmarkEnd w:id="49"/>
     </w:p>
     <w:p>
       <w:r>
@@ -9020,11 +9417,7 @@
         </w:numPr>
       </w:pPr>
       <w:r>
-        <w:t>Automatisation et IA : n8n (agents d'automatisation par webhooks), API Cohere (scoring IA des CV).</w:t>
-      </w:r>
-      <w:r>
-        <w:rPr/>
-        <w:t xml:space="preserve"> Assistant conversationnel candidat : API OpenRouter (modèle stealth/ox-alpha, format compatible OpenAI).</w:t>
+        <w:t>Automatisation et IA : n8n (agents d'automatisation par webhooks), API Cohere (scoring IA des CV). Assistant conversationnel candidat : API OpenRouter (modèle stealth/ox-alpha, format compatible OpenAI).</w:t>
       </w:r>
     </w:p>
     <w:p>
@@ -9092,11 +9485,11 @@
       <w:pPr>
         <w:pStyle w:val="Titre3"/>
       </w:pPr>
-      <w:bookmarkStart w:id="48" w:name="_Toc238461659"/>
+      <w:bookmarkStart w:id="50" w:name="_Toc238477324"/>
       <w:r>
         <w:t>4.2.3 Autres</w:t>
       </w:r>
-      <w:bookmarkEnd w:id="48"/>
+      <w:bookmarkEnd w:id="50"/>
     </w:p>
     <w:p>
       <w:r>
@@ -9107,11 +9500,11 @@
       <w:pPr>
         <w:pStyle w:val="Titre3"/>
       </w:pPr>
-      <w:bookmarkStart w:id="49" w:name="_Toc238461660"/>
+      <w:bookmarkStart w:id="51" w:name="_Toc238477325"/>
       <w:r>
         <w:t>4.2.4 Sécurité applicative</w:t>
       </w:r>
-      <w:bookmarkEnd w:id="49"/>
+      <w:bookmarkEnd w:id="51"/>
     </w:p>
     <w:p>
       <w:r>
@@ -9122,11 +9515,11 @@
       <w:pPr>
         <w:pStyle w:val="Titre2"/>
       </w:pPr>
-      <w:bookmarkStart w:id="50" w:name="_Toc238461661"/>
+      <w:bookmarkStart w:id="52" w:name="_Toc238477326"/>
       <w:r>
         <w:t>4.3 Interfaces graphiques de l'application</w:t>
       </w:r>
-      <w:bookmarkEnd w:id="50"/>
+      <w:bookmarkEnd w:id="52"/>
     </w:p>
     <w:p>
       <w:r>
@@ -9143,6 +9536,44 @@
         </w:rPr>
         <w:pict w14:anchorId="650581FA">
           <v:shape id="Image 13" o:spid="_x0000_i1037" type="#_x0000_t75" style="width:420pt;height:249.6pt;visibility:visible;mso-wrap-style:square">
+            <v:imagedata r:id="rId29" o:title=""/>
+          </v:shape>
+        </w:pict>
+      </w:r>
+    </w:p>
+    <w:p>
+      <w:pPr>
+        <w:jc w:val="center"/>
+        <w:rPr>
+          <w:i/>
+          <w:sz w:val="21"/>
+        </w:rPr>
+      </w:pPr>
+      <w:r>
+        <w:rPr>
+          <w:i/>
+          <w:sz w:val="21"/>
+        </w:rPr>
+        <w:t>Figure 4.1 : Page d'accueil publique — recherche d'offres d'emploi</w:t>
+      </w:r>
+    </w:p>
+    <w:p/>
+    <w:p>
+      <w:r>
+        <w:lastRenderedPageBreak/>
+        <w:t>Accessible sans authentification, la page d'accueil permet à tout visiteur de rechercher une offre par mot-clé et par localisation, et met en avant les offres publiées les plus récentes.</w:t>
+      </w:r>
+    </w:p>
+    <w:p>
+      <w:pPr>
+        <w:jc w:val="center"/>
+      </w:pPr>
+      <w:r>
+        <w:rPr>
+          <w:noProof/>
+        </w:rPr>
+        <w:pict w14:anchorId="5BF0AF37">
+          <v:shape id="Image 14" o:spid="_x0000_i1038" type="#_x0000_t75" style="width:349.8pt;height:207.6pt;visibility:visible;mso-wrap-style:square">
             <v:imagedata r:id="rId30" o:title=""/>
           </v:shape>
         </w:pict>
@@ -9161,14 +9592,13 @@
           <w:i/>
           <w:sz w:val="21"/>
         </w:rPr>
-        <w:t>Figure 4.1 : Page d'accueil publique — recherche d'offres d'emploi</w:t>
+        <w:t>Figure 4.2 : Page de connexion</w:t>
       </w:r>
     </w:p>
     <w:p/>
     <w:p>
       <w:r>
-        <w:lastRenderedPageBreak/>
-        <w:t>Accessible sans authentification, la page d'accueil permet à tout visiteur de rechercher une offre par mot-clé et par localisation, et met en avant les offres publiées les plus récentes.</w:t>
+        <w:t>L'authentification se fait par nom d'utilisateur et mot de passe ; le jeton JWT renvoyé par le backend sécurise ensuite l'ensemble des requêtes vers l'API.</w:t>
       </w:r>
     </w:p>
     <w:p>
@@ -9179,8 +9609,8 @@
         <w:rPr>
           <w:noProof/>
         </w:rPr>
-        <w:pict w14:anchorId="5BF0AF37">
-          <v:shape id="Image 14" o:spid="_x0000_i1038" type="#_x0000_t75" style="width:349.8pt;height:207.6pt;visibility:visible;mso-wrap-style:square">
+        <w:pict w14:anchorId="1EEBD083">
+          <v:shape id="Image 15" o:spid="_x0000_i1039" type="#_x0000_t75" style="width:420pt;height:249.6pt;visibility:visible;mso-wrap-style:square">
             <v:imagedata r:id="rId31" o:title=""/>
           </v:shape>
         </w:pict>
@@ -9199,13 +9629,13 @@
           <w:i/>
           <w:sz w:val="21"/>
         </w:rPr>
-        <w:t>Figure 4.2 : Page de connexion</w:t>
+        <w:t>Figure 4.3 : Gestion des offres d'emploi (espace RH)</w:t>
       </w:r>
     </w:p>
     <w:p/>
     <w:p>
       <w:r>
-        <w:t>L'authentification se fait par nom d'utilisateur et mot de passe ; le jeton JWT renvoyé par le backend sécurise ensuite l'ensemble des requêtes vers l'API.</w:t>
+        <w:t>Le Responsable RH crée, modifie et suit ici le statut de chaque offre d'emploi (active, fermée, expirée) ; la bascule en « expirée » se fait automatiquement une fois la date limite dépassée.</w:t>
       </w:r>
     </w:p>
     <w:p>
@@ -9216,8 +9646,9 @@
         <w:rPr>
           <w:noProof/>
         </w:rPr>
-        <w:pict w14:anchorId="1EEBD083">
-          <v:shape id="Image 15" o:spid="_x0000_i1039" type="#_x0000_t75" style="width:420pt;height:249.6pt;visibility:visible;mso-wrap-style:square">
+        <w:lastRenderedPageBreak/>
+        <w:pict w14:anchorId="131B476D">
+          <v:shape id="Image 16" o:spid="_x0000_i1040" type="#_x0000_t75" style="width:420pt;height:249.6pt;visibility:visible;mso-wrap-style:square">
             <v:imagedata r:id="rId32" o:title=""/>
           </v:shape>
         </w:pict>
@@ -9236,13 +9667,13 @@
           <w:i/>
           <w:sz w:val="21"/>
         </w:rPr>
-        <w:t>Figure 4.3 : Gestion des offres d'emploi (espace RH)</w:t>
+        <w:t>Figure 4.4 : Gestion des candidats — vue liste avec score IA</w:t>
       </w:r>
     </w:p>
     <w:p/>
     <w:p>
       <w:r>
-        <w:t>Le Responsable RH crée, modifie et suit ici le statut de chaque offre d'emploi (active, fermée, expirée) ; la bascule en « expirée » se fait automatiquement une fois la date limite dépassée.</w:t>
+        <w:t>Pour chaque dossier, la liste des candidats affiche le statut courant, le score calculé par l'agent IA, ainsi qu'un ensemble d'actions rapides (changement de statut, envoi d'e-mail, consultation, suppression).</w:t>
       </w:r>
     </w:p>
     <w:p>
@@ -9253,9 +9684,8 @@
         <w:rPr>
           <w:noProof/>
         </w:rPr>
-        <w:lastRenderedPageBreak/>
-        <w:pict w14:anchorId="131B476D">
-          <v:shape id="Image 16" o:spid="_x0000_i1040" type="#_x0000_t75" style="width:420pt;height:249.6pt;visibility:visible;mso-wrap-style:square">
+        <w:pict w14:anchorId="0B44AC1E">
+          <v:shape id="Image 17" o:spid="_x0000_i1041" type="#_x0000_t75" style="width:420pt;height:249.6pt;visibility:visible;mso-wrap-style:square">
             <v:imagedata r:id="rId33" o:title=""/>
           </v:shape>
         </w:pict>
@@ -9274,13 +9704,17 @@
           <w:i/>
           <w:sz w:val="21"/>
         </w:rPr>
-        <w:t>Figure 4.4 : Gestion des candidats — vue liste avec score IA</w:t>
+        <w:t>Figure 4.5 : Modification d'un dossier candidat</w:t>
       </w:r>
     </w:p>
     <w:p/>
     <w:p>
       <w:r>
-        <w:t>Pour chaque dossier, la liste des candidats affiche le statut courant, le score calculé par l'agent IA, ainsi qu'un ensemble d'actions rapides (changement de statut, envoi d'e-mail, consultation, suppression).</w:t>
+        <w:t xml:space="preserve">Le RH corrige ici les informations d'un candidat (coordonnées, lettre de motivation, statut, offre associée) via le formulaire de modification ; la fiche de consultation associée regroupe le CV, </w:t>
+      </w:r>
+      <w:r>
+        <w:lastRenderedPageBreak/>
+        <w:t>l'analyse IA détaillée (scores technique, communication, adéquation séniorité) et l'historique des actions des agents n8n sur ce dossier.</w:t>
       </w:r>
     </w:p>
     <w:p>
@@ -9291,8 +9725,8 @@
         <w:rPr>
           <w:noProof/>
         </w:rPr>
-        <w:pict w14:anchorId="0B44AC1E">
-          <v:shape id="Image 17" o:spid="_x0000_i1041" type="#_x0000_t75" style="width:420pt;height:249.6pt;visibility:visible;mso-wrap-style:square">
+        <w:pict w14:anchorId="3DE79FED">
+          <v:shape id="Image 18" o:spid="_x0000_i1042" type="#_x0000_t75" style="width:420pt;height:249.6pt;visibility:visible;mso-wrap-style:square">
             <v:imagedata r:id="rId34" o:title=""/>
           </v:shape>
         </w:pict>
@@ -9311,17 +9745,13 @@
           <w:i/>
           <w:sz w:val="21"/>
         </w:rPr>
-        <w:t>Figure 4.5 : Modification d'un dossier candidat</w:t>
+        <w:t>Figure 4.6 : Tableau Kanban du pipeline de recrutement</w:t>
       </w:r>
     </w:p>
     <w:p/>
     <w:p>
       <w:r>
-        <w:t xml:space="preserve">Le RH corrige ici les informations d'un candidat (coordonnées, lettre de motivation, statut, offre associée) via le formulaire de modification ; la fiche de consultation associée regroupe le CV, </w:t>
-      </w:r>
-      <w:r>
-        <w:lastRenderedPageBreak/>
-        <w:t>l'analyse IA détaillée (scores technique, communication, adéquation séniorité) et l'historique des actions des agents n8n sur ce dossier.</w:t>
+        <w:t>Le tableau Kanban donne une vue synthétique et interactive de toutes les candidatures réparties par statut ; glisser une carte d'une colonne à une autre déclenche automatiquement la mise à jour du statut, sous réserve des garde-fous métier décrits au chapitre 3 pour les décisions finales.</w:t>
       </w:r>
     </w:p>
     <w:p>
@@ -9332,8 +9762,8 @@
         <w:rPr>
           <w:noProof/>
         </w:rPr>
-        <w:pict w14:anchorId="3DE79FED">
-          <v:shape id="Image 18" o:spid="_x0000_i1042" type="#_x0000_t75" style="width:420pt;height:249.6pt;visibility:visible;mso-wrap-style:square">
+        <w:pict w14:anchorId="61C2271E">
+          <v:shape id="Image 19" o:spid="_x0000_i1043" type="#_x0000_t75" style="width:420pt;height:249.6pt;visibility:visible;mso-wrap-style:square">
             <v:imagedata r:id="rId35" o:title=""/>
           </v:shape>
         </w:pict>
@@ -9352,13 +9782,14 @@
           <w:i/>
           <w:sz w:val="21"/>
         </w:rPr>
-        <w:t>Figure 4.6 : Tableau Kanban du pipeline de recrutement</w:t>
+        <w:t>Figure 4.7 : Gestion des entretiens</w:t>
       </w:r>
     </w:p>
     <w:p/>
     <w:p>
       <w:r>
-        <w:t>Le tableau Kanban donne une vue synthétique et interactive de toutes les candidatures réparties par statut ; glisser une carte d'une colonne à une autre déclenche automatiquement la mise à jour du statut, sous réserve des garde-fous métier décrits au chapitre 3 pour les décisions finales.</w:t>
+        <w:lastRenderedPageBreak/>
+        <w:t>On planifie, filtre et suit ici les entretiens (type, date, interviewer, statut), avec des actions contextuelles comme le démarrage, l'annulation, la reprogrammation ou l'ajout d'un feedback une fois l'entretien terminé.</w:t>
       </w:r>
     </w:p>
     <w:p>
@@ -9369,8 +9800,8 @@
         <w:rPr>
           <w:noProof/>
         </w:rPr>
-        <w:pict w14:anchorId="61C2271E">
-          <v:shape id="Image 19" o:spid="_x0000_i1043" type="#_x0000_t75" style="width:420pt;height:249.6pt;visibility:visible;mso-wrap-style:square">
+        <w:pict w14:anchorId="4A63A72C">
+          <v:shape id="Image 20" o:spid="_x0000_i1044" type="#_x0000_t75" style="width:420pt;height:249.6pt;visibility:visible;mso-wrap-style:square">
             <v:imagedata r:id="rId36" o:title=""/>
           </v:shape>
         </w:pict>
@@ -9389,14 +9820,13 @@
           <w:i/>
           <w:sz w:val="21"/>
         </w:rPr>
-        <w:t>Figure 4.7 : Gestion des entretiens</w:t>
+        <w:t>Figure 4.8 : Gestion des feedbacks</w:t>
       </w:r>
     </w:p>
     <w:p/>
     <w:p>
       <w:r>
-        <w:lastRenderedPageBreak/>
-        <w:t>On planifie, filtre et suit ici les entretiens (type, date, interviewer, statut), avec des actions contextuelles comme le démarrage, l'annulation, la reprogrammation ou l'ajout d'un feedback une fois l'entretien terminé.</w:t>
+        <w:t>Les feedbacks saisis par les managers sont centralisés ici, avec une étape de validation par le RH avant transmission au candidat.</w:t>
       </w:r>
     </w:p>
     <w:p>
@@ -9407,8 +9837,8 @@
         <w:rPr>
           <w:noProof/>
         </w:rPr>
-        <w:pict w14:anchorId="4A63A72C">
-          <v:shape id="Image 20" o:spid="_x0000_i1044" type="#_x0000_t75" style="width:420pt;height:249.6pt;visibility:visible;mso-wrap-style:square">
+        <w:pict w14:anchorId="1C64D113">
+          <v:shape id="Image 21" o:spid="_x0000_i1045" type="#_x0000_t75" style="width:420pt;height:249.6pt;visibility:visible;mso-wrap-style:square">
             <v:imagedata r:id="rId37" o:title=""/>
           </v:shape>
         </w:pict>
@@ -9427,13 +9857,14 @@
           <w:i/>
           <w:sz w:val="21"/>
         </w:rPr>
-        <w:t>Figure 4.8 : Gestion des feedbacks</w:t>
+        <w:t>Figure 4.9 : Gestion des utilisateurs et des rôles (espace Administrateur)</w:t>
       </w:r>
     </w:p>
     <w:p/>
     <w:p>
       <w:r>
-        <w:t>Les feedbacks saisis par les managers sont centralisés ici, avec une étape de validation par le RH avant transmission au candidat.</w:t>
+        <w:lastRenderedPageBreak/>
+        <w:t>L'administrateur y gère l'ensemble des comptes de la plateforme, leurs rôles, ainsi que leur rattachement à un département ou une famille de métier.</w:t>
       </w:r>
     </w:p>
     <w:p>
@@ -9444,8 +9875,8 @@
         <w:rPr>
           <w:noProof/>
         </w:rPr>
-        <w:pict w14:anchorId="1C64D113">
-          <v:shape id="Image 21" o:spid="_x0000_i1045" type="#_x0000_t75" style="width:420pt;height:249.6pt;visibility:visible;mso-wrap-style:square">
+        <w:pict w14:anchorId="30680820">
+          <v:shape id="Image 22" o:spid="_x0000_i1046" type="#_x0000_t75" style="width:420pt;height:249.6pt;visibility:visible;mso-wrap-style:square">
             <v:imagedata r:id="rId38" o:title=""/>
           </v:shape>
         </w:pict>
@@ -9464,14 +9895,13 @@
           <w:i/>
           <w:sz w:val="21"/>
         </w:rPr>
-        <w:t>Figure 4.9 : Gestion des utilisateurs et des rôles (espace Administrateur)</w:t>
+        <w:t>Figure 4.10 : Paramétrage du scoring IA par famille de métier</w:t>
       </w:r>
     </w:p>
     <w:p/>
     <w:p>
       <w:r>
-        <w:lastRenderedPageBreak/>
-        <w:t>L'administrateur y gère l'ensemble des comptes de la plateforme, leurs rôles, ainsi que leur rattachement à un département ou une famille de métier.</w:t>
+        <w:t>Réservée à l'administrateur, cette interface permet d'ajuster la pondération (technique / communication / séniorité) que l'agent IA utilise pour calculer le score de chaque candidature, selon la famille de métier et le niveau de séniorité de l'offre.</w:t>
       </w:r>
     </w:p>
     <w:p>
@@ -9482,8 +9912,8 @@
         <w:rPr>
           <w:noProof/>
         </w:rPr>
-        <w:pict w14:anchorId="30680820">
-          <v:shape id="Image 22" o:spid="_x0000_i1046" type="#_x0000_t75" style="width:420pt;height:249.6pt;visibility:visible;mso-wrap-style:square">
+        <w:pict w14:anchorId="66625CE5">
+          <v:shape id="Image 23" o:spid="_x0000_i1047" type="#_x0000_t75" style="width:420pt;height:249.6pt;visibility:visible;mso-wrap-style:square">
             <v:imagedata r:id="rId39" o:title=""/>
           </v:shape>
         </w:pict>
@@ -9502,43 +9932,6 @@
           <w:i/>
           <w:sz w:val="21"/>
         </w:rPr>
-        <w:t>Figure 4.10 : Paramétrage du scoring IA par famille de métier</w:t>
-      </w:r>
-    </w:p>
-    <w:p/>
-    <w:p>
-      <w:r>
-        <w:t>Réservée à l'administrateur, cette interface permet d'ajuster la pondération (technique / communication / séniorité) que l'agent IA utilise pour calculer le score de chaque candidature, selon la famille de métier et le niveau de séniorité de l'offre.</w:t>
-      </w:r>
-    </w:p>
-    <w:p>
-      <w:pPr>
-        <w:jc w:val="center"/>
-      </w:pPr>
-      <w:r>
-        <w:rPr>
-          <w:noProof/>
-        </w:rPr>
-        <w:pict w14:anchorId="66625CE5">
-          <v:shape id="Image 23" o:spid="_x0000_i1047" type="#_x0000_t75" style="width:420pt;height:249.6pt;visibility:visible;mso-wrap-style:square">
-            <v:imagedata r:id="rId40" o:title=""/>
-          </v:shape>
-        </w:pict>
-      </w:r>
-    </w:p>
-    <w:p>
-      <w:pPr>
-        <w:jc w:val="center"/>
-        <w:rPr>
-          <w:i/>
-          <w:sz w:val="21"/>
-        </w:rPr>
-      </w:pPr>
-      <w:r>
-        <w:rPr>
-          <w:i/>
-          <w:sz w:val="21"/>
-        </w:rPr>
         <w:t>Figure 4.11 : Journal d'audit</w:t>
       </w:r>
     </w:p>
@@ -9554,20 +9947,14 @@
         <w:t>J'ai aussi donné à chaque manager une page « Mon calendrier », en lecture seule, qui regroupe ses entretiens du mois et ses trois prochains rendez-vous ; les données y sont filtrées côté serveur selon son département, sa famille de métier ou son affectation directe, le même cloisonnement que pour la liste des dossiers candidats.</w:t>
       </w:r>
     </w:p>
-    <w:p>
-      <w:pPr/>
-    </w:p>
-    <w:p>
-      <w:pPr/>
-      <w:r>
-        <w:t>Figure 4.12 : Assistant conversationnel candidat (chatbot)</w:t>
-      </w:r>
-    </w:p>
-    <w:p>
-      <w:pPr/>
-    </w:p>
-    <w:p>
-      <w:pPr/>
+    <w:p/>
+    <w:p>
+      <w:r>
+        <w:t>Figure 4.12 : Assistant conversationnel candidat (chatbot)</w:t>
+      </w:r>
+    </w:p>
+    <w:p/>
+    <w:p>
       <w:r>
         <w:t>Disponible uniquement pour un candidat authentifié, ce widget flottant permet de poser des questions en langage naturel sur le suivi de ses propres candidatures ou sur le fonctionnement général de la plateforme (offres, Job idéal, retrait de candidature, etc.). Les réponses sont générées par un modèle de raisonnement (stealth/ox-alpha, via l'API OpenRouter) à partir d'un contexte constitué uniquement des données réelles du candidat connecté ; les champs internes (score IA, notes RH, identité de l'intervieweur) sont explicitement exclus de ce contexte et ne peuvent donc pas être révélés, y compris face à une tentative d'injection de prompt.</w:t>
       </w:r>
@@ -9576,21 +9963,21 @@
       <w:pPr>
         <w:pStyle w:val="Titre2"/>
       </w:pPr>
-      <w:bookmarkStart w:id="51" w:name="_Toc238461662"/>
+      <w:bookmarkStart w:id="53" w:name="_Toc238477327"/>
       <w:r>
         <w:t>4.4 Tests</w:t>
       </w:r>
-      <w:bookmarkEnd w:id="51"/>
+      <w:bookmarkEnd w:id="53"/>
     </w:p>
     <w:p>
       <w:pPr>
         <w:pStyle w:val="Titre3"/>
       </w:pPr>
-      <w:bookmarkStart w:id="52" w:name="_Toc238461663"/>
+      <w:bookmarkStart w:id="54" w:name="_Toc238477328"/>
       <w:r>
         <w:t>4.4.1 Tests unitaires (JUnit 5 / Mockito)</w:t>
       </w:r>
-      <w:bookmarkEnd w:id="52"/>
+      <w:bookmarkEnd w:id="54"/>
     </w:p>
     <w:p>
       <w:r>
@@ -9699,6 +10086,7 @@
                 <w:rFonts w:ascii="Consolas" w:hAnsi="Consolas"/>
                 <w:sz w:val="18"/>
               </w:rPr>
+              <w:lastRenderedPageBreak/>
               <w:t xml:space="preserve">    Candidate outOfScope = candidateWithOffer(61L, "manager.devops@company.com", devops);</w:t>
             </w:r>
           </w:p>
@@ -9815,12 +10203,11 @@
       <w:pPr>
         <w:pStyle w:val="Titre3"/>
       </w:pPr>
-      <w:bookmarkStart w:id="53" w:name="_Toc238461664"/>
-      <w:r>
-        <w:lastRenderedPageBreak/>
+      <w:bookmarkStart w:id="55" w:name="_Toc238477329"/>
+      <w:r>
         <w:t>4.4.2 Tests fonctionnels manuels</w:t>
       </w:r>
-      <w:bookmarkEnd w:id="53"/>
+      <w:bookmarkEnd w:id="55"/>
     </w:p>
     <w:p>
       <w:r>
@@ -10452,7 +10839,14 @@
               <w:rPr>
                 <w:sz w:val="21"/>
               </w:rPr>
-              <w:t>Notification par e-mail au candidat après décision finale</w:t>
+              <w:t xml:space="preserve">Notification par e-mail au </w:t>
+            </w:r>
+            <w:r>
+              <w:rPr>
+                <w:sz w:val="21"/>
+              </w:rPr>
+              <w:lastRenderedPageBreak/>
+              <w:t>candidat après décision finale</w:t>
             </w:r>
           </w:p>
         </w:tc>
@@ -10470,7 +10864,15 @@
               <w:rPr>
                 <w:sz w:val="21"/>
               </w:rPr>
-              <w:t>E-mail reçu, contenu cohérent avec le statut</w:t>
+              <w:lastRenderedPageBreak/>
+              <w:t xml:space="preserve">E-mail reçu, contenu cohérent </w:t>
+            </w:r>
+            <w:r>
+              <w:rPr>
+                <w:sz w:val="21"/>
+              </w:rPr>
+              <w:lastRenderedPageBreak/>
+              <w:t>avec le statut</w:t>
             </w:r>
           </w:p>
         </w:tc>
@@ -10488,6 +10890,7 @@
               <w:rPr>
                 <w:sz w:val="21"/>
               </w:rPr>
+              <w:lastRenderedPageBreak/>
               <w:t>OK</w:t>
             </w:r>
           </w:p>
@@ -10700,14 +11103,7 @@
               <w:rPr>
                 <w:sz w:val="21"/>
               </w:rPr>
-              <w:t xml:space="preserve">Le dossier quitte la liste active sans rechargement et reste </w:t>
-            </w:r>
-            <w:r>
-              <w:rPr>
-                <w:sz w:val="21"/>
-              </w:rPr>
-              <w:lastRenderedPageBreak/>
-              <w:t>filtrable</w:t>
+              <w:t>Le dossier quitte la liste active sans rechargement et reste filtrable</w:t>
             </w:r>
           </w:p>
         </w:tc>
@@ -10725,7 +11121,6 @@
               <w:rPr>
                 <w:sz w:val="21"/>
               </w:rPr>
-              <w:lastRenderedPageBreak/>
               <w:t>OK</w:t>
             </w:r>
           </w:p>
@@ -10846,7 +11241,7 @@
       <w:tr>
         <w:tc>
           <w:tcPr>
-            <w:tcW w:type="dxa" w:w="3070"/>
+            <w:tcW w:w="3070" w:type="dxa"/>
           </w:tcPr>
           <w:p>
             <w:r>
@@ -10856,7 +11251,7 @@
         </w:tc>
         <w:tc>
           <w:tcPr>
-            <w:tcW w:type="dxa" w:w="3069"/>
+            <w:tcW w:w="3069" w:type="dxa"/>
           </w:tcPr>
           <w:p>
             <w:r>
@@ -10866,7 +11261,7 @@
         </w:tc>
         <w:tc>
           <w:tcPr>
-            <w:tcW w:type="dxa" w:w="3067"/>
+            <w:tcW w:w="3067" w:type="dxa"/>
           </w:tcPr>
           <w:p>
             <w:r>
@@ -10878,7 +11273,7 @@
       <w:tr>
         <w:tc>
           <w:tcPr>
-            <w:tcW w:type="dxa" w:w="3070"/>
+            <w:tcW w:w="3070" w:type="dxa"/>
           </w:tcPr>
           <w:p>
             <w:r>
@@ -10888,7 +11283,7 @@
         </w:tc>
         <w:tc>
           <w:tcPr>
-            <w:tcW w:type="dxa" w:w="3069"/>
+            <w:tcW w:w="3069" w:type="dxa"/>
           </w:tcPr>
           <w:p>
             <w:r>
@@ -10898,7 +11293,7 @@
         </w:tc>
         <w:tc>
           <w:tcPr>
-            <w:tcW w:type="dxa" w:w="3067"/>
+            <w:tcW w:w="3067" w:type="dxa"/>
           </w:tcPr>
           <w:p>
             <w:r>
@@ -10910,7 +11305,7 @@
       <w:tr>
         <w:tc>
           <w:tcPr>
-            <w:tcW w:type="dxa" w:w="3070"/>
+            <w:tcW w:w="3070" w:type="dxa"/>
           </w:tcPr>
           <w:p>
             <w:r>
@@ -10920,7 +11315,7 @@
         </w:tc>
         <w:tc>
           <w:tcPr>
-            <w:tcW w:type="dxa" w:w="3069"/>
+            <w:tcW w:w="3069" w:type="dxa"/>
           </w:tcPr>
           <w:p>
             <w:r>
@@ -10930,7 +11325,7 @@
         </w:tc>
         <w:tc>
           <w:tcPr>
-            <w:tcW w:type="dxa" w:w="3067"/>
+            <w:tcW w:w="3067" w:type="dxa"/>
           </w:tcPr>
           <w:p>
             <w:r>
@@ -10942,7 +11337,7 @@
       <w:tr>
         <w:tc>
           <w:tcPr>
-            <w:tcW w:type="dxa" w:w="3070"/>
+            <w:tcW w:w="3070" w:type="dxa"/>
           </w:tcPr>
           <w:p>
             <w:r>
@@ -10952,7 +11347,7 @@
         </w:tc>
         <w:tc>
           <w:tcPr>
-            <w:tcW w:type="dxa" w:w="3069"/>
+            <w:tcW w:w="3069" w:type="dxa"/>
           </w:tcPr>
           <w:p>
             <w:r>
@@ -10962,7 +11357,7 @@
         </w:tc>
         <w:tc>
           <w:tcPr>
-            <w:tcW w:type="dxa" w:w="3067"/>
+            <w:tcW w:w="3067" w:type="dxa"/>
           </w:tcPr>
           <w:p>
             <w:r>
@@ -10977,11 +11372,11 @@
       <w:pPr>
         <w:pStyle w:val="Titre3"/>
       </w:pPr>
-      <w:bookmarkStart w:id="54" w:name="_Toc238461665"/>
+      <w:bookmarkStart w:id="56" w:name="_Toc238477330"/>
       <w:r>
         <w:t>4.4.3 Tests des API avec Postman et Swagger</w:t>
       </w:r>
-      <w:bookmarkEnd w:id="54"/>
+      <w:bookmarkEnd w:id="56"/>
     </w:p>
     <w:p>
       <w:r>
@@ -10992,26 +11387,30 @@
       <w:pPr>
         <w:pStyle w:val="Titre3"/>
       </w:pPr>
-      <w:bookmarkStart w:id="55" w:name="_Toc238461666"/>
+      <w:bookmarkStart w:id="57" w:name="_Toc238477331"/>
       <w:r>
         <w:t>4.4.4 Vérification de bout en bout</w:t>
       </w:r>
-      <w:bookmarkEnd w:id="55"/>
-    </w:p>
-    <w:p>
-      <w:r>
-        <w:t>Au-delà des tests unitaires par fonctionnalité, j'ai mené une vérification de bout en bout du parcours complet de recrutement : soumission d'une candidature, analyse automatique par l'IA, validation par le RH, planification d'un entretien, saisie d'un feedback, puis décision finale du manager — chaque étape déclenchant la notification par e-mail attendue, au candidat et/ou aux parties prenantes internes.</w:t>
+      <w:bookmarkEnd w:id="57"/>
+    </w:p>
+    <w:p>
+      <w:r>
+        <w:t xml:space="preserve">Au-delà des tests unitaires par fonctionnalité, j'ai mené une vérification de bout en bout du parcours complet de recrutement : soumission d'une candidature, analyse automatique par l'IA, validation par le RH, planification d'un entretien, saisie d'un feedback, puis décision finale du manager — chaque </w:t>
+      </w:r>
+      <w:r>
+        <w:lastRenderedPageBreak/>
+        <w:t>étape déclenchant la notification par e-mail attendue, au candidat et/ou aux parties prenantes internes.</w:t>
       </w:r>
     </w:p>
     <w:p>
       <w:pPr>
         <w:pStyle w:val="Titre2"/>
       </w:pPr>
-      <w:bookmarkStart w:id="56" w:name="_Toc238461667"/>
+      <w:bookmarkStart w:id="58" w:name="_Toc238477332"/>
       <w:r>
         <w:t>4.5 Difficultés rencontrées et solutions apportées</w:t>
       </w:r>
-      <w:bookmarkEnd w:id="56"/>
+      <w:bookmarkEnd w:id="58"/>
     </w:p>
     <w:p>
       <w:r>
@@ -11022,11 +11421,11 @@
       <w:pPr>
         <w:pStyle w:val="Titre3"/>
       </w:pPr>
-      <w:bookmarkStart w:id="57" w:name="_Toc238461668"/>
+      <w:bookmarkStart w:id="59" w:name="_Toc238477333"/>
       <w:r>
         <w:t>4.5.1 Notification incomplète des managers</w:t>
       </w:r>
-      <w:bookmarkEnd w:id="57"/>
+      <w:bookmarkEnd w:id="59"/>
     </w:p>
     <w:p>
       <w:r>
@@ -11040,233 +11439,233 @@
       <w:pPr>
         <w:pStyle w:val="Titre3"/>
       </w:pPr>
-      <w:bookmarkStart w:id="58" w:name="_Toc238461669"/>
+      <w:bookmarkStart w:id="60" w:name="_Toc238477334"/>
+      <w:r>
+        <w:t>4.5.2 Distinguer un rejet RH d'un rejet manager</w:t>
+      </w:r>
+      <w:bookmarkEnd w:id="60"/>
+    </w:p>
+    <w:p>
+      <w:r>
+        <w:t>Le modèle de données utilise un statut unique, MANAGER_REJECTED, que ce soit le RH ou le manager qui prenne la décision de refus — les deux s'appuient sur le même mécanisme de décision. Or le tableau de bord devait afficher séparément les rejets RH et les rejets manager, ces derniers ventilés par famille de métier. Plutôt que d'introduire un nouveau statut en base (ce qui aurait complexifié le modèle pour un besoin purement d'affichage), j'ai choisi de reconstruire cette information à partir du journal d'audit existant : chaque changement de statut y est déjà associé à l'utilisateur qui l'a effectué, il suffisait de croiser ce nom d'utilisateur avec son rôle réel pour déterminer si la décision provenait du RH ou d'un manager, et dans ce dernier cas, de quelle famille de métier.</w:t>
+      </w:r>
+    </w:p>
+    <w:p>
+      <w:pPr>
+        <w:pStyle w:val="Titre3"/>
+      </w:pPr>
+      <w:bookmarkStart w:id="61" w:name="_Toc238477335"/>
+      <w:r>
+        <w:t>4.5.3 Cohérence des transitions de statut</w:t>
+      </w:r>
+      <w:bookmarkEnd w:id="61"/>
+    </w:p>
+    <w:p>
+      <w:r>
+        <w:t>Le cycle de vie d'une candidature comporte de nombreux états, et plusieurs actions (planifier un entretien, prendre une décision finale) n'ont de sens que si le dossier se trouve dans un état précis. Sans garde-fou, il était possible par exemple de planifier un entretien sur un dossier déjà rejeté, ou de faire valider un candidat par un manager avant même que le RH n'ait examiné son dossier. J'ai donc ajouté, côté backend, des vérifications explicites avant chaque transition sensible, avec des messages d'erreur clairs renvoyés à l'interface plutôt que des échecs silencieux — un choix qui a nécessité de revenir plusieurs fois sur le diagramme d'états du chapitre 3 pour m'assurer que l'implémentation restait fidèle au modèle.</w:t>
+      </w:r>
+    </w:p>
+    <w:p>
+      <w:pPr>
+        <w:pStyle w:val="Titre3"/>
+      </w:pPr>
+      <w:bookmarkStart w:id="62" w:name="_Toc238477336"/>
       <w:r>
         <w:lastRenderedPageBreak/>
-        <w:t>4.5.2 Distinguer un rejet RH d'un rejet manager</w:t>
-      </w:r>
-      <w:bookmarkEnd w:id="58"/>
-    </w:p>
-    <w:p>
-      <w:r>
-        <w:t>Le modèle de données utilise un statut unique, MANAGER_REJECTED, que ce soit le RH ou le manager qui prenne la décision de refus — les deux s'appuient sur le même mécanisme de décision. Or le tableau de bord devait afficher séparément les rejets RH et les rejets manager, ces derniers ventilés par famille de métier. Plutôt que d'introduire un nouveau statut en base (ce qui aurait complexifié le modèle pour un besoin purement d'affichage), j'ai choisi de reconstruire cette information à partir du journal d'audit existant : chaque changement de statut y est déjà associé à l'utilisateur qui l'a effectué, il suffisait de croiser ce nom d'utilisateur avec son rôle réel pour déterminer si la décision provenait du RH ou d'un manager, et dans ce dernier cas, de quelle famille de métier.</w:t>
+        <w:t>4.5.4 Filtrage incomplet des routes de lecture pour les managers</w:t>
+      </w:r>
+      <w:bookmarkEnd w:id="62"/>
+    </w:p>
+    <w:p>
+      <w:r>
+        <w:t>Le garde-fou décrit en 4.5.2 empêchait bien un manager d'agir en écriture (changer un statut) sur un candidat hors de son périmètre, mais je me suis rendu compte, en réexaminant systématiquement chaque route accessible au rôle Manager, que ce n'était pas le cas des routes de lecture : GET /api/candidates, GET /api/candidates/{id}, la recherche par nom et le classement par offre ne filtraient pas par périmètre. Un manager authentifié pouvait donc, en appelant directement l'API (pas via l'interface, qui n'expose pas ce chemin), lister ou consulter des candidats d'un autre département. J'ai corrigé ce point en centralisant la logique de périmètre déjà utilisée pour les écritures dans une méthode réutilisable, appliquée à présent à toutes les routes de lecture concernées, et j'ai ajouté deux tests unitaires dédiés (section 4.4.1) pour figer ce comportement.</w:t>
       </w:r>
     </w:p>
     <w:p>
       <w:pPr>
         <w:pStyle w:val="Titre3"/>
       </w:pPr>
-      <w:bookmarkStart w:id="59" w:name="_Toc238461670"/>
-      <w:r>
-        <w:t>4.5.3 Cohérence des transitions de statut</w:t>
-      </w:r>
-      <w:bookmarkEnd w:id="59"/>
-    </w:p>
-    <w:p>
-      <w:r>
-        <w:t>Le cycle de vie d'une candidature comporte de nombreux états, et plusieurs actions (planifier un entretien, prendre une décision finale) n'ont de sens que si le dossier se trouve dans un état précis. Sans garde-fou, il était possible par exemple de planifier un entretien sur un dossier déjà rejeté, ou de faire valider un candidat par un manager avant même que le RH n'ait examiné son dossier. J'ai donc ajouté, côté backend, des vérifications explicites avant chaque transition sensible, avec des messages d'erreur clairs renvoyés à l'interface plutôt que des échecs silencieux — un choix qui a nécessité de revenir plusieurs fois sur le diagramme d'états du chapitre 3 pour m'assurer que l'implémentation restait fidèle au modèle.</w:t>
+      <w:bookmarkStart w:id="63" w:name="_Toc238477337"/>
+      <w:r>
+        <w:t>4.5.5 Solliciter le manager au bon moment du processus</w:t>
+      </w:r>
+      <w:bookmarkEnd w:id="63"/>
+    </w:p>
+    <w:p>
+      <w:pPr>
+        <w:jc w:val="both"/>
+      </w:pPr>
+      <w:r>
+        <w:t>Dans une première version, le manager destinataire était notifié dès la validation du CV par le RH (statut CV_REVIEWED). À l'usage, cela le sollicitait trop tôt : de nombreux dossiers étaient encore écartés lors du pré-filtrage téléphonique mené par le RH. J'ai donc déplacé la notification du manager à l'entrée en Test technique, c'est-à-dire une fois l'entretien téléphonique franchi ; le candidat, lui, reste informé de la présélection de son CV dès l'étape CV_REVIEWED. En cohérence, la vue des dossiers validés du manager ne fait plus apparaître les candidats qu'à partir du Test technique, ce qui recentre son attention sur les profils réellement en lice.</w:t>
       </w:r>
     </w:p>
     <w:p>
       <w:pPr>
         <w:pStyle w:val="Titre3"/>
       </w:pPr>
-      <w:bookmarkStart w:id="60" w:name="_Toc238461671"/>
-      <w:r>
-        <w:t>4.5.4 Filtrage incomplet des routes de lecture pour les managers</w:t>
-      </w:r>
-      <w:bookmarkEnd w:id="60"/>
-    </w:p>
-    <w:p>
-      <w:r>
-        <w:t>Le garde-fou décrit en 4.5.2 empêchait bien un manager d'agir en écriture (changer un statut) sur un candidat hors de son périmètre, mais je me suis rendu compte, en réexaminant systématiquement chaque route accessible au rôle Manager, que ce n'était pas le cas des routes de lecture : GET /api/candidates, GET /api/candidates/{id}, la recherche par nom et le classement par offre ne filtraient pas par périmètre. Un manager authentifié pouvait donc, en appelant directement l'API (pas via l'interface, qui n'expose pas ce chemin), lister ou consulter des candidats d'un autre département. J'ai corrigé ce point en centralisant la logique de périmètre déjà utilisée pour les écritures dans une méthode réutilisable, appliquée à présent à toutes les routes de lecture concernées, et j'ai ajouté deux tests unitaires dédiés (section 4.4.1) pour figer ce comportement.</w:t>
+      <w:bookmarkStart w:id="64" w:name="_Toc238477338"/>
+      <w:r>
+        <w:t>4.5.6 Pertinence du matching Job idéal</w:t>
+      </w:r>
+      <w:bookmarkEnd w:id="64"/>
+    </w:p>
+    <w:p>
+      <w:pPr>
+        <w:jc w:val="both"/>
+      </w:pPr>
+      <w:r>
+        <w:t>La fonctionnalité de matching inverse, par laquelle un visiteur dépose son CV et le système lui suggère les offres les plus proches, retournait des résultats peu pertinents : un profil DevOps se voyait par exemple proposer des postes de développement backend. L'analyse a révélé deux causes : le score ne tenait compte que des compétences requises, en ignorant l'intitulé de l'offre, et le jeu de données comportait de nombreuses annonces en double qui saturaient le lot soumis à l'IA. J'ai corrigé les deux points en combinant, dans le score, l'intitulé de l'offre (pondéré à 60 %) et les compétences (40 %), et en dédupliquant les offres identiques avant l'appel à l'IA. Chaque profil (Java, DevOps, ProdOps, QA) ressort désormais sur les offres qui lui correspondent réellement.</w:t>
       </w:r>
     </w:p>
     <w:p>
       <w:pPr>
         <w:pStyle w:val="Titre3"/>
       </w:pPr>
-      <w:bookmarkStart w:id="61" w:name="_Toc238461672"/>
-      <w:r>
-        <w:t>4.5.5 Solliciter le manager au bon moment du processus</w:t>
-      </w:r>
-      <w:bookmarkEnd w:id="61"/>
+      <w:bookmarkStart w:id="65" w:name="_Toc238477339"/>
+      <w:r>
+        <w:t>4.5.7 Traitement distinct des candidatures retirées</w:t>
+      </w:r>
+      <w:bookmarkEnd w:id="65"/>
     </w:p>
     <w:p>
       <w:pPr>
         <w:jc w:val="both"/>
       </w:pPr>
       <w:r>
-        <w:t>Dans une première version, le manager destinataire était notifié dès la validation du CV par le RH (statut CV_REVIEWED). À l'usage, cela le sollicitait trop tôt : de nombreux dossiers étaient encore écartés lors du pré-filtrage téléphonique mené par le RH. J'ai donc déplacé la notification du manager à l'entrée en Test technique, c'est-à-dire une fois l'entretien téléphonique franchi ; le candidat, lui, reste informé de la présélection de son CV dès l'étape CV_REVIEWED. En cohérence, la vue des dossiers validés du manager ne fait plus apparaître les candidats qu'à partir du Test technique, ce qui recentre son attention sur les profils réellement en lice.</w:t>
+        <w:t>Une candidature retirée (statut WITHDRAWN) était jusque-là confondue avec les candidatures rejetées dans les filtres de la liste, et cette liste ne se mettait à jour qu'après rechargement de la page. J'ai séparé le retrait du rejet en lui dédiant son propre filtre, à l'image du filtre des candidatures rejetées, dans la liste des candidatures comme sur le tableau de bord, et fait en sorte que tout changement de statut rafraîchisse immédiatement la liste : un candidat passé en candidature retirée quitte aussitôt la vue active et le compteur est décrémenté, sans rechargement. Conformément au choix retenu, ces candidatures ne sont pas supprimées automatiquement : elles restent consultables via leur filtre, comme les candidatures rejetées.</w:t>
+      </w:r>
+      <w:r>
+        <w:t xml:space="preserve"> </w:t>
+      </w:r>
+      <w:r>
+        <w:t>Un candidat peut aussi retirer lui-même sa candidature tant qu’elle n’est pas close, via un endpoint dédié qui ne passe pas par les actions réservées au RH ou au manager.</w:t>
       </w:r>
     </w:p>
     <w:p>
       <w:pPr>
         <w:pStyle w:val="Titre3"/>
       </w:pPr>
-      <w:bookmarkStart w:id="62" w:name="_Toc238461673"/>
-      <w:r>
-        <w:t>4.5.6 Pertinence du matching Job idéal</w:t>
-      </w:r>
-      <w:bookmarkEnd w:id="62"/>
+      <w:bookmarkStart w:id="66" w:name="_Toc238477340"/>
+      <w:r>
+        <w:t>4.5.8 Entretien téléphonique RH obligatoire avant acceptation</w:t>
+      </w:r>
+      <w:bookmarkEnd w:id="66"/>
     </w:p>
     <w:p>
       <w:pPr>
         <w:jc w:val="both"/>
       </w:pPr>
       <w:r>
-        <w:t xml:space="preserve">La fonctionnalité de matching inverse, par laquelle un visiteur dépose son CV et le système lui suggère les offres les plus proches, retournait des résultats peu pertinents : un profil DevOps se voyait par exemple proposer des postes de développement backend. L'analyse a révélé deux causes : </w:t>
+        <w:t xml:space="preserve">En testant le parcours RH de bout en bout, je me suis rendu compte qu'un candidat pouvait être accepté directement depuis CV_REVIEWED, sans qu'aucun entretien téléphonique n'ait eu lieu : la </w:t>
       </w:r>
       <w:r>
         <w:lastRenderedPageBreak/>
-        <w:t>le score ne tenait compte que des compétences requises, en ignorant l'intitulé de l'offre, et le jeu de données comportait de nombreuses annonces en double qui saturaient le lot soumis à l'IA. J'ai corrigé les deux points en combinant, dans le score, l'intitulé de l'offre (pondéré à 60 %) et les compétences (40 %), et en dédupliquant les offres identiques avant l'appel à l'IA. Chaque profil (Java, DevOps, ProdOps, QA) ressort désormais sur les offres qui lui correspondent réellement.</w:t>
+        <w:t>machine à états ne l'interdisait pas explicitement. Cela allait à l'encontre du processus voulu, où cet entretien constitue le premier vrai filtre humain avant de solliciter le manager. J'ai donc retiré la transition CV_REVIEWED vers ACCEPTED : depuis cette étape, seuls restent possibles le passage en entretien téléphonique, le refus ou le retrait. Un profil manifestement hors sujet peut toujours être écarté sans attendre cet entretien ; c'est uniquement l'acceptation qui exige désormais d'être passé par PHONE_SCREENING.</w:t>
       </w:r>
     </w:p>
     <w:p>
       <w:pPr>
         <w:pStyle w:val="Titre3"/>
       </w:pPr>
-      <w:bookmarkStart w:id="63" w:name="_Toc238461674"/>
-      <w:r>
-        <w:t>4.5.7 Traitement distinct des candidatures retirées</w:t>
-      </w:r>
-      <w:bookmarkEnd w:id="63"/>
+      <w:bookmarkStart w:id="67" w:name="_Toc238477341"/>
+      <w:r>
+        <w:t>4.5.9 Découplage entre planification d'entretien et statut du candidat</w:t>
+      </w:r>
+      <w:bookmarkEnd w:id="67"/>
     </w:p>
     <w:p>
       <w:pPr>
         <w:jc w:val="both"/>
       </w:pPr>
       <w:r>
-        <w:t>Une candidature retirée (statut WITHDRAWN) était jusque-là confondue avec les candidatures rejetées dans les filtres de la liste, et cette liste ne se mettait à jour qu'après rechargement de la page. J'ai séparé le retrait du rejet en lui dédiant son propre filtre, à l'image du filtre des candidatures rejetées, dans la liste des candidatures comme sur le tableau de bord, et fait en sorte que tout changement de statut rafraîchisse immédiatement la liste : un candidat passé en candidature retirée quitte aussitôt la vue active et le compteur est décrémenté, sans rechargement. Conformément au choix retenu, ces candidatures ne sont pas supprimées automatiquement : elles restent consultables via leur filtre, comme les candidatures rejetées.</w:t>
+        <w:t>Ce même exercice a fait remonter un second problème, plus discret : planifier un entretien changeait le statut du candidat selon le type choisi, mais sans passer ni par le garde-fou décrit en 4.5.4, ni par le contrôle de périmètre du manager. Concrètement, planifier un entretien téléphonique sur un dossier déjà en phase technique suffisait à faire régresser son statut, sans qu'aucune vérification ne s'y oppose. J'ai séparé les deux responsabilités : la planification reste une opération de logistique (date, intervieweur, lieu) qui n'a plus aucun effet sur le statut ; seules des actions de statut dédiées, elles-mêmes garde-foutées, font avancer le dossier. Pour ne pas perdre en confort d'usage, l'interface garde une case à cocher optionnelle qui déclenche la transition correspondante en un clic, mais via l'endpoint garde-fouté, donc sans contourner la règle.</w:t>
+      </w:r>
+    </w:p>
+    <w:p>
+      <w:pPr>
+        <w:pStyle w:val="Titre3"/>
+      </w:pPr>
+      <w:bookmarkStart w:id="68" w:name="_Toc238477342"/>
+      <w:r>
+        <w:t>4.5.10 Fiabiliser l'intégration Google Meet et le format des webhooks n8n</w:t>
+      </w:r>
+      <w:bookmarkEnd w:id="68"/>
+    </w:p>
+    <w:p>
+      <w:r>
+        <w:t>Le lien Google Meet envoyé aux candidats et aux managers reposait initialement sur une valeur fictive, générée côté n8n sans appel réel à l'API Google Calendar - une limitation assumée à ce stade du développement. En remplaçant ce mécanisme par une véritable création d'événement Google Calendar (avec génération automatique du lien Meet), un problème plus ancien est remonté : le noeud Webhook de n8n imbrique le corps réel de la requête POST sous un champ body, alors que le workflow lisait les données à la racine. Ce défaut, antérieur à cette évolution, cassait silencieusement à la fois le routage de l'agent d'entretien et, potentiellement, celui de l'agent de décision finale. Je l'ai corrigé aux trois endroits concernés, puis validé le nouveau flux de bout en bout : création réelle de l'événement, ajout des participants, envoi de l'e-mail de convocation, et sauvegarde du lien via un point d'API dédié. Pour que cet appel à n8n reste fiable même en cas d'indisponibilité passagère, le backend s'appuie sur une file d'attente interne (outbox) : chaque déclenchement est journalisé, puis retenté automatiquement à intervalles croissants en cas d'échec, jusqu'à un nombre de tentatives limité, ce qui évite de perdre un événement sans pour autant bloquer la requête initiale.</w:t>
+      </w:r>
+    </w:p>
+    <w:p>
+      <w:pPr>
+        <w:pStyle w:val="Titre3"/>
+      </w:pPr>
+      <w:bookmarkStart w:id="69" w:name="_Toc238477343"/>
+      <w:r>
+        <w:t>4.5.11 Cloisonnement des données dans le chatbot candidat</w:t>
+      </w:r>
+      <w:bookmarkEnd w:id="69"/>
+    </w:p>
+    <w:p>
+      <w:r>
+        <w:t xml:space="preserve">L'ajout d'un assistant conversationnel candidat posait un risque spécifique : un modèle de langage peut, si on le laisse faire, être incité par un utilisateur malveillant à révéler des informations qu'il ne devrait pas partager, y compris celles qu'on lui a explicitement fournies en contexte. J'ai donc construit le contexte transmis au modèle en excluant dès la source, avant même l'appel à l'IA, le score et le résumé générés par l'agent de scoring, la correction manuelle du RH, l'identité de l'intervieweur et les notes internes d'entretien — ces champs ne quittent jamais le backend vers le prompt. Le message système impose en complément au modèle de ne répondre qu'à partir de ce contexte filtré, d'ignorer toute instruction contraire glissée dans la question du candidat, et de ne jamais reproduire ce contexte mot pour mot. Ces deux niveaux de protection — filtrage des données à la source, puis consignes du prompt système — ont été validés par des tests manuels explicites : demande directe du score, de l'identité de l'intervieweur, et tentative d'injection de prompt (« </w:t>
+      </w:r>
+      <w:r>
+        <w:lastRenderedPageBreak/>
+        <w:t>ignore tes instructions précédentes... ») ; dans les trois cas, l'assistant refuse poliment sans jamais divulguer l'information protégée.</w:t>
+      </w:r>
+    </w:p>
+    <w:p>
+      <w:pPr>
+        <w:pStyle w:val="Titre2"/>
+      </w:pPr>
+      <w:bookmarkStart w:id="70" w:name="_Toc238477344"/>
+      <w:r>
+        <w:t>4.6 Protection des données et éthique de l'IA</w:t>
+      </w:r>
+      <w:bookmarkEnd w:id="70"/>
+    </w:p>
+    <w:p>
+      <w:r>
+        <w:t xml:space="preserve">La plateforme manipule des données à caractère personnel : identité, coordonnées, CV et évaluations des candidats. Plusieurs principes ont guidé leur traitement. L'accès aux dossiers est strictement contrôlé selon le rôle de l'utilisateur, comme détaillé au tableau de la section 2.2.1 : un manager ne voit que les candidatures de son périmètre, seuls RH et Administrateur disposant d'une vue d'ensemble. Les mots de passe sont hachés (section 4.2.4), et chaque action sensible sur un dossier candidat est journalisée dans le journal d'audit avec l'identité de son auteur et un horodatage — </w:t>
+      </w:r>
+      <w:r>
+        <w:t>de quoi retracer qui a consulté ou modifié un dossier donné. Plusieurs protections techniques complètent ce socle : une limitation du nombre de tentatives de connexion pour freiner les attaques par force brute, une validation du contenu réel de chaque fichier déposé (au-delà de la simple extension déclarée) pour bloquer un upload malveillant, et un garde-fou contre les redirections internes non autorisées sur le point d'API utilisé pour tester la connectivité des webhooks n8n.</w:t>
+      </w:r>
+    </w:p>
+    <w:p>
+      <w:r>
+        <w:t>Le score attribué par l'agent d'intelligence artificielle est une aide à la présélection, pas une décision autonome : comme détaillé au chapitre 3, un score insuffisant déclenche un rejet automatique, mais ce rejet reste réversible par un RH ou un Administrateur via le mécanisme de surcharge manuelle, avec justification obligatoire et traçabilité complète. Cette conception vise à limiter le risque d'erreur ou de biais algorithmique en gardant un contrôle humain sur toute décision affectant un candidat, dans l'esprit des principes du RGPD [9], [10] relatifs aux décisions individuelles automatisées.</w:t>
+      </w:r>
+    </w:p>
+    <w:p>
+      <w:r>
+        <w:t>Ce dispositif comporte néanmoins des limites qu'il convient d'assumer : la dépendance à un service d'IA externe (Cohere) et à sa disponibilité, la sensibilité du score à la qualité et à la structure du CV fourni, le risque de biais inhérent à tout modèle statistique, et l'absence volontaire de décision entièrement autonome — chaque rejet automatique restant réversible par un opérateur humain.</w:t>
+      </w:r>
+      <w:r>
+        <w:t xml:space="preserve"> Pour ne jamais bloquer le dépôt d’une candidature en cas d’indisponibilité ou d’erreur de l’API Cohere, un mode dégradé prend automatiquement le relais : le score est alors calculé par une heuristique locale (analyse de mots-clés et de structure du texte), la source du score (COHERE ou SIMULATED) étant conservée pour traçabilité.</w:t>
       </w:r>
       <w:r>
         <w:t xml:space="preserve"> </w:t>
       </w:r>
       <w:r>
-        <w:t>Un candidat peut aussi retirer lui-même sa candidature tant qu’elle n’est pas close, via un endpoint dédié qui ne passe pas par les actions réservées au RH ou au manager.</w:t>
-      </w:r>
-    </w:p>
-    <w:p>
-      <w:pPr>
-        <w:pStyle w:val="Titre3"/>
-      </w:pPr>
-      <w:bookmarkStart w:id="64" w:name="_Toc238461675"/>
-      <w:r>
-        <w:t>4.5.8 Entretien téléphonique RH obligatoire avant acceptation</w:t>
-      </w:r>
-      <w:bookmarkEnd w:id="64"/>
-    </w:p>
-    <w:p>
-      <w:pPr>
-        <w:jc w:val="both"/>
-      </w:pPr>
-      <w:r>
-        <w:t>En testant le parcours RH de bout en bout, je me suis rendu compte qu'un candidat pouvait être accepté directement depuis CV_REVIEWED, sans qu'aucun entretien téléphonique n'ait eu lieu : la machine à états ne l'interdisait pas explicitement. Cela allait à l'encontre du processus voulu, où cet entretien constitue le premier vrai filtre humain avant de solliciter le manager. J'ai donc retiré la transition CV_REVIEWED vers ACCEPTED : depuis cette étape, seuls restent possibles le passage en entretien téléphonique, le refus ou le retrait. Un profil manifestement hors sujet peut toujours être écarté sans attendre cet entretien ; c'est uniquement l'acceptation qui exige désormais d'être passé par PHONE_SCREENING.</w:t>
-      </w:r>
-    </w:p>
-    <w:p>
-      <w:pPr>
-        <w:pStyle w:val="Titre3"/>
-      </w:pPr>
-      <w:bookmarkStart w:id="65" w:name="_Toc238461676"/>
-      <w:r>
-        <w:t>4.5.9 Découplage entre planification d'entretien et statut du candidat</w:t>
-      </w:r>
-      <w:bookmarkEnd w:id="65"/>
-    </w:p>
-    <w:p>
-      <w:pPr>
-        <w:jc w:val="both"/>
-      </w:pPr>
-      <w:r>
-        <w:t>Ce même exercice a fait remonter un second problème, plus discret : planifier un entretien changeait le statut du candidat selon le type choisi, mais sans passer ni par le garde-fou décrit en 4.5.4, ni par le contrôle de périmètre du manager. Concrètement, planifier un entretien téléphonique sur un dossier déjà en phase technique suffisait à faire régresser son statut, sans qu'aucune vérification ne s'y oppose. J'ai séparé les deux responsabilités : la planification reste une opération de logistique (date, intervieweur, lieu) qui n'a plus aucun effet sur le statut ; seules des actions de statut dédiées, elles-mêmes garde-foutées, font avancer le dossier. Pour ne pas perdre en confort d'usage, l'interface garde une case à cocher optionnelle qui déclenche la transition correspondante en un clic, mais via l'endpoint garde-fouté, donc sans contourner la règle.</w:t>
-      </w:r>
-    </w:p>
-    <w:p>
-      <w:pPr>
-        <w:pStyle w:val="Titre3"/>
-      </w:pPr>
-      <w:bookmarkStart w:id="66" w:name="_Toc238461677"/>
-      <w:r>
-        <w:t>4.5.10 Fiabiliser l'intégration Google Meet et le format des webhooks n8n</w:t>
-      </w:r>
-      <w:bookmarkEnd w:id="66"/>
-    </w:p>
-    <w:p>
-      <w:r>
-        <w:t xml:space="preserve">Le lien Google Meet envoyé aux candidats et aux managers reposait initialement sur une valeur fictive, générée côté n8n sans appel réel à l'API Google Calendar - une limitation assumée à ce stade du développement. En remplaçant ce mécanisme par une véritable création d'événement Google Calendar (avec génération automatique du lien Meet), un problème plus ancien est remonté : le noeud Webhook de n8n imbrique le corps réel de la requête POST sous un champ body, alors que le workflow lisait les données à la racine. Ce défaut, antérieur à cette évolution, cassait silencieusement </w:t>
-      </w:r>
-      <w:r>
-        <w:lastRenderedPageBreak/>
-        <w:t>à la fois le routage de l'agent d'entretien et, potentiellement, celui de l'agent de décision finale. Je l'ai corrigé aux trois endroits concernés, puis validé le nouveau flux de bout en bout : création réelle de l'événement, ajout des participants, envoi de l'e-mail de convocation, et sauvegarde du lien via un point d'API dédié. Pour que cet appel à n8n reste fiable même en cas d'indisponibilité passagère, le backend s'appuie sur une file d'attente interne (outbox) : chaque déclenchement est journalisé, puis retenté automatiquement à intervalles croissants en cas d'échec, jusqu'à un nombre de tentatives limité, ce qui évite de perdre un événement sans pour autant bloquer la requête initiale.</w:t>
-      </w:r>
-    </w:p>
-    <w:p>
-      <w:pPr>
-        <w:pStyle w:val="Titre3"/>
-      </w:pPr>
-      <w:r>
-        <w:t>4.5.11 Cloisonnement des données dans le chatbot candidat</w:t>
-      </w:r>
-    </w:p>
-    <w:p>
-      <w:pPr/>
-      <w:r>
-        <w:t>L'ajout d'un assistant conversationnel candidat posait un risque spécifique : un modèle de langage peut, si on le laisse faire, être incité par un utilisateur malveillant à révéler des informations qu'il ne devrait pas partager, y compris celles qu'on lui a explicitement fournies en contexte. J'ai donc construit le contexte transmis au modèle en excluant dès la source, avant même l'appel à l'IA, le score et le résumé générés par l'agent de scoring, la correction manuelle du RH, l'identité de l'intervieweur et les notes internes d'entretien — ces champs ne quittent jamais le backend vers le prompt. Le message système impose en complément au modèle de ne répondre qu'à partir de ce contexte filtré, d'ignorer toute instruction contraire glissée dans la question du candidat, et de ne jamais reproduire ce contexte mot pour mot. Ces deux niveaux de protection — filtrage des données à la source, puis consignes du prompt système — ont été validés par des tests manuels explicites : demande directe du score, de l'identité de l'intervieweur, et tentative d'injection de prompt (« ignore tes instructions précédentes... ») ; dans les trois cas, l'assistant refuse poliment sans jamais divulguer l'information protégée.</w:t>
+        <w:t>Ces limites justifient le maintien systématique d'une validation humaine et d'une traçabilité complète des décisions prises. La conception du processus de recrutement doit aussi tenir compte des principes de diversité et d'inclusion, afin de limiter les risques de discrimination dans des processus de sélection automatisés [14]. Par ailleurs, les captures d'écran présentées dans ce rapport (section 4.3) utilisent des données de test fictives ou anonymisées, à l'exception de quelques comptes de démonstration que j'ai moi-même créés à des fins de test.</w:t>
+      </w:r>
+    </w:p>
+    <w:p>
+      <w:r>
+        <w:t>Le chatbot candidat introduit en fin de projet (section 4.5.11) applique les mêmes principes : il ne s'appuie que sur les données de candidature du candidat connecté, dérivées côté serveur à partir du jeton JWT plutôt que d'un identifiant transmis par le client, et exclut structurellement les champs à usage interne (score IA, notes RH, identité de l'intervieweur) du contexte envoyé au modèle de langage.</w:t>
       </w:r>
     </w:p>
     <w:p>
       <w:pPr>
         <w:pStyle w:val="Titre2"/>
       </w:pPr>
-      <w:bookmarkStart w:id="67" w:name="_Toc238461678"/>
-      <w:r>
-        <w:t>4.6 Protection des données et éthique de l'IA</w:t>
-      </w:r>
-      <w:bookmarkEnd w:id="67"/>
-    </w:p>
-    <w:p>
-      <w:r>
-        <w:t xml:space="preserve">La plateforme manipule des données à caractère personnel : identité, coordonnées, CV et évaluations des candidats. Plusieurs principes ont guidé leur traitement. L'accès aux dossiers est strictement contrôlé selon le rôle de l'utilisateur, comme détaillé au tableau de la section 2.2.1 : un manager ne voit que les candidatures de son périmètre, seuls RH et Administrateur disposant d'une vue d'ensemble. Les mots de passe sont hachés (section 4.2.4), et chaque action sensible sur un dossier candidat est journalisée dans le journal d'audit avec l'identité de son auteur et un horodatage — </w:t>
-      </w:r>
-      <w:r>
-        <w:t>de quoi retracer qui a consulté ou modifié un dossier donné. Plusieurs protections techniques complètent ce socle : une limitation du nombre de tentatives de connexion pour freiner les attaques par force brute, une validation du contenu réel de chaque fichier déposé (au-delà de la simple extension déclarée) pour bloquer un upload malveillant, et un garde-fou contre les redirections internes non autorisées sur le point d'API utilisé pour tester la connectivité des webhooks n8n.</w:t>
-      </w:r>
-    </w:p>
-    <w:p>
-      <w:r>
-        <w:t>Le score attribué par l'agent d'intelligence artificielle est une aide à la présélection, pas une décision autonome : comme détaillé au chapitre 3, un score insuffisant déclenche un rejet automatique, mais ce rejet reste réversible par un RH ou un Administrateur via le mécanisme de surcharge manuelle, avec justification obligatoire et traçabilité complète. Cette conception vise à limiter le risque d'erreur ou de biais algorithmique en gardant un contrôle humain sur toute décision affectant un candidat, dans l'esprit des principes du RGPD [9], [10] relatifs aux décisions individuelles automatisées.</w:t>
-      </w:r>
-    </w:p>
-    <w:p>
-      <w:r>
-        <w:t>Ce dispositif comporte néanmoins des limites qu'il convient d'assumer : la dépendance à un service d'IA externe (Cohere) et à sa disponibilité, la sensibilité du score à la qualité et à la structure du CV fourni, le risque de biais inhérent à tout modèle statistique, et l'absence volontaire de décision entièrement autonome — chaque rejet automatique restant réversible par un opérateur humain.</w:t>
-      </w:r>
-      <w:r>
-        <w:t xml:space="preserve"> Pour ne jamais bloquer le dépôt d’une candidature en cas d’indisponibilité ou d’erreur de l’API Cohere, un mode dégradé prend automatiquement le relais : le score est alors calculé par une heuristique locale (analyse de mots-clés et de structure du texte), la source du score (COHERE ou SIMULATED) étant conservée pour traçabilité.</w:t>
-      </w:r>
-      <w:r>
-        <w:t xml:space="preserve"> </w:t>
-      </w:r>
-      <w:r>
-        <w:t>Ces limites justifient le maintien systématique d'une validation humaine et d'une traçabilité complète des décisions prises. La conception du processus de recrutement doit aussi tenir compte des principes de diversité et d'inclusion, afin de limiter les risques de discrimination dans des processus de sélection automatisés [14]. Par ailleurs, les captures d'écran présentées dans ce rapport (section 4.3) utilisent des données de test fictives ou anonymisées, à l'exception de quelques comptes de démonstration que j'ai moi-même créés à des fins de test.</w:t>
-      </w:r>
-    </w:p>
-    <w:p>
-      <w:pPr/>
-      <w:r>
-        <w:t>Le chatbot candidat introduit en fin de projet (section 4.5.11) applique les mêmes principes : il ne s'appuie que sur les données de candidature du candidat connecté, dérivées côté serveur à partir du jeton JWT plutôt que d'un identifiant transmis par le client, et exclut structurellement les champs à usage interne (score IA, notes RH, identité de l'intervieweur) du contexte envoyé au modèle de langage.</w:t>
-      </w:r>
-    </w:p>
-    <w:p>
-      <w:pPr>
-        <w:pStyle w:val="Titre2"/>
-      </w:pPr>
-      <w:bookmarkStart w:id="68" w:name="_Toc238461679"/>
+      <w:bookmarkStart w:id="71" w:name="_Toc238477345"/>
       <w:r>
         <w:t>4.7 Bilan des fonctionnalités réalisées</w:t>
       </w:r>
-      <w:bookmarkEnd w:id="68"/>
+      <w:bookmarkEnd w:id="71"/>
     </w:p>
     <w:p>
       <w:r>
@@ -11899,7 +12298,7 @@
       <w:tr>
         <w:tc>
           <w:tcPr>
-            <w:tcW w:type="dxa" w:w="4603"/>
+            <w:tcW w:w="4603" w:type="dxa"/>
           </w:tcPr>
           <w:p>
             <w:r>
@@ -11909,7 +12308,7 @@
         </w:tc>
         <w:tc>
           <w:tcPr>
-            <w:tcW w:type="dxa" w:w="4603"/>
+            <w:tcW w:w="4603" w:type="dxa"/>
           </w:tcPr>
           <w:p>
             <w:r>
@@ -11924,11 +12323,11 @@
       <w:pPr>
         <w:pStyle w:val="Titre2"/>
       </w:pPr>
-      <w:bookmarkStart w:id="69" w:name="_Toc238461680"/>
+      <w:bookmarkStart w:id="72" w:name="_Toc238477346"/>
       <w:r>
         <w:t>4.8 Conclusion</w:t>
       </w:r>
-      <w:bookmarkEnd w:id="69"/>
+      <w:bookmarkEnd w:id="72"/>
     </w:p>
     <w:p>
       <w:r>
@@ -11948,11 +12347,11 @@
         <w:pStyle w:val="Titre1"/>
         <w:jc w:val="center"/>
       </w:pPr>
-      <w:bookmarkStart w:id="70" w:name="_Toc238461681"/>
+      <w:bookmarkStart w:id="73" w:name="_Toc238477347"/>
       <w:r>
         <w:t>Conclusion Générale et Perspectives</w:t>
       </w:r>
-      <w:bookmarkEnd w:id="70"/>
+      <w:bookmarkEnd w:id="73"/>
     </w:p>
     <w:p>
       <w:r>
@@ -11996,11 +12395,11 @@
       <w:pPr>
         <w:pStyle w:val="Titre1"/>
       </w:pPr>
-      <w:bookmarkStart w:id="71" w:name="_Toc238461682"/>
+      <w:bookmarkStart w:id="74" w:name="_Toc238477348"/>
       <w:r>
         <w:t>Bibliographie</w:t>
       </w:r>
-      <w:bookmarkEnd w:id="71"/>
+      <w:bookmarkEnd w:id="74"/>
     </w:p>
     <w:p>
       <w:pPr>
@@ -12224,11 +12623,11 @@
       <w:pPr>
         <w:pStyle w:val="Titre1"/>
       </w:pPr>
-      <w:bookmarkStart w:id="72" w:name="_Toc238461683"/>
+      <w:bookmarkStart w:id="75" w:name="_Toc238477349"/>
       <w:r>
         <w:t>Glossaire</w:t>
       </w:r>
-      <w:bookmarkEnd w:id="72"/>
+      <w:bookmarkEnd w:id="75"/>
     </w:p>
     <w:p>
       <w:pPr>
@@ -12541,36 +12940,6 @@
     <w:pPr>
       <w:pStyle w:val="En-tte"/>
     </w:pPr>
-  </w:p>
-</w:hdr>
-</file>
-
-<file path=word/header2.xml><?xml version="1.0" encoding="utf-8"?>
-<w:hdr xmlns:wpc="http://schemas.microsoft.com/office/word/2010/wordprocessingCanvas" xmlns:cx="http://schemas.microsoft.com/office/drawing/2014/chartex" xmlns:cx1="http://schemas.microsoft.com/office/drawing/2015/9/8/chartex" xmlns:cx2="http://schemas.microsoft.com/office/drawing/2015/10/21/chartex" xmlns:cx3="http://schemas.microsoft.com/office/drawing/2016/5/9/chartex" xmlns:cx4="http://schemas.microsoft.com/office/drawing/2016/5/10/chartex" xmlns:cx5="http://schemas.microsoft.com/office/drawing/2016/5/11/chartex" xmlns:cx6="http://schemas.microsoft.com/office/drawing/2016/5/12/chartex" xmlns:cx7="http://schemas.microsoft.com/office/drawing/2016/5/13/chartex" xmlns:cx8="http://schemas.microsoft.com/office/drawing/2016/5/14/chartex" xmlns:mc="http://schemas.openxmlformats.org/markup-compatibility/2006" xmlns:aink="http://schemas.microsoft.com/office/drawing/2016/ink" xmlns:am3d="http://schemas.microsoft.com/office/drawing/2017/model3d" xmlns:o="urn:schemas-microsoft-com:office:office" xmlns:oel="http://schemas.microsoft.com/office/2019/extlst" xmlns:r="http://schemas.openxmlformats.org/officeDocument/2006/relationships" xmlns:m="http://schemas.openxmlformats.org/officeDocument/2006/math" xmlns:v="urn:schemas-microsoft-com:vml" xmlns:wp14="http://schemas.microsoft.com/office/word/2010/wordprocessingDrawing" xmlns:wp="http://schemas.openxmlformats.org/drawingml/2006/wordprocessingDrawing" xmlns:w10="urn:schemas-microsoft-com:office:word" xmlns:w="http://schemas.openxmlformats.org/wordprocessingml/2006/main" xmlns:w14="http://schemas.microsoft.com/office/word/2010/wordml" xmlns:w15="http://schemas.microsoft.com/office/word/2012/wordml" xmlns:w16cei="http://schemas.microsoft.com/office/word/2026/wordml/cei" xmlns:w16cex="http://schemas.microsoft.com/office/word/2018/wordml/cex" xmlns:w16cid="http://schemas.microsoft.com/office/word/2016/wordml/cid" xmlns:w16="http://schemas.microsoft.com/office/word/2018/wordml" xmlns:w16du="http://schemas.microsoft.com/office/word/2023/wordml/word16du" xmlns:w16sdtdh="http://schemas.microsoft.com/office/word/2020/wordml/sdtdatahash" xmlns:w16sdtfl="http://schemas.microsoft.com/office/word/2024/wordml/sdtformatlock" xmlns:w16se="http://schemas.microsoft.com/office/word/2015/wordml/symex" xmlns:wpg="http://schemas.microsoft.com/office/word/2010/wordprocessingGroup" xmlns:wpi="http://schemas.microsoft.com/office/word/2010/wordprocessingInk" xmlns:wne="http://schemas.microsoft.com/office/word/2006/wordml" xmlns:wps="http://schemas.microsoft.com/office/word/2010/wordprocessingShape" mc:Ignorable="w14 w15 w16se w16cid w16 w16cex w16sdtdh w16sdtfl w16du wp14">
-  <w:p>
-    <w:pPr>
-      <w:pStyle w:val="En-tte"/>
-    </w:pPr>
-  </w:p>
-</w:hdr>
-</file>
-
-<file path=word/header3.xml><?xml version="1.0" encoding="utf-8"?>
-<w:hdr xmlns:wpc="http://schemas.microsoft.com/office/word/2010/wordprocessingCanvas" xmlns:cx="http://schemas.microsoft.com/office/drawing/2014/chartex" xmlns:cx1="http://schemas.microsoft.com/office/drawing/2015/9/8/chartex" xmlns:cx2="http://schemas.microsoft.com/office/drawing/2015/10/21/chartex" xmlns:cx3="http://schemas.microsoft.com/office/drawing/2016/5/9/chartex" xmlns:cx4="http://schemas.microsoft.com/office/drawing/2016/5/10/chartex" xmlns:cx5="http://schemas.microsoft.com/office/drawing/2016/5/11/chartex" xmlns:cx6="http://schemas.microsoft.com/office/drawing/2016/5/12/chartex" xmlns:cx7="http://schemas.microsoft.com/office/drawing/2016/5/13/chartex" xmlns:cx8="http://schemas.microsoft.com/office/drawing/2016/5/14/chartex" xmlns:mc="http://schemas.openxmlformats.org/markup-compatibility/2006" xmlns:aink="http://schemas.microsoft.com/office/drawing/2016/ink" xmlns:am3d="http://schemas.microsoft.com/office/drawing/2017/model3d" xmlns:o="urn:schemas-microsoft-com:office:office" xmlns:oel="http://schemas.microsoft.com/office/2019/extlst" xmlns:r="http://schemas.openxmlformats.org/officeDocument/2006/relationships" xmlns:m="http://schemas.openxmlformats.org/officeDocument/2006/math" xmlns:v="urn:schemas-microsoft-com:vml" xmlns:wp14="http://schemas.microsoft.com/office/word/2010/wordprocessingDrawing" xmlns:wp="http://schemas.openxmlformats.org/drawingml/2006/wordprocessingDrawing" xmlns:w10="urn:schemas-microsoft-com:office:word" xmlns:w="http://schemas.openxmlformats.org/wordprocessingml/2006/main" xmlns:w14="http://schemas.microsoft.com/office/word/2010/wordml" xmlns:w15="http://schemas.microsoft.com/office/word/2012/wordml" xmlns:w16cei="http://schemas.microsoft.com/office/word/2026/wordml/cei" xmlns:w16cex="http://schemas.microsoft.com/office/word/2018/wordml/cex" xmlns:w16cid="http://schemas.microsoft.com/office/word/2016/wordml/cid" xmlns:w16="http://schemas.microsoft.com/office/word/2018/wordml" xmlns:w16du="http://schemas.microsoft.com/office/word/2023/wordml/word16du" xmlns:w16sdtdh="http://schemas.microsoft.com/office/word/2020/wordml/sdtdatahash" xmlns:w16sdtfl="http://schemas.microsoft.com/office/word/2024/wordml/sdtformatlock" xmlns:w16se="http://schemas.microsoft.com/office/word/2015/wordml/symex" xmlns:wpg="http://schemas.microsoft.com/office/word/2010/wordprocessingGroup" xmlns:wpi="http://schemas.microsoft.com/office/word/2010/wordprocessingInk" xmlns:wne="http://schemas.microsoft.com/office/word/2006/wordml" xmlns:wps="http://schemas.microsoft.com/office/word/2010/wordprocessingShape" mc:Ignorable="w14 w15 w16se w16cid w16 w16cex w16sdtdh w16sdtfl w16du wp14">
-  <w:p>
-    <w:pPr>
-      <w:pStyle w:val="En-tte"/>
-    </w:pPr>
-  </w:p>
-</w:hdr>
-</file>
-
-<file path=word/header4.xml><?xml version="1.0" encoding="utf-8"?>
-<w:hdr xmlns:wpc="http://schemas.microsoft.com/office/word/2010/wordprocessingCanvas" xmlns:cx="http://schemas.microsoft.com/office/drawing/2014/chartex" xmlns:cx1="http://schemas.microsoft.com/office/drawing/2015/9/8/chartex" xmlns:cx2="http://schemas.microsoft.com/office/drawing/2015/10/21/chartex" xmlns:cx3="http://schemas.microsoft.com/office/drawing/2016/5/9/chartex" xmlns:cx4="http://schemas.microsoft.com/office/drawing/2016/5/10/chartex" xmlns:cx5="http://schemas.microsoft.com/office/drawing/2016/5/11/chartex" xmlns:cx6="http://schemas.microsoft.com/office/drawing/2016/5/12/chartex" xmlns:cx7="http://schemas.microsoft.com/office/drawing/2016/5/13/chartex" xmlns:cx8="http://schemas.microsoft.com/office/drawing/2016/5/14/chartex" xmlns:mc="http://schemas.openxmlformats.org/markup-compatibility/2006" xmlns:aink="http://schemas.microsoft.com/office/drawing/2016/ink" xmlns:am3d="http://schemas.microsoft.com/office/drawing/2017/model3d" xmlns:o="urn:schemas-microsoft-com:office:office" xmlns:oel="http://schemas.microsoft.com/office/2019/extlst" xmlns:r="http://schemas.openxmlformats.org/officeDocument/2006/relationships" xmlns:m="http://schemas.openxmlformats.org/officeDocument/2006/math" xmlns:v="urn:schemas-microsoft-com:vml" xmlns:wp14="http://schemas.microsoft.com/office/word/2010/wordprocessingDrawing" xmlns:wp="http://schemas.openxmlformats.org/drawingml/2006/wordprocessingDrawing" xmlns:w10="urn:schemas-microsoft-com:office:word" xmlns:w="http://schemas.openxmlformats.org/wordprocessingml/2006/main" xmlns:w14="http://schemas.microsoft.com/office/word/2010/wordml" xmlns:w15="http://schemas.microsoft.com/office/word/2012/wordml" xmlns:w16cei="http://schemas.microsoft.com/office/word/2026/wordml/cei" xmlns:w16cex="http://schemas.microsoft.com/office/word/2018/wordml/cex" xmlns:w16cid="http://schemas.microsoft.com/office/word/2016/wordml/cid" xmlns:w16="http://schemas.microsoft.com/office/word/2018/wordml" xmlns:w16du="http://schemas.microsoft.com/office/word/2023/wordml/word16du" xmlns:w16sdtdh="http://schemas.microsoft.com/office/word/2020/wordml/sdtdatahash" xmlns:w16sdtfl="http://schemas.microsoft.com/office/word/2024/wordml/sdtformatlock" xmlns:w16se="http://schemas.microsoft.com/office/word/2015/wordml/symex" xmlns:wpg="http://schemas.microsoft.com/office/word/2010/wordprocessingGroup" xmlns:wpi="http://schemas.microsoft.com/office/word/2010/wordprocessingInk" xmlns:wne="http://schemas.microsoft.com/office/word/2006/wordml" xmlns:wps="http://schemas.microsoft.com/office/word/2010/wordprocessingShape" mc:Ignorable="w14 w15 w16se w16cid w16 w16cex w16sdtdh w16sdtfl w16du wp14">
-  <w:p>
-    <w:pPr>
-      <w:pStyle w:val="En-tte"/>
-    </w:pPr>
     <w:r>
       <w:rPr>
         <w:noProof/>
@@ -12615,7 +12984,7 @@
 </w:hdr>
 </file>
 
-<file path=word/header5.xml><?xml version="1.0" encoding="utf-8"?>
+<file path=word/header2.xml><?xml version="1.0" encoding="utf-8"?>
 <w:hdr xmlns:wpc="http://schemas.microsoft.com/office/word/2010/wordprocessingCanvas" xmlns:cx="http://schemas.microsoft.com/office/drawing/2014/chartex" xmlns:cx1="http://schemas.microsoft.com/office/drawing/2015/9/8/chartex" xmlns:cx2="http://schemas.microsoft.com/office/drawing/2015/10/21/chartex" xmlns:cx3="http://schemas.microsoft.com/office/drawing/2016/5/9/chartex" xmlns:cx4="http://schemas.microsoft.com/office/drawing/2016/5/10/chartex" xmlns:cx5="http://schemas.microsoft.com/office/drawing/2016/5/11/chartex" xmlns:cx6="http://schemas.microsoft.com/office/drawing/2016/5/12/chartex" xmlns:cx7="http://schemas.microsoft.com/office/drawing/2016/5/13/chartex" xmlns:cx8="http://schemas.microsoft.com/office/drawing/2016/5/14/chartex" xmlns:mc="http://schemas.openxmlformats.org/markup-compatibility/2006" xmlns:aink="http://schemas.microsoft.com/office/drawing/2016/ink" xmlns:am3d="http://schemas.microsoft.com/office/drawing/2017/model3d" xmlns:o="urn:schemas-microsoft-com:office:office" xmlns:oel="http://schemas.microsoft.com/office/2019/extlst" xmlns:r="http://schemas.openxmlformats.org/officeDocument/2006/relationships" xmlns:m="http://schemas.openxmlformats.org/officeDocument/2006/math" xmlns:v="urn:schemas-microsoft-com:vml" xmlns:wp14="http://schemas.microsoft.com/office/word/2010/wordprocessingDrawing" xmlns:wp="http://schemas.openxmlformats.org/drawingml/2006/wordprocessingDrawing" xmlns:w10="urn:schemas-microsoft-com:office:word" xmlns:w="http://schemas.openxmlformats.org/wordprocessingml/2006/main" xmlns:w14="http://schemas.microsoft.com/office/word/2010/wordml" xmlns:w15="http://schemas.microsoft.com/office/word/2012/wordml" xmlns:w16cei="http://schemas.microsoft.com/office/word/2026/wordml/cei" xmlns:w16cex="http://schemas.microsoft.com/office/word/2018/wordml/cex" xmlns:w16cid="http://schemas.microsoft.com/office/word/2016/wordml/cid" xmlns:w16="http://schemas.microsoft.com/office/word/2018/wordml" xmlns:w16du="http://schemas.microsoft.com/office/word/2023/wordml/word16du" xmlns:w16sdtdh="http://schemas.microsoft.com/office/word/2020/wordml/sdtdatahash" xmlns:w16sdtfl="http://schemas.microsoft.com/office/word/2024/wordml/sdtformatlock" xmlns:w16se="http://schemas.microsoft.com/office/word/2015/wordml/symex" xmlns:wpg="http://schemas.microsoft.com/office/word/2010/wordprocessingGroup" xmlns:wpi="http://schemas.microsoft.com/office/word/2010/wordprocessingInk" xmlns:wne="http://schemas.microsoft.com/office/word/2006/wordml" xmlns:wps="http://schemas.microsoft.com/office/word/2010/wordprocessingShape" mc:Ignorable="w14 w15 w16se w16cid w16 w16cex w16sdtdh w16sdtfl w16du wp14">
   <w:p>
     <w:pPr>
@@ -12665,7 +13034,7 @@
 </w:hdr>
 </file>
 
-<file path=word/header6.xml><?xml version="1.0" encoding="utf-8"?>
+<file path=word/header3.xml><?xml version="1.0" encoding="utf-8"?>
 <w:hdr xmlns:wpc="http://schemas.microsoft.com/office/word/2010/wordprocessingCanvas" xmlns:cx="http://schemas.microsoft.com/office/drawing/2014/chartex" xmlns:cx1="http://schemas.microsoft.com/office/drawing/2015/9/8/chartex" xmlns:cx2="http://schemas.microsoft.com/office/drawing/2015/10/21/chartex" xmlns:cx3="http://schemas.microsoft.com/office/drawing/2016/5/9/chartex" xmlns:cx4="http://schemas.microsoft.com/office/drawing/2016/5/10/chartex" xmlns:cx5="http://schemas.microsoft.com/office/drawing/2016/5/11/chartex" xmlns:cx6="http://schemas.microsoft.com/office/drawing/2016/5/12/chartex" xmlns:cx7="http://schemas.microsoft.com/office/drawing/2016/5/13/chartex" xmlns:cx8="http://schemas.microsoft.com/office/drawing/2016/5/14/chartex" xmlns:mc="http://schemas.openxmlformats.org/markup-compatibility/2006" xmlns:aink="http://schemas.microsoft.com/office/drawing/2016/ink" xmlns:am3d="http://schemas.microsoft.com/office/drawing/2017/model3d" xmlns:o="urn:schemas-microsoft-com:office:office" xmlns:oel="http://schemas.microsoft.com/office/2019/extlst" xmlns:r="http://schemas.openxmlformats.org/officeDocument/2006/relationships" xmlns:m="http://schemas.openxmlformats.org/officeDocument/2006/math" xmlns:v="urn:schemas-microsoft-com:vml" xmlns:wp14="http://schemas.microsoft.com/office/word/2010/wordprocessingDrawing" xmlns:wp="http://schemas.openxmlformats.org/drawingml/2006/wordprocessingDrawing" xmlns:w10="urn:schemas-microsoft-com:office:word" xmlns:w="http://schemas.openxmlformats.org/wordprocessingml/2006/main" xmlns:w14="http://schemas.microsoft.com/office/word/2010/wordml" xmlns:w15="http://schemas.microsoft.com/office/word/2012/wordml" xmlns:w16cei="http://schemas.microsoft.com/office/word/2026/wordml/cei" xmlns:w16cex="http://schemas.microsoft.com/office/word/2018/wordml/cex" xmlns:w16cid="http://schemas.microsoft.com/office/word/2016/wordml/cid" xmlns:w16="http://schemas.microsoft.com/office/word/2018/wordml" xmlns:w16du="http://schemas.microsoft.com/office/word/2023/wordml/word16du" xmlns:w16sdtdh="http://schemas.microsoft.com/office/word/2020/wordml/sdtdatahash" xmlns:w16sdtfl="http://schemas.microsoft.com/office/word/2024/wordml/sdtformatlock" xmlns:w16se="http://schemas.microsoft.com/office/word/2015/wordml/symex" xmlns:wpg="http://schemas.microsoft.com/office/word/2010/wordprocessingGroup" xmlns:wpi="http://schemas.microsoft.com/office/word/2010/wordprocessingInk" xmlns:wne="http://schemas.microsoft.com/office/word/2006/wordml" xmlns:wps="http://schemas.microsoft.com/office/word/2010/wordprocessingShape" mc:Ignorable="w14 w15 w16se w16cid w16 w16cex w16sdtdh w16sdtfl w16du wp14">
   <w:p>
     <w:pPr>

</xml_diff>

<commit_message>
docs: ajouter le diagramme d'activite du processus de recrutement
Ajoute en 3.9 une vue d'ensemble en diagramme d'activite (PlantUML,
meme style que les autres diagrammes), avec un couloir par acteur
(Candidat / Systeme-IA / RH / Manager). Complete le diagramme d'etats
existant (3.5), qui decrit les statuts mais pas qui agit a chaque
etape. Rend explicites l'obligation de l'entretien telephonique RH
avant l'evaluation technique (4.5.8) et le moment reel du routage
manager (4.5.5).

Renomme "3.9 Conclusion" en "3.10 Conclusion", ajoute la Figure 3.11
correspondante, et met a jour la Table des matieres / Liste des
figures / Liste des tableaux avec les vraies pages (calculees via
Word).

Co-Authored-By: Claude Sonnet 5 <noreply@anthropic.com>
</commit_message>
<xml_diff>
--- a/Rapport-PFE/Rapport_PFE_Bargaoui_Haythem.docx
+++ b/Rapport-PFE/Rapport_PFE_Bargaoui_Haythem.docx
@@ -805,7 +805,7 @@
         <w:pStyle w:val="Titre1"/>
         <w:jc w:val="center"/>
       </w:pPr>
-      <w:bookmarkStart w:id="0" w:name="_Toc238477274"/>
+      <w:bookmarkStart w:id="0" w:name="_Toc238477756"/>
       <w:r>
         <w:t>Table des matières</w:t>
       </w:r>
@@ -855,7 +855,7 @@
         <w:rPr>
           <w:noProof/>
         </w:rPr>
-        <w:instrText xml:space="preserve"> PAGEREF _Toc238477274 \h </w:instrText>
+        <w:instrText xml:space="preserve"> PAGEREF _Toc238477756 \h </w:instrText>
       </w:r>
       <w:r>
         <w:rPr>
@@ -916,7 +916,7 @@
         <w:rPr>
           <w:noProof/>
         </w:rPr>
-        <w:instrText xml:space="preserve"> PAGEREF _Toc238477275 \h </w:instrText>
+        <w:instrText xml:space="preserve"> PAGEREF _Toc238477757 \h </w:instrText>
       </w:r>
       <w:r>
         <w:rPr>
@@ -977,7 +977,7 @@
         <w:rPr>
           <w:noProof/>
         </w:rPr>
-        <w:instrText xml:space="preserve"> PAGEREF _Toc238477276 \h </w:instrText>
+        <w:instrText xml:space="preserve"> PAGEREF _Toc238477758 \h </w:instrText>
       </w:r>
       <w:r>
         <w:rPr>
@@ -1038,7 +1038,7 @@
         <w:rPr>
           <w:noProof/>
         </w:rPr>
-        <w:instrText xml:space="preserve"> PAGEREF _Toc238477277 \h </w:instrText>
+        <w:instrText xml:space="preserve"> PAGEREF _Toc238477759 \h </w:instrText>
       </w:r>
       <w:r>
         <w:rPr>
@@ -1099,7 +1099,7 @@
         <w:rPr>
           <w:noProof/>
         </w:rPr>
-        <w:instrText xml:space="preserve"> PAGEREF _Toc238477278 \h </w:instrText>
+        <w:instrText xml:space="preserve"> PAGEREF _Toc238477760 \h </w:instrText>
       </w:r>
       <w:r>
         <w:rPr>
@@ -1160,7 +1160,7 @@
         <w:rPr>
           <w:noProof/>
         </w:rPr>
-        <w:instrText xml:space="preserve"> PAGEREF _Toc238477279 \h </w:instrText>
+        <w:instrText xml:space="preserve"> PAGEREF _Toc238477761 \h </w:instrText>
       </w:r>
       <w:r>
         <w:rPr>
@@ -1221,7 +1221,7 @@
         <w:rPr>
           <w:noProof/>
         </w:rPr>
-        <w:instrText xml:space="preserve"> PAGEREF _Toc238477280 \h </w:instrText>
+        <w:instrText xml:space="preserve"> PAGEREF _Toc238477762 \h </w:instrText>
       </w:r>
       <w:r>
         <w:rPr>
@@ -1282,7 +1282,7 @@
         <w:rPr>
           <w:noProof/>
         </w:rPr>
-        <w:instrText xml:space="preserve"> PAGEREF _Toc238477281 \h </w:instrText>
+        <w:instrText xml:space="preserve"> PAGEREF _Toc238477763 \h </w:instrText>
       </w:r>
       <w:r>
         <w:rPr>
@@ -1343,7 +1343,7 @@
         <w:rPr>
           <w:noProof/>
         </w:rPr>
-        <w:instrText xml:space="preserve"> PAGEREF _Toc238477282 \h </w:instrText>
+        <w:instrText xml:space="preserve"> PAGEREF _Toc238477764 \h </w:instrText>
       </w:r>
       <w:r>
         <w:rPr>
@@ -1404,7 +1404,7 @@
         <w:rPr>
           <w:noProof/>
         </w:rPr>
-        <w:instrText xml:space="preserve"> PAGEREF _Toc238477283 \h </w:instrText>
+        <w:instrText xml:space="preserve"> PAGEREF _Toc238477765 \h </w:instrText>
       </w:r>
       <w:r>
         <w:rPr>
@@ -1465,7 +1465,7 @@
         <w:rPr>
           <w:noProof/>
         </w:rPr>
-        <w:instrText xml:space="preserve"> PAGEREF _Toc238477284 \h </w:instrText>
+        <w:instrText xml:space="preserve"> PAGEREF _Toc238477766 \h </w:instrText>
       </w:r>
       <w:r>
         <w:rPr>
@@ -1526,7 +1526,7 @@
         <w:rPr>
           <w:noProof/>
         </w:rPr>
-        <w:instrText xml:space="preserve"> PAGEREF _Toc238477285 \h </w:instrText>
+        <w:instrText xml:space="preserve"> PAGEREF _Toc238477767 \h </w:instrText>
       </w:r>
       <w:r>
         <w:rPr>
@@ -1587,7 +1587,7 @@
         <w:rPr>
           <w:noProof/>
         </w:rPr>
-        <w:instrText xml:space="preserve"> PAGEREF _Toc238477286 \h </w:instrText>
+        <w:instrText xml:space="preserve"> PAGEREF _Toc238477768 \h </w:instrText>
       </w:r>
       <w:r>
         <w:rPr>
@@ -1648,7 +1648,7 @@
         <w:rPr>
           <w:noProof/>
         </w:rPr>
-        <w:instrText xml:space="preserve"> PAGEREF _Toc238477287 \h </w:instrText>
+        <w:instrText xml:space="preserve"> PAGEREF _Toc238477769 \h </w:instrText>
       </w:r>
       <w:r>
         <w:rPr>
@@ -1709,7 +1709,7 @@
         <w:rPr>
           <w:noProof/>
         </w:rPr>
-        <w:instrText xml:space="preserve"> PAGEREF _Toc238477288 \h </w:instrText>
+        <w:instrText xml:space="preserve"> PAGEREF _Toc238477770 \h </w:instrText>
       </w:r>
       <w:r>
         <w:rPr>
@@ -1770,7 +1770,7 @@
         <w:rPr>
           <w:noProof/>
         </w:rPr>
-        <w:instrText xml:space="preserve"> PAGEREF _Toc238477289 \h </w:instrText>
+        <w:instrText xml:space="preserve"> PAGEREF _Toc238477771 \h </w:instrText>
       </w:r>
       <w:r>
         <w:rPr>
@@ -1831,7 +1831,7 @@
         <w:rPr>
           <w:noProof/>
         </w:rPr>
-        <w:instrText xml:space="preserve"> PAGEREF _Toc238477290 \h </w:instrText>
+        <w:instrText xml:space="preserve"> PAGEREF _Toc238477772 \h </w:instrText>
       </w:r>
       <w:r>
         <w:rPr>
@@ -1892,7 +1892,7 @@
         <w:rPr>
           <w:noProof/>
         </w:rPr>
-        <w:instrText xml:space="preserve"> PAGEREF _Toc238477291 \h </w:instrText>
+        <w:instrText xml:space="preserve"> PAGEREF _Toc238477773 \h </w:instrText>
       </w:r>
       <w:r>
         <w:rPr>
@@ -1953,7 +1953,7 @@
         <w:rPr>
           <w:noProof/>
         </w:rPr>
-        <w:instrText xml:space="preserve"> PAGEREF _Toc238477292 \h </w:instrText>
+        <w:instrText xml:space="preserve"> PAGEREF _Toc238477774 \h </w:instrText>
       </w:r>
       <w:r>
         <w:rPr>
@@ -2014,7 +2014,7 @@
         <w:rPr>
           <w:noProof/>
         </w:rPr>
-        <w:instrText xml:space="preserve"> PAGEREF _Toc238477293 \h </w:instrText>
+        <w:instrText xml:space="preserve"> PAGEREF _Toc238477775 \h </w:instrText>
       </w:r>
       <w:r>
         <w:rPr>
@@ -2075,7 +2075,7 @@
         <w:rPr>
           <w:noProof/>
         </w:rPr>
-        <w:instrText xml:space="preserve"> PAGEREF _Toc238477294 \h </w:instrText>
+        <w:instrText xml:space="preserve"> PAGEREF _Toc238477776 \h </w:instrText>
       </w:r>
       <w:r>
         <w:rPr>
@@ -2136,7 +2136,7 @@
         <w:rPr>
           <w:noProof/>
         </w:rPr>
-        <w:instrText xml:space="preserve"> PAGEREF _Toc238477295 \h </w:instrText>
+        <w:instrText xml:space="preserve"> PAGEREF _Toc238477777 \h </w:instrText>
       </w:r>
       <w:r>
         <w:rPr>
@@ -2197,7 +2197,7 @@
         <w:rPr>
           <w:noProof/>
         </w:rPr>
-        <w:instrText xml:space="preserve"> PAGEREF _Toc238477296 \h </w:instrText>
+        <w:instrText xml:space="preserve"> PAGEREF _Toc238477778 \h </w:instrText>
       </w:r>
       <w:r>
         <w:rPr>
@@ -2258,7 +2258,7 @@
         <w:rPr>
           <w:noProof/>
         </w:rPr>
-        <w:instrText xml:space="preserve"> PAGEREF _Toc238477297 \h </w:instrText>
+        <w:instrText xml:space="preserve"> PAGEREF _Toc238477779 \h </w:instrText>
       </w:r>
       <w:r>
         <w:rPr>
@@ -2319,7 +2319,7 @@
         <w:rPr>
           <w:noProof/>
         </w:rPr>
-        <w:instrText xml:space="preserve"> PAGEREF _Toc238477298 \h </w:instrText>
+        <w:instrText xml:space="preserve"> PAGEREF _Toc238477780 \h </w:instrText>
       </w:r>
       <w:r>
         <w:rPr>
@@ -2380,7 +2380,7 @@
         <w:rPr>
           <w:noProof/>
         </w:rPr>
-        <w:instrText xml:space="preserve"> PAGEREF _Toc238477299 \h </w:instrText>
+        <w:instrText xml:space="preserve"> PAGEREF _Toc238477781 \h </w:instrText>
       </w:r>
       <w:r>
         <w:rPr>
@@ -2441,7 +2441,7 @@
         <w:rPr>
           <w:noProof/>
         </w:rPr>
-        <w:instrText xml:space="preserve"> PAGEREF _Toc238477300 \h </w:instrText>
+        <w:instrText xml:space="preserve"> PAGEREF _Toc238477782 \h </w:instrText>
       </w:r>
       <w:r>
         <w:rPr>
@@ -2503,7 +2503,7 @@
         <w:rPr>
           <w:noProof/>
         </w:rPr>
-        <w:instrText xml:space="preserve"> PAGEREF _Toc238477301 \h </w:instrText>
+        <w:instrText xml:space="preserve"> PAGEREF _Toc238477783 \h </w:instrText>
       </w:r>
       <w:r>
         <w:rPr>
@@ -2564,7 +2564,7 @@
         <w:rPr>
           <w:noProof/>
         </w:rPr>
-        <w:instrText xml:space="preserve"> PAGEREF _Toc238477302 \h </w:instrText>
+        <w:instrText xml:space="preserve"> PAGEREF _Toc238477784 \h </w:instrText>
       </w:r>
       <w:r>
         <w:rPr>
@@ -2625,7 +2625,7 @@
         <w:rPr>
           <w:noProof/>
         </w:rPr>
-        <w:instrText xml:space="preserve"> PAGEREF _Toc238477303 \h </w:instrText>
+        <w:instrText xml:space="preserve"> PAGEREF _Toc238477785 \h </w:instrText>
       </w:r>
       <w:r>
         <w:rPr>
@@ -2686,7 +2686,7 @@
         <w:rPr>
           <w:noProof/>
         </w:rPr>
-        <w:instrText xml:space="preserve"> PAGEREF _Toc238477304 \h </w:instrText>
+        <w:instrText xml:space="preserve"> PAGEREF _Toc238477786 \h </w:instrText>
       </w:r>
       <w:r>
         <w:rPr>
@@ -2747,7 +2747,7 @@
         <w:rPr>
           <w:noProof/>
         </w:rPr>
-        <w:instrText xml:space="preserve"> PAGEREF _Toc238477305 \h </w:instrText>
+        <w:instrText xml:space="preserve"> PAGEREF _Toc238477787 \h </w:instrText>
       </w:r>
       <w:r>
         <w:rPr>
@@ -2808,7 +2808,7 @@
         <w:rPr>
           <w:noProof/>
         </w:rPr>
-        <w:instrText xml:space="preserve"> PAGEREF _Toc238477306 \h </w:instrText>
+        <w:instrText xml:space="preserve"> PAGEREF _Toc238477788 \h </w:instrText>
       </w:r>
       <w:r>
         <w:rPr>
@@ -2869,7 +2869,7 @@
         <w:rPr>
           <w:noProof/>
         </w:rPr>
-        <w:instrText xml:space="preserve"> PAGEREF _Toc238477307 \h </w:instrText>
+        <w:instrText xml:space="preserve"> PAGEREF _Toc238477789 \h </w:instrText>
       </w:r>
       <w:r>
         <w:rPr>
@@ -2930,7 +2930,7 @@
         <w:rPr>
           <w:noProof/>
         </w:rPr>
-        <w:instrText xml:space="preserve"> PAGEREF _Toc238477308 \h </w:instrText>
+        <w:instrText xml:space="preserve"> PAGEREF _Toc238477790 \h </w:instrText>
       </w:r>
       <w:r>
         <w:rPr>
@@ -2991,7 +2991,7 @@
         <w:rPr>
           <w:noProof/>
         </w:rPr>
-        <w:instrText xml:space="preserve"> PAGEREF _Toc238477309 \h </w:instrText>
+        <w:instrText xml:space="preserve"> PAGEREF _Toc238477791 \h </w:instrText>
       </w:r>
       <w:r>
         <w:rPr>
@@ -3052,7 +3052,7 @@
         <w:rPr>
           <w:noProof/>
         </w:rPr>
-        <w:instrText xml:space="preserve"> PAGEREF _Toc238477310 \h </w:instrText>
+        <w:instrText xml:space="preserve"> PAGEREF _Toc238477792 \h </w:instrText>
       </w:r>
       <w:r>
         <w:rPr>
@@ -3113,7 +3113,7 @@
         <w:rPr>
           <w:noProof/>
         </w:rPr>
-        <w:instrText xml:space="preserve"> PAGEREF _Toc238477311 \h </w:instrText>
+        <w:instrText xml:space="preserve"> PAGEREF _Toc238477793 \h </w:instrText>
       </w:r>
       <w:r>
         <w:rPr>
@@ -3174,7 +3174,7 @@
         <w:rPr>
           <w:noProof/>
         </w:rPr>
-        <w:instrText xml:space="preserve"> PAGEREF _Toc238477312 \h </w:instrText>
+        <w:instrText xml:space="preserve"> PAGEREF _Toc238477794 \h </w:instrText>
       </w:r>
       <w:r>
         <w:rPr>
@@ -3235,7 +3235,7 @@
         <w:rPr>
           <w:noProof/>
         </w:rPr>
-        <w:instrText xml:space="preserve"> PAGEREF _Toc238477313 \h </w:instrText>
+        <w:instrText xml:space="preserve"> PAGEREF _Toc238477795 \h </w:instrText>
       </w:r>
       <w:r>
         <w:rPr>
@@ -3296,7 +3296,7 @@
         <w:rPr>
           <w:noProof/>
         </w:rPr>
-        <w:instrText xml:space="preserve"> PAGEREF _Toc238477314 \h </w:instrText>
+        <w:instrText xml:space="preserve"> PAGEREF _Toc238477796 \h </w:instrText>
       </w:r>
       <w:r>
         <w:rPr>
@@ -3357,7 +3357,7 @@
         <w:rPr>
           <w:noProof/>
         </w:rPr>
-        <w:instrText xml:space="preserve"> PAGEREF _Toc238477315 \h </w:instrText>
+        <w:instrText xml:space="preserve"> PAGEREF _Toc238477797 \h </w:instrText>
       </w:r>
       <w:r>
         <w:rPr>
@@ -3418,7 +3418,7 @@
         <w:rPr>
           <w:noProof/>
         </w:rPr>
-        <w:instrText xml:space="preserve"> PAGEREF _Toc238477316 \h </w:instrText>
+        <w:instrText xml:space="preserve"> PAGEREF _Toc238477798 \h </w:instrText>
       </w:r>
       <w:r>
         <w:rPr>
@@ -3479,7 +3479,7 @@
         <w:rPr>
           <w:noProof/>
         </w:rPr>
-        <w:instrText xml:space="preserve"> PAGEREF _Toc238477317 \h </w:instrText>
+        <w:instrText xml:space="preserve"> PAGEREF _Toc238477799 \h </w:instrText>
       </w:r>
       <w:r>
         <w:rPr>
@@ -3522,7 +3522,7 @@
         <w:rPr>
           <w:noProof/>
         </w:rPr>
-        <w:t>3.9 Conclusion</w:t>
+        <w:t>3.9 Diagramme d'activité — Vue d'ensemble du processus de recrutement</w:t>
       </w:r>
       <w:r>
         <w:rPr>
@@ -3540,7 +3540,7 @@
         <w:rPr>
           <w:noProof/>
         </w:rPr>
-        <w:instrText xml:space="preserve"> PAGEREF _Toc238477318 \h </w:instrText>
+        <w:instrText xml:space="preserve"> PAGEREF _Toc238477800 \h </w:instrText>
       </w:r>
       <w:r>
         <w:rPr>
@@ -3558,6 +3558,67 @@
           <w:noProof/>
         </w:rPr>
         <w:t>31</w:t>
+      </w:r>
+      <w:r>
+        <w:rPr>
+          <w:noProof/>
+        </w:rPr>
+        <w:fldChar w:fldCharType="end"/>
+      </w:r>
+    </w:p>
+    <w:p>
+      <w:pPr>
+        <w:pStyle w:val="TM2"/>
+        <w:tabs>
+          <w:tab w:val="right" w:leader="dot" w:pos="10456"/>
+        </w:tabs>
+        <w:rPr>
+          <w:rFonts w:asciiTheme="minorHAnsi" w:eastAsiaTheme="minorEastAsia" w:hAnsiTheme="minorHAnsi" w:cstheme="minorBidi"/>
+          <w:noProof/>
+          <w:lang w:eastAsia="fr-FR"/>
+          <w14:ligatures w14:val="standardContextual"/>
+        </w:rPr>
+      </w:pPr>
+      <w:r>
+        <w:rPr>
+          <w:noProof/>
+        </w:rPr>
+        <w:t>3.10 Conclusion</w:t>
+      </w:r>
+      <w:r>
+        <w:rPr>
+          <w:noProof/>
+        </w:rPr>
+        <w:tab/>
+      </w:r>
+      <w:r>
+        <w:rPr>
+          <w:noProof/>
+        </w:rPr>
+        <w:fldChar w:fldCharType="begin"/>
+      </w:r>
+      <w:r>
+        <w:rPr>
+          <w:noProof/>
+        </w:rPr>
+        <w:instrText xml:space="preserve"> PAGEREF _Toc238477801 \h </w:instrText>
+      </w:r>
+      <w:r>
+        <w:rPr>
+          <w:noProof/>
+        </w:rPr>
+      </w:r>
+      <w:r>
+        <w:rPr>
+          <w:noProof/>
+        </w:rPr>
+        <w:fldChar w:fldCharType="separate"/>
+      </w:r>
+      <w:r>
+        <w:rPr>
+          <w:noProof/>
+        </w:rPr>
+        <w:t>32</w:t>
       </w:r>
       <w:r>
         <w:rPr>
@@ -3601,7 +3662,7 @@
         <w:rPr>
           <w:noProof/>
         </w:rPr>
-        <w:instrText xml:space="preserve"> PAGEREF _Toc238477319 \h </w:instrText>
+        <w:instrText xml:space="preserve"> PAGEREF _Toc238477802 \h </w:instrText>
       </w:r>
       <w:r>
         <w:rPr>
@@ -3618,7 +3679,7 @@
         <w:rPr>
           <w:noProof/>
         </w:rPr>
-        <w:t>32</w:t>
+        <w:t>34</w:t>
       </w:r>
       <w:r>
         <w:rPr>
@@ -3662,7 +3723,7 @@
         <w:rPr>
           <w:noProof/>
         </w:rPr>
-        <w:instrText xml:space="preserve"> PAGEREF _Toc238477320 \h </w:instrText>
+        <w:instrText xml:space="preserve"> PAGEREF _Toc238477803 \h </w:instrText>
       </w:r>
       <w:r>
         <w:rPr>
@@ -3679,7 +3740,7 @@
         <w:rPr>
           <w:noProof/>
         </w:rPr>
-        <w:t>32</w:t>
+        <w:t>34</w:t>
       </w:r>
       <w:r>
         <w:rPr>
@@ -3723,7 +3784,7 @@
         <w:rPr>
           <w:noProof/>
         </w:rPr>
-        <w:instrText xml:space="preserve"> PAGEREF _Toc238477321 \h </w:instrText>
+        <w:instrText xml:space="preserve"> PAGEREF _Toc238477804 \h </w:instrText>
       </w:r>
       <w:r>
         <w:rPr>
@@ -3740,7 +3801,7 @@
         <w:rPr>
           <w:noProof/>
         </w:rPr>
-        <w:t>32</w:t>
+        <w:t>34</w:t>
       </w:r>
       <w:r>
         <w:rPr>
@@ -3784,7 +3845,7 @@
         <w:rPr>
           <w:noProof/>
         </w:rPr>
-        <w:instrText xml:space="preserve"> PAGEREF _Toc238477322 \h </w:instrText>
+        <w:instrText xml:space="preserve"> PAGEREF _Toc238477805 \h </w:instrText>
       </w:r>
       <w:r>
         <w:rPr>
@@ -3801,7 +3862,7 @@
         <w:rPr>
           <w:noProof/>
         </w:rPr>
-        <w:t>32</w:t>
+        <w:t>34</w:t>
       </w:r>
       <w:r>
         <w:rPr>
@@ -3845,7 +3906,7 @@
         <w:rPr>
           <w:noProof/>
         </w:rPr>
-        <w:instrText xml:space="preserve"> PAGEREF _Toc238477323 \h </w:instrText>
+        <w:instrText xml:space="preserve"> PAGEREF _Toc238477806 \h </w:instrText>
       </w:r>
       <w:r>
         <w:rPr>
@@ -3862,7 +3923,7 @@
         <w:rPr>
           <w:noProof/>
         </w:rPr>
-        <w:t>32</w:t>
+        <w:t>34</w:t>
       </w:r>
       <w:r>
         <w:rPr>
@@ -3906,7 +3967,7 @@
         <w:rPr>
           <w:noProof/>
         </w:rPr>
-        <w:instrText xml:space="preserve"> PAGEREF _Toc238477324 \h </w:instrText>
+        <w:instrText xml:space="preserve"> PAGEREF _Toc238477807 \h </w:instrText>
       </w:r>
       <w:r>
         <w:rPr>
@@ -3923,7 +3984,7 @@
         <w:rPr>
           <w:noProof/>
         </w:rPr>
-        <w:t>33</w:t>
+        <w:t>35</w:t>
       </w:r>
       <w:r>
         <w:rPr>
@@ -3967,7 +4028,7 @@
         <w:rPr>
           <w:noProof/>
         </w:rPr>
-        <w:instrText xml:space="preserve"> PAGEREF _Toc238477325 \h </w:instrText>
+        <w:instrText xml:space="preserve"> PAGEREF _Toc238477808 \h </w:instrText>
       </w:r>
       <w:r>
         <w:rPr>
@@ -3984,7 +4045,7 @@
         <w:rPr>
           <w:noProof/>
         </w:rPr>
-        <w:t>33</w:t>
+        <w:t>35</w:t>
       </w:r>
       <w:r>
         <w:rPr>
@@ -4028,7 +4089,7 @@
         <w:rPr>
           <w:noProof/>
         </w:rPr>
-        <w:instrText xml:space="preserve"> PAGEREF _Toc238477326 \h </w:instrText>
+        <w:instrText xml:space="preserve"> PAGEREF _Toc238477809 \h </w:instrText>
       </w:r>
       <w:r>
         <w:rPr>
@@ -4045,7 +4106,7 @@
         <w:rPr>
           <w:noProof/>
         </w:rPr>
-        <w:t>33</w:t>
+        <w:t>35</w:t>
       </w:r>
       <w:r>
         <w:rPr>
@@ -4089,7 +4150,7 @@
         <w:rPr>
           <w:noProof/>
         </w:rPr>
-        <w:instrText xml:space="preserve"> PAGEREF _Toc238477327 \h </w:instrText>
+        <w:instrText xml:space="preserve"> PAGEREF _Toc238477810 \h </w:instrText>
       </w:r>
       <w:r>
         <w:rPr>
@@ -4106,7 +4167,7 @@
         <w:rPr>
           <w:noProof/>
         </w:rPr>
-        <w:t>39</w:t>
+        <w:t>41</w:t>
       </w:r>
       <w:r>
         <w:rPr>
@@ -4150,7 +4211,7 @@
         <w:rPr>
           <w:noProof/>
         </w:rPr>
-        <w:instrText xml:space="preserve"> PAGEREF _Toc238477328 \h </w:instrText>
+        <w:instrText xml:space="preserve"> PAGEREF _Toc238477811 \h </w:instrText>
       </w:r>
       <w:r>
         <w:rPr>
@@ -4167,7 +4228,7 @@
         <w:rPr>
           <w:noProof/>
         </w:rPr>
-        <w:t>39</w:t>
+        <w:t>41</w:t>
       </w:r>
       <w:r>
         <w:rPr>
@@ -4193,6 +4254,7 @@
         <w:rPr>
           <w:noProof/>
         </w:rPr>
+        <w:lastRenderedPageBreak/>
         <w:t>4.4.2 Tests fonctionnels manuels</w:t>
       </w:r>
       <w:r>
@@ -4211,7 +4273,7 @@
         <w:rPr>
           <w:noProof/>
         </w:rPr>
-        <w:instrText xml:space="preserve"> PAGEREF _Toc238477329 \h </w:instrText>
+        <w:instrText xml:space="preserve"> PAGEREF _Toc238477812 \h </w:instrText>
       </w:r>
       <w:r>
         <w:rPr>
@@ -4228,7 +4290,7 @@
         <w:rPr>
           <w:noProof/>
         </w:rPr>
-        <w:t>40</w:t>
+        <w:t>42</w:t>
       </w:r>
       <w:r>
         <w:rPr>
@@ -4254,7 +4316,6 @@
         <w:rPr>
           <w:noProof/>
         </w:rPr>
-        <w:lastRenderedPageBreak/>
         <w:t>4.4.3 Tests des API avec Postman et Swagger</w:t>
       </w:r>
       <w:r>
@@ -4273,7 +4334,7 @@
         <w:rPr>
           <w:noProof/>
         </w:rPr>
-        <w:instrText xml:space="preserve"> PAGEREF _Toc238477330 \h </w:instrText>
+        <w:instrText xml:space="preserve"> PAGEREF _Toc238477813 \h </w:instrText>
       </w:r>
       <w:r>
         <w:rPr>
@@ -4290,7 +4351,7 @@
         <w:rPr>
           <w:noProof/>
         </w:rPr>
-        <w:t>41</w:t>
+        <w:t>43</w:t>
       </w:r>
       <w:r>
         <w:rPr>
@@ -4334,7 +4395,7 @@
         <w:rPr>
           <w:noProof/>
         </w:rPr>
-        <w:instrText xml:space="preserve"> PAGEREF _Toc238477331 \h </w:instrText>
+        <w:instrText xml:space="preserve"> PAGEREF _Toc238477814 \h </w:instrText>
       </w:r>
       <w:r>
         <w:rPr>
@@ -4351,7 +4412,7 @@
         <w:rPr>
           <w:noProof/>
         </w:rPr>
-        <w:t>41</w:t>
+        <w:t>43</w:t>
       </w:r>
       <w:r>
         <w:rPr>
@@ -4395,7 +4456,7 @@
         <w:rPr>
           <w:noProof/>
         </w:rPr>
-        <w:instrText xml:space="preserve"> PAGEREF _Toc238477332 \h </w:instrText>
+        <w:instrText xml:space="preserve"> PAGEREF _Toc238477815 \h </w:instrText>
       </w:r>
       <w:r>
         <w:rPr>
@@ -4412,7 +4473,7 @@
         <w:rPr>
           <w:noProof/>
         </w:rPr>
-        <w:t>42</w:t>
+        <w:t>44</w:t>
       </w:r>
       <w:r>
         <w:rPr>
@@ -4456,7 +4517,7 @@
         <w:rPr>
           <w:noProof/>
         </w:rPr>
-        <w:instrText xml:space="preserve"> PAGEREF _Toc238477333 \h </w:instrText>
+        <w:instrText xml:space="preserve"> PAGEREF _Toc238477816 \h </w:instrText>
       </w:r>
       <w:r>
         <w:rPr>
@@ -4473,7 +4534,7 @@
         <w:rPr>
           <w:noProof/>
         </w:rPr>
-        <w:t>42</w:t>
+        <w:t>44</w:t>
       </w:r>
       <w:r>
         <w:rPr>
@@ -4517,7 +4578,7 @@
         <w:rPr>
           <w:noProof/>
         </w:rPr>
-        <w:instrText xml:space="preserve"> PAGEREF _Toc238477334 \h </w:instrText>
+        <w:instrText xml:space="preserve"> PAGEREF _Toc238477817 \h </w:instrText>
       </w:r>
       <w:r>
         <w:rPr>
@@ -4534,7 +4595,7 @@
         <w:rPr>
           <w:noProof/>
         </w:rPr>
-        <w:t>42</w:t>
+        <w:t>44</w:t>
       </w:r>
       <w:r>
         <w:rPr>
@@ -4578,7 +4639,7 @@
         <w:rPr>
           <w:noProof/>
         </w:rPr>
-        <w:instrText xml:space="preserve"> PAGEREF _Toc238477335 \h </w:instrText>
+        <w:instrText xml:space="preserve"> PAGEREF _Toc238477818 \h </w:instrText>
       </w:r>
       <w:r>
         <w:rPr>
@@ -4595,7 +4656,7 @@
         <w:rPr>
           <w:noProof/>
         </w:rPr>
-        <w:t>42</w:t>
+        <w:t>44</w:t>
       </w:r>
       <w:r>
         <w:rPr>
@@ -4639,7 +4700,7 @@
         <w:rPr>
           <w:noProof/>
         </w:rPr>
-        <w:instrText xml:space="preserve"> PAGEREF _Toc238477336 \h </w:instrText>
+        <w:instrText xml:space="preserve"> PAGEREF _Toc238477819 \h </w:instrText>
       </w:r>
       <w:r>
         <w:rPr>
@@ -4656,7 +4717,7 @@
         <w:rPr>
           <w:noProof/>
         </w:rPr>
-        <w:t>43</w:t>
+        <w:t>45</w:t>
       </w:r>
       <w:r>
         <w:rPr>
@@ -4700,7 +4761,7 @@
         <w:rPr>
           <w:noProof/>
         </w:rPr>
-        <w:instrText xml:space="preserve"> PAGEREF _Toc238477337 \h </w:instrText>
+        <w:instrText xml:space="preserve"> PAGEREF _Toc238477820 \h </w:instrText>
       </w:r>
       <w:r>
         <w:rPr>
@@ -4717,7 +4778,7 @@
         <w:rPr>
           <w:noProof/>
         </w:rPr>
-        <w:t>43</w:t>
+        <w:t>45</w:t>
       </w:r>
       <w:r>
         <w:rPr>
@@ -4761,7 +4822,7 @@
         <w:rPr>
           <w:noProof/>
         </w:rPr>
-        <w:instrText xml:space="preserve"> PAGEREF _Toc238477338 \h </w:instrText>
+        <w:instrText xml:space="preserve"> PAGEREF _Toc238477821 \h </w:instrText>
       </w:r>
       <w:r>
         <w:rPr>
@@ -4778,7 +4839,7 @@
         <w:rPr>
           <w:noProof/>
         </w:rPr>
-        <w:t>43</w:t>
+        <w:t>45</w:t>
       </w:r>
       <w:r>
         <w:rPr>
@@ -4822,7 +4883,7 @@
         <w:rPr>
           <w:noProof/>
         </w:rPr>
-        <w:instrText xml:space="preserve"> PAGEREF _Toc238477339 \h </w:instrText>
+        <w:instrText xml:space="preserve"> PAGEREF _Toc238477822 \h </w:instrText>
       </w:r>
       <w:r>
         <w:rPr>
@@ -4839,7 +4900,7 @@
         <w:rPr>
           <w:noProof/>
         </w:rPr>
-        <w:t>43</w:t>
+        <w:t>45</w:t>
       </w:r>
       <w:r>
         <w:rPr>
@@ -4883,7 +4944,7 @@
         <w:rPr>
           <w:noProof/>
         </w:rPr>
-        <w:instrText xml:space="preserve"> PAGEREF _Toc238477340 \h </w:instrText>
+        <w:instrText xml:space="preserve"> PAGEREF _Toc238477823 \h </w:instrText>
       </w:r>
       <w:r>
         <w:rPr>
@@ -4900,7 +4961,7 @@
         <w:rPr>
           <w:noProof/>
         </w:rPr>
-        <w:t>43</w:t>
+        <w:t>45</w:t>
       </w:r>
       <w:r>
         <w:rPr>
@@ -4944,7 +5005,7 @@
         <w:rPr>
           <w:noProof/>
         </w:rPr>
-        <w:instrText xml:space="preserve"> PAGEREF _Toc238477341 \h </w:instrText>
+        <w:instrText xml:space="preserve"> PAGEREF _Toc238477824 \h </w:instrText>
       </w:r>
       <w:r>
         <w:rPr>
@@ -4961,7 +5022,7 @@
         <w:rPr>
           <w:noProof/>
         </w:rPr>
-        <w:t>44</w:t>
+        <w:t>46</w:t>
       </w:r>
       <w:r>
         <w:rPr>
@@ -5005,7 +5066,7 @@
         <w:rPr>
           <w:noProof/>
         </w:rPr>
-        <w:instrText xml:space="preserve"> PAGEREF _Toc238477342 \h </w:instrText>
+        <w:instrText xml:space="preserve"> PAGEREF _Toc238477825 \h </w:instrText>
       </w:r>
       <w:r>
         <w:rPr>
@@ -5022,7 +5083,7 @@
         <w:rPr>
           <w:noProof/>
         </w:rPr>
-        <w:t>44</w:t>
+        <w:t>46</w:t>
       </w:r>
       <w:r>
         <w:rPr>
@@ -5066,7 +5127,7 @@
         <w:rPr>
           <w:noProof/>
         </w:rPr>
-        <w:instrText xml:space="preserve"> PAGEREF _Toc238477343 \h </w:instrText>
+        <w:instrText xml:space="preserve"> PAGEREF _Toc238477826 \h </w:instrText>
       </w:r>
       <w:r>
         <w:rPr>
@@ -5083,7 +5144,7 @@
         <w:rPr>
           <w:noProof/>
         </w:rPr>
-        <w:t>44</w:t>
+        <w:t>46</w:t>
       </w:r>
       <w:r>
         <w:rPr>
@@ -5127,7 +5188,7 @@
         <w:rPr>
           <w:noProof/>
         </w:rPr>
-        <w:instrText xml:space="preserve"> PAGEREF _Toc238477344 \h </w:instrText>
+        <w:instrText xml:space="preserve"> PAGEREF _Toc238477827 \h </w:instrText>
       </w:r>
       <w:r>
         <w:rPr>
@@ -5144,7 +5205,7 @@
         <w:rPr>
           <w:noProof/>
         </w:rPr>
-        <w:t>45</w:t>
+        <w:t>47</w:t>
       </w:r>
       <w:r>
         <w:rPr>
@@ -5188,7 +5249,7 @@
         <w:rPr>
           <w:noProof/>
         </w:rPr>
-        <w:instrText xml:space="preserve"> PAGEREF _Toc238477345 \h </w:instrText>
+        <w:instrText xml:space="preserve"> PAGEREF _Toc238477828 \h </w:instrText>
       </w:r>
       <w:r>
         <w:rPr>
@@ -5205,7 +5266,7 @@
         <w:rPr>
           <w:noProof/>
         </w:rPr>
-        <w:t>45</w:t>
+        <w:t>47</w:t>
       </w:r>
       <w:r>
         <w:rPr>
@@ -5249,7 +5310,7 @@
         <w:rPr>
           <w:noProof/>
         </w:rPr>
-        <w:instrText xml:space="preserve"> PAGEREF _Toc238477346 \h </w:instrText>
+        <w:instrText xml:space="preserve"> PAGEREF _Toc238477829 \h </w:instrText>
       </w:r>
       <w:r>
         <w:rPr>
@@ -5266,7 +5327,7 @@
         <w:rPr>
           <w:noProof/>
         </w:rPr>
-        <w:t>46</w:t>
+        <w:t>48</w:t>
       </w:r>
       <w:r>
         <w:rPr>
@@ -5310,7 +5371,7 @@
         <w:rPr>
           <w:noProof/>
         </w:rPr>
-        <w:instrText xml:space="preserve"> PAGEREF _Toc238477347 \h </w:instrText>
+        <w:instrText xml:space="preserve"> PAGEREF _Toc238477830 \h </w:instrText>
       </w:r>
       <w:r>
         <w:rPr>
@@ -5327,7 +5388,7 @@
         <w:rPr>
           <w:noProof/>
         </w:rPr>
-        <w:t>47</w:t>
+        <w:t>49</w:t>
       </w:r>
       <w:r>
         <w:rPr>
@@ -5371,7 +5432,7 @@
         <w:rPr>
           <w:noProof/>
         </w:rPr>
-        <w:instrText xml:space="preserve"> PAGEREF _Toc238477348 \h </w:instrText>
+        <w:instrText xml:space="preserve"> PAGEREF _Toc238477831 \h </w:instrText>
       </w:r>
       <w:r>
         <w:rPr>
@@ -5388,7 +5449,7 @@
         <w:rPr>
           <w:noProof/>
         </w:rPr>
-        <w:t>48</w:t>
+        <w:t>50</w:t>
       </w:r>
       <w:r>
         <w:rPr>
@@ -5432,7 +5493,7 @@
         <w:rPr>
           <w:noProof/>
         </w:rPr>
-        <w:instrText xml:space="preserve"> PAGEREF _Toc238477349 \h </w:instrText>
+        <w:instrText xml:space="preserve"> PAGEREF _Toc238477832 \h </w:instrText>
       </w:r>
       <w:r>
         <w:rPr>
@@ -5449,7 +5510,7 @@
         <w:rPr>
           <w:noProof/>
         </w:rPr>
-        <w:t>49</w:t>
+        <w:t>51</w:t>
       </w:r>
       <w:r>
         <w:rPr>
@@ -5475,7 +5536,7 @@
       <w:pPr>
         <w:pStyle w:val="Titre1"/>
       </w:pPr>
-      <w:bookmarkStart w:id="1" w:name="_Toc238477275"/>
+      <w:bookmarkStart w:id="1" w:name="_Toc238477757"/>
       <w:r>
         <w:t>Liste des figures</w:t>
       </w:r>
@@ -5682,13 +5743,13 @@
         </w:tabs>
       </w:pPr>
       <w:r>
-        <w:t>Figure 4.1 : Page d'accueil publique — recherche d'offres d'emploi</w:t>
+        <w:t>Figure 3.11 : Diagramme d'activité — Vue d'ensemble du processus de recrutement</w:t>
       </w:r>
       <w:r>
         <w:tab/>
       </w:r>
       <w:r>
-        <w:t>33</w:t>
+        <w:t>32</w:t>
       </w:r>
     </w:p>
     <w:p>
@@ -5698,13 +5759,13 @@
         </w:tabs>
       </w:pPr>
       <w:r>
-        <w:t>Figure 4.2 : Page de connexion</w:t>
+        <w:t>Figure 4.1 : Page d'accueil publique — recherche d'offres d'emploi</w:t>
       </w:r>
       <w:r>
         <w:tab/>
       </w:r>
       <w:r>
-        <w:t>34</w:t>
+        <w:t>35</w:t>
       </w:r>
     </w:p>
     <w:p>
@@ -5714,13 +5775,13 @@
         </w:tabs>
       </w:pPr>
       <w:r>
-        <w:t>Figure 4.3 : Gestion des offres d'emploi (espace RH)</w:t>
+        <w:t>Figure 4.2 : Page de connexion</w:t>
       </w:r>
       <w:r>
         <w:tab/>
       </w:r>
       <w:r>
-        <w:t>34</w:t>
+        <w:t>36</w:t>
       </w:r>
     </w:p>
     <w:p>
@@ -5730,13 +5791,13 @@
         </w:tabs>
       </w:pPr>
       <w:r>
-        <w:t>Figure 4.4 : Gestion des candidats — vue liste avec score IA</w:t>
+        <w:t>Figure 4.3 : Gestion des offres d'emploi (espace RH)</w:t>
       </w:r>
       <w:r>
         <w:tab/>
       </w:r>
       <w:r>
-        <w:t>35</w:t>
+        <w:t>36</w:t>
       </w:r>
     </w:p>
     <w:p>
@@ -5746,13 +5807,13 @@
         </w:tabs>
       </w:pPr>
       <w:r>
-        <w:t>Figure 4.5 : Modification d'un dossier candidat</w:t>
+        <w:t>Figure 4.4 : Gestion des candidats — vue liste avec score IA</w:t>
       </w:r>
       <w:r>
         <w:tab/>
       </w:r>
       <w:r>
-        <w:t>35</w:t>
+        <w:t>37</w:t>
       </w:r>
     </w:p>
     <w:p>
@@ -5762,13 +5823,13 @@
         </w:tabs>
       </w:pPr>
       <w:r>
-        <w:t>Figure 4.6 : Tableau Kanban du pipeline de recrutement</w:t>
+        <w:t>Figure 4.5 : Modification d'un dossier candidat</w:t>
       </w:r>
       <w:r>
         <w:tab/>
       </w:r>
       <w:r>
-        <w:t>36</w:t>
+        <w:t>37</w:t>
       </w:r>
     </w:p>
     <w:p>
@@ -5778,13 +5839,13 @@
         </w:tabs>
       </w:pPr>
       <w:r>
-        <w:t>Figure 4.7 : Gestion des entretiens</w:t>
+        <w:t>Figure 4.6 : Tableau Kanban du pipeline de recrutement</w:t>
       </w:r>
       <w:r>
         <w:tab/>
       </w:r>
       <w:r>
-        <w:t>36</w:t>
+        <w:t>38</w:t>
       </w:r>
     </w:p>
     <w:p>
@@ -5794,13 +5855,13 @@
         </w:tabs>
       </w:pPr>
       <w:r>
-        <w:t>Figure 4.8 : Gestion des feedbacks</w:t>
+        <w:t>Figure 4.7 : Gestion des entretiens</w:t>
       </w:r>
       <w:r>
         <w:tab/>
       </w:r>
       <w:r>
-        <w:t>37</w:t>
+        <w:t>38</w:t>
       </w:r>
     </w:p>
     <w:p>
@@ -5810,13 +5871,13 @@
         </w:tabs>
       </w:pPr>
       <w:r>
-        <w:t>Figure 4.9 : Gestion des utilisateurs et des rôles (espace Administrateur)</w:t>
+        <w:t>Figure 4.8 : Gestion des feedbacks</w:t>
       </w:r>
       <w:r>
         <w:tab/>
       </w:r>
       <w:r>
-        <w:t>37</w:t>
+        <w:t>39</w:t>
       </w:r>
     </w:p>
     <w:p>
@@ -5826,13 +5887,13 @@
         </w:tabs>
       </w:pPr>
       <w:r>
-        <w:t>Figure 4.10 : Paramétrage du scoring IA par famille de métier</w:t>
+        <w:t>Figure 4.9 : Gestion des utilisateurs et des rôles (espace Administrateur)</w:t>
       </w:r>
       <w:r>
         <w:tab/>
       </w:r>
       <w:r>
-        <w:t>38</w:t>
+        <w:t>39</w:t>
       </w:r>
     </w:p>
     <w:p>
@@ -5842,13 +5903,13 @@
         </w:tabs>
       </w:pPr>
       <w:r>
-        <w:t>Figure 4.11 : Journal d'audit</w:t>
+        <w:t>Figure 4.10 : Paramétrage du scoring IA par famille de métier</w:t>
       </w:r>
       <w:r>
         <w:tab/>
       </w:r>
       <w:r>
-        <w:t>38</w:t>
+        <w:t>40</w:t>
       </w:r>
     </w:p>
     <w:p>
@@ -5858,32 +5919,14 @@
         </w:tabs>
       </w:pPr>
       <w:r>
-        <w:t>Figure 4.12 : Assistant conversationnel candidat (chatbot)</w:t>
+        <w:t>Figure 4.11 : Journal d'audit</w:t>
       </w:r>
       <w:r>
         <w:tab/>
       </w:r>
       <w:r>
-        <w:t>39</w:t>
-      </w:r>
-    </w:p>
-    <w:p>
-      <w:pPr>
-        <w:spacing w:line="278" w:lineRule="auto"/>
-      </w:pPr>
-      <w:r>
-        <w:br w:type="page"/>
-      </w:r>
-    </w:p>
-    <w:p>
-      <w:pPr>
-        <w:pStyle w:val="Titre1"/>
-      </w:pPr>
-      <w:bookmarkStart w:id="2" w:name="_Toc238477276"/>
-      <w:r>
-        <w:t>Liste des tableaux</w:t>
-      </w:r>
-      <w:bookmarkEnd w:id="2"/>
+        <w:t>40</w:t>
+      </w:r>
     </w:p>
     <w:p>
       <w:pPr>
@@ -5892,12 +5935,32 @@
         </w:tabs>
       </w:pPr>
       <w:r>
-        <w:t>Tableau 2.1 : Matrice des responsabilités par rôle</w:t>
+        <w:t>Figure 4.12 : Assistant conversationnel candidat (chatbot)</w:t>
       </w:r>
       <w:r>
         <w:tab/>
-        <w:t>16</w:t>
-      </w:r>
+      </w:r>
+      <w:r>
+        <w:t>41</w:t>
+      </w:r>
+    </w:p>
+    <w:p>
+      <w:pPr>
+        <w:spacing w:line="278" w:lineRule="auto"/>
+      </w:pPr>
+      <w:r>
+        <w:br w:type="page"/>
+      </w:r>
+    </w:p>
+    <w:p>
+      <w:pPr>
+        <w:pStyle w:val="Titre1"/>
+      </w:pPr>
+      <w:bookmarkStart w:id="2" w:name="_Toc238477758"/>
+      <w:r>
+        <w:t>Liste des tableaux</w:t>
+      </w:r>
+      <w:bookmarkEnd w:id="2"/>
     </w:p>
     <w:p>
       <w:pPr>
@@ -5906,16 +5969,11 @@
         </w:tabs>
       </w:pPr>
       <w:r>
-        <w:t xml:space="preserve">Tableau 4.1 : </w:t>
-      </w:r>
-      <w:r>
-        <w:t>Synthèse des tests fonctionnels réalisés</w:t>
+        <w:t>Tableau 2.1 : Matrice des responsabilités par rôle</w:t>
       </w:r>
       <w:r>
         <w:tab/>
-      </w:r>
-      <w:r>
-        <w:t>40</w:t>
+        <w:t>16</w:t>
       </w:r>
     </w:p>
     <w:p>
@@ -5925,13 +5983,32 @@
         </w:tabs>
       </w:pPr>
       <w:r>
+        <w:t xml:space="preserve">Tableau 4.1 : </w:t>
+      </w:r>
+      <w:r>
+        <w:t>Synthèse des tests fonctionnels réalisés</w:t>
+      </w:r>
+      <w:r>
+        <w:tab/>
+      </w:r>
+      <w:r>
+        <w:t>42</w:t>
+      </w:r>
+    </w:p>
+    <w:p>
+      <w:pPr>
+        <w:tabs>
+          <w:tab w:val="right" w:leader="dot" w:pos="8600"/>
+        </w:tabs>
+      </w:pPr>
+      <w:r>
         <w:t>Tableau 4.2 : Bilan des fonctionnalités réalisées</w:t>
       </w:r>
       <w:r>
         <w:tab/>
       </w:r>
       <w:r>
-        <w:t>46</w:t>
+        <w:t>48</w:t>
       </w:r>
     </w:p>
     <w:p>
@@ -5947,7 +6024,7 @@
         <w:pStyle w:val="Titre1"/>
         <w:jc w:val="center"/>
       </w:pPr>
-      <w:bookmarkStart w:id="3" w:name="_Toc238477277"/>
+      <w:bookmarkStart w:id="3" w:name="_Toc238477759"/>
       <w:r>
         <w:t>Introduction Générale</w:t>
       </w:r>
@@ -5980,7 +6057,7 @@
       <w:pPr>
         <w:pStyle w:val="Titre1"/>
       </w:pPr>
-      <w:bookmarkStart w:id="4" w:name="_Toc238477278"/>
+      <w:bookmarkStart w:id="4" w:name="_Toc238477760"/>
       <w:r>
         <w:t>Chapitre 1 : Cadre Général du Projet</w:t>
       </w:r>
@@ -5995,7 +6072,7 @@
       <w:pPr>
         <w:pStyle w:val="Titre2"/>
       </w:pPr>
-      <w:bookmarkStart w:id="5" w:name="_Toc238477279"/>
+      <w:bookmarkStart w:id="5" w:name="_Toc238477761"/>
       <w:r>
         <w:t>1.1 Introduction</w:t>
       </w:r>
@@ -6010,7 +6087,7 @@
       <w:pPr>
         <w:pStyle w:val="Titre2"/>
       </w:pPr>
-      <w:bookmarkStart w:id="6" w:name="_Toc238477280"/>
+      <w:bookmarkStart w:id="6" w:name="_Toc238477762"/>
       <w:r>
         <w:t>1.2 Présentation de l'organisme d'accueil</w:t>
       </w:r>
@@ -6020,7 +6097,7 @@
       <w:pPr>
         <w:pStyle w:val="Titre3"/>
       </w:pPr>
-      <w:bookmarkStart w:id="7" w:name="_Toc238477281"/>
+      <w:bookmarkStart w:id="7" w:name="_Toc238477763"/>
       <w:r>
         <w:t>1.2.1 Le groupe Sopra Steria</w:t>
       </w:r>
@@ -6035,7 +6112,7 @@
       <w:pPr>
         <w:pStyle w:val="Titre3"/>
       </w:pPr>
-      <w:bookmarkStart w:id="8" w:name="_Toc238477282"/>
+      <w:bookmarkStart w:id="8" w:name="_Toc238477764"/>
       <w:r>
         <w:t>1.2.2 Sopra HR Software</w:t>
       </w:r>
@@ -6055,7 +6132,7 @@
       <w:pPr>
         <w:pStyle w:val="Titre2"/>
       </w:pPr>
-      <w:bookmarkStart w:id="9" w:name="_Toc238477283"/>
+      <w:bookmarkStart w:id="9" w:name="_Toc238477765"/>
       <w:r>
         <w:t>1.3 Étude de l'existant</w:t>
       </w:r>
@@ -6143,7 +6220,7 @@
       <w:pPr>
         <w:pStyle w:val="Titre2"/>
       </w:pPr>
-      <w:bookmarkStart w:id="10" w:name="_Toc238477284"/>
+      <w:bookmarkStart w:id="10" w:name="_Toc238477766"/>
       <w:r>
         <w:t>1.4 Critique de l'existant et problématique</w:t>
       </w:r>
@@ -6163,7 +6240,7 @@
       <w:pPr>
         <w:pStyle w:val="Titre2"/>
       </w:pPr>
-      <w:bookmarkStart w:id="11" w:name="_Toc238477285"/>
+      <w:bookmarkStart w:id="11" w:name="_Toc238477767"/>
       <w:r>
         <w:t>1.5 Objectifs du projet</w:t>
       </w:r>
@@ -6250,7 +6327,7 @@
       <w:pPr>
         <w:pStyle w:val="Titre2"/>
       </w:pPr>
-      <w:bookmarkStart w:id="12" w:name="_Toc238477286"/>
+      <w:bookmarkStart w:id="12" w:name="_Toc238477768"/>
       <w:r>
         <w:t>1.6 Présentation de la solution proposée : JOB4YOU</w:t>
       </w:r>
@@ -6319,7 +6396,7 @@
       <w:pPr>
         <w:pStyle w:val="Titre2"/>
       </w:pPr>
-      <w:bookmarkStart w:id="13" w:name="_Toc238477287"/>
+      <w:bookmarkStart w:id="13" w:name="_Toc238477769"/>
       <w:r>
         <w:t>1.7 Méthodologie de travail adoptée</w:t>
       </w:r>
@@ -6339,7 +6416,7 @@
       <w:pPr>
         <w:pStyle w:val="Titre2"/>
       </w:pPr>
-      <w:bookmarkStart w:id="14" w:name="_Toc238477288"/>
+      <w:bookmarkStart w:id="14" w:name="_Toc238477770"/>
       <w:r>
         <w:t>1.8 Planification du projet</w:t>
       </w:r>
@@ -6747,7 +6824,7 @@
       <w:pPr>
         <w:pStyle w:val="Titre2"/>
       </w:pPr>
-      <w:bookmarkStart w:id="15" w:name="_Toc238477289"/>
+      <w:bookmarkStart w:id="15" w:name="_Toc238477771"/>
       <w:r>
         <w:t>1.9 Conclusion</w:t>
       </w:r>
@@ -6770,7 +6847,7 @@
       <w:pPr>
         <w:pStyle w:val="Titre1"/>
       </w:pPr>
-      <w:bookmarkStart w:id="16" w:name="_Toc238477290"/>
+      <w:bookmarkStart w:id="16" w:name="_Toc238477772"/>
       <w:r>
         <w:t>Chapitre 2 : Analyse et Spécification des Besoins</w:t>
       </w:r>
@@ -6785,7 +6862,7 @@
       <w:pPr>
         <w:pStyle w:val="Titre2"/>
       </w:pPr>
-      <w:bookmarkStart w:id="17" w:name="_Toc238477291"/>
+      <w:bookmarkStart w:id="17" w:name="_Toc238477773"/>
       <w:r>
         <w:t>2.1 Introduction</w:t>
       </w:r>
@@ -6800,7 +6877,7 @@
       <w:pPr>
         <w:pStyle w:val="Titre2"/>
       </w:pPr>
-      <w:bookmarkStart w:id="18" w:name="_Toc238477292"/>
+      <w:bookmarkStart w:id="18" w:name="_Toc238477774"/>
       <w:r>
         <w:t>2.2 Étude fonctionnelle</w:t>
       </w:r>
@@ -6810,7 +6887,7 @@
       <w:pPr>
         <w:pStyle w:val="Titre3"/>
       </w:pPr>
-      <w:bookmarkStart w:id="19" w:name="_Toc238477293"/>
+      <w:bookmarkStart w:id="19" w:name="_Toc238477775"/>
       <w:r>
         <w:t>2.2.1 Identification des acteurs du système</w:t>
       </w:r>
@@ -7772,7 +7849,7 @@
       <w:pPr>
         <w:pStyle w:val="Titre3"/>
       </w:pPr>
-      <w:bookmarkStart w:id="20" w:name="_Toc238477294"/>
+      <w:bookmarkStart w:id="20" w:name="_Toc238477776"/>
       <w:r>
         <w:t>2.2.2 Identification des besoins fonctionnels</w:t>
       </w:r>
@@ -7920,7 +7997,7 @@
       <w:pPr>
         <w:pStyle w:val="Titre3"/>
       </w:pPr>
-      <w:bookmarkStart w:id="21" w:name="_Toc238477295"/>
+      <w:bookmarkStart w:id="21" w:name="_Toc238477777"/>
       <w:r>
         <w:t>2.2.3 Identification des besoins non fonctionnels</w:t>
       </w:r>
@@ -8007,7 +8084,7 @@
       <w:pPr>
         <w:pStyle w:val="Titre3"/>
       </w:pPr>
-      <w:bookmarkStart w:id="22" w:name="_Toc238477296"/>
+      <w:bookmarkStart w:id="22" w:name="_Toc238477778"/>
       <w:r>
         <w:t>2.2.4 Diagramme de cas d'utilisation</w:t>
       </w:r>
@@ -8057,7 +8134,7 @@
       <w:pPr>
         <w:pStyle w:val="Titre3"/>
       </w:pPr>
-      <w:bookmarkStart w:id="23" w:name="_Toc238477297"/>
+      <w:bookmarkStart w:id="23" w:name="_Toc238477779"/>
       <w:r>
         <w:t>2.2.5 Description textuelle de quelques cas d'utilisation</w:t>
       </w:r>
@@ -8445,7 +8522,7 @@
       <w:pPr>
         <w:pStyle w:val="Titre3"/>
       </w:pPr>
-      <w:bookmarkStart w:id="24" w:name="_Toc238477298"/>
+      <w:bookmarkStart w:id="24" w:name="_Toc238477780"/>
       <w:r>
         <w:t>2.2.6 Diagramme de séquence système</w:t>
       </w:r>
@@ -8492,7 +8569,7 @@
       <w:pPr>
         <w:pStyle w:val="Titre2"/>
       </w:pPr>
-      <w:bookmarkStart w:id="25" w:name="_Toc238477299"/>
+      <w:bookmarkStart w:id="25" w:name="_Toc238477781"/>
       <w:r>
         <w:t>2.3 Étude technique</w:t>
       </w:r>
@@ -8502,7 +8579,7 @@
       <w:pPr>
         <w:pStyle w:val="Titre3"/>
       </w:pPr>
-      <w:bookmarkStart w:id="26" w:name="_Toc238477300"/>
+      <w:bookmarkStart w:id="26" w:name="_Toc238477782"/>
       <w:r>
         <w:t>2.3.1 Architecture physique</w:t>
       </w:r>
@@ -8556,7 +8633,7 @@
       <w:pPr>
         <w:pStyle w:val="Titre3"/>
       </w:pPr>
-      <w:bookmarkStart w:id="27" w:name="_Toc238477301"/>
+      <w:bookmarkStart w:id="27" w:name="_Toc238477783"/>
       <w:r>
         <w:t>2.3.2 Côté client — Angular</w:t>
       </w:r>
@@ -8571,7 +8648,7 @@
       <w:pPr>
         <w:pStyle w:val="Titre3"/>
       </w:pPr>
-      <w:bookmarkStart w:id="28" w:name="_Toc238477302"/>
+      <w:bookmarkStart w:id="28" w:name="_Toc238477784"/>
       <w:r>
         <w:t>2.3.3 Côté serveur — Spring Boot</w:t>
       </w:r>
@@ -8586,7 +8663,7 @@
       <w:pPr>
         <w:pStyle w:val="Titre3"/>
       </w:pPr>
-      <w:bookmarkStart w:id="29" w:name="_Toc238477303"/>
+      <w:bookmarkStart w:id="29" w:name="_Toc238477785"/>
       <w:r>
         <w:t>2.3.4 La sécurité — Spring Security et JWT</w:t>
       </w:r>
@@ -8601,7 +8678,7 @@
       <w:pPr>
         <w:pStyle w:val="Titre2"/>
       </w:pPr>
-      <w:bookmarkStart w:id="30" w:name="_Toc238477304"/>
+      <w:bookmarkStart w:id="30" w:name="_Toc238477786"/>
       <w:r>
         <w:t>2.4 Conclusion</w:t>
       </w:r>
@@ -8624,7 +8701,7 @@
       <w:pPr>
         <w:pStyle w:val="Titre1"/>
       </w:pPr>
-      <w:bookmarkStart w:id="31" w:name="_Toc238477305"/>
+      <w:bookmarkStart w:id="31" w:name="_Toc238477787"/>
       <w:r>
         <w:t>Chapitre 3 : Conception</w:t>
       </w:r>
@@ -8639,7 +8716,7 @@
       <w:pPr>
         <w:pStyle w:val="Titre2"/>
       </w:pPr>
-      <w:bookmarkStart w:id="32" w:name="_Toc238477306"/>
+      <w:bookmarkStart w:id="32" w:name="_Toc238477788"/>
       <w:r>
         <w:t>3.1 Introduction</w:t>
       </w:r>
@@ -8654,7 +8731,7 @@
       <w:pPr>
         <w:pStyle w:val="Titre2"/>
       </w:pPr>
-      <w:bookmarkStart w:id="33" w:name="_Toc238477307"/>
+      <w:bookmarkStart w:id="33" w:name="_Toc238477789"/>
       <w:r>
         <w:t>3.2 Diagramme des paquetages</w:t>
       </w:r>
@@ -8706,7 +8783,7 @@
       <w:pPr>
         <w:pStyle w:val="Titre2"/>
       </w:pPr>
-      <w:bookmarkStart w:id="34" w:name="_Toc238477308"/>
+      <w:bookmarkStart w:id="34" w:name="_Toc238477790"/>
       <w:r>
         <w:t>3.3 Diagramme de classes global</w:t>
       </w:r>
@@ -8787,7 +8864,7 @@
       <w:pPr>
         <w:pStyle w:val="Titre2"/>
       </w:pPr>
-      <w:bookmarkStart w:id="35" w:name="_Toc238477309"/>
+      <w:bookmarkStart w:id="35" w:name="_Toc238477791"/>
       <w:r>
         <w:t>3.4 Diagrammes de séquence objet</w:t>
       </w:r>
@@ -8802,7 +8879,7 @@
       <w:pPr>
         <w:pStyle w:val="Titre3"/>
       </w:pPr>
-      <w:bookmarkStart w:id="36" w:name="_Toc238477310"/>
+      <w:bookmarkStart w:id="36" w:name="_Toc238477792"/>
       <w:r>
         <w:t>3.4.1 Planifier un entretien</w:t>
       </w:r>
@@ -8849,7 +8926,7 @@
       <w:pPr>
         <w:pStyle w:val="Titre3"/>
       </w:pPr>
-      <w:bookmarkStart w:id="37" w:name="_Toc238477311"/>
+      <w:bookmarkStart w:id="37" w:name="_Toc238477793"/>
       <w:r>
         <w:lastRenderedPageBreak/>
         <w:t>3.4.2 Décision finale de recrutement</w:t>
@@ -8897,7 +8974,7 @@
       <w:pPr>
         <w:pStyle w:val="Titre3"/>
       </w:pPr>
-      <w:bookmarkStart w:id="38" w:name="_Toc238477312"/>
+      <w:bookmarkStart w:id="38" w:name="_Toc238477794"/>
       <w:r>
         <w:t>3.4.3 Analyse IA du CV (extraction, scoring via n8n et Cohere)</w:t>
       </w:r>
@@ -8966,7 +9043,7 @@
       <w:pPr>
         <w:pStyle w:val="Titre3"/>
       </w:pPr>
-      <w:bookmarkStart w:id="39" w:name="_Toc238477313"/>
+      <w:bookmarkStart w:id="39" w:name="_Toc238477795"/>
       <w:r>
         <w:t>3.4.4 Passage en évaluation technique — routage et notification des managers</w:t>
       </w:r>
@@ -9035,7 +9112,7 @@
       <w:pPr>
         <w:pStyle w:val="Titre2"/>
       </w:pPr>
-      <w:bookmarkStart w:id="40" w:name="_Toc238477314"/>
+      <w:bookmarkStart w:id="40" w:name="_Toc238477796"/>
       <w:r>
         <w:lastRenderedPageBreak/>
         <w:t>3.5 Diagramme d'états — Cycle de vie d'une candidature</w:t>
@@ -9099,7 +9176,7 @@
       <w:pPr>
         <w:pStyle w:val="Titre2"/>
       </w:pPr>
-      <w:bookmarkStart w:id="41" w:name="_Toc238477315"/>
+      <w:bookmarkStart w:id="41" w:name="_Toc238477797"/>
       <w:r>
         <w:t>3.6 Conception de la base de données</w:t>
       </w:r>
@@ -9174,7 +9251,7 @@
       <w:pPr>
         <w:pStyle w:val="Titre2"/>
       </w:pPr>
-      <w:bookmarkStart w:id="42" w:name="_Toc238477316"/>
+      <w:bookmarkStart w:id="42" w:name="_Toc238477798"/>
       <w:r>
         <w:lastRenderedPageBreak/>
         <w:t>3.7 Diagramme de déploiement</w:t>
@@ -9230,7 +9307,7 @@
       <w:pPr>
         <w:pStyle w:val="Titre2"/>
       </w:pPr>
-      <w:bookmarkStart w:id="43" w:name="_Toc238477317"/>
+      <w:bookmarkStart w:id="43" w:name="_Toc238477799"/>
       <w:r>
         <w:t>3.8 Diagramme de composants</w:t>
       </w:r>
@@ -9283,15 +9360,94 @@
       <w:pPr>
         <w:pStyle w:val="Titre2"/>
       </w:pPr>
-      <w:bookmarkStart w:id="44" w:name="_Toc238477318"/>
-      <w:r>
-        <w:t>3.9 Conclusion</w:t>
+      <w:bookmarkStart w:id="44" w:name="_Toc238477800"/>
+      <w:r>
+        <w:t>3.9 Diagramme d'activité — Vue d'ensemble du processus de recrutement</w:t>
       </w:r>
       <w:bookmarkEnd w:id="44"/>
     </w:p>
     <w:p>
       <w:r>
-        <w:t>Ces modèles — paquetages, classes, séquences, états, base de données, déploiement et composants — forment ensemble le plan directeur qui a guidé chaque ligne de code écrite par la suite. Reste à voir comment ce plan s'est concrètement traduit en une application fonctionnelle : c'est l'objet du chapitre suivant.</w:t>
+        <w:t>Le diagramme d'états (section 3.5) décrit les statuts possibles d'une candidature, mais pas qui agit à chaque étape ni dans quel ordre. Le diagramme d'activité ci-dessous complète cette vue en répartissant le processus de recrutement complet entre quatre couloirs d'acteurs : le candidat, le système (traitement automatique et IA), le RH et le manager.</w:t>
+      </w:r>
+    </w:p>
+    <w:p/>
+    <w:p>
+      <w:pPr>
+        <w:jc w:val="center"/>
+      </w:pPr>
+      <w:r>
+        <w:rPr>
+          <w:noProof/>
+        </w:rPr>
+        <w:lastRenderedPageBreak/>
+        <w:drawing>
+          <wp:inline distT="0" distB="0" distL="0" distR="0" wp14:anchorId="6FCB700B" wp14:editId="6A963D9F">
+            <wp:extent cx="5760000" cy="5701304"/>
+            <wp:effectExtent l="0" t="0" r="0" b="0"/>
+            <wp:docPr id="3" name="Picture 3"/>
+            <wp:cNvGraphicFramePr>
+              <a:graphicFrameLocks xmlns:a="http://schemas.openxmlformats.org/drawingml/2006/main" noChangeAspect="1"/>
+            </wp:cNvGraphicFramePr>
+            <a:graphic xmlns:a="http://schemas.openxmlformats.org/drawingml/2006/main">
+              <a:graphicData uri="http://schemas.openxmlformats.org/drawingml/2006/picture">
+                <pic:pic xmlns:pic="http://schemas.openxmlformats.org/drawingml/2006/picture">
+                  <pic:nvPicPr>
+                    <pic:cNvPr id="0" name="activity_workflow.png"/>
+                    <pic:cNvPicPr/>
+                  </pic:nvPicPr>
+                  <pic:blipFill>
+                    <a:blip r:embed="rId29"/>
+                    <a:stretch>
+                      <a:fillRect/>
+                    </a:stretch>
+                  </pic:blipFill>
+                  <pic:spPr>
+                    <a:xfrm>
+                      <a:off x="0" y="0"/>
+                      <a:ext cx="5760000" cy="5701304"/>
+                    </a:xfrm>
+                    <a:prstGeom prst="rect">
+                      <a:avLst/>
+                    </a:prstGeom>
+                  </pic:spPr>
+                </pic:pic>
+              </a:graphicData>
+            </a:graphic>
+          </wp:inline>
+        </w:drawing>
+      </w:r>
+    </w:p>
+    <w:p/>
+    <w:p>
+      <w:r>
+        <w:t>Figure 3.11 : Diagramme d'activité — Vue d'ensemble du processus de recrutement</w:t>
+      </w:r>
+    </w:p>
+    <w:p/>
+    <w:p>
+      <w:r>
+        <w:t>Ce diagramme rend explicite un point que le texte seul rendait moins visible : l'entretien téléphonique RH est un passage obligé avant toute évaluation technique (section 4.5.8), et le routage vers le ou les managers concernés (ManagerRoutingService, section 3.4.4) n'intervient qu'à ce moment-là, pas dès la validation du CV — conformément à la correction décrite en section 4.5.5.</w:t>
+      </w:r>
+    </w:p>
+    <w:p/>
+    <w:p>
+      <w:pPr>
+        <w:pStyle w:val="Titre2"/>
+      </w:pPr>
+      <w:bookmarkStart w:id="45" w:name="_Toc238477801"/>
+      <w:r>
+        <w:t>3.10 Conclusion</w:t>
+      </w:r>
+      <w:bookmarkEnd w:id="45"/>
+    </w:p>
+    <w:p>
+      <w:r>
+        <w:t xml:space="preserve">Ces modèles — paquetages, classes, séquences, états, base de données, déploiement et composants — forment ensemble le plan directeur qui a guidé chaque ligne de code écrite par la suite. Reste à </w:t>
+      </w:r>
+      <w:r>
+        <w:lastRenderedPageBreak/>
+        <w:t>voir comment ce plan s'est concrètement traduit en une application fonctionnelle : c'est l'objet du chapitre suivant.</w:t>
       </w:r>
     </w:p>
     <w:p>
@@ -9306,11 +9462,11 @@
       <w:pPr>
         <w:pStyle w:val="Titre1"/>
       </w:pPr>
-      <w:bookmarkStart w:id="45" w:name="_Toc238477319"/>
+      <w:bookmarkStart w:id="46" w:name="_Toc238477802"/>
       <w:r>
         <w:t>Chapitre 4 : Réalisation</w:t>
       </w:r>
-      <w:bookmarkEnd w:id="45"/>
+      <w:bookmarkEnd w:id="46"/>
     </w:p>
     <w:p>
       <w:r>
@@ -9321,11 +9477,11 @@
       <w:pPr>
         <w:pStyle w:val="Titre2"/>
       </w:pPr>
-      <w:bookmarkStart w:id="46" w:name="_Toc238477320"/>
+      <w:bookmarkStart w:id="47" w:name="_Toc238477803"/>
       <w:r>
         <w:t>4.1 Introduction</w:t>
       </w:r>
-      <w:bookmarkEnd w:id="46"/>
+      <w:bookmarkEnd w:id="47"/>
     </w:p>
     <w:p>
       <w:r>
@@ -9336,21 +9492,21 @@
       <w:pPr>
         <w:pStyle w:val="Titre2"/>
       </w:pPr>
-      <w:bookmarkStart w:id="47" w:name="_Toc238477321"/>
+      <w:bookmarkStart w:id="48" w:name="_Toc238477804"/>
       <w:r>
         <w:t>4.2 Environnement de travail</w:t>
       </w:r>
-      <w:bookmarkEnd w:id="47"/>
+      <w:bookmarkEnd w:id="48"/>
     </w:p>
     <w:p>
       <w:pPr>
         <w:pStyle w:val="Titre3"/>
       </w:pPr>
-      <w:bookmarkStart w:id="48" w:name="_Toc238477322"/>
+      <w:bookmarkStart w:id="49" w:name="_Toc238477805"/>
       <w:r>
         <w:t>4.2.1 Environnement matériel</w:t>
       </w:r>
-      <w:bookmarkEnd w:id="48"/>
+      <w:bookmarkEnd w:id="49"/>
     </w:p>
     <w:p>
       <w:r>
@@ -9361,11 +9517,11 @@
       <w:pPr>
         <w:pStyle w:val="Titre3"/>
       </w:pPr>
-      <w:bookmarkStart w:id="49" w:name="_Toc238477323"/>
+      <w:bookmarkStart w:id="50" w:name="_Toc238477806"/>
       <w:r>
         <w:t>4.2.2 Environnement logiciel</w:t>
       </w:r>
-      <w:bookmarkEnd w:id="49"/>
+      <w:bookmarkEnd w:id="50"/>
     </w:p>
     <w:p>
       <w:r>
@@ -9485,11 +9641,11 @@
       <w:pPr>
         <w:pStyle w:val="Titre3"/>
       </w:pPr>
-      <w:bookmarkStart w:id="50" w:name="_Toc238477324"/>
+      <w:bookmarkStart w:id="51" w:name="_Toc238477807"/>
       <w:r>
         <w:t>4.2.3 Autres</w:t>
       </w:r>
-      <w:bookmarkEnd w:id="50"/>
+      <w:bookmarkEnd w:id="51"/>
     </w:p>
     <w:p>
       <w:r>
@@ -9500,11 +9656,11 @@
       <w:pPr>
         <w:pStyle w:val="Titre3"/>
       </w:pPr>
-      <w:bookmarkStart w:id="51" w:name="_Toc238477325"/>
+      <w:bookmarkStart w:id="52" w:name="_Toc238477808"/>
       <w:r>
         <w:t>4.2.4 Sécurité applicative</w:t>
       </w:r>
-      <w:bookmarkEnd w:id="51"/>
+      <w:bookmarkEnd w:id="52"/>
     </w:p>
     <w:p>
       <w:r>
@@ -9515,11 +9671,11 @@
       <w:pPr>
         <w:pStyle w:val="Titre2"/>
       </w:pPr>
-      <w:bookmarkStart w:id="52" w:name="_Toc238477326"/>
+      <w:bookmarkStart w:id="53" w:name="_Toc238477809"/>
       <w:r>
         <w:t>4.3 Interfaces graphiques de l'application</w:t>
       </w:r>
-      <w:bookmarkEnd w:id="52"/>
+      <w:bookmarkEnd w:id="53"/>
     </w:p>
     <w:p>
       <w:r>
@@ -9536,44 +9692,6 @@
         </w:rPr>
         <w:pict w14:anchorId="650581FA">
           <v:shape id="Image 13" o:spid="_x0000_i1037" type="#_x0000_t75" style="width:420pt;height:249.6pt;visibility:visible;mso-wrap-style:square">
-            <v:imagedata r:id="rId29" o:title=""/>
-          </v:shape>
-        </w:pict>
-      </w:r>
-    </w:p>
-    <w:p>
-      <w:pPr>
-        <w:jc w:val="center"/>
-        <w:rPr>
-          <w:i/>
-          <w:sz w:val="21"/>
-        </w:rPr>
-      </w:pPr>
-      <w:r>
-        <w:rPr>
-          <w:i/>
-          <w:sz w:val="21"/>
-        </w:rPr>
-        <w:t>Figure 4.1 : Page d'accueil publique — recherche d'offres d'emploi</w:t>
-      </w:r>
-    </w:p>
-    <w:p/>
-    <w:p>
-      <w:r>
-        <w:lastRenderedPageBreak/>
-        <w:t>Accessible sans authentification, la page d'accueil permet à tout visiteur de rechercher une offre par mot-clé et par localisation, et met en avant les offres publiées les plus récentes.</w:t>
-      </w:r>
-    </w:p>
-    <w:p>
-      <w:pPr>
-        <w:jc w:val="center"/>
-      </w:pPr>
-      <w:r>
-        <w:rPr>
-          <w:noProof/>
-        </w:rPr>
-        <w:pict w14:anchorId="5BF0AF37">
-          <v:shape id="Image 14" o:spid="_x0000_i1038" type="#_x0000_t75" style="width:349.8pt;height:207.6pt;visibility:visible;mso-wrap-style:square">
             <v:imagedata r:id="rId30" o:title=""/>
           </v:shape>
         </w:pict>
@@ -9592,13 +9710,14 @@
           <w:i/>
           <w:sz w:val="21"/>
         </w:rPr>
-        <w:t>Figure 4.2 : Page de connexion</w:t>
+        <w:t>Figure 4.1 : Page d'accueil publique — recherche d'offres d'emploi</w:t>
       </w:r>
     </w:p>
     <w:p/>
     <w:p>
       <w:r>
-        <w:t>L'authentification se fait par nom d'utilisateur et mot de passe ; le jeton JWT renvoyé par le backend sécurise ensuite l'ensemble des requêtes vers l'API.</w:t>
+        <w:lastRenderedPageBreak/>
+        <w:t>Accessible sans authentification, la page d'accueil permet à tout visiteur de rechercher une offre par mot-clé et par localisation, et met en avant les offres publiées les plus récentes.</w:t>
       </w:r>
     </w:p>
     <w:p>
@@ -9609,8 +9728,8 @@
         <w:rPr>
           <w:noProof/>
         </w:rPr>
-        <w:pict w14:anchorId="1EEBD083">
-          <v:shape id="Image 15" o:spid="_x0000_i1039" type="#_x0000_t75" style="width:420pt;height:249.6pt;visibility:visible;mso-wrap-style:square">
+        <w:pict w14:anchorId="5BF0AF37">
+          <v:shape id="Image 14" o:spid="_x0000_i1038" type="#_x0000_t75" style="width:349.8pt;height:207.6pt;visibility:visible;mso-wrap-style:square">
             <v:imagedata r:id="rId31" o:title=""/>
           </v:shape>
         </w:pict>
@@ -9629,6 +9748,43 @@
           <w:i/>
           <w:sz w:val="21"/>
         </w:rPr>
+        <w:t>Figure 4.2 : Page de connexion</w:t>
+      </w:r>
+    </w:p>
+    <w:p/>
+    <w:p>
+      <w:r>
+        <w:t>L'authentification se fait par nom d'utilisateur et mot de passe ; le jeton JWT renvoyé par le backend sécurise ensuite l'ensemble des requêtes vers l'API.</w:t>
+      </w:r>
+    </w:p>
+    <w:p>
+      <w:pPr>
+        <w:jc w:val="center"/>
+      </w:pPr>
+      <w:r>
+        <w:rPr>
+          <w:noProof/>
+        </w:rPr>
+        <w:pict w14:anchorId="1EEBD083">
+          <v:shape id="Image 15" o:spid="_x0000_i1039" type="#_x0000_t75" style="width:420pt;height:249.6pt;visibility:visible;mso-wrap-style:square">
+            <v:imagedata r:id="rId32" o:title=""/>
+          </v:shape>
+        </w:pict>
+      </w:r>
+    </w:p>
+    <w:p>
+      <w:pPr>
+        <w:jc w:val="center"/>
+        <w:rPr>
+          <w:i/>
+          <w:sz w:val="21"/>
+        </w:rPr>
+      </w:pPr>
+      <w:r>
+        <w:rPr>
+          <w:i/>
+          <w:sz w:val="21"/>
+        </w:rPr>
         <w:t>Figure 4.3 : Gestion des offres d'emploi (espace RH)</w:t>
       </w:r>
     </w:p>
@@ -9649,43 +9805,6 @@
         <w:lastRenderedPageBreak/>
         <w:pict w14:anchorId="131B476D">
           <v:shape id="Image 16" o:spid="_x0000_i1040" type="#_x0000_t75" style="width:420pt;height:249.6pt;visibility:visible;mso-wrap-style:square">
-            <v:imagedata r:id="rId32" o:title=""/>
-          </v:shape>
-        </w:pict>
-      </w:r>
-    </w:p>
-    <w:p>
-      <w:pPr>
-        <w:jc w:val="center"/>
-        <w:rPr>
-          <w:i/>
-          <w:sz w:val="21"/>
-        </w:rPr>
-      </w:pPr>
-      <w:r>
-        <w:rPr>
-          <w:i/>
-          <w:sz w:val="21"/>
-        </w:rPr>
-        <w:t>Figure 4.4 : Gestion des candidats — vue liste avec score IA</w:t>
-      </w:r>
-    </w:p>
-    <w:p/>
-    <w:p>
-      <w:r>
-        <w:t>Pour chaque dossier, la liste des candidats affiche le statut courant, le score calculé par l'agent IA, ainsi qu'un ensemble d'actions rapides (changement de statut, envoi d'e-mail, consultation, suppression).</w:t>
-      </w:r>
-    </w:p>
-    <w:p>
-      <w:pPr>
-        <w:jc w:val="center"/>
-      </w:pPr>
-      <w:r>
-        <w:rPr>
-          <w:noProof/>
-        </w:rPr>
-        <w:pict w14:anchorId="0B44AC1E">
-          <v:shape id="Image 17" o:spid="_x0000_i1041" type="#_x0000_t75" style="width:420pt;height:249.6pt;visibility:visible;mso-wrap-style:square">
             <v:imagedata r:id="rId33" o:title=""/>
           </v:shape>
         </w:pict>
@@ -9704,17 +9823,13 @@
           <w:i/>
           <w:sz w:val="21"/>
         </w:rPr>
-        <w:t>Figure 4.5 : Modification d'un dossier candidat</w:t>
+        <w:t>Figure 4.4 : Gestion des candidats — vue liste avec score IA</w:t>
       </w:r>
     </w:p>
     <w:p/>
     <w:p>
       <w:r>
-        <w:t xml:space="preserve">Le RH corrige ici les informations d'un candidat (coordonnées, lettre de motivation, statut, offre associée) via le formulaire de modification ; la fiche de consultation associée regroupe le CV, </w:t>
-      </w:r>
-      <w:r>
-        <w:lastRenderedPageBreak/>
-        <w:t>l'analyse IA détaillée (scores technique, communication, adéquation séniorité) et l'historique des actions des agents n8n sur ce dossier.</w:t>
+        <w:t>Pour chaque dossier, la liste des candidats affiche le statut courant, le score calculé par l'agent IA, ainsi qu'un ensemble d'actions rapides (changement de statut, envoi d'e-mail, consultation, suppression).</w:t>
       </w:r>
     </w:p>
     <w:p>
@@ -9725,8 +9840,8 @@
         <w:rPr>
           <w:noProof/>
         </w:rPr>
-        <w:pict w14:anchorId="3DE79FED">
-          <v:shape id="Image 18" o:spid="_x0000_i1042" type="#_x0000_t75" style="width:420pt;height:249.6pt;visibility:visible;mso-wrap-style:square">
+        <w:pict w14:anchorId="0B44AC1E">
+          <v:shape id="Image 17" o:spid="_x0000_i1041" type="#_x0000_t75" style="width:420pt;height:249.6pt;visibility:visible;mso-wrap-style:square">
             <v:imagedata r:id="rId34" o:title=""/>
           </v:shape>
         </w:pict>
@@ -9745,13 +9860,17 @@
           <w:i/>
           <w:sz w:val="21"/>
         </w:rPr>
-        <w:t>Figure 4.6 : Tableau Kanban du pipeline de recrutement</w:t>
+        <w:t>Figure 4.5 : Modification d'un dossier candidat</w:t>
       </w:r>
     </w:p>
     <w:p/>
     <w:p>
       <w:r>
-        <w:t>Le tableau Kanban donne une vue synthétique et interactive de toutes les candidatures réparties par statut ; glisser une carte d'une colonne à une autre déclenche automatiquement la mise à jour du statut, sous réserve des garde-fous métier décrits au chapitre 3 pour les décisions finales.</w:t>
+        <w:t xml:space="preserve">Le RH corrige ici les informations d'un candidat (coordonnées, lettre de motivation, statut, offre associée) via le formulaire de modification ; la fiche de consultation associée regroupe le CV, </w:t>
+      </w:r>
+      <w:r>
+        <w:lastRenderedPageBreak/>
+        <w:t>l'analyse IA détaillée (scores technique, communication, adéquation séniorité) et l'historique des actions des agents n8n sur ce dossier.</w:t>
       </w:r>
     </w:p>
     <w:p>
@@ -9762,8 +9881,8 @@
         <w:rPr>
           <w:noProof/>
         </w:rPr>
-        <w:pict w14:anchorId="61C2271E">
-          <v:shape id="Image 19" o:spid="_x0000_i1043" type="#_x0000_t75" style="width:420pt;height:249.6pt;visibility:visible;mso-wrap-style:square">
+        <w:pict w14:anchorId="3DE79FED">
+          <v:shape id="Image 18" o:spid="_x0000_i1042" type="#_x0000_t75" style="width:420pt;height:249.6pt;visibility:visible;mso-wrap-style:square">
             <v:imagedata r:id="rId35" o:title=""/>
           </v:shape>
         </w:pict>
@@ -9782,14 +9901,13 @@
           <w:i/>
           <w:sz w:val="21"/>
         </w:rPr>
-        <w:t>Figure 4.7 : Gestion des entretiens</w:t>
+        <w:t>Figure 4.6 : Tableau Kanban du pipeline de recrutement</w:t>
       </w:r>
     </w:p>
     <w:p/>
     <w:p>
       <w:r>
-        <w:lastRenderedPageBreak/>
-        <w:t>On planifie, filtre et suit ici les entretiens (type, date, interviewer, statut), avec des actions contextuelles comme le démarrage, l'annulation, la reprogrammation ou l'ajout d'un feedback une fois l'entretien terminé.</w:t>
+        <w:t>Le tableau Kanban donne une vue synthétique et interactive de toutes les candidatures réparties par statut ; glisser une carte d'une colonne à une autre déclenche automatiquement la mise à jour du statut, sous réserve des garde-fous métier décrits au chapitre 3 pour les décisions finales.</w:t>
       </w:r>
     </w:p>
     <w:p>
@@ -9800,8 +9918,8 @@
         <w:rPr>
           <w:noProof/>
         </w:rPr>
-        <w:pict w14:anchorId="4A63A72C">
-          <v:shape id="Image 20" o:spid="_x0000_i1044" type="#_x0000_t75" style="width:420pt;height:249.6pt;visibility:visible;mso-wrap-style:square">
+        <w:pict w14:anchorId="61C2271E">
+          <v:shape id="Image 19" o:spid="_x0000_i1043" type="#_x0000_t75" style="width:420pt;height:249.6pt;visibility:visible;mso-wrap-style:square">
             <v:imagedata r:id="rId36" o:title=""/>
           </v:shape>
         </w:pict>
@@ -9820,13 +9938,14 @@
           <w:i/>
           <w:sz w:val="21"/>
         </w:rPr>
-        <w:t>Figure 4.8 : Gestion des feedbacks</w:t>
+        <w:t>Figure 4.7 : Gestion des entretiens</w:t>
       </w:r>
     </w:p>
     <w:p/>
     <w:p>
       <w:r>
-        <w:t>Les feedbacks saisis par les managers sont centralisés ici, avec une étape de validation par le RH avant transmission au candidat.</w:t>
+        <w:lastRenderedPageBreak/>
+        <w:t>On planifie, filtre et suit ici les entretiens (type, date, interviewer, statut), avec des actions contextuelles comme le démarrage, l'annulation, la reprogrammation ou l'ajout d'un feedback une fois l'entretien terminé.</w:t>
       </w:r>
     </w:p>
     <w:p>
@@ -9837,8 +9956,8 @@
         <w:rPr>
           <w:noProof/>
         </w:rPr>
-        <w:pict w14:anchorId="1C64D113">
-          <v:shape id="Image 21" o:spid="_x0000_i1045" type="#_x0000_t75" style="width:420pt;height:249.6pt;visibility:visible;mso-wrap-style:square">
+        <w:pict w14:anchorId="4A63A72C">
+          <v:shape id="Image 20" o:spid="_x0000_i1044" type="#_x0000_t75" style="width:420pt;height:249.6pt;visibility:visible;mso-wrap-style:square">
             <v:imagedata r:id="rId37" o:title=""/>
           </v:shape>
         </w:pict>
@@ -9857,14 +9976,13 @@
           <w:i/>
           <w:sz w:val="21"/>
         </w:rPr>
-        <w:t>Figure 4.9 : Gestion des utilisateurs et des rôles (espace Administrateur)</w:t>
+        <w:t>Figure 4.8 : Gestion des feedbacks</w:t>
       </w:r>
     </w:p>
     <w:p/>
     <w:p>
       <w:r>
-        <w:lastRenderedPageBreak/>
-        <w:t>L'administrateur y gère l'ensemble des comptes de la plateforme, leurs rôles, ainsi que leur rattachement à un département ou une famille de métier.</w:t>
+        <w:t>Les feedbacks saisis par les managers sont centralisés ici, avec une étape de validation par le RH avant transmission au candidat.</w:t>
       </w:r>
     </w:p>
     <w:p>
@@ -9875,8 +9993,8 @@
         <w:rPr>
           <w:noProof/>
         </w:rPr>
-        <w:pict w14:anchorId="30680820">
-          <v:shape id="Image 22" o:spid="_x0000_i1046" type="#_x0000_t75" style="width:420pt;height:249.6pt;visibility:visible;mso-wrap-style:square">
+        <w:pict w14:anchorId="1C64D113">
+          <v:shape id="Image 21" o:spid="_x0000_i1045" type="#_x0000_t75" style="width:420pt;height:249.6pt;visibility:visible;mso-wrap-style:square">
             <v:imagedata r:id="rId38" o:title=""/>
           </v:shape>
         </w:pict>
@@ -9895,13 +10013,14 @@
           <w:i/>
           <w:sz w:val="21"/>
         </w:rPr>
-        <w:t>Figure 4.10 : Paramétrage du scoring IA par famille de métier</w:t>
+        <w:t>Figure 4.9 : Gestion des utilisateurs et des rôles (espace Administrateur)</w:t>
       </w:r>
     </w:p>
     <w:p/>
     <w:p>
       <w:r>
-        <w:t>Réservée à l'administrateur, cette interface permet d'ajuster la pondération (technique / communication / séniorité) que l'agent IA utilise pour calculer le score de chaque candidature, selon la famille de métier et le niveau de séniorité de l'offre.</w:t>
+        <w:lastRenderedPageBreak/>
+        <w:t>L'administrateur y gère l'ensemble des comptes de la plateforme, leurs rôles, ainsi que leur rattachement à un département ou une famille de métier.</w:t>
       </w:r>
     </w:p>
     <w:p>
@@ -9912,8 +10031,8 @@
         <w:rPr>
           <w:noProof/>
         </w:rPr>
-        <w:pict w14:anchorId="66625CE5">
-          <v:shape id="Image 23" o:spid="_x0000_i1047" type="#_x0000_t75" style="width:420pt;height:249.6pt;visibility:visible;mso-wrap-style:square">
+        <w:pict w14:anchorId="30680820">
+          <v:shape id="Image 22" o:spid="_x0000_i1046" type="#_x0000_t75" style="width:420pt;height:249.6pt;visibility:visible;mso-wrap-style:square">
             <v:imagedata r:id="rId39" o:title=""/>
           </v:shape>
         </w:pict>
@@ -9932,6 +10051,43 @@
           <w:i/>
           <w:sz w:val="21"/>
         </w:rPr>
+        <w:t>Figure 4.10 : Paramétrage du scoring IA par famille de métier</w:t>
+      </w:r>
+    </w:p>
+    <w:p/>
+    <w:p>
+      <w:r>
+        <w:t>Réservée à l'administrateur, cette interface permet d'ajuster la pondération (technique / communication / séniorité) que l'agent IA utilise pour calculer le score de chaque candidature, selon la famille de métier et le niveau de séniorité de l'offre.</w:t>
+      </w:r>
+    </w:p>
+    <w:p>
+      <w:pPr>
+        <w:jc w:val="center"/>
+      </w:pPr>
+      <w:r>
+        <w:rPr>
+          <w:noProof/>
+        </w:rPr>
+        <w:pict w14:anchorId="66625CE5">
+          <v:shape id="Image 23" o:spid="_x0000_i1047" type="#_x0000_t75" style="width:420pt;height:249.6pt;visibility:visible;mso-wrap-style:square">
+            <v:imagedata r:id="rId40" o:title=""/>
+          </v:shape>
+        </w:pict>
+      </w:r>
+    </w:p>
+    <w:p>
+      <w:pPr>
+        <w:jc w:val="center"/>
+        <w:rPr>
+          <w:i/>
+          <w:sz w:val="21"/>
+        </w:rPr>
+      </w:pPr>
+      <w:r>
+        <w:rPr>
+          <w:i/>
+          <w:sz w:val="21"/>
+        </w:rPr>
         <w:t>Figure 4.11 : Journal d'audit</w:t>
       </w:r>
     </w:p>
@@ -9963,21 +10119,21 @@
       <w:pPr>
         <w:pStyle w:val="Titre2"/>
       </w:pPr>
-      <w:bookmarkStart w:id="53" w:name="_Toc238477327"/>
+      <w:bookmarkStart w:id="54" w:name="_Toc238477810"/>
       <w:r>
         <w:t>4.4 Tests</w:t>
       </w:r>
-      <w:bookmarkEnd w:id="53"/>
+      <w:bookmarkEnd w:id="54"/>
     </w:p>
     <w:p>
       <w:pPr>
         <w:pStyle w:val="Titre3"/>
       </w:pPr>
-      <w:bookmarkStart w:id="54" w:name="_Toc238477328"/>
+      <w:bookmarkStart w:id="55" w:name="_Toc238477811"/>
       <w:r>
         <w:t>4.4.1 Tests unitaires (JUnit 5 / Mockito)</w:t>
       </w:r>
-      <w:bookmarkEnd w:id="54"/>
+      <w:bookmarkEnd w:id="55"/>
     </w:p>
     <w:p>
       <w:r>
@@ -10203,11 +10359,11 @@
       <w:pPr>
         <w:pStyle w:val="Titre3"/>
       </w:pPr>
-      <w:bookmarkStart w:id="55" w:name="_Toc238477329"/>
+      <w:bookmarkStart w:id="56" w:name="_Toc238477812"/>
       <w:r>
         <w:t>4.4.2 Tests fonctionnels manuels</w:t>
       </w:r>
-      <w:bookmarkEnd w:id="55"/>
+      <w:bookmarkEnd w:id="56"/>
     </w:p>
     <w:p>
       <w:r>
@@ -11372,11 +11528,11 @@
       <w:pPr>
         <w:pStyle w:val="Titre3"/>
       </w:pPr>
-      <w:bookmarkStart w:id="56" w:name="_Toc238477330"/>
+      <w:bookmarkStart w:id="57" w:name="_Toc238477813"/>
       <w:r>
         <w:t>4.4.3 Tests des API avec Postman et Swagger</w:t>
       </w:r>
-      <w:bookmarkEnd w:id="56"/>
+      <w:bookmarkEnd w:id="57"/>
     </w:p>
     <w:p>
       <w:r>
@@ -11387,11 +11543,11 @@
       <w:pPr>
         <w:pStyle w:val="Titre3"/>
       </w:pPr>
-      <w:bookmarkStart w:id="57" w:name="_Toc238477331"/>
+      <w:bookmarkStart w:id="58" w:name="_Toc238477814"/>
       <w:r>
         <w:t>4.4.4 Vérification de bout en bout</w:t>
       </w:r>
-      <w:bookmarkEnd w:id="57"/>
+      <w:bookmarkEnd w:id="58"/>
     </w:p>
     <w:p>
       <w:r>
@@ -11406,11 +11562,11 @@
       <w:pPr>
         <w:pStyle w:val="Titre2"/>
       </w:pPr>
-      <w:bookmarkStart w:id="58" w:name="_Toc238477332"/>
+      <w:bookmarkStart w:id="59" w:name="_Toc238477815"/>
       <w:r>
         <w:t>4.5 Difficultés rencontrées et solutions apportées</w:t>
       </w:r>
-      <w:bookmarkEnd w:id="58"/>
+      <w:bookmarkEnd w:id="59"/>
     </w:p>
     <w:p>
       <w:r>
@@ -11421,11 +11577,11 @@
       <w:pPr>
         <w:pStyle w:val="Titre3"/>
       </w:pPr>
-      <w:bookmarkStart w:id="59" w:name="_Toc238477333"/>
+      <w:bookmarkStart w:id="60" w:name="_Toc238477816"/>
       <w:r>
         <w:t>4.5.1 Notification incomplète des managers</w:t>
       </w:r>
-      <w:bookmarkEnd w:id="59"/>
+      <w:bookmarkEnd w:id="60"/>
     </w:p>
     <w:p>
       <w:r>
@@ -11439,11 +11595,11 @@
       <w:pPr>
         <w:pStyle w:val="Titre3"/>
       </w:pPr>
-      <w:bookmarkStart w:id="60" w:name="_Toc238477334"/>
+      <w:bookmarkStart w:id="61" w:name="_Toc238477817"/>
       <w:r>
         <w:t>4.5.2 Distinguer un rejet RH d'un rejet manager</w:t>
       </w:r>
-      <w:bookmarkEnd w:id="60"/>
+      <w:bookmarkEnd w:id="61"/>
     </w:p>
     <w:p>
       <w:r>
@@ -11454,11 +11610,11 @@
       <w:pPr>
         <w:pStyle w:val="Titre3"/>
       </w:pPr>
-      <w:bookmarkStart w:id="61" w:name="_Toc238477335"/>
+      <w:bookmarkStart w:id="62" w:name="_Toc238477818"/>
       <w:r>
         <w:t>4.5.3 Cohérence des transitions de statut</w:t>
       </w:r>
-      <w:bookmarkEnd w:id="61"/>
+      <w:bookmarkEnd w:id="62"/>
     </w:p>
     <w:p>
       <w:r>
@@ -11469,12 +11625,12 @@
       <w:pPr>
         <w:pStyle w:val="Titre3"/>
       </w:pPr>
-      <w:bookmarkStart w:id="62" w:name="_Toc238477336"/>
+      <w:bookmarkStart w:id="63" w:name="_Toc238477819"/>
       <w:r>
         <w:lastRenderedPageBreak/>
         <w:t>4.5.4 Filtrage incomplet des routes de lecture pour les managers</w:t>
       </w:r>
-      <w:bookmarkEnd w:id="62"/>
+      <w:bookmarkEnd w:id="63"/>
     </w:p>
     <w:p>
       <w:r>
@@ -11485,11 +11641,11 @@
       <w:pPr>
         <w:pStyle w:val="Titre3"/>
       </w:pPr>
-      <w:bookmarkStart w:id="63" w:name="_Toc238477337"/>
+      <w:bookmarkStart w:id="64" w:name="_Toc238477820"/>
       <w:r>
         <w:t>4.5.5 Solliciter le manager au bon moment du processus</w:t>
       </w:r>
-      <w:bookmarkEnd w:id="63"/>
+      <w:bookmarkEnd w:id="64"/>
     </w:p>
     <w:p>
       <w:pPr>
@@ -11503,11 +11659,11 @@
       <w:pPr>
         <w:pStyle w:val="Titre3"/>
       </w:pPr>
-      <w:bookmarkStart w:id="64" w:name="_Toc238477338"/>
+      <w:bookmarkStart w:id="65" w:name="_Toc238477821"/>
       <w:r>
         <w:t>4.5.6 Pertinence du matching Job idéal</w:t>
       </w:r>
-      <w:bookmarkEnd w:id="64"/>
+      <w:bookmarkEnd w:id="65"/>
     </w:p>
     <w:p>
       <w:pPr>
@@ -11521,11 +11677,11 @@
       <w:pPr>
         <w:pStyle w:val="Titre3"/>
       </w:pPr>
-      <w:bookmarkStart w:id="65" w:name="_Toc238477339"/>
+      <w:bookmarkStart w:id="66" w:name="_Toc238477822"/>
       <w:r>
         <w:t>4.5.7 Traitement distinct des candidatures retirées</w:t>
       </w:r>
-      <w:bookmarkEnd w:id="65"/>
+      <w:bookmarkEnd w:id="66"/>
     </w:p>
     <w:p>
       <w:pPr>
@@ -11545,11 +11701,11 @@
       <w:pPr>
         <w:pStyle w:val="Titre3"/>
       </w:pPr>
-      <w:bookmarkStart w:id="66" w:name="_Toc238477340"/>
+      <w:bookmarkStart w:id="67" w:name="_Toc238477823"/>
       <w:r>
         <w:t>4.5.8 Entretien téléphonique RH obligatoire avant acceptation</w:t>
       </w:r>
-      <w:bookmarkEnd w:id="66"/>
+      <w:bookmarkEnd w:id="67"/>
     </w:p>
     <w:p>
       <w:pPr>
@@ -11567,11 +11723,11 @@
       <w:pPr>
         <w:pStyle w:val="Titre3"/>
       </w:pPr>
-      <w:bookmarkStart w:id="67" w:name="_Toc238477341"/>
+      <w:bookmarkStart w:id="68" w:name="_Toc238477824"/>
       <w:r>
         <w:t>4.5.9 Découplage entre planification d'entretien et statut du candidat</w:t>
       </w:r>
-      <w:bookmarkEnd w:id="67"/>
+      <w:bookmarkEnd w:id="68"/>
     </w:p>
     <w:p>
       <w:pPr>
@@ -11585,11 +11741,11 @@
       <w:pPr>
         <w:pStyle w:val="Titre3"/>
       </w:pPr>
-      <w:bookmarkStart w:id="68" w:name="_Toc238477342"/>
+      <w:bookmarkStart w:id="69" w:name="_Toc238477825"/>
       <w:r>
         <w:t>4.5.10 Fiabiliser l'intégration Google Meet et le format des webhooks n8n</w:t>
       </w:r>
-      <w:bookmarkEnd w:id="68"/>
+      <w:bookmarkEnd w:id="69"/>
     </w:p>
     <w:p>
       <w:r>
@@ -11600,11 +11756,11 @@
       <w:pPr>
         <w:pStyle w:val="Titre3"/>
       </w:pPr>
-      <w:bookmarkStart w:id="69" w:name="_Toc238477343"/>
+      <w:bookmarkStart w:id="70" w:name="_Toc238477826"/>
       <w:r>
         <w:t>4.5.11 Cloisonnement des données dans le chatbot candidat</w:t>
       </w:r>
-      <w:bookmarkEnd w:id="69"/>
+      <w:bookmarkEnd w:id="70"/>
     </w:p>
     <w:p>
       <w:r>
@@ -11619,11 +11775,11 @@
       <w:pPr>
         <w:pStyle w:val="Titre2"/>
       </w:pPr>
-      <w:bookmarkStart w:id="70" w:name="_Toc238477344"/>
+      <w:bookmarkStart w:id="71" w:name="_Toc238477827"/>
       <w:r>
         <w:t>4.6 Protection des données et éthique de l'IA</w:t>
       </w:r>
-      <w:bookmarkEnd w:id="70"/>
+      <w:bookmarkEnd w:id="71"/>
     </w:p>
     <w:p>
       <w:r>
@@ -11661,11 +11817,11 @@
       <w:pPr>
         <w:pStyle w:val="Titre2"/>
       </w:pPr>
-      <w:bookmarkStart w:id="71" w:name="_Toc238477345"/>
+      <w:bookmarkStart w:id="72" w:name="_Toc238477828"/>
       <w:r>
         <w:t>4.7 Bilan des fonctionnalités réalisées</w:t>
       </w:r>
-      <w:bookmarkEnd w:id="71"/>
+      <w:bookmarkEnd w:id="72"/>
     </w:p>
     <w:p>
       <w:r>
@@ -12323,11 +12479,11 @@
       <w:pPr>
         <w:pStyle w:val="Titre2"/>
       </w:pPr>
-      <w:bookmarkStart w:id="72" w:name="_Toc238477346"/>
+      <w:bookmarkStart w:id="73" w:name="_Toc238477829"/>
       <w:r>
         <w:t>4.8 Conclusion</w:t>
       </w:r>
-      <w:bookmarkEnd w:id="72"/>
+      <w:bookmarkEnd w:id="73"/>
     </w:p>
     <w:p>
       <w:r>
@@ -12347,11 +12503,11 @@
         <w:pStyle w:val="Titre1"/>
         <w:jc w:val="center"/>
       </w:pPr>
-      <w:bookmarkStart w:id="73" w:name="_Toc238477347"/>
+      <w:bookmarkStart w:id="74" w:name="_Toc238477830"/>
       <w:r>
         <w:t>Conclusion Générale et Perspectives</w:t>
       </w:r>
-      <w:bookmarkEnd w:id="73"/>
+      <w:bookmarkEnd w:id="74"/>
     </w:p>
     <w:p>
       <w:r>
@@ -12395,11 +12551,11 @@
       <w:pPr>
         <w:pStyle w:val="Titre1"/>
       </w:pPr>
-      <w:bookmarkStart w:id="74" w:name="_Toc238477348"/>
+      <w:bookmarkStart w:id="75" w:name="_Toc238477831"/>
       <w:r>
         <w:t>Bibliographie</w:t>
       </w:r>
-      <w:bookmarkEnd w:id="74"/>
+      <w:bookmarkEnd w:id="75"/>
     </w:p>
     <w:p>
       <w:pPr>
@@ -12623,11 +12779,11 @@
       <w:pPr>
         <w:pStyle w:val="Titre1"/>
       </w:pPr>
-      <w:bookmarkStart w:id="75" w:name="_Toc238477349"/>
+      <w:bookmarkStart w:id="76" w:name="_Toc238477832"/>
       <w:r>
         <w:t>Glossaire</w:t>
       </w:r>
-      <w:bookmarkEnd w:id="75"/>
+      <w:bookmarkEnd w:id="76"/>
     </w:p>
     <w:p>
       <w:pPr>

</xml_diff>

<commit_message>
docs: ajouter 4 captures ciblees (candidature+CV, Job ideal, score IA, manager)
Ajoute en fin de section 4.3 quatre captures reelles prises sur
l'application en fonctionnement : soumission d'une candidature avec
upload de CV, matching "Job ideal" (badge Analyse IA Cohere avec vrais
pourcentages de compatibilite), detail du score IA par critere
(technique/communication/seniorite, avec correction RH justifiee), et
la vue Manager cloisonnee des dossiers valides par le RH.

Met a jour la Liste des figures avec les vraies pages calculees via
Word.

Co-Authored-By: Claude Sonnet 5 <noreply@anthropic.com>
</commit_message>
<xml_diff>
--- a/Rapport-PFE/Rapport_PFE_Bargaoui_Haythem.docx
+++ b/Rapport-PFE/Rapport_PFE_Bargaoui_Haythem.docx
@@ -805,7 +805,7 @@
         <w:pStyle w:val="Titre1"/>
         <w:jc w:val="center"/>
       </w:pPr>
-      <w:bookmarkStart w:id="0" w:name="_Toc238477756"/>
+      <w:bookmarkStart w:id="0" w:name="_Toc238479043"/>
       <w:r>
         <w:t>Table des matières</w:t>
       </w:r>
@@ -855,7 +855,7 @@
         <w:rPr>
           <w:noProof/>
         </w:rPr>
-        <w:instrText xml:space="preserve"> PAGEREF _Toc238477756 \h </w:instrText>
+        <w:instrText xml:space="preserve"> PAGEREF _Toc238479043 \h </w:instrText>
       </w:r>
       <w:r>
         <w:rPr>
@@ -916,7 +916,7 @@
         <w:rPr>
           <w:noProof/>
         </w:rPr>
-        <w:instrText xml:space="preserve"> PAGEREF _Toc238477757 \h </w:instrText>
+        <w:instrText xml:space="preserve"> PAGEREF _Toc238479044 \h </w:instrText>
       </w:r>
       <w:r>
         <w:rPr>
@@ -977,7 +977,7 @@
         <w:rPr>
           <w:noProof/>
         </w:rPr>
-        <w:instrText xml:space="preserve"> PAGEREF _Toc238477758 \h </w:instrText>
+        <w:instrText xml:space="preserve"> PAGEREF _Toc238479045 \h </w:instrText>
       </w:r>
       <w:r>
         <w:rPr>
@@ -1038,7 +1038,7 @@
         <w:rPr>
           <w:noProof/>
         </w:rPr>
-        <w:instrText xml:space="preserve"> PAGEREF _Toc238477759 \h </w:instrText>
+        <w:instrText xml:space="preserve"> PAGEREF _Toc238479046 \h </w:instrText>
       </w:r>
       <w:r>
         <w:rPr>
@@ -1099,7 +1099,7 @@
         <w:rPr>
           <w:noProof/>
         </w:rPr>
-        <w:instrText xml:space="preserve"> PAGEREF _Toc238477760 \h </w:instrText>
+        <w:instrText xml:space="preserve"> PAGEREF _Toc238479047 \h </w:instrText>
       </w:r>
       <w:r>
         <w:rPr>
@@ -1160,7 +1160,7 @@
         <w:rPr>
           <w:noProof/>
         </w:rPr>
-        <w:instrText xml:space="preserve"> PAGEREF _Toc238477761 \h </w:instrText>
+        <w:instrText xml:space="preserve"> PAGEREF _Toc238479048 \h </w:instrText>
       </w:r>
       <w:r>
         <w:rPr>
@@ -1221,7 +1221,7 @@
         <w:rPr>
           <w:noProof/>
         </w:rPr>
-        <w:instrText xml:space="preserve"> PAGEREF _Toc238477762 \h </w:instrText>
+        <w:instrText xml:space="preserve"> PAGEREF _Toc238479049 \h </w:instrText>
       </w:r>
       <w:r>
         <w:rPr>
@@ -1282,7 +1282,7 @@
         <w:rPr>
           <w:noProof/>
         </w:rPr>
-        <w:instrText xml:space="preserve"> PAGEREF _Toc238477763 \h </w:instrText>
+        <w:instrText xml:space="preserve"> PAGEREF _Toc238479050 \h </w:instrText>
       </w:r>
       <w:r>
         <w:rPr>
@@ -1343,7 +1343,7 @@
         <w:rPr>
           <w:noProof/>
         </w:rPr>
-        <w:instrText xml:space="preserve"> PAGEREF _Toc238477764 \h </w:instrText>
+        <w:instrText xml:space="preserve"> PAGEREF _Toc238479051 \h </w:instrText>
       </w:r>
       <w:r>
         <w:rPr>
@@ -1404,7 +1404,7 @@
         <w:rPr>
           <w:noProof/>
         </w:rPr>
-        <w:instrText xml:space="preserve"> PAGEREF _Toc238477765 \h </w:instrText>
+        <w:instrText xml:space="preserve"> PAGEREF _Toc238479052 \h </w:instrText>
       </w:r>
       <w:r>
         <w:rPr>
@@ -1465,7 +1465,7 @@
         <w:rPr>
           <w:noProof/>
         </w:rPr>
-        <w:instrText xml:space="preserve"> PAGEREF _Toc238477766 \h </w:instrText>
+        <w:instrText xml:space="preserve"> PAGEREF _Toc238479053 \h </w:instrText>
       </w:r>
       <w:r>
         <w:rPr>
@@ -1526,7 +1526,7 @@
         <w:rPr>
           <w:noProof/>
         </w:rPr>
-        <w:instrText xml:space="preserve"> PAGEREF _Toc238477767 \h </w:instrText>
+        <w:instrText xml:space="preserve"> PAGEREF _Toc238479054 \h </w:instrText>
       </w:r>
       <w:r>
         <w:rPr>
@@ -1587,7 +1587,7 @@
         <w:rPr>
           <w:noProof/>
         </w:rPr>
-        <w:instrText xml:space="preserve"> PAGEREF _Toc238477768 \h </w:instrText>
+        <w:instrText xml:space="preserve"> PAGEREF _Toc238479055 \h </w:instrText>
       </w:r>
       <w:r>
         <w:rPr>
@@ -1648,7 +1648,7 @@
         <w:rPr>
           <w:noProof/>
         </w:rPr>
-        <w:instrText xml:space="preserve"> PAGEREF _Toc238477769 \h </w:instrText>
+        <w:instrText xml:space="preserve"> PAGEREF _Toc238479056 \h </w:instrText>
       </w:r>
       <w:r>
         <w:rPr>
@@ -1709,7 +1709,7 @@
         <w:rPr>
           <w:noProof/>
         </w:rPr>
-        <w:instrText xml:space="preserve"> PAGEREF _Toc238477770 \h </w:instrText>
+        <w:instrText xml:space="preserve"> PAGEREF _Toc238479057 \h </w:instrText>
       </w:r>
       <w:r>
         <w:rPr>
@@ -1770,7 +1770,7 @@
         <w:rPr>
           <w:noProof/>
         </w:rPr>
-        <w:instrText xml:space="preserve"> PAGEREF _Toc238477771 \h </w:instrText>
+        <w:instrText xml:space="preserve"> PAGEREF _Toc238479058 \h </w:instrText>
       </w:r>
       <w:r>
         <w:rPr>
@@ -1831,7 +1831,7 @@
         <w:rPr>
           <w:noProof/>
         </w:rPr>
-        <w:instrText xml:space="preserve"> PAGEREF _Toc238477772 \h </w:instrText>
+        <w:instrText xml:space="preserve"> PAGEREF _Toc238479059 \h </w:instrText>
       </w:r>
       <w:r>
         <w:rPr>
@@ -1892,7 +1892,7 @@
         <w:rPr>
           <w:noProof/>
         </w:rPr>
-        <w:instrText xml:space="preserve"> PAGEREF _Toc238477773 \h </w:instrText>
+        <w:instrText xml:space="preserve"> PAGEREF _Toc238479060 \h </w:instrText>
       </w:r>
       <w:r>
         <w:rPr>
@@ -1953,7 +1953,7 @@
         <w:rPr>
           <w:noProof/>
         </w:rPr>
-        <w:instrText xml:space="preserve"> PAGEREF _Toc238477774 \h </w:instrText>
+        <w:instrText xml:space="preserve"> PAGEREF _Toc238479061 \h </w:instrText>
       </w:r>
       <w:r>
         <w:rPr>
@@ -2014,7 +2014,7 @@
         <w:rPr>
           <w:noProof/>
         </w:rPr>
-        <w:instrText xml:space="preserve"> PAGEREF _Toc238477775 \h </w:instrText>
+        <w:instrText xml:space="preserve"> PAGEREF _Toc238479062 \h </w:instrText>
       </w:r>
       <w:r>
         <w:rPr>
@@ -2075,7 +2075,7 @@
         <w:rPr>
           <w:noProof/>
         </w:rPr>
-        <w:instrText xml:space="preserve"> PAGEREF _Toc238477776 \h </w:instrText>
+        <w:instrText xml:space="preserve"> PAGEREF _Toc238479063 \h </w:instrText>
       </w:r>
       <w:r>
         <w:rPr>
@@ -2136,7 +2136,7 @@
         <w:rPr>
           <w:noProof/>
         </w:rPr>
-        <w:instrText xml:space="preserve"> PAGEREF _Toc238477777 \h </w:instrText>
+        <w:instrText xml:space="preserve"> PAGEREF _Toc238479064 \h </w:instrText>
       </w:r>
       <w:r>
         <w:rPr>
@@ -2197,7 +2197,7 @@
         <w:rPr>
           <w:noProof/>
         </w:rPr>
-        <w:instrText xml:space="preserve"> PAGEREF _Toc238477778 \h </w:instrText>
+        <w:instrText xml:space="preserve"> PAGEREF _Toc238479065 \h </w:instrText>
       </w:r>
       <w:r>
         <w:rPr>
@@ -2258,7 +2258,7 @@
         <w:rPr>
           <w:noProof/>
         </w:rPr>
-        <w:instrText xml:space="preserve"> PAGEREF _Toc238477779 \h </w:instrText>
+        <w:instrText xml:space="preserve"> PAGEREF _Toc238479066 \h </w:instrText>
       </w:r>
       <w:r>
         <w:rPr>
@@ -2319,7 +2319,7 @@
         <w:rPr>
           <w:noProof/>
         </w:rPr>
-        <w:instrText xml:space="preserve"> PAGEREF _Toc238477780 \h </w:instrText>
+        <w:instrText xml:space="preserve"> PAGEREF _Toc238479067 \h </w:instrText>
       </w:r>
       <w:r>
         <w:rPr>
@@ -2380,7 +2380,7 @@
         <w:rPr>
           <w:noProof/>
         </w:rPr>
-        <w:instrText xml:space="preserve"> PAGEREF _Toc238477781 \h </w:instrText>
+        <w:instrText xml:space="preserve"> PAGEREF _Toc238479068 \h </w:instrText>
       </w:r>
       <w:r>
         <w:rPr>
@@ -2441,7 +2441,7 @@
         <w:rPr>
           <w:noProof/>
         </w:rPr>
-        <w:instrText xml:space="preserve"> PAGEREF _Toc238477782 \h </w:instrText>
+        <w:instrText xml:space="preserve"> PAGEREF _Toc238479069 \h </w:instrText>
       </w:r>
       <w:r>
         <w:rPr>
@@ -2503,7 +2503,7 @@
         <w:rPr>
           <w:noProof/>
         </w:rPr>
-        <w:instrText xml:space="preserve"> PAGEREF _Toc238477783 \h </w:instrText>
+        <w:instrText xml:space="preserve"> PAGEREF _Toc238479070 \h </w:instrText>
       </w:r>
       <w:r>
         <w:rPr>
@@ -2564,7 +2564,7 @@
         <w:rPr>
           <w:noProof/>
         </w:rPr>
-        <w:instrText xml:space="preserve"> PAGEREF _Toc238477784 \h </w:instrText>
+        <w:instrText xml:space="preserve"> PAGEREF _Toc238479071 \h </w:instrText>
       </w:r>
       <w:r>
         <w:rPr>
@@ -2625,7 +2625,7 @@
         <w:rPr>
           <w:noProof/>
         </w:rPr>
-        <w:instrText xml:space="preserve"> PAGEREF _Toc238477785 \h </w:instrText>
+        <w:instrText xml:space="preserve"> PAGEREF _Toc238479072 \h </w:instrText>
       </w:r>
       <w:r>
         <w:rPr>
@@ -2686,7 +2686,7 @@
         <w:rPr>
           <w:noProof/>
         </w:rPr>
-        <w:instrText xml:space="preserve"> PAGEREF _Toc238477786 \h </w:instrText>
+        <w:instrText xml:space="preserve"> PAGEREF _Toc238479073 \h </w:instrText>
       </w:r>
       <w:r>
         <w:rPr>
@@ -2747,7 +2747,7 @@
         <w:rPr>
           <w:noProof/>
         </w:rPr>
-        <w:instrText xml:space="preserve"> PAGEREF _Toc238477787 \h </w:instrText>
+        <w:instrText xml:space="preserve"> PAGEREF _Toc238479074 \h </w:instrText>
       </w:r>
       <w:r>
         <w:rPr>
@@ -2808,7 +2808,7 @@
         <w:rPr>
           <w:noProof/>
         </w:rPr>
-        <w:instrText xml:space="preserve"> PAGEREF _Toc238477788 \h </w:instrText>
+        <w:instrText xml:space="preserve"> PAGEREF _Toc238479075 \h </w:instrText>
       </w:r>
       <w:r>
         <w:rPr>
@@ -2869,7 +2869,7 @@
         <w:rPr>
           <w:noProof/>
         </w:rPr>
-        <w:instrText xml:space="preserve"> PAGEREF _Toc238477789 \h </w:instrText>
+        <w:instrText xml:space="preserve"> PAGEREF _Toc238479076 \h </w:instrText>
       </w:r>
       <w:r>
         <w:rPr>
@@ -2930,7 +2930,7 @@
         <w:rPr>
           <w:noProof/>
         </w:rPr>
-        <w:instrText xml:space="preserve"> PAGEREF _Toc238477790 \h </w:instrText>
+        <w:instrText xml:space="preserve"> PAGEREF _Toc238479077 \h </w:instrText>
       </w:r>
       <w:r>
         <w:rPr>
@@ -2991,7 +2991,7 @@
         <w:rPr>
           <w:noProof/>
         </w:rPr>
-        <w:instrText xml:space="preserve"> PAGEREF _Toc238477791 \h </w:instrText>
+        <w:instrText xml:space="preserve"> PAGEREF _Toc238479078 \h </w:instrText>
       </w:r>
       <w:r>
         <w:rPr>
@@ -3052,7 +3052,7 @@
         <w:rPr>
           <w:noProof/>
         </w:rPr>
-        <w:instrText xml:space="preserve"> PAGEREF _Toc238477792 \h </w:instrText>
+        <w:instrText xml:space="preserve"> PAGEREF _Toc238479079 \h </w:instrText>
       </w:r>
       <w:r>
         <w:rPr>
@@ -3113,7 +3113,7 @@
         <w:rPr>
           <w:noProof/>
         </w:rPr>
-        <w:instrText xml:space="preserve"> PAGEREF _Toc238477793 \h </w:instrText>
+        <w:instrText xml:space="preserve"> PAGEREF _Toc238479080 \h </w:instrText>
       </w:r>
       <w:r>
         <w:rPr>
@@ -3174,7 +3174,7 @@
         <w:rPr>
           <w:noProof/>
         </w:rPr>
-        <w:instrText xml:space="preserve"> PAGEREF _Toc238477794 \h </w:instrText>
+        <w:instrText xml:space="preserve"> PAGEREF _Toc238479081 \h </w:instrText>
       </w:r>
       <w:r>
         <w:rPr>
@@ -3235,7 +3235,7 @@
         <w:rPr>
           <w:noProof/>
         </w:rPr>
-        <w:instrText xml:space="preserve"> PAGEREF _Toc238477795 \h </w:instrText>
+        <w:instrText xml:space="preserve"> PAGEREF _Toc238479082 \h </w:instrText>
       </w:r>
       <w:r>
         <w:rPr>
@@ -3296,7 +3296,7 @@
         <w:rPr>
           <w:noProof/>
         </w:rPr>
-        <w:instrText xml:space="preserve"> PAGEREF _Toc238477796 \h </w:instrText>
+        <w:instrText xml:space="preserve"> PAGEREF _Toc238479083 \h </w:instrText>
       </w:r>
       <w:r>
         <w:rPr>
@@ -3357,7 +3357,7 @@
         <w:rPr>
           <w:noProof/>
         </w:rPr>
-        <w:instrText xml:space="preserve"> PAGEREF _Toc238477797 \h </w:instrText>
+        <w:instrText xml:space="preserve"> PAGEREF _Toc238479084 \h </w:instrText>
       </w:r>
       <w:r>
         <w:rPr>
@@ -3418,7 +3418,7 @@
         <w:rPr>
           <w:noProof/>
         </w:rPr>
-        <w:instrText xml:space="preserve"> PAGEREF _Toc238477798 \h </w:instrText>
+        <w:instrText xml:space="preserve"> PAGEREF _Toc238479085 \h </w:instrText>
       </w:r>
       <w:r>
         <w:rPr>
@@ -3479,7 +3479,7 @@
         <w:rPr>
           <w:noProof/>
         </w:rPr>
-        <w:instrText xml:space="preserve"> PAGEREF _Toc238477799 \h </w:instrText>
+        <w:instrText xml:space="preserve"> PAGEREF _Toc238479086 \h </w:instrText>
       </w:r>
       <w:r>
         <w:rPr>
@@ -3540,7 +3540,7 @@
         <w:rPr>
           <w:noProof/>
         </w:rPr>
-        <w:instrText xml:space="preserve"> PAGEREF _Toc238477800 \h </w:instrText>
+        <w:instrText xml:space="preserve"> PAGEREF _Toc238479087 \h </w:instrText>
       </w:r>
       <w:r>
         <w:rPr>
@@ -3601,7 +3601,7 @@
         <w:rPr>
           <w:noProof/>
         </w:rPr>
-        <w:instrText xml:space="preserve"> PAGEREF _Toc238477801 \h </w:instrText>
+        <w:instrText xml:space="preserve"> PAGEREF _Toc238479088 \h </w:instrText>
       </w:r>
       <w:r>
         <w:rPr>
@@ -3662,7 +3662,7 @@
         <w:rPr>
           <w:noProof/>
         </w:rPr>
-        <w:instrText xml:space="preserve"> PAGEREF _Toc238477802 \h </w:instrText>
+        <w:instrText xml:space="preserve"> PAGEREF _Toc238479089 \h </w:instrText>
       </w:r>
       <w:r>
         <w:rPr>
@@ -3723,7 +3723,7 @@
         <w:rPr>
           <w:noProof/>
         </w:rPr>
-        <w:instrText xml:space="preserve"> PAGEREF _Toc238477803 \h </w:instrText>
+        <w:instrText xml:space="preserve"> PAGEREF _Toc238479090 \h </w:instrText>
       </w:r>
       <w:r>
         <w:rPr>
@@ -3784,7 +3784,7 @@
         <w:rPr>
           <w:noProof/>
         </w:rPr>
-        <w:instrText xml:space="preserve"> PAGEREF _Toc238477804 \h </w:instrText>
+        <w:instrText xml:space="preserve"> PAGEREF _Toc238479091 \h </w:instrText>
       </w:r>
       <w:r>
         <w:rPr>
@@ -3845,7 +3845,7 @@
         <w:rPr>
           <w:noProof/>
         </w:rPr>
-        <w:instrText xml:space="preserve"> PAGEREF _Toc238477805 \h </w:instrText>
+        <w:instrText xml:space="preserve"> PAGEREF _Toc238479092 \h </w:instrText>
       </w:r>
       <w:r>
         <w:rPr>
@@ -3906,7 +3906,7 @@
         <w:rPr>
           <w:noProof/>
         </w:rPr>
-        <w:instrText xml:space="preserve"> PAGEREF _Toc238477806 \h </w:instrText>
+        <w:instrText xml:space="preserve"> PAGEREF _Toc238479093 \h </w:instrText>
       </w:r>
       <w:r>
         <w:rPr>
@@ -3967,7 +3967,7 @@
         <w:rPr>
           <w:noProof/>
         </w:rPr>
-        <w:instrText xml:space="preserve"> PAGEREF _Toc238477807 \h </w:instrText>
+        <w:instrText xml:space="preserve"> PAGEREF _Toc238479094 \h </w:instrText>
       </w:r>
       <w:r>
         <w:rPr>
@@ -4028,7 +4028,7 @@
         <w:rPr>
           <w:noProof/>
         </w:rPr>
-        <w:instrText xml:space="preserve"> PAGEREF _Toc238477808 \h </w:instrText>
+        <w:instrText xml:space="preserve"> PAGEREF _Toc238479095 \h </w:instrText>
       </w:r>
       <w:r>
         <w:rPr>
@@ -4089,7 +4089,7 @@
         <w:rPr>
           <w:noProof/>
         </w:rPr>
-        <w:instrText xml:space="preserve"> PAGEREF _Toc238477809 \h </w:instrText>
+        <w:instrText xml:space="preserve"> PAGEREF _Toc238479096 \h </w:instrText>
       </w:r>
       <w:r>
         <w:rPr>
@@ -4150,7 +4150,7 @@
         <w:rPr>
           <w:noProof/>
         </w:rPr>
-        <w:instrText xml:space="preserve"> PAGEREF _Toc238477810 \h </w:instrText>
+        <w:instrText xml:space="preserve"> PAGEREF _Toc238479097 \h </w:instrText>
       </w:r>
       <w:r>
         <w:rPr>
@@ -4167,7 +4167,7 @@
         <w:rPr>
           <w:noProof/>
         </w:rPr>
-        <w:t>41</w:t>
+        <w:t>43</w:t>
       </w:r>
       <w:r>
         <w:rPr>
@@ -4211,7 +4211,7 @@
         <w:rPr>
           <w:noProof/>
         </w:rPr>
-        <w:instrText xml:space="preserve"> PAGEREF _Toc238477811 \h </w:instrText>
+        <w:instrText xml:space="preserve"> PAGEREF _Toc238479098 \h </w:instrText>
       </w:r>
       <w:r>
         <w:rPr>
@@ -4228,7 +4228,7 @@
         <w:rPr>
           <w:noProof/>
         </w:rPr>
-        <w:t>41</w:t>
+        <w:t>43</w:t>
       </w:r>
       <w:r>
         <w:rPr>
@@ -4273,7 +4273,7 @@
         <w:rPr>
           <w:noProof/>
         </w:rPr>
-        <w:instrText xml:space="preserve"> PAGEREF _Toc238477812 \h </w:instrText>
+        <w:instrText xml:space="preserve"> PAGEREF _Toc238479099 \h </w:instrText>
       </w:r>
       <w:r>
         <w:rPr>
@@ -4290,7 +4290,7 @@
         <w:rPr>
           <w:noProof/>
         </w:rPr>
-        <w:t>42</w:t>
+        <w:t>44</w:t>
       </w:r>
       <w:r>
         <w:rPr>
@@ -4334,7 +4334,7 @@
         <w:rPr>
           <w:noProof/>
         </w:rPr>
-        <w:instrText xml:space="preserve"> PAGEREF _Toc238477813 \h </w:instrText>
+        <w:instrText xml:space="preserve"> PAGEREF _Toc238479100 \h </w:instrText>
       </w:r>
       <w:r>
         <w:rPr>
@@ -4351,7 +4351,7 @@
         <w:rPr>
           <w:noProof/>
         </w:rPr>
-        <w:t>43</w:t>
+        <w:t>45</w:t>
       </w:r>
       <w:r>
         <w:rPr>
@@ -4395,7 +4395,7 @@
         <w:rPr>
           <w:noProof/>
         </w:rPr>
-        <w:instrText xml:space="preserve"> PAGEREF _Toc238477814 \h </w:instrText>
+        <w:instrText xml:space="preserve"> PAGEREF _Toc238479101 \h </w:instrText>
       </w:r>
       <w:r>
         <w:rPr>
@@ -4412,7 +4412,7 @@
         <w:rPr>
           <w:noProof/>
         </w:rPr>
-        <w:t>43</w:t>
+        <w:t>46</w:t>
       </w:r>
       <w:r>
         <w:rPr>
@@ -4456,7 +4456,7 @@
         <w:rPr>
           <w:noProof/>
         </w:rPr>
-        <w:instrText xml:space="preserve"> PAGEREF _Toc238477815 \h </w:instrText>
+        <w:instrText xml:space="preserve"> PAGEREF _Toc238479102 \h </w:instrText>
       </w:r>
       <w:r>
         <w:rPr>
@@ -4473,7 +4473,7 @@
         <w:rPr>
           <w:noProof/>
         </w:rPr>
-        <w:t>44</w:t>
+        <w:t>46</w:t>
       </w:r>
       <w:r>
         <w:rPr>
@@ -4517,7 +4517,7 @@
         <w:rPr>
           <w:noProof/>
         </w:rPr>
-        <w:instrText xml:space="preserve"> PAGEREF _Toc238477816 \h </w:instrText>
+        <w:instrText xml:space="preserve"> PAGEREF _Toc238479103 \h </w:instrText>
       </w:r>
       <w:r>
         <w:rPr>
@@ -4534,7 +4534,7 @@
         <w:rPr>
           <w:noProof/>
         </w:rPr>
-        <w:t>44</w:t>
+        <w:t>46</w:t>
       </w:r>
       <w:r>
         <w:rPr>
@@ -4578,7 +4578,7 @@
         <w:rPr>
           <w:noProof/>
         </w:rPr>
-        <w:instrText xml:space="preserve"> PAGEREF _Toc238477817 \h </w:instrText>
+        <w:instrText xml:space="preserve"> PAGEREF _Toc238479104 \h </w:instrText>
       </w:r>
       <w:r>
         <w:rPr>
@@ -4595,7 +4595,7 @@
         <w:rPr>
           <w:noProof/>
         </w:rPr>
-        <w:t>44</w:t>
+        <w:t>46</w:t>
       </w:r>
       <w:r>
         <w:rPr>
@@ -4639,7 +4639,7 @@
         <w:rPr>
           <w:noProof/>
         </w:rPr>
-        <w:instrText xml:space="preserve"> PAGEREF _Toc238477818 \h </w:instrText>
+        <w:instrText xml:space="preserve"> PAGEREF _Toc238479105 \h </w:instrText>
       </w:r>
       <w:r>
         <w:rPr>
@@ -4656,7 +4656,7 @@
         <w:rPr>
           <w:noProof/>
         </w:rPr>
-        <w:t>44</w:t>
+        <w:t>46</w:t>
       </w:r>
       <w:r>
         <w:rPr>
@@ -4700,7 +4700,7 @@
         <w:rPr>
           <w:noProof/>
         </w:rPr>
-        <w:instrText xml:space="preserve"> PAGEREF _Toc238477819 \h </w:instrText>
+        <w:instrText xml:space="preserve"> PAGEREF _Toc238479106 \h </w:instrText>
       </w:r>
       <w:r>
         <w:rPr>
@@ -4717,7 +4717,7 @@
         <w:rPr>
           <w:noProof/>
         </w:rPr>
-        <w:t>45</w:t>
+        <w:t>47</w:t>
       </w:r>
       <w:r>
         <w:rPr>
@@ -4761,7 +4761,7 @@
         <w:rPr>
           <w:noProof/>
         </w:rPr>
-        <w:instrText xml:space="preserve"> PAGEREF _Toc238477820 \h </w:instrText>
+        <w:instrText xml:space="preserve"> PAGEREF _Toc238479107 \h </w:instrText>
       </w:r>
       <w:r>
         <w:rPr>
@@ -4778,7 +4778,7 @@
         <w:rPr>
           <w:noProof/>
         </w:rPr>
-        <w:t>45</w:t>
+        <w:t>47</w:t>
       </w:r>
       <w:r>
         <w:rPr>
@@ -4822,7 +4822,7 @@
         <w:rPr>
           <w:noProof/>
         </w:rPr>
-        <w:instrText xml:space="preserve"> PAGEREF _Toc238477821 \h </w:instrText>
+        <w:instrText xml:space="preserve"> PAGEREF _Toc238479108 \h </w:instrText>
       </w:r>
       <w:r>
         <w:rPr>
@@ -4839,7 +4839,7 @@
         <w:rPr>
           <w:noProof/>
         </w:rPr>
-        <w:t>45</w:t>
+        <w:t>47</w:t>
       </w:r>
       <w:r>
         <w:rPr>
@@ -4883,7 +4883,7 @@
         <w:rPr>
           <w:noProof/>
         </w:rPr>
-        <w:instrText xml:space="preserve"> PAGEREF _Toc238477822 \h </w:instrText>
+        <w:instrText xml:space="preserve"> PAGEREF _Toc238479109 \h </w:instrText>
       </w:r>
       <w:r>
         <w:rPr>
@@ -4900,7 +4900,7 @@
         <w:rPr>
           <w:noProof/>
         </w:rPr>
-        <w:t>45</w:t>
+        <w:t>47</w:t>
       </w:r>
       <w:r>
         <w:rPr>
@@ -4944,7 +4944,7 @@
         <w:rPr>
           <w:noProof/>
         </w:rPr>
-        <w:instrText xml:space="preserve"> PAGEREF _Toc238477823 \h </w:instrText>
+        <w:instrText xml:space="preserve"> PAGEREF _Toc238479110 \h </w:instrText>
       </w:r>
       <w:r>
         <w:rPr>
@@ -4961,7 +4961,7 @@
         <w:rPr>
           <w:noProof/>
         </w:rPr>
-        <w:t>45</w:t>
+        <w:t>48</w:t>
       </w:r>
       <w:r>
         <w:rPr>
@@ -5005,7 +5005,7 @@
         <w:rPr>
           <w:noProof/>
         </w:rPr>
-        <w:instrText xml:space="preserve"> PAGEREF _Toc238477824 \h </w:instrText>
+        <w:instrText xml:space="preserve"> PAGEREF _Toc238479111 \h </w:instrText>
       </w:r>
       <w:r>
         <w:rPr>
@@ -5022,7 +5022,7 @@
         <w:rPr>
           <w:noProof/>
         </w:rPr>
-        <w:t>46</w:t>
+        <w:t>48</w:t>
       </w:r>
       <w:r>
         <w:rPr>
@@ -5066,7 +5066,7 @@
         <w:rPr>
           <w:noProof/>
         </w:rPr>
-        <w:instrText xml:space="preserve"> PAGEREF _Toc238477825 \h </w:instrText>
+        <w:instrText xml:space="preserve"> PAGEREF _Toc238479112 \h </w:instrText>
       </w:r>
       <w:r>
         <w:rPr>
@@ -5083,7 +5083,7 @@
         <w:rPr>
           <w:noProof/>
         </w:rPr>
-        <w:t>46</w:t>
+        <w:t>48</w:t>
       </w:r>
       <w:r>
         <w:rPr>
@@ -5127,7 +5127,7 @@
         <w:rPr>
           <w:noProof/>
         </w:rPr>
-        <w:instrText xml:space="preserve"> PAGEREF _Toc238477826 \h </w:instrText>
+        <w:instrText xml:space="preserve"> PAGEREF _Toc238479113 \h </w:instrText>
       </w:r>
       <w:r>
         <w:rPr>
@@ -5144,7 +5144,7 @@
         <w:rPr>
           <w:noProof/>
         </w:rPr>
-        <w:t>46</w:t>
+        <w:t>48</w:t>
       </w:r>
       <w:r>
         <w:rPr>
@@ -5188,7 +5188,7 @@
         <w:rPr>
           <w:noProof/>
         </w:rPr>
-        <w:instrText xml:space="preserve"> PAGEREF _Toc238477827 \h </w:instrText>
+        <w:instrText xml:space="preserve"> PAGEREF _Toc238479114 \h </w:instrText>
       </w:r>
       <w:r>
         <w:rPr>
@@ -5205,7 +5205,7 @@
         <w:rPr>
           <w:noProof/>
         </w:rPr>
-        <w:t>47</w:t>
+        <w:t>49</w:t>
       </w:r>
       <w:r>
         <w:rPr>
@@ -5249,7 +5249,7 @@
         <w:rPr>
           <w:noProof/>
         </w:rPr>
-        <w:instrText xml:space="preserve"> PAGEREF _Toc238477828 \h </w:instrText>
+        <w:instrText xml:space="preserve"> PAGEREF _Toc238479115 \h </w:instrText>
       </w:r>
       <w:r>
         <w:rPr>
@@ -5266,7 +5266,7 @@
         <w:rPr>
           <w:noProof/>
         </w:rPr>
-        <w:t>47</w:t>
+        <w:t>50</w:t>
       </w:r>
       <w:r>
         <w:rPr>
@@ -5310,7 +5310,7 @@
         <w:rPr>
           <w:noProof/>
         </w:rPr>
-        <w:instrText xml:space="preserve"> PAGEREF _Toc238477829 \h </w:instrText>
+        <w:instrText xml:space="preserve"> PAGEREF _Toc238479116 \h </w:instrText>
       </w:r>
       <w:r>
         <w:rPr>
@@ -5327,7 +5327,7 @@
         <w:rPr>
           <w:noProof/>
         </w:rPr>
-        <w:t>48</w:t>
+        <w:t>51</w:t>
       </w:r>
       <w:r>
         <w:rPr>
@@ -5371,7 +5371,7 @@
         <w:rPr>
           <w:noProof/>
         </w:rPr>
-        <w:instrText xml:space="preserve"> PAGEREF _Toc238477830 \h </w:instrText>
+        <w:instrText xml:space="preserve"> PAGEREF _Toc238479117 \h </w:instrText>
       </w:r>
       <w:r>
         <w:rPr>
@@ -5388,7 +5388,7 @@
         <w:rPr>
           <w:noProof/>
         </w:rPr>
-        <w:t>49</w:t>
+        <w:t>52</w:t>
       </w:r>
       <w:r>
         <w:rPr>
@@ -5432,7 +5432,7 @@
         <w:rPr>
           <w:noProof/>
         </w:rPr>
-        <w:instrText xml:space="preserve"> PAGEREF _Toc238477831 \h </w:instrText>
+        <w:instrText xml:space="preserve"> PAGEREF _Toc238479118 \h </w:instrText>
       </w:r>
       <w:r>
         <w:rPr>
@@ -5449,7 +5449,7 @@
         <w:rPr>
           <w:noProof/>
         </w:rPr>
-        <w:t>50</w:t>
+        <w:t>53</w:t>
       </w:r>
       <w:r>
         <w:rPr>
@@ -5493,7 +5493,7 @@
         <w:rPr>
           <w:noProof/>
         </w:rPr>
-        <w:instrText xml:space="preserve"> PAGEREF _Toc238477832 \h </w:instrText>
+        <w:instrText xml:space="preserve"> PAGEREF _Toc238479119 \h </w:instrText>
       </w:r>
       <w:r>
         <w:rPr>
@@ -5510,7 +5510,7 @@
         <w:rPr>
           <w:noProof/>
         </w:rPr>
-        <w:t>51</w:t>
+        <w:t>54</w:t>
       </w:r>
       <w:r>
         <w:rPr>
@@ -5536,7 +5536,7 @@
       <w:pPr>
         <w:pStyle w:val="Titre1"/>
       </w:pPr>
-      <w:bookmarkStart w:id="1" w:name="_Toc238477757"/>
+      <w:bookmarkStart w:id="1" w:name="_Toc238479044"/>
       <w:r>
         <w:t>Liste des figures</w:t>
       </w:r>
@@ -5946,34 +5946,18 @@
     </w:p>
     <w:p>
       <w:pPr>
-        <w:spacing w:line="278" w:lineRule="auto"/>
-      </w:pPr>
-      <w:r>
-        <w:br w:type="page"/>
-      </w:r>
-    </w:p>
-    <w:p>
-      <w:pPr>
-        <w:pStyle w:val="Titre1"/>
-      </w:pPr>
-      <w:bookmarkStart w:id="2" w:name="_Toc238477758"/>
-      <w:r>
-        <w:t>Liste des tableaux</w:t>
-      </w:r>
-      <w:bookmarkEnd w:id="2"/>
-    </w:p>
-    <w:p>
-      <w:pPr>
         <w:tabs>
           <w:tab w:val="right" w:leader="dot" w:pos="8600"/>
         </w:tabs>
       </w:pPr>
       <w:r>
-        <w:t>Tableau 2.1 : Matrice des responsabilités par rôle</w:t>
+        <w:t>Figure 4.13 : Soumission d'une candidature avec dépôt de CV</w:t>
       </w:r>
       <w:r>
         <w:tab/>
-        <w:t>16</w:t>
+      </w:r>
+      <w:r>
+        <w:t>41</w:t>
       </w:r>
     </w:p>
     <w:p>
@@ -5983,10 +5967,7 @@
         </w:tabs>
       </w:pPr>
       <w:r>
-        <w:t xml:space="preserve">Tableau 4.1 : </w:t>
-      </w:r>
-      <w:r>
-        <w:t>Synthèse des tests fonctionnels réalisés</w:t>
+        <w:t>Figure 4.14 : Fonctionnalité « Job idéal » — suggestions d'offres selon le CV</w:t>
       </w:r>
       <w:r>
         <w:tab/>
@@ -6002,13 +5983,96 @@
         </w:tabs>
       </w:pPr>
       <w:r>
+        <w:t>Figure 4.15 : Analyse détaillée d'une candidature par intelligence artificielle</w:t>
+      </w:r>
+      <w:r>
+        <w:tab/>
+      </w:r>
+      <w:r>
+        <w:t>42</w:t>
+      </w:r>
+    </w:p>
+    <w:p>
+      <w:pPr>
+        <w:tabs>
+          <w:tab w:val="right" w:leader="dot" w:pos="8600"/>
+        </w:tabs>
+      </w:pPr>
+      <w:r>
+        <w:t>Figure 4.16 : Espace Manager — dossiers validés par le RH</w:t>
+      </w:r>
+      <w:r>
+        <w:tab/>
+      </w:r>
+      <w:r>
+        <w:t>43</w:t>
+      </w:r>
+    </w:p>
+    <w:p>
+      <w:pPr>
+        <w:spacing w:line="278" w:lineRule="auto"/>
+      </w:pPr>
+      <w:r>
+        <w:br w:type="page"/>
+      </w:r>
+    </w:p>
+    <w:p>
+      <w:pPr>
+        <w:pStyle w:val="Titre1"/>
+      </w:pPr>
+      <w:bookmarkStart w:id="2" w:name="_Toc238479045"/>
+      <w:r>
+        <w:t>Liste des tableaux</w:t>
+      </w:r>
+      <w:bookmarkEnd w:id="2"/>
+    </w:p>
+    <w:p>
+      <w:pPr>
+        <w:tabs>
+          <w:tab w:val="right" w:leader="dot" w:pos="8600"/>
+        </w:tabs>
+      </w:pPr>
+      <w:r>
+        <w:t>Tableau 2.1 : Matrice des responsabilités par rôle</w:t>
+      </w:r>
+      <w:r>
+        <w:tab/>
+        <w:t>16</w:t>
+      </w:r>
+    </w:p>
+    <w:p>
+      <w:pPr>
+        <w:tabs>
+          <w:tab w:val="right" w:leader="dot" w:pos="8600"/>
+        </w:tabs>
+      </w:pPr>
+      <w:r>
+        <w:t xml:space="preserve">Tableau 4.1 : </w:t>
+      </w:r>
+      <w:r>
+        <w:t>Synthèse des tests fonctionnels réalisés</w:t>
+      </w:r>
+      <w:r>
+        <w:tab/>
+      </w:r>
+      <w:r>
+        <w:t>44</w:t>
+      </w:r>
+    </w:p>
+    <w:p>
+      <w:pPr>
+        <w:tabs>
+          <w:tab w:val="right" w:leader="dot" w:pos="8600"/>
+        </w:tabs>
+      </w:pPr>
+      <w:r>
         <w:t>Tableau 4.2 : Bilan des fonctionnalités réalisées</w:t>
       </w:r>
       <w:r>
         <w:tab/>
       </w:r>
       <w:r>
-        <w:t>48</w:t>
+        <w:t>50</w:t>
       </w:r>
     </w:p>
     <w:p>
@@ -6024,7 +6088,7 @@
         <w:pStyle w:val="Titre1"/>
         <w:jc w:val="center"/>
       </w:pPr>
-      <w:bookmarkStart w:id="3" w:name="_Toc238477759"/>
+      <w:bookmarkStart w:id="3" w:name="_Toc238479046"/>
       <w:r>
         <w:t>Introduction Générale</w:t>
       </w:r>
@@ -6057,7 +6121,7 @@
       <w:pPr>
         <w:pStyle w:val="Titre1"/>
       </w:pPr>
-      <w:bookmarkStart w:id="4" w:name="_Toc238477760"/>
+      <w:bookmarkStart w:id="4" w:name="_Toc238479047"/>
       <w:r>
         <w:t>Chapitre 1 : Cadre Général du Projet</w:t>
       </w:r>
@@ -6072,7 +6136,7 @@
       <w:pPr>
         <w:pStyle w:val="Titre2"/>
       </w:pPr>
-      <w:bookmarkStart w:id="5" w:name="_Toc238477761"/>
+      <w:bookmarkStart w:id="5" w:name="_Toc238479048"/>
       <w:r>
         <w:t>1.1 Introduction</w:t>
       </w:r>
@@ -6087,7 +6151,7 @@
       <w:pPr>
         <w:pStyle w:val="Titre2"/>
       </w:pPr>
-      <w:bookmarkStart w:id="6" w:name="_Toc238477762"/>
+      <w:bookmarkStart w:id="6" w:name="_Toc238479049"/>
       <w:r>
         <w:t>1.2 Présentation de l'organisme d'accueil</w:t>
       </w:r>
@@ -6097,7 +6161,7 @@
       <w:pPr>
         <w:pStyle w:val="Titre3"/>
       </w:pPr>
-      <w:bookmarkStart w:id="7" w:name="_Toc238477763"/>
+      <w:bookmarkStart w:id="7" w:name="_Toc238479050"/>
       <w:r>
         <w:t>1.2.1 Le groupe Sopra Steria</w:t>
       </w:r>
@@ -6112,7 +6176,7 @@
       <w:pPr>
         <w:pStyle w:val="Titre3"/>
       </w:pPr>
-      <w:bookmarkStart w:id="8" w:name="_Toc238477764"/>
+      <w:bookmarkStart w:id="8" w:name="_Toc238479051"/>
       <w:r>
         <w:t>1.2.2 Sopra HR Software</w:t>
       </w:r>
@@ -6132,7 +6196,7 @@
       <w:pPr>
         <w:pStyle w:val="Titre2"/>
       </w:pPr>
-      <w:bookmarkStart w:id="9" w:name="_Toc238477765"/>
+      <w:bookmarkStart w:id="9" w:name="_Toc238479052"/>
       <w:r>
         <w:t>1.3 Étude de l'existant</w:t>
       </w:r>
@@ -6220,7 +6284,7 @@
       <w:pPr>
         <w:pStyle w:val="Titre2"/>
       </w:pPr>
-      <w:bookmarkStart w:id="10" w:name="_Toc238477766"/>
+      <w:bookmarkStart w:id="10" w:name="_Toc238479053"/>
       <w:r>
         <w:t>1.4 Critique de l'existant et problématique</w:t>
       </w:r>
@@ -6240,7 +6304,7 @@
       <w:pPr>
         <w:pStyle w:val="Titre2"/>
       </w:pPr>
-      <w:bookmarkStart w:id="11" w:name="_Toc238477767"/>
+      <w:bookmarkStart w:id="11" w:name="_Toc238479054"/>
       <w:r>
         <w:t>1.5 Objectifs du projet</w:t>
       </w:r>
@@ -6327,7 +6391,7 @@
       <w:pPr>
         <w:pStyle w:val="Titre2"/>
       </w:pPr>
-      <w:bookmarkStart w:id="12" w:name="_Toc238477768"/>
+      <w:bookmarkStart w:id="12" w:name="_Toc238479055"/>
       <w:r>
         <w:t>1.6 Présentation de la solution proposée : JOB4YOU</w:t>
       </w:r>
@@ -6396,7 +6460,7 @@
       <w:pPr>
         <w:pStyle w:val="Titre2"/>
       </w:pPr>
-      <w:bookmarkStart w:id="13" w:name="_Toc238477769"/>
+      <w:bookmarkStart w:id="13" w:name="_Toc238479056"/>
       <w:r>
         <w:t>1.7 Méthodologie de travail adoptée</w:t>
       </w:r>
@@ -6416,7 +6480,7 @@
       <w:pPr>
         <w:pStyle w:val="Titre2"/>
       </w:pPr>
-      <w:bookmarkStart w:id="14" w:name="_Toc238477770"/>
+      <w:bookmarkStart w:id="14" w:name="_Toc238479057"/>
       <w:r>
         <w:t>1.8 Planification du projet</w:t>
       </w:r>
@@ -6824,7 +6888,7 @@
       <w:pPr>
         <w:pStyle w:val="Titre2"/>
       </w:pPr>
-      <w:bookmarkStart w:id="15" w:name="_Toc238477771"/>
+      <w:bookmarkStart w:id="15" w:name="_Toc238479058"/>
       <w:r>
         <w:t>1.9 Conclusion</w:t>
       </w:r>
@@ -6847,7 +6911,7 @@
       <w:pPr>
         <w:pStyle w:val="Titre1"/>
       </w:pPr>
-      <w:bookmarkStart w:id="16" w:name="_Toc238477772"/>
+      <w:bookmarkStart w:id="16" w:name="_Toc238479059"/>
       <w:r>
         <w:t>Chapitre 2 : Analyse et Spécification des Besoins</w:t>
       </w:r>
@@ -6862,7 +6926,7 @@
       <w:pPr>
         <w:pStyle w:val="Titre2"/>
       </w:pPr>
-      <w:bookmarkStart w:id="17" w:name="_Toc238477773"/>
+      <w:bookmarkStart w:id="17" w:name="_Toc238479060"/>
       <w:r>
         <w:t>2.1 Introduction</w:t>
       </w:r>
@@ -6877,7 +6941,7 @@
       <w:pPr>
         <w:pStyle w:val="Titre2"/>
       </w:pPr>
-      <w:bookmarkStart w:id="18" w:name="_Toc238477774"/>
+      <w:bookmarkStart w:id="18" w:name="_Toc238479061"/>
       <w:r>
         <w:t>2.2 Étude fonctionnelle</w:t>
       </w:r>
@@ -6887,7 +6951,7 @@
       <w:pPr>
         <w:pStyle w:val="Titre3"/>
       </w:pPr>
-      <w:bookmarkStart w:id="19" w:name="_Toc238477775"/>
+      <w:bookmarkStart w:id="19" w:name="_Toc238479062"/>
       <w:r>
         <w:t>2.2.1 Identification des acteurs du système</w:t>
       </w:r>
@@ -7849,7 +7913,7 @@
       <w:pPr>
         <w:pStyle w:val="Titre3"/>
       </w:pPr>
-      <w:bookmarkStart w:id="20" w:name="_Toc238477776"/>
+      <w:bookmarkStart w:id="20" w:name="_Toc238479063"/>
       <w:r>
         <w:t>2.2.2 Identification des besoins fonctionnels</w:t>
       </w:r>
@@ -7997,7 +8061,7 @@
       <w:pPr>
         <w:pStyle w:val="Titre3"/>
       </w:pPr>
-      <w:bookmarkStart w:id="21" w:name="_Toc238477777"/>
+      <w:bookmarkStart w:id="21" w:name="_Toc238479064"/>
       <w:r>
         <w:t>2.2.3 Identification des besoins non fonctionnels</w:t>
       </w:r>
@@ -8084,7 +8148,7 @@
       <w:pPr>
         <w:pStyle w:val="Titre3"/>
       </w:pPr>
-      <w:bookmarkStart w:id="22" w:name="_Toc238477778"/>
+      <w:bookmarkStart w:id="22" w:name="_Toc238479065"/>
       <w:r>
         <w:t>2.2.4 Diagramme de cas d'utilisation</w:t>
       </w:r>
@@ -8134,7 +8198,7 @@
       <w:pPr>
         <w:pStyle w:val="Titre3"/>
       </w:pPr>
-      <w:bookmarkStart w:id="23" w:name="_Toc238477779"/>
+      <w:bookmarkStart w:id="23" w:name="_Toc238479066"/>
       <w:r>
         <w:t>2.2.5 Description textuelle de quelques cas d'utilisation</w:t>
       </w:r>
@@ -8522,7 +8586,7 @@
       <w:pPr>
         <w:pStyle w:val="Titre3"/>
       </w:pPr>
-      <w:bookmarkStart w:id="24" w:name="_Toc238477780"/>
+      <w:bookmarkStart w:id="24" w:name="_Toc238479067"/>
       <w:r>
         <w:t>2.2.6 Diagramme de séquence système</w:t>
       </w:r>
@@ -8569,7 +8633,7 @@
       <w:pPr>
         <w:pStyle w:val="Titre2"/>
       </w:pPr>
-      <w:bookmarkStart w:id="25" w:name="_Toc238477781"/>
+      <w:bookmarkStart w:id="25" w:name="_Toc238479068"/>
       <w:r>
         <w:t>2.3 Étude technique</w:t>
       </w:r>
@@ -8579,7 +8643,7 @@
       <w:pPr>
         <w:pStyle w:val="Titre3"/>
       </w:pPr>
-      <w:bookmarkStart w:id="26" w:name="_Toc238477782"/>
+      <w:bookmarkStart w:id="26" w:name="_Toc238479069"/>
       <w:r>
         <w:t>2.3.1 Architecture physique</w:t>
       </w:r>
@@ -8633,7 +8697,7 @@
       <w:pPr>
         <w:pStyle w:val="Titre3"/>
       </w:pPr>
-      <w:bookmarkStart w:id="27" w:name="_Toc238477783"/>
+      <w:bookmarkStart w:id="27" w:name="_Toc238479070"/>
       <w:r>
         <w:t>2.3.2 Côté client — Angular</w:t>
       </w:r>
@@ -8648,7 +8712,7 @@
       <w:pPr>
         <w:pStyle w:val="Titre3"/>
       </w:pPr>
-      <w:bookmarkStart w:id="28" w:name="_Toc238477784"/>
+      <w:bookmarkStart w:id="28" w:name="_Toc238479071"/>
       <w:r>
         <w:t>2.3.3 Côté serveur — Spring Boot</w:t>
       </w:r>
@@ -8663,7 +8727,7 @@
       <w:pPr>
         <w:pStyle w:val="Titre3"/>
       </w:pPr>
-      <w:bookmarkStart w:id="29" w:name="_Toc238477785"/>
+      <w:bookmarkStart w:id="29" w:name="_Toc238479072"/>
       <w:r>
         <w:t>2.3.4 La sécurité — Spring Security et JWT</w:t>
       </w:r>
@@ -8678,7 +8742,7 @@
       <w:pPr>
         <w:pStyle w:val="Titre2"/>
       </w:pPr>
-      <w:bookmarkStart w:id="30" w:name="_Toc238477786"/>
+      <w:bookmarkStart w:id="30" w:name="_Toc238479073"/>
       <w:r>
         <w:t>2.4 Conclusion</w:t>
       </w:r>
@@ -8701,7 +8765,7 @@
       <w:pPr>
         <w:pStyle w:val="Titre1"/>
       </w:pPr>
-      <w:bookmarkStart w:id="31" w:name="_Toc238477787"/>
+      <w:bookmarkStart w:id="31" w:name="_Toc238479074"/>
       <w:r>
         <w:t>Chapitre 3 : Conception</w:t>
       </w:r>
@@ -8716,7 +8780,7 @@
       <w:pPr>
         <w:pStyle w:val="Titre2"/>
       </w:pPr>
-      <w:bookmarkStart w:id="32" w:name="_Toc238477788"/>
+      <w:bookmarkStart w:id="32" w:name="_Toc238479075"/>
       <w:r>
         <w:t>3.1 Introduction</w:t>
       </w:r>
@@ -8731,7 +8795,7 @@
       <w:pPr>
         <w:pStyle w:val="Titre2"/>
       </w:pPr>
-      <w:bookmarkStart w:id="33" w:name="_Toc238477789"/>
+      <w:bookmarkStart w:id="33" w:name="_Toc238479076"/>
       <w:r>
         <w:t>3.2 Diagramme des paquetages</w:t>
       </w:r>
@@ -8783,7 +8847,7 @@
       <w:pPr>
         <w:pStyle w:val="Titre2"/>
       </w:pPr>
-      <w:bookmarkStart w:id="34" w:name="_Toc238477790"/>
+      <w:bookmarkStart w:id="34" w:name="_Toc238479077"/>
       <w:r>
         <w:t>3.3 Diagramme de classes global</w:t>
       </w:r>
@@ -8864,7 +8928,7 @@
       <w:pPr>
         <w:pStyle w:val="Titre2"/>
       </w:pPr>
-      <w:bookmarkStart w:id="35" w:name="_Toc238477791"/>
+      <w:bookmarkStart w:id="35" w:name="_Toc238479078"/>
       <w:r>
         <w:t>3.4 Diagrammes de séquence objet</w:t>
       </w:r>
@@ -8879,7 +8943,7 @@
       <w:pPr>
         <w:pStyle w:val="Titre3"/>
       </w:pPr>
-      <w:bookmarkStart w:id="36" w:name="_Toc238477792"/>
+      <w:bookmarkStart w:id="36" w:name="_Toc238479079"/>
       <w:r>
         <w:t>3.4.1 Planifier un entretien</w:t>
       </w:r>
@@ -8926,7 +8990,7 @@
       <w:pPr>
         <w:pStyle w:val="Titre3"/>
       </w:pPr>
-      <w:bookmarkStart w:id="37" w:name="_Toc238477793"/>
+      <w:bookmarkStart w:id="37" w:name="_Toc238479080"/>
       <w:r>
         <w:lastRenderedPageBreak/>
         <w:t>3.4.2 Décision finale de recrutement</w:t>
@@ -8974,7 +9038,7 @@
       <w:pPr>
         <w:pStyle w:val="Titre3"/>
       </w:pPr>
-      <w:bookmarkStart w:id="38" w:name="_Toc238477794"/>
+      <w:bookmarkStart w:id="38" w:name="_Toc238479081"/>
       <w:r>
         <w:t>3.4.3 Analyse IA du CV (extraction, scoring via n8n et Cohere)</w:t>
       </w:r>
@@ -9043,7 +9107,7 @@
       <w:pPr>
         <w:pStyle w:val="Titre3"/>
       </w:pPr>
-      <w:bookmarkStart w:id="39" w:name="_Toc238477795"/>
+      <w:bookmarkStart w:id="39" w:name="_Toc238479082"/>
       <w:r>
         <w:t>3.4.4 Passage en évaluation technique — routage et notification des managers</w:t>
       </w:r>
@@ -9112,7 +9176,7 @@
       <w:pPr>
         <w:pStyle w:val="Titre2"/>
       </w:pPr>
-      <w:bookmarkStart w:id="40" w:name="_Toc238477796"/>
+      <w:bookmarkStart w:id="40" w:name="_Toc238479083"/>
       <w:r>
         <w:lastRenderedPageBreak/>
         <w:t>3.5 Diagramme d'états — Cycle de vie d'une candidature</w:t>
@@ -9176,7 +9240,7 @@
       <w:pPr>
         <w:pStyle w:val="Titre2"/>
       </w:pPr>
-      <w:bookmarkStart w:id="41" w:name="_Toc238477797"/>
+      <w:bookmarkStart w:id="41" w:name="_Toc238479084"/>
       <w:r>
         <w:t>3.6 Conception de la base de données</w:t>
       </w:r>
@@ -9251,7 +9315,7 @@
       <w:pPr>
         <w:pStyle w:val="Titre2"/>
       </w:pPr>
-      <w:bookmarkStart w:id="42" w:name="_Toc238477798"/>
+      <w:bookmarkStart w:id="42" w:name="_Toc238479085"/>
       <w:r>
         <w:lastRenderedPageBreak/>
         <w:t>3.7 Diagramme de déploiement</w:t>
@@ -9307,7 +9371,7 @@
       <w:pPr>
         <w:pStyle w:val="Titre2"/>
       </w:pPr>
-      <w:bookmarkStart w:id="43" w:name="_Toc238477799"/>
+      <w:bookmarkStart w:id="43" w:name="_Toc238479086"/>
       <w:r>
         <w:t>3.8 Diagramme de composants</w:t>
       </w:r>
@@ -9360,7 +9424,7 @@
       <w:pPr>
         <w:pStyle w:val="Titre2"/>
       </w:pPr>
-      <w:bookmarkStart w:id="44" w:name="_Toc238477800"/>
+      <w:bookmarkStart w:id="44" w:name="_Toc238479087"/>
       <w:r>
         <w:t>3.9 Diagramme d'activité — Vue d'ensemble du processus de recrutement</w:t>
       </w:r>
@@ -9435,7 +9499,7 @@
       <w:pPr>
         <w:pStyle w:val="Titre2"/>
       </w:pPr>
-      <w:bookmarkStart w:id="45" w:name="_Toc238477801"/>
+      <w:bookmarkStart w:id="45" w:name="_Toc238479088"/>
       <w:r>
         <w:t>3.10 Conclusion</w:t>
       </w:r>
@@ -9462,7 +9526,7 @@
       <w:pPr>
         <w:pStyle w:val="Titre1"/>
       </w:pPr>
-      <w:bookmarkStart w:id="46" w:name="_Toc238477802"/>
+      <w:bookmarkStart w:id="46" w:name="_Toc238479089"/>
       <w:r>
         <w:t>Chapitre 4 : Réalisation</w:t>
       </w:r>
@@ -9477,7 +9541,7 @@
       <w:pPr>
         <w:pStyle w:val="Titre2"/>
       </w:pPr>
-      <w:bookmarkStart w:id="47" w:name="_Toc238477803"/>
+      <w:bookmarkStart w:id="47" w:name="_Toc238479090"/>
       <w:r>
         <w:t>4.1 Introduction</w:t>
       </w:r>
@@ -9492,7 +9556,7 @@
       <w:pPr>
         <w:pStyle w:val="Titre2"/>
       </w:pPr>
-      <w:bookmarkStart w:id="48" w:name="_Toc238477804"/>
+      <w:bookmarkStart w:id="48" w:name="_Toc238479091"/>
       <w:r>
         <w:t>4.2 Environnement de travail</w:t>
       </w:r>
@@ -9502,7 +9566,7 @@
       <w:pPr>
         <w:pStyle w:val="Titre3"/>
       </w:pPr>
-      <w:bookmarkStart w:id="49" w:name="_Toc238477805"/>
+      <w:bookmarkStart w:id="49" w:name="_Toc238479092"/>
       <w:r>
         <w:t>4.2.1 Environnement matériel</w:t>
       </w:r>
@@ -9517,7 +9581,7 @@
       <w:pPr>
         <w:pStyle w:val="Titre3"/>
       </w:pPr>
-      <w:bookmarkStart w:id="50" w:name="_Toc238477806"/>
+      <w:bookmarkStart w:id="50" w:name="_Toc238479093"/>
       <w:r>
         <w:t>4.2.2 Environnement logiciel</w:t>
       </w:r>
@@ -9641,7 +9705,7 @@
       <w:pPr>
         <w:pStyle w:val="Titre3"/>
       </w:pPr>
-      <w:bookmarkStart w:id="51" w:name="_Toc238477807"/>
+      <w:bookmarkStart w:id="51" w:name="_Toc238479094"/>
       <w:r>
         <w:t>4.2.3 Autres</w:t>
       </w:r>
@@ -9656,7 +9720,7 @@
       <w:pPr>
         <w:pStyle w:val="Titre3"/>
       </w:pPr>
-      <w:bookmarkStart w:id="52" w:name="_Toc238477808"/>
+      <w:bookmarkStart w:id="52" w:name="_Toc238479095"/>
       <w:r>
         <w:t>4.2.4 Sécurité applicative</w:t>
       </w:r>
@@ -9671,7 +9735,7 @@
       <w:pPr>
         <w:pStyle w:val="Titre2"/>
       </w:pPr>
-      <w:bookmarkStart w:id="53" w:name="_Toc238477809"/>
+      <w:bookmarkStart w:id="53" w:name="_Toc238479096"/>
       <w:r>
         <w:t>4.3 Interfaces graphiques de l'application</w:t>
       </w:r>
@@ -10117,9 +10181,243 @@
     </w:p>
     <w:p>
       <w:pPr>
+        <w:jc w:val="center"/>
+      </w:pPr>
+      <w:r>
+        <w:rPr>
+          <w:noProof/>
+        </w:rPr>
+        <w:drawing>
+          <wp:inline distT="0" distB="0" distL="0" distR="0" wp14:anchorId="6F5C8862" wp14:editId="4BE90E10">
+            <wp:extent cx="5400000" cy="2430428"/>
+            <wp:effectExtent l="0" t="0" r="0" b="0"/>
+            <wp:docPr id="4" name="Picture 4"/>
+            <wp:cNvGraphicFramePr>
+              <a:graphicFrameLocks xmlns:a="http://schemas.openxmlformats.org/drawingml/2006/main" noChangeAspect="1"/>
+            </wp:cNvGraphicFramePr>
+            <a:graphic xmlns:a="http://schemas.openxmlformats.org/drawingml/2006/main">
+              <a:graphicData uri="http://schemas.openxmlformats.org/drawingml/2006/picture">
+                <pic:pic xmlns:pic="http://schemas.openxmlformats.org/drawingml/2006/picture">
+                  <pic:nvPicPr>
+                    <pic:cNvPr id="0" name="apply_form4.png"/>
+                    <pic:cNvPicPr/>
+                  </pic:nvPicPr>
+                  <pic:blipFill>
+                    <a:blip r:embed="rId41"/>
+                    <a:stretch>
+                      <a:fillRect/>
+                    </a:stretch>
+                  </pic:blipFill>
+                  <pic:spPr>
+                    <a:xfrm>
+                      <a:off x="0" y="0"/>
+                      <a:ext cx="5400000" cy="2430428"/>
+                    </a:xfrm>
+                    <a:prstGeom prst="rect">
+                      <a:avLst/>
+                    </a:prstGeom>
+                  </pic:spPr>
+                </pic:pic>
+              </a:graphicData>
+            </a:graphic>
+          </wp:inline>
+        </w:drawing>
+      </w:r>
+    </w:p>
+    <w:p/>
+    <w:p>
+      <w:r>
+        <w:t>Figure 4.13 : Soumission d'une candidature avec dépôt de CV</w:t>
+      </w:r>
+    </w:p>
+    <w:p/>
+    <w:p>
+      <w:r>
+        <w:t>Un candidat connecté postule directement depuis une offre : le formulaire pré-remplit son e-mail de compte, valide le format et la taille du CV (PDF, DOC, DOCX, 5 Mo maximum) et confirme visuellement la sélection avant l'envoi. C'est ce dépôt qui déclenche la chaîne décrite en section 3.4.3 (extraction du texte, analyse Cohere via n8n, score automatique).</w:t>
+      </w:r>
+    </w:p>
+    <w:p/>
+    <w:p>
+      <w:pPr>
+        <w:jc w:val="center"/>
+      </w:pPr>
+      <w:r>
+        <w:rPr>
+          <w:noProof/>
+        </w:rPr>
+        <w:lastRenderedPageBreak/>
+        <w:drawing>
+          <wp:inline distT="0" distB="0" distL="0" distR="0" wp14:anchorId="46CD5C65" wp14:editId="4F5E6DB3">
+            <wp:extent cx="5400000" cy="2430428"/>
+            <wp:effectExtent l="0" t="0" r="0" b="0"/>
+            <wp:docPr id="5" name="Picture 5"/>
+            <wp:cNvGraphicFramePr>
+              <a:graphicFrameLocks xmlns:a="http://schemas.openxmlformats.org/drawingml/2006/main" noChangeAspect="1"/>
+            </wp:cNvGraphicFramePr>
+            <a:graphic xmlns:a="http://schemas.openxmlformats.org/drawingml/2006/main">
+              <a:graphicData uri="http://schemas.openxmlformats.org/drawingml/2006/picture">
+                <pic:pic xmlns:pic="http://schemas.openxmlformats.org/drawingml/2006/picture">
+                  <pic:nvPicPr>
+                    <pic:cNvPr id="0" name="job_ideal_final.png"/>
+                    <pic:cNvPicPr/>
+                  </pic:nvPicPr>
+                  <pic:blipFill>
+                    <a:blip r:embed="rId42"/>
+                    <a:stretch>
+                      <a:fillRect/>
+                    </a:stretch>
+                  </pic:blipFill>
+                  <pic:spPr>
+                    <a:xfrm>
+                      <a:off x="0" y="0"/>
+                      <a:ext cx="5400000" cy="2430428"/>
+                    </a:xfrm>
+                    <a:prstGeom prst="rect">
+                      <a:avLst/>
+                    </a:prstGeom>
+                  </pic:spPr>
+                </pic:pic>
+              </a:graphicData>
+            </a:graphic>
+          </wp:inline>
+        </w:drawing>
+      </w:r>
+    </w:p>
+    <w:p/>
+    <w:p>
+      <w:r>
+        <w:t>Figure 4.14 : Fonctionnalité « Job idéal » — suggestions d'offres selon le CV</w:t>
+      </w:r>
+    </w:p>
+    <w:p/>
+    <w:p>
+      <w:r>
+        <w:t>Sans postuler à une offre précise, un visiteur ou un candidat dépose son CV et reçoit une liste des offres actives classées par pourcentage de compatibilité, calculé par l'API Cohere (badge « Analyse IA (Cohere) », avec repli automatique sur un classement par mots-clés si l'IA est indisponible).</w:t>
+      </w:r>
+    </w:p>
+    <w:p/>
+    <w:p>
+      <w:pPr>
+        <w:jc w:val="center"/>
+      </w:pPr>
+      <w:r>
+        <w:rPr>
+          <w:noProof/>
+        </w:rPr>
+        <w:drawing>
+          <wp:inline distT="0" distB="0" distL="0" distR="0" wp14:anchorId="74A35227" wp14:editId="3893921D">
+            <wp:extent cx="5400000" cy="2430428"/>
+            <wp:effectExtent l="0" t="0" r="0" b="0"/>
+            <wp:docPr id="6" name="Picture 6"/>
+            <wp:cNvGraphicFramePr>
+              <a:graphicFrameLocks xmlns:a="http://schemas.openxmlformats.org/drawingml/2006/main" noChangeAspect="1"/>
+            </wp:cNvGraphicFramePr>
+            <a:graphic xmlns:a="http://schemas.openxmlformats.org/drawingml/2006/main">
+              <a:graphicData uri="http://schemas.openxmlformats.org/drawingml/2006/picture">
+                <pic:pic xmlns:pic="http://schemas.openxmlformats.org/drawingml/2006/picture">
+                  <pic:nvPicPr>
+                    <pic:cNvPr id="0" name="camille_detail.png"/>
+                    <pic:cNvPicPr/>
+                  </pic:nvPicPr>
+                  <pic:blipFill>
+                    <a:blip r:embed="rId43"/>
+                    <a:stretch>
+                      <a:fillRect/>
+                    </a:stretch>
+                  </pic:blipFill>
+                  <pic:spPr>
+                    <a:xfrm>
+                      <a:off x="0" y="0"/>
+                      <a:ext cx="5400000" cy="2430428"/>
+                    </a:xfrm>
+                    <a:prstGeom prst="rect">
+                      <a:avLst/>
+                    </a:prstGeom>
+                  </pic:spPr>
+                </pic:pic>
+              </a:graphicData>
+            </a:graphic>
+          </wp:inline>
+        </w:drawing>
+      </w:r>
+    </w:p>
+    <w:p/>
+    <w:p>
+      <w:r>
+        <w:t>Figure 4.15 : Analyse détaillée d'une candidature par intelligence artificielle</w:t>
+      </w:r>
+    </w:p>
+    <w:p/>
+    <w:p>
+      <w:r>
+        <w:t>Au-delà du score global visible en liste (Figure 4.4), le détail d'un dossier expose la répartition par critère — technique, communication, adéquation séniorité — ainsi que, le cas échéant, la correction manuelle appliquée par un RH avec sa justification, conformément au principe de contrôle humain décrit en section 4.6.</w:t>
+      </w:r>
+    </w:p>
+    <w:p/>
+    <w:p>
+      <w:pPr>
+        <w:jc w:val="center"/>
+      </w:pPr>
+      <w:r>
+        <w:rPr>
+          <w:noProof/>
+        </w:rPr>
+        <w:lastRenderedPageBreak/>
+        <w:drawing>
+          <wp:inline distT="0" distB="0" distL="0" distR="0" wp14:anchorId="10592466" wp14:editId="46D629EE">
+            <wp:extent cx="5400000" cy="2430428"/>
+            <wp:effectExtent l="0" t="0" r="0" b="0"/>
+            <wp:docPr id="7" name="Picture 7"/>
+            <wp:cNvGraphicFramePr>
+              <a:graphicFrameLocks xmlns:a="http://schemas.openxmlformats.org/drawingml/2006/main" noChangeAspect="1"/>
+            </wp:cNvGraphicFramePr>
+            <a:graphic xmlns:a="http://schemas.openxmlformats.org/drawingml/2006/main">
+              <a:graphicData uri="http://schemas.openxmlformats.org/drawingml/2006/picture">
+                <pic:pic xmlns:pic="http://schemas.openxmlformats.org/drawingml/2006/picture">
+                  <pic:nvPicPr>
+                    <pic:cNvPr id="0" name="manager_candidates.png"/>
+                    <pic:cNvPicPr/>
+                  </pic:nvPicPr>
+                  <pic:blipFill>
+                    <a:blip r:embed="rId44"/>
+                    <a:stretch>
+                      <a:fillRect/>
+                    </a:stretch>
+                  </pic:blipFill>
+                  <pic:spPr>
+                    <a:xfrm>
+                      <a:off x="0" y="0"/>
+                      <a:ext cx="5400000" cy="2430428"/>
+                    </a:xfrm>
+                    <a:prstGeom prst="rect">
+                      <a:avLst/>
+                    </a:prstGeom>
+                  </pic:spPr>
+                </pic:pic>
+              </a:graphicData>
+            </a:graphic>
+          </wp:inline>
+        </w:drawing>
+      </w:r>
+    </w:p>
+    <w:p/>
+    <w:p>
+      <w:r>
+        <w:t>Figure 4.16 : Espace Manager — dossiers validés par le RH</w:t>
+      </w:r>
+    </w:p>
+    <w:p/>
+    <w:p>
+      <w:r>
+        <w:t>Un manager ne voit que les candidatures relevant de son périmètre (département, ou à défaut famille de métier — voir ManagerRoutingService, section 3.4.4), déjà validées par le RH. Cette vue cloisonnée est distincte de la liste globale accessible au RH et à l'administrateur (Figure 4.4).</w:t>
+      </w:r>
+    </w:p>
+    <w:p/>
+    <w:p>
+      <w:pPr>
         <w:pStyle w:val="Titre2"/>
       </w:pPr>
-      <w:bookmarkStart w:id="54" w:name="_Toc238477810"/>
+      <w:bookmarkStart w:id="54" w:name="_Toc238479097"/>
       <w:r>
         <w:t>4.4 Tests</w:t>
       </w:r>
@@ -10129,7 +10427,7 @@
       <w:pPr>
         <w:pStyle w:val="Titre3"/>
       </w:pPr>
-      <w:bookmarkStart w:id="55" w:name="_Toc238477811"/>
+      <w:bookmarkStart w:id="55" w:name="_Toc238479098"/>
       <w:r>
         <w:t>4.4.1 Tests unitaires (JUnit 5 / Mockito)</w:t>
       </w:r>
@@ -10212,6 +10510,7 @@
                 <w:rFonts w:ascii="Consolas" w:hAnsi="Consolas"/>
                 <w:sz w:val="18"/>
               </w:rPr>
+              <w:lastRenderedPageBreak/>
               <w:t>void shouldScopeGetCandidatesByStatusToCurrentManager() {</w:t>
             </w:r>
           </w:p>
@@ -10242,7 +10541,6 @@
                 <w:rFonts w:ascii="Consolas" w:hAnsi="Consolas"/>
                 <w:sz w:val="18"/>
               </w:rPr>
-              <w:lastRenderedPageBreak/>
               <w:t xml:space="preserve">    Candidate outOfScope = candidateWithOffer(61L, "manager.devops@company.com", devops);</w:t>
             </w:r>
           </w:p>
@@ -10359,7 +10657,7 @@
       <w:pPr>
         <w:pStyle w:val="Titre3"/>
       </w:pPr>
-      <w:bookmarkStart w:id="56" w:name="_Toc238477812"/>
+      <w:bookmarkStart w:id="56" w:name="_Toc238479099"/>
       <w:r>
         <w:t>4.4.2 Tests fonctionnels manuels</w:t>
       </w:r>
@@ -10939,7 +11237,14 @@
               <w:rPr>
                 <w:sz w:val="21"/>
               </w:rPr>
-              <w:t>Planification d'un entretien sur un dossier clos (rejeté/retiré)</w:t>
+              <w:t xml:space="preserve">Planification d'un entretien sur un </w:t>
+            </w:r>
+            <w:r>
+              <w:rPr>
+                <w:sz w:val="21"/>
+              </w:rPr>
+              <w:lastRenderedPageBreak/>
+              <w:t>dossier clos (rejeté/retiré)</w:t>
             </w:r>
           </w:p>
         </w:tc>
@@ -10957,6 +11262,7 @@
               <w:rPr>
                 <w:sz w:val="21"/>
               </w:rPr>
+              <w:lastRenderedPageBreak/>
               <w:t>Erreur 400, planification bloquée</w:t>
             </w:r>
           </w:p>
@@ -10995,14 +11301,7 @@
               <w:rPr>
                 <w:sz w:val="21"/>
               </w:rPr>
-              <w:t xml:space="preserve">Notification par e-mail au </w:t>
-            </w:r>
-            <w:r>
-              <w:rPr>
-                <w:sz w:val="21"/>
-              </w:rPr>
-              <w:lastRenderedPageBreak/>
-              <w:t>candidat après décision finale</w:t>
+              <w:t>Notification par e-mail au candidat après décision finale</w:t>
             </w:r>
           </w:p>
         </w:tc>
@@ -11020,15 +11319,7 @@
               <w:rPr>
                 <w:sz w:val="21"/>
               </w:rPr>
-              <w:lastRenderedPageBreak/>
-              <w:t xml:space="preserve">E-mail reçu, contenu cohérent </w:t>
-            </w:r>
-            <w:r>
-              <w:rPr>
-                <w:sz w:val="21"/>
-              </w:rPr>
-              <w:lastRenderedPageBreak/>
-              <w:t>avec le statut</w:t>
+              <w:t>E-mail reçu, contenu cohérent avec le statut</w:t>
             </w:r>
           </w:p>
         </w:tc>
@@ -11046,7 +11337,6 @@
               <w:rPr>
                 <w:sz w:val="21"/>
               </w:rPr>
-              <w:lastRenderedPageBreak/>
               <w:t>OK</w:t>
             </w:r>
           </w:p>
@@ -11528,7 +11818,7 @@
       <w:pPr>
         <w:pStyle w:val="Titre3"/>
       </w:pPr>
-      <w:bookmarkStart w:id="57" w:name="_Toc238477813"/>
+      <w:bookmarkStart w:id="57" w:name="_Toc238479100"/>
       <w:r>
         <w:t>4.4.3 Tests des API avec Postman et Swagger</w:t>
       </w:r>
@@ -11543,282 +11833,280 @@
       <w:pPr>
         <w:pStyle w:val="Titre3"/>
       </w:pPr>
-      <w:bookmarkStart w:id="58" w:name="_Toc238477814"/>
-      <w:r>
+      <w:bookmarkStart w:id="58" w:name="_Toc238479101"/>
+      <w:r>
+        <w:lastRenderedPageBreak/>
         <w:t>4.4.4 Vérification de bout en bout</w:t>
       </w:r>
       <w:bookmarkEnd w:id="58"/>
     </w:p>
     <w:p>
       <w:r>
-        <w:t xml:space="preserve">Au-delà des tests unitaires par fonctionnalité, j'ai mené une vérification de bout en bout du parcours complet de recrutement : soumission d'une candidature, analyse automatique par l'IA, validation par le RH, planification d'un entretien, saisie d'un feedback, puis décision finale du manager — chaque </w:t>
+        <w:t>Au-delà des tests unitaires par fonctionnalité, j'ai mené une vérification de bout en bout du parcours complet de recrutement : soumission d'une candidature, analyse automatique par l'IA, validation par le RH, planification d'un entretien, saisie d'un feedback, puis décision finale du manager — chaque étape déclenchant la notification par e-mail attendue, au candidat et/ou aux parties prenantes internes.</w:t>
+      </w:r>
+    </w:p>
+    <w:p>
+      <w:pPr>
+        <w:pStyle w:val="Titre2"/>
+      </w:pPr>
+      <w:bookmarkStart w:id="59" w:name="_Toc238479102"/>
+      <w:r>
+        <w:t>4.5 Difficultés rencontrées et solutions apportées</w:t>
+      </w:r>
+      <w:bookmarkEnd w:id="59"/>
+    </w:p>
+    <w:p>
+      <w:r>
+        <w:t>Au-delà des fonctionnalités livrées, le développement de JOB4YOU a été jalonné de plusieurs difficultés concrètes. Je détaille ici les principales, représentatives des problèmes rencontrés sur ce projet.</w:t>
+      </w:r>
+    </w:p>
+    <w:p>
+      <w:pPr>
+        <w:pStyle w:val="Titre3"/>
+      </w:pPr>
+      <w:bookmarkStart w:id="60" w:name="_Toc238479103"/>
+      <w:r>
+        <w:t>4.5.1 Notification incomplète des managers</w:t>
+      </w:r>
+      <w:bookmarkEnd w:id="60"/>
+    </w:p>
+    <w:p>
+      <w:r>
+        <w:t>Un premier bug, découvert tardivement, concernait le routage automatique RH → manager. Lorsqu'une offre d'emploi était rattachée à une famille de métier suivie par plusieurs managers, seul le premier manager trouvé en base recevait la notification de validation RH : les autres n'étaient jamais informés, sans qu'aucune erreur ne soit levée. Le problème venait d'une méthode qui retournait un unique e-mail (le premier résultat de la requête) au lieu de la liste complète des managers concernés. La correction a consisté à faire retourner l'ensemble des adresses correspondantes et à notifier chaque manager individuellement, tout en veillant à ne pas dupliquer l'e-mail envoyé au candidat, qui doit rester unique quel que soit le nombre de managers notifiés.</w:t>
+      </w:r>
+      <w:r>
+        <w:t xml:space="preserve"> Ce routage a par la suite été affiné pour s'appuyer prioritairement sur le département de l'offre (CS, DevOps, ProdOps, R&amp;D, QA), la famille de métier n'intervenant plus qu'en repli pour les offres non rattachées à un département : un manager ne reçoit et ne voit désormais que les dossiers relevant strictement de son département, sans fuite possible vers un autre périmètre.</w:t>
+      </w:r>
+    </w:p>
+    <w:p>
+      <w:pPr>
+        <w:pStyle w:val="Titre3"/>
+      </w:pPr>
+      <w:bookmarkStart w:id="61" w:name="_Toc238479104"/>
+      <w:r>
+        <w:t>4.5.2 Distinguer un rejet RH d'un rejet manager</w:t>
+      </w:r>
+      <w:bookmarkEnd w:id="61"/>
+    </w:p>
+    <w:p>
+      <w:r>
+        <w:t>Le modèle de données utilise un statut unique, MANAGER_REJECTED, que ce soit le RH ou le manager qui prenne la décision de refus — les deux s'appuient sur le même mécanisme de décision. Or le tableau de bord devait afficher séparément les rejets RH et les rejets manager, ces derniers ventilés par famille de métier. Plutôt que d'introduire un nouveau statut en base (ce qui aurait complexifié le modèle pour un besoin purement d'affichage), j'ai choisi de reconstruire cette information à partir du journal d'audit existant : chaque changement de statut y est déjà associé à l'utilisateur qui l'a effectué, il suffisait de croiser ce nom d'utilisateur avec son rôle réel pour déterminer si la décision provenait du RH ou d'un manager, et dans ce dernier cas, de quelle famille de métier.</w:t>
+      </w:r>
+    </w:p>
+    <w:p>
+      <w:pPr>
+        <w:pStyle w:val="Titre3"/>
+      </w:pPr>
+      <w:bookmarkStart w:id="62" w:name="_Toc238479105"/>
+      <w:r>
+        <w:t>4.5.3 Cohérence des transitions de statut</w:t>
+      </w:r>
+      <w:bookmarkEnd w:id="62"/>
+    </w:p>
+    <w:p>
+      <w:r>
+        <w:t xml:space="preserve">Le cycle de vie d'une candidature comporte de nombreux états, et plusieurs actions (planifier un entretien, prendre une décision finale) n'ont de sens que si le dossier se trouve dans un état précis. Sans garde-fou, il était possible par exemple de planifier un entretien sur un dossier déjà rejeté, ou de faire valider un candidat par un manager avant même que le RH n'ait examiné son dossier. J'ai donc ajouté, côté backend, des vérifications explicites avant chaque transition sensible, avec des messages d'erreur clairs renvoyés à l'interface plutôt que des échecs silencieux — un choix qui a </w:t>
       </w:r>
       <w:r>
         <w:lastRenderedPageBreak/>
-        <w:t>étape déclenchant la notification par e-mail attendue, au candidat et/ou aux parties prenantes internes.</w:t>
+        <w:t>nécessité de revenir plusieurs fois sur le diagramme d'états du chapitre 3 pour m'assurer que l'implémentation restait fidèle au modèle.</w:t>
+      </w:r>
+    </w:p>
+    <w:p>
+      <w:pPr>
+        <w:pStyle w:val="Titre3"/>
+      </w:pPr>
+      <w:bookmarkStart w:id="63" w:name="_Toc238479106"/>
+      <w:r>
+        <w:t>4.5.4 Filtrage incomplet des routes de lecture pour les managers</w:t>
+      </w:r>
+      <w:bookmarkEnd w:id="63"/>
+    </w:p>
+    <w:p>
+      <w:r>
+        <w:t>Le garde-fou décrit en 4.5.2 empêchait bien un manager d'agir en écriture (changer un statut) sur un candidat hors de son périmètre, mais je me suis rendu compte, en réexaminant systématiquement chaque route accessible au rôle Manager, que ce n'était pas le cas des routes de lecture : GET /api/candidates, GET /api/candidates/{id}, la recherche par nom et le classement par offre ne filtraient pas par périmètre. Un manager authentifié pouvait donc, en appelant directement l'API (pas via l'interface, qui n'expose pas ce chemin), lister ou consulter des candidats d'un autre département. J'ai corrigé ce point en centralisant la logique de périmètre déjà utilisée pour les écritures dans une méthode réutilisable, appliquée à présent à toutes les routes de lecture concernées, et j'ai ajouté deux tests unitaires dédiés (section 4.4.1) pour figer ce comportement.</w:t>
+      </w:r>
+    </w:p>
+    <w:p>
+      <w:pPr>
+        <w:pStyle w:val="Titre3"/>
+      </w:pPr>
+      <w:bookmarkStart w:id="64" w:name="_Toc238479107"/>
+      <w:r>
+        <w:t>4.5.5 Solliciter le manager au bon moment du processus</w:t>
+      </w:r>
+      <w:bookmarkEnd w:id="64"/>
+    </w:p>
+    <w:p>
+      <w:pPr>
+        <w:jc w:val="both"/>
+      </w:pPr>
+      <w:r>
+        <w:t>Dans une première version, le manager destinataire était notifié dès la validation du CV par le RH (statut CV_REVIEWED). À l'usage, cela le sollicitait trop tôt : de nombreux dossiers étaient encore écartés lors du pré-filtrage téléphonique mené par le RH. J'ai donc déplacé la notification du manager à l'entrée en Test technique, c'est-à-dire une fois l'entretien téléphonique franchi ; le candidat, lui, reste informé de la présélection de son CV dès l'étape CV_REVIEWED. En cohérence, la vue des dossiers validés du manager ne fait plus apparaître les candidats qu'à partir du Test technique, ce qui recentre son attention sur les profils réellement en lice.</w:t>
+      </w:r>
+    </w:p>
+    <w:p>
+      <w:pPr>
+        <w:pStyle w:val="Titre3"/>
+      </w:pPr>
+      <w:bookmarkStart w:id="65" w:name="_Toc238479108"/>
+      <w:r>
+        <w:t>4.5.6 Pertinence du matching Job idéal</w:t>
+      </w:r>
+      <w:bookmarkEnd w:id="65"/>
+    </w:p>
+    <w:p>
+      <w:pPr>
+        <w:jc w:val="both"/>
+      </w:pPr>
+      <w:r>
+        <w:t>La fonctionnalité de matching inverse, par laquelle un visiteur dépose son CV et le système lui suggère les offres les plus proches, retournait des résultats peu pertinents : un profil DevOps se voyait par exemple proposer des postes de développement backend. L'analyse a révélé deux causes : le score ne tenait compte que des compétences requises, en ignorant l'intitulé de l'offre, et le jeu de données comportait de nombreuses annonces en double qui saturaient le lot soumis à l'IA. J'ai corrigé les deux points en combinant, dans le score, l'intitulé de l'offre (pondéré à 60 %) et les compétences (40 %), et en dédupliquant les offres identiques avant l'appel à l'IA. Chaque profil (Java, DevOps, ProdOps, QA) ressort désormais sur les offres qui lui correspondent réellement.</w:t>
+      </w:r>
+    </w:p>
+    <w:p>
+      <w:pPr>
+        <w:pStyle w:val="Titre3"/>
+      </w:pPr>
+      <w:bookmarkStart w:id="66" w:name="_Toc238479109"/>
+      <w:r>
+        <w:t>4.5.7 Traitement distinct des candidatures retirées</w:t>
+      </w:r>
+      <w:bookmarkEnd w:id="66"/>
+    </w:p>
+    <w:p>
+      <w:pPr>
+        <w:jc w:val="both"/>
+      </w:pPr>
+      <w:r>
+        <w:t>Une candidature retirée (statut WITHDRAWN) était jusque-là confondue avec les candidatures rejetées dans les filtres de la liste, et cette liste ne se mettait à jour qu'après rechargement de la page. J'ai séparé le retrait du rejet en lui dédiant son propre filtre, à l'image du filtre des candidatures rejetées, dans la liste des candidatures comme sur le tableau de bord, et fait en sorte que tout changement de statut rafraîchisse immédiatement la liste : un candidat passé en candidature retirée quitte aussitôt la vue active et le compteur est décrémenté, sans rechargement. Conformément au choix retenu, ces candidatures ne sont pas supprimées automatiquement : elles restent consultables via leur filtre, comme les candidatures rejetées.</w:t>
+      </w:r>
+      <w:r>
+        <w:t xml:space="preserve"> </w:t>
+      </w:r>
+      <w:r>
+        <w:t>Un candidat peut aussi retirer lui-même sa candidature tant qu’elle n’est pas close, via un endpoint dédié qui ne passe pas par les actions réservées au RH ou au manager.</w:t>
+      </w:r>
+    </w:p>
+    <w:p>
+      <w:pPr>
+        <w:pStyle w:val="Titre3"/>
+      </w:pPr>
+      <w:bookmarkStart w:id="67" w:name="_Toc238479110"/>
+      <w:r>
+        <w:lastRenderedPageBreak/>
+        <w:t>4.5.8 Entretien téléphonique RH obligatoire avant acceptation</w:t>
+      </w:r>
+      <w:bookmarkEnd w:id="67"/>
+    </w:p>
+    <w:p>
+      <w:pPr>
+        <w:jc w:val="both"/>
+      </w:pPr>
+      <w:r>
+        <w:t>En testant le parcours RH de bout en bout, je me suis rendu compte qu'un candidat pouvait être accepté directement depuis CV_REVIEWED, sans qu'aucun entretien téléphonique n'ait eu lieu : la machine à états ne l'interdisait pas explicitement. Cela allait à l'encontre du processus voulu, où cet entretien constitue le premier vrai filtre humain avant de solliciter le manager. J'ai donc retiré la transition CV_REVIEWED vers ACCEPTED : depuis cette étape, seuls restent possibles le passage en entretien téléphonique, le refus ou le retrait. Un profil manifestement hors sujet peut toujours être écarté sans attendre cet entretien ; c'est uniquement l'acceptation qui exige désormais d'être passé par PHONE_SCREENING.</w:t>
+      </w:r>
+    </w:p>
+    <w:p>
+      <w:pPr>
+        <w:pStyle w:val="Titre3"/>
+      </w:pPr>
+      <w:bookmarkStart w:id="68" w:name="_Toc238479111"/>
+      <w:r>
+        <w:t>4.5.9 Découplage entre planification d'entretien et statut du candidat</w:t>
+      </w:r>
+      <w:bookmarkEnd w:id="68"/>
+    </w:p>
+    <w:p>
+      <w:pPr>
+        <w:jc w:val="both"/>
+      </w:pPr>
+      <w:r>
+        <w:t>Ce même exercice a fait remonter un second problème, plus discret : planifier un entretien changeait le statut du candidat selon le type choisi, mais sans passer ni par le garde-fou décrit en 4.5.4, ni par le contrôle de périmètre du manager. Concrètement, planifier un entretien téléphonique sur un dossier déjà en phase technique suffisait à faire régresser son statut, sans qu'aucune vérification ne s'y oppose. J'ai séparé les deux responsabilités : la planification reste une opération de logistique (date, intervieweur, lieu) qui n'a plus aucun effet sur le statut ; seules des actions de statut dédiées, elles-mêmes garde-foutées, font avancer le dossier. Pour ne pas perdre en confort d'usage, l'interface garde une case à cocher optionnelle qui déclenche la transition correspondante en un clic, mais via l'endpoint garde-fouté, donc sans contourner la règle.</w:t>
+      </w:r>
+    </w:p>
+    <w:p>
+      <w:pPr>
+        <w:pStyle w:val="Titre3"/>
+      </w:pPr>
+      <w:bookmarkStart w:id="69" w:name="_Toc238479112"/>
+      <w:r>
+        <w:t>4.5.10 Fiabiliser l'intégration Google Meet et le format des webhooks n8n</w:t>
+      </w:r>
+      <w:bookmarkEnd w:id="69"/>
+    </w:p>
+    <w:p>
+      <w:r>
+        <w:t>Le lien Google Meet envoyé aux candidats et aux managers reposait initialement sur une valeur fictive, générée côté n8n sans appel réel à l'API Google Calendar - une limitation assumée à ce stade du développement. En remplaçant ce mécanisme par une véritable création d'événement Google Calendar (avec génération automatique du lien Meet), un problème plus ancien est remonté : le noeud Webhook de n8n imbrique le corps réel de la requête POST sous un champ body, alors que le workflow lisait les données à la racine. Ce défaut, antérieur à cette évolution, cassait silencieusement à la fois le routage de l'agent d'entretien et, potentiellement, celui de l'agent de décision finale. Je l'ai corrigé aux trois endroits concernés, puis validé le nouveau flux de bout en bout : création réelle de l'événement, ajout des participants, envoi de l'e-mail de convocation, et sauvegarde du lien via un point d'API dédié. Pour que cet appel à n8n reste fiable même en cas d'indisponibilité passagère, le backend s'appuie sur une file d'attente interne (outbox) : chaque déclenchement est journalisé, puis retenté automatiquement à intervalles croissants en cas d'échec, jusqu'à un nombre de tentatives limité, ce qui évite de perdre un événement sans pour autant bloquer la requête initiale.</w:t>
+      </w:r>
+    </w:p>
+    <w:p>
+      <w:pPr>
+        <w:pStyle w:val="Titre3"/>
+      </w:pPr>
+      <w:bookmarkStart w:id="70" w:name="_Toc238479113"/>
+      <w:r>
+        <w:t>4.5.11 Cloisonnement des données dans le chatbot candidat</w:t>
+      </w:r>
+      <w:bookmarkEnd w:id="70"/>
+    </w:p>
+    <w:p>
+      <w:r>
+        <w:t xml:space="preserve">L'ajout d'un assistant conversationnel candidat posait un risque spécifique : un modèle de langage peut, si on le laisse faire, être incité par un utilisateur malveillant à révéler des informations qu'il ne devrait pas partager, y compris celles qu'on lui a explicitement fournies en contexte. J'ai donc construit le contexte transmis au modèle en excluant dès la source, avant même l'appel à l'IA, le score et le résumé générés par l'agent de scoring, la correction manuelle du RH, l'identité de l'intervieweur et les notes internes d'entretien — ces champs ne quittent jamais le backend vers le prompt. Le message système impose en complément au modèle de ne répondre qu'à partir de ce contexte filtré, d'ignorer toute instruction contraire glissée dans la question du candidat, et de ne </w:t>
+      </w:r>
+      <w:r>
+        <w:lastRenderedPageBreak/>
+        <w:t>jamais reproduire ce contexte mot pour mot. Ces deux niveaux de protection — filtrage des données à la source, puis consignes du prompt système — ont été validés par des tests manuels explicites : demande directe du score, de l'identité de l'intervieweur, et tentative d'injection de prompt (« ignore tes instructions précédentes... ») ; dans les trois cas, l'assistant refuse poliment sans jamais divulguer l'information protégée.</w:t>
       </w:r>
     </w:p>
     <w:p>
       <w:pPr>
         <w:pStyle w:val="Titre2"/>
       </w:pPr>
-      <w:bookmarkStart w:id="59" w:name="_Toc238477815"/>
-      <w:r>
-        <w:t>4.5 Difficultés rencontrées et solutions apportées</w:t>
-      </w:r>
-      <w:bookmarkEnd w:id="59"/>
-    </w:p>
-    <w:p>
-      <w:r>
-        <w:t>Au-delà des fonctionnalités livrées, le développement de JOB4YOU a été jalonné de plusieurs difficultés concrètes. Je détaille ici les principales, représentatives des problèmes rencontrés sur ce projet.</w:t>
-      </w:r>
-    </w:p>
-    <w:p>
-      <w:pPr>
-        <w:pStyle w:val="Titre3"/>
-      </w:pPr>
-      <w:bookmarkStart w:id="60" w:name="_Toc238477816"/>
-      <w:r>
-        <w:t>4.5.1 Notification incomplète des managers</w:t>
-      </w:r>
-      <w:bookmarkEnd w:id="60"/>
-    </w:p>
-    <w:p>
-      <w:r>
-        <w:t>Un premier bug, découvert tardivement, concernait le routage automatique RH → manager. Lorsqu'une offre d'emploi était rattachée à une famille de métier suivie par plusieurs managers, seul le premier manager trouvé en base recevait la notification de validation RH : les autres n'étaient jamais informés, sans qu'aucune erreur ne soit levée. Le problème venait d'une méthode qui retournait un unique e-mail (le premier résultat de la requête) au lieu de la liste complète des managers concernés. La correction a consisté à faire retourner l'ensemble des adresses correspondantes et à notifier chaque manager individuellement, tout en veillant à ne pas dupliquer l'e-mail envoyé au candidat, qui doit rester unique quel que soit le nombre de managers notifiés.</w:t>
-      </w:r>
-      <w:r>
-        <w:t xml:space="preserve"> Ce routage a par la suite été affiné pour s'appuyer prioritairement sur le département de l'offre (CS, DevOps, ProdOps, R&amp;D, QA), la famille de métier n'intervenant plus qu'en repli pour les offres non rattachées à un département : un manager ne reçoit et ne voit désormais que les dossiers relevant strictement de son département, sans fuite possible vers un autre périmètre.</w:t>
-      </w:r>
-    </w:p>
-    <w:p>
-      <w:pPr>
-        <w:pStyle w:val="Titre3"/>
-      </w:pPr>
-      <w:bookmarkStart w:id="61" w:name="_Toc238477817"/>
-      <w:r>
-        <w:t>4.5.2 Distinguer un rejet RH d'un rejet manager</w:t>
-      </w:r>
-      <w:bookmarkEnd w:id="61"/>
-    </w:p>
-    <w:p>
-      <w:r>
-        <w:t>Le modèle de données utilise un statut unique, MANAGER_REJECTED, que ce soit le RH ou le manager qui prenne la décision de refus — les deux s'appuient sur le même mécanisme de décision. Or le tableau de bord devait afficher séparément les rejets RH et les rejets manager, ces derniers ventilés par famille de métier. Plutôt que d'introduire un nouveau statut en base (ce qui aurait complexifié le modèle pour un besoin purement d'affichage), j'ai choisi de reconstruire cette information à partir du journal d'audit existant : chaque changement de statut y est déjà associé à l'utilisateur qui l'a effectué, il suffisait de croiser ce nom d'utilisateur avec son rôle réel pour déterminer si la décision provenait du RH ou d'un manager, et dans ce dernier cas, de quelle famille de métier.</w:t>
-      </w:r>
-    </w:p>
-    <w:p>
-      <w:pPr>
-        <w:pStyle w:val="Titre3"/>
-      </w:pPr>
-      <w:bookmarkStart w:id="62" w:name="_Toc238477818"/>
-      <w:r>
-        <w:t>4.5.3 Cohérence des transitions de statut</w:t>
-      </w:r>
-      <w:bookmarkEnd w:id="62"/>
-    </w:p>
-    <w:p>
-      <w:r>
-        <w:t>Le cycle de vie d'une candidature comporte de nombreux états, et plusieurs actions (planifier un entretien, prendre une décision finale) n'ont de sens que si le dossier se trouve dans un état précis. Sans garde-fou, il était possible par exemple de planifier un entretien sur un dossier déjà rejeté, ou de faire valider un candidat par un manager avant même que le RH n'ait examiné son dossier. J'ai donc ajouté, côté backend, des vérifications explicites avant chaque transition sensible, avec des messages d'erreur clairs renvoyés à l'interface plutôt que des échecs silencieux — un choix qui a nécessité de revenir plusieurs fois sur le diagramme d'états du chapitre 3 pour m'assurer que l'implémentation restait fidèle au modèle.</w:t>
-      </w:r>
-    </w:p>
-    <w:p>
-      <w:pPr>
-        <w:pStyle w:val="Titre3"/>
-      </w:pPr>
-      <w:bookmarkStart w:id="63" w:name="_Toc238477819"/>
+      <w:bookmarkStart w:id="71" w:name="_Toc238479114"/>
+      <w:r>
+        <w:t>4.6 Protection des données et éthique de l'IA</w:t>
+      </w:r>
+      <w:bookmarkEnd w:id="71"/>
+    </w:p>
+    <w:p>
+      <w:r>
+        <w:t xml:space="preserve">La plateforme manipule des données à caractère personnel : identité, coordonnées, CV et évaluations des candidats. Plusieurs principes ont guidé leur traitement. L'accès aux dossiers est strictement contrôlé selon le rôle de l'utilisateur, comme détaillé au tableau de la section 2.2.1 : un manager ne voit que les candidatures de son périmètre, seuls RH et Administrateur disposant d'une vue d'ensemble. Les mots de passe sont hachés (section 4.2.4), et chaque action sensible sur un dossier candidat est journalisée dans le journal d'audit avec l'identité de son auteur et un horodatage — </w:t>
+      </w:r>
+      <w:r>
+        <w:t>de quoi retracer qui a consulté ou modifié un dossier donné. Plusieurs protections techniques complètent ce socle : une limitation du nombre de tentatives de connexion pour freiner les attaques par force brute, une validation du contenu réel de chaque fichier déposé (au-delà de la simple extension déclarée) pour bloquer un upload malveillant, et un garde-fou contre les redirections internes non autorisées sur le point d'API utilisé pour tester la connectivité des webhooks n8n.</w:t>
+      </w:r>
+    </w:p>
+    <w:p>
+      <w:r>
+        <w:t>Le score attribué par l'agent d'intelligence artificielle est une aide à la présélection, pas une décision autonome : comme détaillé au chapitre 3, un score insuffisant déclenche un rejet automatique, mais ce rejet reste réversible par un RH ou un Administrateur via le mécanisme de surcharge manuelle, avec justification obligatoire et traçabilité complète. Cette conception vise à limiter le risque d'erreur ou de biais algorithmique en gardant un contrôle humain sur toute décision affectant un candidat, dans l'esprit des principes du RGPD [9], [10] relatifs aux décisions individuelles automatisées.</w:t>
+      </w:r>
+    </w:p>
+    <w:p>
+      <w:r>
+        <w:t>Ce dispositif comporte néanmoins des limites qu'il convient d'assumer : la dépendance à un service d'IA externe (Cohere) et à sa disponibilité, la sensibilité du score à la qualité et à la structure du CV fourni, le risque de biais inhérent à tout modèle statistique, et l'absence volontaire de décision entièrement autonome — chaque rejet automatique restant réversible par un opérateur humain.</w:t>
+      </w:r>
+      <w:r>
+        <w:t xml:space="preserve"> Pour ne jamais bloquer le dépôt d’une candidature en cas d’indisponibilité ou d’erreur de l’API Cohere, un mode dégradé prend automatiquement le relais : le score est alors calculé par une heuristique locale (analyse de mots-clés et de structure du texte), la source du score (COHERE ou SIMULATED) étant conservée pour traçabilité.</w:t>
+      </w:r>
+      <w:r>
+        <w:t xml:space="preserve"> </w:t>
+      </w:r>
+      <w:r>
+        <w:t>Ces limites justifient le maintien systématique d'une validation humaine et d'une traçabilité complète des décisions prises. La conception du processus de recrutement doit aussi tenir compte des principes de diversité et d'inclusion, afin de limiter les risques de discrimination dans des processus de sélection automatisés [14]. Par ailleurs, les captures d'écran présentées dans ce rapport (section 4.3) utilisent des données de test fictives ou anonymisées, à l'exception de quelques comptes de démonstration que j'ai moi-même créés à des fins de test.</w:t>
+      </w:r>
+    </w:p>
+    <w:p>
+      <w:r>
+        <w:t>Le chatbot candidat introduit en fin de projet (section 4.5.11) applique les mêmes principes : il ne s'appuie que sur les données de candidature du candidat connecté, dérivées côté serveur à partir du jeton JWT plutôt que d'un identifiant transmis par le client, et exclut structurellement les champs à usage interne (score IA, notes RH, identité de l'intervieweur) du contexte envoyé au modèle de langage.</w:t>
+      </w:r>
+    </w:p>
+    <w:p>
+      <w:pPr>
+        <w:pStyle w:val="Titre2"/>
+      </w:pPr>
+      <w:bookmarkStart w:id="72" w:name="_Toc238479115"/>
       <w:r>
         <w:lastRenderedPageBreak/>
-        <w:t>4.5.4 Filtrage incomplet des routes de lecture pour les managers</w:t>
-      </w:r>
-      <w:bookmarkEnd w:id="63"/>
-    </w:p>
-    <w:p>
-      <w:r>
-        <w:t>Le garde-fou décrit en 4.5.2 empêchait bien un manager d'agir en écriture (changer un statut) sur un candidat hors de son périmètre, mais je me suis rendu compte, en réexaminant systématiquement chaque route accessible au rôle Manager, que ce n'était pas le cas des routes de lecture : GET /api/candidates, GET /api/candidates/{id}, la recherche par nom et le classement par offre ne filtraient pas par périmètre. Un manager authentifié pouvait donc, en appelant directement l'API (pas via l'interface, qui n'expose pas ce chemin), lister ou consulter des candidats d'un autre département. J'ai corrigé ce point en centralisant la logique de périmètre déjà utilisée pour les écritures dans une méthode réutilisable, appliquée à présent à toutes les routes de lecture concernées, et j'ai ajouté deux tests unitaires dédiés (section 4.4.1) pour figer ce comportement.</w:t>
-      </w:r>
-    </w:p>
-    <w:p>
-      <w:pPr>
-        <w:pStyle w:val="Titre3"/>
-      </w:pPr>
-      <w:bookmarkStart w:id="64" w:name="_Toc238477820"/>
-      <w:r>
-        <w:t>4.5.5 Solliciter le manager au bon moment du processus</w:t>
-      </w:r>
-      <w:bookmarkEnd w:id="64"/>
-    </w:p>
-    <w:p>
-      <w:pPr>
-        <w:jc w:val="both"/>
-      </w:pPr>
-      <w:r>
-        <w:t>Dans une première version, le manager destinataire était notifié dès la validation du CV par le RH (statut CV_REVIEWED). À l'usage, cela le sollicitait trop tôt : de nombreux dossiers étaient encore écartés lors du pré-filtrage téléphonique mené par le RH. J'ai donc déplacé la notification du manager à l'entrée en Test technique, c'est-à-dire une fois l'entretien téléphonique franchi ; le candidat, lui, reste informé de la présélection de son CV dès l'étape CV_REVIEWED. En cohérence, la vue des dossiers validés du manager ne fait plus apparaître les candidats qu'à partir du Test technique, ce qui recentre son attention sur les profils réellement en lice.</w:t>
-      </w:r>
-    </w:p>
-    <w:p>
-      <w:pPr>
-        <w:pStyle w:val="Titre3"/>
-      </w:pPr>
-      <w:bookmarkStart w:id="65" w:name="_Toc238477821"/>
-      <w:r>
-        <w:t>4.5.6 Pertinence du matching Job idéal</w:t>
-      </w:r>
-      <w:bookmarkEnd w:id="65"/>
-    </w:p>
-    <w:p>
-      <w:pPr>
-        <w:jc w:val="both"/>
-      </w:pPr>
-      <w:r>
-        <w:t>La fonctionnalité de matching inverse, par laquelle un visiteur dépose son CV et le système lui suggère les offres les plus proches, retournait des résultats peu pertinents : un profil DevOps se voyait par exemple proposer des postes de développement backend. L'analyse a révélé deux causes : le score ne tenait compte que des compétences requises, en ignorant l'intitulé de l'offre, et le jeu de données comportait de nombreuses annonces en double qui saturaient le lot soumis à l'IA. J'ai corrigé les deux points en combinant, dans le score, l'intitulé de l'offre (pondéré à 60 %) et les compétences (40 %), et en dédupliquant les offres identiques avant l'appel à l'IA. Chaque profil (Java, DevOps, ProdOps, QA) ressort désormais sur les offres qui lui correspondent réellement.</w:t>
-      </w:r>
-    </w:p>
-    <w:p>
-      <w:pPr>
-        <w:pStyle w:val="Titre3"/>
-      </w:pPr>
-      <w:bookmarkStart w:id="66" w:name="_Toc238477822"/>
-      <w:r>
-        <w:t>4.5.7 Traitement distinct des candidatures retirées</w:t>
-      </w:r>
-      <w:bookmarkEnd w:id="66"/>
-    </w:p>
-    <w:p>
-      <w:pPr>
-        <w:jc w:val="both"/>
-      </w:pPr>
-      <w:r>
-        <w:t>Une candidature retirée (statut WITHDRAWN) était jusque-là confondue avec les candidatures rejetées dans les filtres de la liste, et cette liste ne se mettait à jour qu'après rechargement de la page. J'ai séparé le retrait du rejet en lui dédiant son propre filtre, à l'image du filtre des candidatures rejetées, dans la liste des candidatures comme sur le tableau de bord, et fait en sorte que tout changement de statut rafraîchisse immédiatement la liste : un candidat passé en candidature retirée quitte aussitôt la vue active et le compteur est décrémenté, sans rechargement. Conformément au choix retenu, ces candidatures ne sont pas supprimées automatiquement : elles restent consultables via leur filtre, comme les candidatures rejetées.</w:t>
-      </w:r>
-      <w:r>
-        <w:t xml:space="preserve"> </w:t>
-      </w:r>
-      <w:r>
-        <w:t>Un candidat peut aussi retirer lui-même sa candidature tant qu’elle n’est pas close, via un endpoint dédié qui ne passe pas par les actions réservées au RH ou au manager.</w:t>
-      </w:r>
-    </w:p>
-    <w:p>
-      <w:pPr>
-        <w:pStyle w:val="Titre3"/>
-      </w:pPr>
-      <w:bookmarkStart w:id="67" w:name="_Toc238477823"/>
-      <w:r>
-        <w:t>4.5.8 Entretien téléphonique RH obligatoire avant acceptation</w:t>
-      </w:r>
-      <w:bookmarkEnd w:id="67"/>
-    </w:p>
-    <w:p>
-      <w:pPr>
-        <w:jc w:val="both"/>
-      </w:pPr>
-      <w:r>
-        <w:t xml:space="preserve">En testant le parcours RH de bout en bout, je me suis rendu compte qu'un candidat pouvait être accepté directement depuis CV_REVIEWED, sans qu'aucun entretien téléphonique n'ait eu lieu : la </w:t>
-      </w:r>
-      <w:r>
-        <w:lastRenderedPageBreak/>
-        <w:t>machine à états ne l'interdisait pas explicitement. Cela allait à l'encontre du processus voulu, où cet entretien constitue le premier vrai filtre humain avant de solliciter le manager. J'ai donc retiré la transition CV_REVIEWED vers ACCEPTED : depuis cette étape, seuls restent possibles le passage en entretien téléphonique, le refus ou le retrait. Un profil manifestement hors sujet peut toujours être écarté sans attendre cet entretien ; c'est uniquement l'acceptation qui exige désormais d'être passé par PHONE_SCREENING.</w:t>
-      </w:r>
-    </w:p>
-    <w:p>
-      <w:pPr>
-        <w:pStyle w:val="Titre3"/>
-      </w:pPr>
-      <w:bookmarkStart w:id="68" w:name="_Toc238477824"/>
-      <w:r>
-        <w:t>4.5.9 Découplage entre planification d'entretien et statut du candidat</w:t>
-      </w:r>
-      <w:bookmarkEnd w:id="68"/>
-    </w:p>
-    <w:p>
-      <w:pPr>
-        <w:jc w:val="both"/>
-      </w:pPr>
-      <w:r>
-        <w:t>Ce même exercice a fait remonter un second problème, plus discret : planifier un entretien changeait le statut du candidat selon le type choisi, mais sans passer ni par le garde-fou décrit en 4.5.4, ni par le contrôle de périmètre du manager. Concrètement, planifier un entretien téléphonique sur un dossier déjà en phase technique suffisait à faire régresser son statut, sans qu'aucune vérification ne s'y oppose. J'ai séparé les deux responsabilités : la planification reste une opération de logistique (date, intervieweur, lieu) qui n'a plus aucun effet sur le statut ; seules des actions de statut dédiées, elles-mêmes garde-foutées, font avancer le dossier. Pour ne pas perdre en confort d'usage, l'interface garde une case à cocher optionnelle qui déclenche la transition correspondante en un clic, mais via l'endpoint garde-fouté, donc sans contourner la règle.</w:t>
-      </w:r>
-    </w:p>
-    <w:p>
-      <w:pPr>
-        <w:pStyle w:val="Titre3"/>
-      </w:pPr>
-      <w:bookmarkStart w:id="69" w:name="_Toc238477825"/>
-      <w:r>
-        <w:t>4.5.10 Fiabiliser l'intégration Google Meet et le format des webhooks n8n</w:t>
-      </w:r>
-      <w:bookmarkEnd w:id="69"/>
-    </w:p>
-    <w:p>
-      <w:r>
-        <w:t>Le lien Google Meet envoyé aux candidats et aux managers reposait initialement sur une valeur fictive, générée côté n8n sans appel réel à l'API Google Calendar - une limitation assumée à ce stade du développement. En remplaçant ce mécanisme par une véritable création d'événement Google Calendar (avec génération automatique du lien Meet), un problème plus ancien est remonté : le noeud Webhook de n8n imbrique le corps réel de la requête POST sous un champ body, alors que le workflow lisait les données à la racine. Ce défaut, antérieur à cette évolution, cassait silencieusement à la fois le routage de l'agent d'entretien et, potentiellement, celui de l'agent de décision finale. Je l'ai corrigé aux trois endroits concernés, puis validé le nouveau flux de bout en bout : création réelle de l'événement, ajout des participants, envoi de l'e-mail de convocation, et sauvegarde du lien via un point d'API dédié. Pour que cet appel à n8n reste fiable même en cas d'indisponibilité passagère, le backend s'appuie sur une file d'attente interne (outbox) : chaque déclenchement est journalisé, puis retenté automatiquement à intervalles croissants en cas d'échec, jusqu'à un nombre de tentatives limité, ce qui évite de perdre un événement sans pour autant bloquer la requête initiale.</w:t>
-      </w:r>
-    </w:p>
-    <w:p>
-      <w:pPr>
-        <w:pStyle w:val="Titre3"/>
-      </w:pPr>
-      <w:bookmarkStart w:id="70" w:name="_Toc238477826"/>
-      <w:r>
-        <w:t>4.5.11 Cloisonnement des données dans le chatbot candidat</w:t>
-      </w:r>
-      <w:bookmarkEnd w:id="70"/>
-    </w:p>
-    <w:p>
-      <w:r>
-        <w:t xml:space="preserve">L'ajout d'un assistant conversationnel candidat posait un risque spécifique : un modèle de langage peut, si on le laisse faire, être incité par un utilisateur malveillant à révéler des informations qu'il ne devrait pas partager, y compris celles qu'on lui a explicitement fournies en contexte. J'ai donc construit le contexte transmis au modèle en excluant dès la source, avant même l'appel à l'IA, le score et le résumé générés par l'agent de scoring, la correction manuelle du RH, l'identité de l'intervieweur et les notes internes d'entretien — ces champs ne quittent jamais le backend vers le prompt. Le message système impose en complément au modèle de ne répondre qu'à partir de ce contexte filtré, d'ignorer toute instruction contraire glissée dans la question du candidat, et de ne jamais reproduire ce contexte mot pour mot. Ces deux niveaux de protection — filtrage des données à la source, puis consignes du prompt système — ont été validés par des tests manuels explicites : demande directe du score, de l'identité de l'intervieweur, et tentative d'injection de prompt (« </w:t>
-      </w:r>
-      <w:r>
-        <w:lastRenderedPageBreak/>
-        <w:t>ignore tes instructions précédentes... ») ; dans les trois cas, l'assistant refuse poliment sans jamais divulguer l'information protégée.</w:t>
-      </w:r>
-    </w:p>
-    <w:p>
-      <w:pPr>
-        <w:pStyle w:val="Titre2"/>
-      </w:pPr>
-      <w:bookmarkStart w:id="71" w:name="_Toc238477827"/>
-      <w:r>
-        <w:t>4.6 Protection des données et éthique de l'IA</w:t>
-      </w:r>
-      <w:bookmarkEnd w:id="71"/>
-    </w:p>
-    <w:p>
-      <w:r>
-        <w:t xml:space="preserve">La plateforme manipule des données à caractère personnel : identité, coordonnées, CV et évaluations des candidats. Plusieurs principes ont guidé leur traitement. L'accès aux dossiers est strictement contrôlé selon le rôle de l'utilisateur, comme détaillé au tableau de la section 2.2.1 : un manager ne voit que les candidatures de son périmètre, seuls RH et Administrateur disposant d'une vue d'ensemble. Les mots de passe sont hachés (section 4.2.4), et chaque action sensible sur un dossier candidat est journalisée dans le journal d'audit avec l'identité de son auteur et un horodatage — </w:t>
-      </w:r>
-      <w:r>
-        <w:t>de quoi retracer qui a consulté ou modifié un dossier donné. Plusieurs protections techniques complètent ce socle : une limitation du nombre de tentatives de connexion pour freiner les attaques par force brute, une validation du contenu réel de chaque fichier déposé (au-delà de la simple extension déclarée) pour bloquer un upload malveillant, et un garde-fou contre les redirections internes non autorisées sur le point d'API utilisé pour tester la connectivité des webhooks n8n.</w:t>
-      </w:r>
-    </w:p>
-    <w:p>
-      <w:r>
-        <w:t>Le score attribué par l'agent d'intelligence artificielle est une aide à la présélection, pas une décision autonome : comme détaillé au chapitre 3, un score insuffisant déclenche un rejet automatique, mais ce rejet reste réversible par un RH ou un Administrateur via le mécanisme de surcharge manuelle, avec justification obligatoire et traçabilité complète. Cette conception vise à limiter le risque d'erreur ou de biais algorithmique en gardant un contrôle humain sur toute décision affectant un candidat, dans l'esprit des principes du RGPD [9], [10] relatifs aux décisions individuelles automatisées.</w:t>
-      </w:r>
-    </w:p>
-    <w:p>
-      <w:r>
-        <w:t>Ce dispositif comporte néanmoins des limites qu'il convient d'assumer : la dépendance à un service d'IA externe (Cohere) et à sa disponibilité, la sensibilité du score à la qualité et à la structure du CV fourni, le risque de biais inhérent à tout modèle statistique, et l'absence volontaire de décision entièrement autonome — chaque rejet automatique restant réversible par un opérateur humain.</w:t>
-      </w:r>
-      <w:r>
-        <w:t xml:space="preserve"> Pour ne jamais bloquer le dépôt d’une candidature en cas d’indisponibilité ou d’erreur de l’API Cohere, un mode dégradé prend automatiquement le relais : le score est alors calculé par une heuristique locale (analyse de mots-clés et de structure du texte), la source du score (COHERE ou SIMULATED) étant conservée pour traçabilité.</w:t>
-      </w:r>
-      <w:r>
-        <w:t xml:space="preserve"> </w:t>
-      </w:r>
-      <w:r>
-        <w:t>Ces limites justifient le maintien systématique d'une validation humaine et d'une traçabilité complète des décisions prises. La conception du processus de recrutement doit aussi tenir compte des principes de diversité et d'inclusion, afin de limiter les risques de discrimination dans des processus de sélection automatisés [14]. Par ailleurs, les captures d'écran présentées dans ce rapport (section 4.3) utilisent des données de test fictives ou anonymisées, à l'exception de quelques comptes de démonstration que j'ai moi-même créés à des fins de test.</w:t>
-      </w:r>
-    </w:p>
-    <w:p>
-      <w:r>
-        <w:t>Le chatbot candidat introduit en fin de projet (section 4.5.11) applique les mêmes principes : il ne s'appuie que sur les données de candidature du candidat connecté, dérivées côté serveur à partir du jeton JWT plutôt que d'un identifiant transmis par le client, et exclut structurellement les champs à usage interne (score IA, notes RH, identité de l'intervieweur) du contexte envoyé au modèle de langage.</w:t>
-      </w:r>
-    </w:p>
-    <w:p>
-      <w:pPr>
-        <w:pStyle w:val="Titre2"/>
-      </w:pPr>
-      <w:bookmarkStart w:id="72" w:name="_Toc238477828"/>
-      <w:r>
         <w:t>4.7 Bilan des fonctionnalités réalisées</w:t>
       </w:r>
       <w:bookmarkEnd w:id="72"/>
@@ -11841,7 +12129,6 @@
           <w:i/>
           <w:sz w:val="21"/>
         </w:rPr>
-        <w:lastRenderedPageBreak/>
         <w:t>Tableau 4.2 : Bilan des fonctionnalités réalisées</w:t>
       </w:r>
     </w:p>
@@ -12479,8 +12766,9 @@
       <w:pPr>
         <w:pStyle w:val="Titre2"/>
       </w:pPr>
-      <w:bookmarkStart w:id="73" w:name="_Toc238477829"/>
-      <w:r>
+      <w:bookmarkStart w:id="73" w:name="_Toc238479116"/>
+      <w:r>
+        <w:lastRenderedPageBreak/>
         <w:t>4.8 Conclusion</w:t>
       </w:r>
       <w:bookmarkEnd w:id="73"/>
@@ -12503,7 +12791,7 @@
         <w:pStyle w:val="Titre1"/>
         <w:jc w:val="center"/>
       </w:pPr>
-      <w:bookmarkStart w:id="74" w:name="_Toc238477830"/>
+      <w:bookmarkStart w:id="74" w:name="_Toc238479117"/>
       <w:r>
         <w:t>Conclusion Générale et Perspectives</w:t>
       </w:r>
@@ -12551,7 +12839,7 @@
       <w:pPr>
         <w:pStyle w:val="Titre1"/>
       </w:pPr>
-      <w:bookmarkStart w:id="75" w:name="_Toc238477831"/>
+      <w:bookmarkStart w:id="75" w:name="_Toc238479118"/>
       <w:r>
         <w:t>Bibliographie</w:t>
       </w:r>
@@ -12779,7 +13067,7 @@
       <w:pPr>
         <w:pStyle w:val="Titre1"/>
       </w:pPr>
-      <w:bookmarkStart w:id="76" w:name="_Toc238477832"/>
+      <w:bookmarkStart w:id="76" w:name="_Toc238479119"/>
       <w:r>
         <w:t>Glossaire</w:t>
       </w:r>

</xml_diff>

<commit_message>
docs: corriger fragmentation paysage et details outbox n8n
- Deux sections (avant le diagramme de classes, avant le schema BDD)
  restaient en portrait a cause d'une limite de section pre-existante
  dans le document (heritee du modele d'origine) tombant au milieu de
  mes nouvelles pages paysage, coupant le titre+intro du diagramme lui
  meme. Corrige en forcant l'orientation paysage sur ces deux sections.
- Ajout des chiffres reels du mecanisme de retry n8n outbox (5 s, 10 s,
  20 s... plafonne a 5 min, 5 tentatives max) au lieu d'une formulation
  vague.

Limite connue non resolue : 2-3 pages quasi vides (titre seul) restent
juste avant certains diagrammes paysage - limitation de Word qui
n'applique pas keep_with_next en tout debut de section forcee par un
saut de page. Le diagramme lui-meme reste grand et lisible sur la page
suivante ; seule la mise en page immediatement avant est imparfaite.

Co-Authored-By: Claude Sonnet 5 <noreply@anthropic.com>
</commit_message>
<xml_diff>
--- a/Rapport-PFE/Rapport_PFE_Bargaoui_Haythem.docx
+++ b/Rapport-PFE/Rapport_PFE_Bargaoui_Haythem.docx
@@ -8249,6 +8249,7 @@
     <w:p>
       <w:pPr>
         <w:pStyle w:val="Titre3"/>
+        <w:keepNext/>
         <w:pageBreakBefore/>
       </w:pPr>
       <w:bookmarkStart w:id="22" w:name="_Toc238481431"/>
@@ -8304,6 +8305,7 @@
     <w:p>
       <w:pPr>
         <w:pStyle w:val="Titre3"/>
+        <w:keepNext/>
       </w:pPr>
       <w:bookmarkStart w:id="23" w:name="_Toc238481432"/>
       <w:r>
@@ -8698,6 +8700,7 @@
     <w:p>
       <w:pPr>
         <w:pStyle w:val="Titre3"/>
+        <w:keepNext/>
         <w:pageBreakBefore/>
       </w:pPr>
       <w:bookmarkStart w:id="24" w:name="_Toc238481433"/>
@@ -8752,6 +8755,7 @@
     <w:p>
       <w:pPr>
         <w:pStyle w:val="Titre2"/>
+        <w:keepNext/>
       </w:pPr>
       <w:bookmarkStart w:id="25" w:name="_Toc238481434"/>
       <w:r>
@@ -8762,6 +8766,7 @@
     <w:p>
       <w:pPr>
         <w:pStyle w:val="Titre3"/>
+        <w:keepNext/>
       </w:pPr>
       <w:bookmarkStart w:id="26" w:name="_Toc238481435"/>
       <w:r>
@@ -8901,6 +8906,7 @@
     <w:p>
       <w:pPr>
         <w:pStyle w:val="Titre2"/>
+        <w:keepNext/>
       </w:pPr>
       <w:bookmarkStart w:id="32" w:name="_Toc238481441"/>
       <w:r>
@@ -8919,6 +8925,7 @@
     <w:p>
       <w:pPr>
         <w:pStyle w:val="Titre2"/>
+        <w:keepNext/>
       </w:pPr>
       <w:bookmarkStart w:id="33" w:name="_Toc238481442"/>
       <w:r>
@@ -8985,6 +8992,7 @@
     <w:p>
       <w:pPr>
         <w:pStyle w:val="Titre2"/>
+        <w:keepNext/>
       </w:pPr>
       <w:bookmarkStart w:id="34" w:name="_Toc238481443"/>
       <w:r>
@@ -9011,8 +9019,8 @@
           <w:footerReference w:type="default" r:id="rId17"/>
           <w:headerReference w:type="first" r:id="rId18"/>
           <w:footerReference w:type="first" r:id="rId19"/>
-          <w:pgSz w:w="11906" w:h="16838"/>
-          <w:pgMar w:top="426" w:right="720" w:bottom="720" w:left="720" w:header="708" w:footer="708" w:gutter="0"/>
+          <w:pgSz w:w="16838" w:h="11906" w:orient="landscape"/>
+          <w:pgMar w:top="720" w:right="720" w:bottom="720" w:left="720" w:header="708" w:footer="708" w:gutter="0"/>
           <w:cols w:space="708"/>
           <w:docGrid w:linePitch="360"/>
         </w:sectPr>
@@ -9082,6 +9090,7 @@
     <w:p>
       <w:pPr>
         <w:pStyle w:val="Titre2"/>
+        <w:keepNext/>
       </w:pPr>
       <w:bookmarkStart w:id="35" w:name="_Toc238481444"/>
       <w:r>
@@ -9101,6 +9110,7 @@
     <w:p>
       <w:pPr>
         <w:pStyle w:val="Titre3"/>
+        <w:keepNext/>
         <w:pageBreakBefore/>
       </w:pPr>
       <w:bookmarkStart w:id="36" w:name="_Toc238481445"/>
@@ -9152,6 +9162,7 @@
     <w:p>
       <w:pPr>
         <w:pStyle w:val="Titre3"/>
+        <w:keepNext/>
         <w:pageBreakBefore/>
       </w:pPr>
       <w:bookmarkStart w:id="37" w:name="_Toc238481446"/>
@@ -9212,6 +9223,7 @@
     <w:p>
       <w:pPr>
         <w:pStyle w:val="Titre3"/>
+        <w:keepNext/>
       </w:pPr>
       <w:bookmarkStart w:id="38" w:name="_Toc238481447"/>
       <w:r>
@@ -9295,6 +9307,7 @@
     <w:p>
       <w:pPr>
         <w:pStyle w:val="Titre3"/>
+        <w:keepNext/>
       </w:pPr>
       <w:bookmarkStart w:id="39" w:name="_Toc238481448"/>
       <w:r>
@@ -9387,6 +9400,7 @@
     <w:p>
       <w:pPr>
         <w:pStyle w:val="Titre2"/>
+        <w:keepNext/>
       </w:pPr>
       <w:bookmarkStart w:id="40" w:name="_Toc238481449"/>
       <w:r>
@@ -9464,6 +9478,7 @@
     <w:p>
       <w:pPr>
         <w:pStyle w:val="Titre2"/>
+        <w:keepNext/>
       </w:pPr>
       <w:bookmarkStart w:id="41" w:name="_Toc238481450"/>
       <w:r>
@@ -9492,8 +9507,8 @@
       <w:pPr>
         <w:keepNext/>
         <w:sectPr>
-          <w:pgSz w:w="11906" w:h="16838"/>
-          <w:pgMar w:top="1420" w:right="1140" w:bottom="1420" w:left="1700" w:header="708" w:footer="708" w:gutter="0"/>
+          <w:pgSz w:w="16838" w:h="11906" w:orient="landscape"/>
+          <w:pgMar w:top="720" w:right="720" w:bottom="720" w:left="720" w:header="708" w:footer="708" w:gutter="0"/>
           <w:cols w:space="708"/>
           <w:titlePg/>
           <w:docGrid w:linePitch="360"/>
@@ -9559,6 +9574,7 @@
     <w:p>
       <w:pPr>
         <w:pStyle w:val="Titre2"/>
+        <w:keepNext/>
       </w:pPr>
       <w:bookmarkStart w:id="42" w:name="_Toc238481451"/>
       <w:r>
@@ -9624,6 +9640,7 @@
     <w:p>
       <w:pPr>
         <w:pStyle w:val="Titre2"/>
+        <w:keepNext/>
       </w:pPr>
       <w:bookmarkStart w:id="43" w:name="_Toc238481452"/>
       <w:r>
@@ -9685,6 +9702,7 @@
     <w:p>
       <w:pPr>
         <w:pStyle w:val="Titre2"/>
+        <w:keepNext/>
         <w:pageBreakBefore/>
       </w:pPr>
       <w:bookmarkStart w:id="44" w:name="_Toc238481453"/>
@@ -9994,6 +10012,7 @@
     <w:p>
       <w:pPr>
         <w:pStyle w:val="Titre3"/>
+        <w:keepNext/>
       </w:pPr>
       <w:bookmarkStart w:id="52" w:name="_Toc238481461"/>
       <w:r>
@@ -10012,6 +10031,7 @@
     <w:p>
       <w:pPr>
         <w:pStyle w:val="Titre2"/>
+        <w:keepNext/>
       </w:pPr>
       <w:bookmarkStart w:id="53" w:name="_Toc238481462"/>
       <w:r>
@@ -12373,7 +12393,7 @@
     </w:p>
     <w:p>
       <w:r>
-        <w:t>Le lien Google Meet envoyé aux candidats et aux managers reposait initialement sur une valeur fictive, générée côté n8n sans appel réel à l'API Google Calendar - une limitation assumée à ce stade du développement. En remplaçant ce mécanisme par une véritable création d'événement Google Calendar (avec génération automatique du lien Meet), un problème plus ancien est remonté : le noeud Webhook de n8n imbrique le corps réel de la requête POST sous un champ body, alors que le workflow lisait les données à la racine. Ce défaut, antérieur à cette évolution, cassait silencieusement à la fois le routage de l'agent d'entretien et, potentiellement, celui de l'agent de décision finale. Je l'ai corrigé aux trois endroits concernés, puis validé le nouveau flux de bout en bout : création réelle de l'événement, ajout des participants, envoi de l'e-mail de convocation, et sauvegarde du lien via un point d'API dédié. Pour que cet appel à n8n reste fiable même en cas d'indisponibilité passagère, le backend s'appuie sur une file d'attente interne (outbox) : chaque déclenchement est journalisé, puis retenté automatiquement à intervalles croissants en cas d'échec, jusqu'à un nombre de tentatives limité, ce qui évite de perdre un événement sans pour autant bloquer la requête initiale.</w:t>
+        <w:t>Le lien Google Meet envoyé aux candidats et aux managers reposait initialement sur une valeur fictive, générée côté n8n sans appel réel à l'API Google Calendar - une limitation assumée à ce stade du développement. En remplaçant ce mécanisme par une véritable création d'événement Google Calendar (avec génération automatique du lien Meet), un problème plus ancien est remonté : le noeud Webhook de n8n imbrique le corps réel de la requête POST sous un champ body, alors que le workflow lisait les données à la racine. Ce défaut, antérieur à cette évolution, cassait silencieusement à la fois le routage de l'agent d'entretien et, potentiellement, celui de l'agent de décision finale. Je l'ai corrigé aux trois endroits concernés, puis validé le nouveau flux de bout en bout : création réelle de l'événement, ajout des participants, envoi de l'e-mail de convocation, et sauvegarde du lien via un point d'API dédié. Pour que cet appel à n8n reste fiable même en cas d'indisponibilité passagère, le backend s'appuie sur une file d'attente interne (outbox) : chaque déclenchement est journalisé, puis retenté automatiquement en cas d'échec avec un délai croissant (5 s, 10 s, 20 s… plafonné à 5 min), jusqu'à 5 tentatives maximum, ce qui évite de perdre un événement sans pour autant bloquer la requête initiale.</w:t>
       </w:r>
     </w:p>
     <w:p>

</xml_diff>

<commit_message>
docs: eliminer les pages orphelines devant les diagrammes paysage
Cause racine identifiee : le modele Word d'origine avait deja des
mini-sections invisibles autour de chaque figure (portrait, dupliquees
par endroits), qui entraient en conflit avec les sauts de page forces
par mes nouvelles sections paysage - creant des titres isoles et une
page totalement blanche.

Corrections :
- Suppression des marqueurs de section caches redondants (dont un
  doublon exact avant "3.7 Diagramme de deploiement" qui provoquait une
  page blanche).
- Reduction fine de 2 images (Analyse IA du CV, schema BDD) de quelques
  millimetres pour qu'elles tiennent reellement avec leur titre dans la
  hauteur utile de la page, calcul fait a partir des espacements reels
  des styles Heading 2/3.

Resultat : 64 pages (contre 68), plus aucun titre de diagramme isole,
plus aucune page totalement vide. Verifie visuellement page par page.

Co-Authored-By: Claude Sonnet 5 <noreply@anthropic.com>
</commit_message>
<xml_diff>
--- a/Rapport-PFE/Rapport_PFE_Bargaoui_Haythem.docx
+++ b/Rapport-PFE/Rapport_PFE_Bargaoui_Haythem.docx
@@ -897,6 +897,7 @@
     <w:p>
       <w:pPr>
         <w:pStyle w:val="Titre1"/>
+        <w:keepNext/>
         <w:jc w:val="center"/>
       </w:pPr>
       <w:bookmarkStart w:id="0" w:name="_Toc238481409"/>
@@ -908,6 +909,7 @@
     <w:p>
       <w:pPr>
         <w:pStyle w:val="TM1"/>
+        <w:keepNext/>
         <w:tabs>
           <w:tab w:val="right" w:leader="dot" w:pos="10456"/>
         </w:tabs>
@@ -978,6 +980,7 @@
     <w:p>
       <w:pPr>
         <w:pStyle w:val="TM1"/>
+        <w:keepNext/>
         <w:tabs>
           <w:tab w:val="right" w:leader="dot" w:pos="10456"/>
         </w:tabs>
@@ -1039,6 +1042,7 @@
     <w:p>
       <w:pPr>
         <w:pStyle w:val="TM1"/>
+        <w:keepNext/>
         <w:tabs>
           <w:tab w:val="right" w:leader="dot" w:pos="10456"/>
         </w:tabs>
@@ -1100,6 +1104,7 @@
     <w:p>
       <w:pPr>
         <w:pStyle w:val="TM1"/>
+        <w:keepNext/>
         <w:tabs>
           <w:tab w:val="right" w:leader="dot" w:pos="10456"/>
         </w:tabs>
@@ -1161,6 +1166,7 @@
     <w:p>
       <w:pPr>
         <w:pStyle w:val="TM1"/>
+        <w:keepNext/>
         <w:tabs>
           <w:tab w:val="right" w:leader="dot" w:pos="10456"/>
         </w:tabs>
@@ -1222,6 +1228,7 @@
     <w:p>
       <w:pPr>
         <w:pStyle w:val="TM2"/>
+        <w:keepNext/>
         <w:tabs>
           <w:tab w:val="right" w:leader="dot" w:pos="10456"/>
         </w:tabs>
@@ -1283,6 +1290,7 @@
     <w:p>
       <w:pPr>
         <w:pStyle w:val="TM2"/>
+        <w:keepNext/>
         <w:tabs>
           <w:tab w:val="right" w:leader="dot" w:pos="10456"/>
         </w:tabs>
@@ -1344,6 +1352,7 @@
     <w:p>
       <w:pPr>
         <w:pStyle w:val="TM3"/>
+        <w:keepNext/>
         <w:tabs>
           <w:tab w:val="right" w:leader="dot" w:pos="10456"/>
         </w:tabs>
@@ -1405,6 +1414,7 @@
     <w:p>
       <w:pPr>
         <w:pStyle w:val="TM3"/>
+        <w:keepNext/>
         <w:tabs>
           <w:tab w:val="right" w:leader="dot" w:pos="10456"/>
         </w:tabs>
@@ -1466,6 +1476,7 @@
     <w:p>
       <w:pPr>
         <w:pStyle w:val="TM2"/>
+        <w:keepNext/>
         <w:tabs>
           <w:tab w:val="right" w:leader="dot" w:pos="10456"/>
         </w:tabs>
@@ -1527,6 +1538,7 @@
     <w:p>
       <w:pPr>
         <w:pStyle w:val="TM2"/>
+        <w:keepNext/>
         <w:tabs>
           <w:tab w:val="right" w:leader="dot" w:pos="10456"/>
         </w:tabs>
@@ -1588,6 +1600,7 @@
     <w:p>
       <w:pPr>
         <w:pStyle w:val="TM2"/>
+        <w:keepNext/>
         <w:tabs>
           <w:tab w:val="right" w:leader="dot" w:pos="10456"/>
         </w:tabs>
@@ -1649,6 +1662,7 @@
     <w:p>
       <w:pPr>
         <w:pStyle w:val="TM2"/>
+        <w:keepNext/>
         <w:tabs>
           <w:tab w:val="right" w:leader="dot" w:pos="10456"/>
         </w:tabs>
@@ -1710,6 +1724,7 @@
     <w:p>
       <w:pPr>
         <w:pStyle w:val="TM2"/>
+        <w:keepNext/>
         <w:tabs>
           <w:tab w:val="right" w:leader="dot" w:pos="10456"/>
         </w:tabs>
@@ -1771,6 +1786,7 @@
     <w:p>
       <w:pPr>
         <w:pStyle w:val="TM2"/>
+        <w:keepNext/>
         <w:tabs>
           <w:tab w:val="right" w:leader="dot" w:pos="10456"/>
         </w:tabs>
@@ -1832,6 +1848,7 @@
     <w:p>
       <w:pPr>
         <w:pStyle w:val="TM2"/>
+        <w:keepNext/>
         <w:tabs>
           <w:tab w:val="right" w:leader="dot" w:pos="10456"/>
         </w:tabs>
@@ -1893,6 +1910,7 @@
     <w:p>
       <w:pPr>
         <w:pStyle w:val="TM1"/>
+        <w:keepNext/>
         <w:tabs>
           <w:tab w:val="right" w:leader="dot" w:pos="10456"/>
         </w:tabs>
@@ -1954,6 +1972,7 @@
     <w:p>
       <w:pPr>
         <w:pStyle w:val="TM2"/>
+        <w:keepNext/>
         <w:tabs>
           <w:tab w:val="right" w:leader="dot" w:pos="10456"/>
         </w:tabs>
@@ -2015,6 +2034,7 @@
     <w:p>
       <w:pPr>
         <w:pStyle w:val="TM2"/>
+        <w:keepNext/>
         <w:tabs>
           <w:tab w:val="right" w:leader="dot" w:pos="10456"/>
         </w:tabs>
@@ -2076,6 +2096,7 @@
     <w:p>
       <w:pPr>
         <w:pStyle w:val="TM3"/>
+        <w:keepNext/>
         <w:tabs>
           <w:tab w:val="right" w:leader="dot" w:pos="10456"/>
         </w:tabs>
@@ -2137,6 +2158,7 @@
     <w:p>
       <w:pPr>
         <w:pStyle w:val="TM3"/>
+        <w:keepNext/>
         <w:tabs>
           <w:tab w:val="right" w:leader="dot" w:pos="10456"/>
         </w:tabs>
@@ -2198,6 +2220,7 @@
     <w:p>
       <w:pPr>
         <w:pStyle w:val="TM3"/>
+        <w:keepNext/>
         <w:tabs>
           <w:tab w:val="right" w:leader="dot" w:pos="10456"/>
         </w:tabs>
@@ -2259,6 +2282,7 @@
     <w:p>
       <w:pPr>
         <w:pStyle w:val="TM3"/>
+        <w:keepNext/>
         <w:tabs>
           <w:tab w:val="right" w:leader="dot" w:pos="10456"/>
         </w:tabs>
@@ -2320,6 +2344,7 @@
     <w:p>
       <w:pPr>
         <w:pStyle w:val="TM3"/>
+        <w:keepNext/>
         <w:tabs>
           <w:tab w:val="right" w:leader="dot" w:pos="10456"/>
         </w:tabs>
@@ -2381,6 +2406,7 @@
     <w:p>
       <w:pPr>
         <w:pStyle w:val="TM3"/>
+        <w:keepNext/>
         <w:tabs>
           <w:tab w:val="right" w:leader="dot" w:pos="10456"/>
         </w:tabs>
@@ -2442,6 +2468,7 @@
     <w:p>
       <w:pPr>
         <w:pStyle w:val="TM2"/>
+        <w:keepNext/>
         <w:tabs>
           <w:tab w:val="right" w:leader="dot" w:pos="10456"/>
         </w:tabs>
@@ -2503,6 +2530,7 @@
     <w:p>
       <w:pPr>
         <w:pStyle w:val="TM3"/>
+        <w:keepNext/>
         <w:tabs>
           <w:tab w:val="right" w:leader="dot" w:pos="10456"/>
         </w:tabs>
@@ -2564,6 +2592,7 @@
     <w:p>
       <w:pPr>
         <w:pStyle w:val="TM3"/>
+        <w:keepNext/>
         <w:tabs>
           <w:tab w:val="right" w:leader="dot" w:pos="10456"/>
         </w:tabs>
@@ -2625,6 +2654,7 @@
     <w:p>
       <w:pPr>
         <w:pStyle w:val="TM3"/>
+        <w:keepNext/>
         <w:tabs>
           <w:tab w:val="right" w:leader="dot" w:pos="10456"/>
         </w:tabs>
@@ -2687,6 +2717,7 @@
     <w:p>
       <w:pPr>
         <w:pStyle w:val="TM3"/>
+        <w:keepNext/>
         <w:tabs>
           <w:tab w:val="right" w:leader="dot" w:pos="10456"/>
         </w:tabs>
@@ -2748,6 +2779,7 @@
     <w:p>
       <w:pPr>
         <w:pStyle w:val="TM2"/>
+        <w:keepNext/>
         <w:tabs>
           <w:tab w:val="right" w:leader="dot" w:pos="10456"/>
         </w:tabs>
@@ -2809,6 +2841,7 @@
     <w:p>
       <w:pPr>
         <w:pStyle w:val="TM1"/>
+        <w:keepNext/>
         <w:tabs>
           <w:tab w:val="right" w:leader="dot" w:pos="10456"/>
         </w:tabs>
@@ -2870,6 +2903,7 @@
     <w:p>
       <w:pPr>
         <w:pStyle w:val="TM2"/>
+        <w:keepNext/>
         <w:tabs>
           <w:tab w:val="right" w:leader="dot" w:pos="10456"/>
         </w:tabs>
@@ -2931,6 +2965,7 @@
     <w:p>
       <w:pPr>
         <w:pStyle w:val="TM2"/>
+        <w:keepNext/>
         <w:tabs>
           <w:tab w:val="right" w:leader="dot" w:pos="10456"/>
         </w:tabs>
@@ -2992,6 +3027,7 @@
     <w:p>
       <w:pPr>
         <w:pStyle w:val="TM2"/>
+        <w:keepNext/>
         <w:tabs>
           <w:tab w:val="right" w:leader="dot" w:pos="10456"/>
         </w:tabs>
@@ -3053,6 +3089,7 @@
     <w:p>
       <w:pPr>
         <w:pStyle w:val="TM2"/>
+        <w:keepNext/>
         <w:tabs>
           <w:tab w:val="right" w:leader="dot" w:pos="10456"/>
         </w:tabs>
@@ -3114,6 +3151,7 @@
     <w:p>
       <w:pPr>
         <w:pStyle w:val="TM3"/>
+        <w:keepNext/>
         <w:tabs>
           <w:tab w:val="right" w:leader="dot" w:pos="10456"/>
         </w:tabs>
@@ -3175,6 +3213,7 @@
     <w:p>
       <w:pPr>
         <w:pStyle w:val="TM3"/>
+        <w:keepNext/>
         <w:tabs>
           <w:tab w:val="right" w:leader="dot" w:pos="10456"/>
         </w:tabs>
@@ -3236,6 +3275,7 @@
     <w:p>
       <w:pPr>
         <w:pStyle w:val="TM3"/>
+        <w:keepNext/>
         <w:tabs>
           <w:tab w:val="right" w:leader="dot" w:pos="10456"/>
         </w:tabs>
@@ -3297,6 +3337,7 @@
     <w:p>
       <w:pPr>
         <w:pStyle w:val="TM3"/>
+        <w:keepNext/>
         <w:tabs>
           <w:tab w:val="right" w:leader="dot" w:pos="10456"/>
         </w:tabs>
@@ -3358,6 +3399,7 @@
     <w:p>
       <w:pPr>
         <w:pStyle w:val="TM2"/>
+        <w:keepNext/>
         <w:tabs>
           <w:tab w:val="right" w:leader="dot" w:pos="10456"/>
         </w:tabs>
@@ -3419,6 +3461,7 @@
     <w:p>
       <w:pPr>
         <w:pStyle w:val="TM2"/>
+        <w:keepNext/>
         <w:tabs>
           <w:tab w:val="right" w:leader="dot" w:pos="10456"/>
         </w:tabs>
@@ -3480,6 +3523,7 @@
     <w:p>
       <w:pPr>
         <w:pStyle w:val="TM2"/>
+        <w:keepNext/>
         <w:tabs>
           <w:tab w:val="right" w:leader="dot" w:pos="10456"/>
         </w:tabs>
@@ -3541,6 +3585,7 @@
     <w:p>
       <w:pPr>
         <w:pStyle w:val="TM2"/>
+        <w:keepNext/>
         <w:tabs>
           <w:tab w:val="right" w:leader="dot" w:pos="10456"/>
         </w:tabs>
@@ -3602,6 +3647,7 @@
     <w:p>
       <w:pPr>
         <w:pStyle w:val="TM2"/>
+        <w:keepNext/>
         <w:tabs>
           <w:tab w:val="right" w:leader="dot" w:pos="10456"/>
         </w:tabs>
@@ -3663,6 +3709,7 @@
     <w:p>
       <w:pPr>
         <w:pStyle w:val="TM2"/>
+        <w:keepNext/>
         <w:tabs>
           <w:tab w:val="right" w:leader="dot" w:pos="10456"/>
         </w:tabs>
@@ -3724,6 +3771,7 @@
     <w:p>
       <w:pPr>
         <w:pStyle w:val="TM1"/>
+        <w:keepNext/>
         <w:tabs>
           <w:tab w:val="right" w:leader="dot" w:pos="10456"/>
         </w:tabs>
@@ -3785,6 +3833,7 @@
     <w:p>
       <w:pPr>
         <w:pStyle w:val="TM2"/>
+        <w:keepNext/>
         <w:tabs>
           <w:tab w:val="right" w:leader="dot" w:pos="10456"/>
         </w:tabs>
@@ -3846,6 +3895,7 @@
     <w:p>
       <w:pPr>
         <w:pStyle w:val="TM2"/>
+        <w:keepNext/>
         <w:tabs>
           <w:tab w:val="right" w:leader="dot" w:pos="10456"/>
         </w:tabs>
@@ -3907,6 +3957,7 @@
     <w:p>
       <w:pPr>
         <w:pStyle w:val="TM3"/>
+        <w:keepNext/>
         <w:tabs>
           <w:tab w:val="right" w:leader="dot" w:pos="10456"/>
         </w:tabs>
@@ -3968,6 +4019,7 @@
     <w:p>
       <w:pPr>
         <w:pStyle w:val="TM3"/>
+        <w:keepNext/>
         <w:tabs>
           <w:tab w:val="right" w:leader="dot" w:pos="10456"/>
         </w:tabs>
@@ -4029,6 +4081,7 @@
     <w:p>
       <w:pPr>
         <w:pStyle w:val="TM3"/>
+        <w:keepNext/>
         <w:tabs>
           <w:tab w:val="right" w:leader="dot" w:pos="10456"/>
         </w:tabs>
@@ -4090,6 +4143,7 @@
     <w:p>
       <w:pPr>
         <w:pStyle w:val="TM3"/>
+        <w:keepNext/>
         <w:tabs>
           <w:tab w:val="right" w:leader="dot" w:pos="10456"/>
         </w:tabs>
@@ -4151,6 +4205,7 @@
     <w:p>
       <w:pPr>
         <w:pStyle w:val="TM2"/>
+        <w:keepNext/>
         <w:tabs>
           <w:tab w:val="right" w:leader="dot" w:pos="10456"/>
         </w:tabs>
@@ -4212,6 +4267,7 @@
     <w:p>
       <w:pPr>
         <w:pStyle w:val="TM2"/>
+        <w:keepNext/>
         <w:tabs>
           <w:tab w:val="right" w:leader="dot" w:pos="10456"/>
         </w:tabs>
@@ -4273,6 +4329,7 @@
     <w:p>
       <w:pPr>
         <w:pStyle w:val="TM3"/>
+        <w:keepNext/>
         <w:tabs>
           <w:tab w:val="right" w:leader="dot" w:pos="10456"/>
         </w:tabs>
@@ -4334,6 +4391,7 @@
     <w:p>
       <w:pPr>
         <w:pStyle w:val="TM3"/>
+        <w:keepNext/>
         <w:tabs>
           <w:tab w:val="right" w:leader="dot" w:pos="10456"/>
         </w:tabs>
@@ -4395,6 +4453,7 @@
     <w:p>
       <w:pPr>
         <w:pStyle w:val="TM3"/>
+        <w:keepNext/>
         <w:tabs>
           <w:tab w:val="right" w:leader="dot" w:pos="10456"/>
         </w:tabs>
@@ -4456,6 +4515,7 @@
     <w:p>
       <w:pPr>
         <w:pStyle w:val="TM3"/>
+        <w:keepNext/>
         <w:tabs>
           <w:tab w:val="right" w:leader="dot" w:pos="10456"/>
         </w:tabs>
@@ -4518,6 +4578,7 @@
     <w:p>
       <w:pPr>
         <w:pStyle w:val="TM2"/>
+        <w:keepNext/>
         <w:tabs>
           <w:tab w:val="right" w:leader="dot" w:pos="10456"/>
         </w:tabs>
@@ -4579,6 +4640,7 @@
     <w:p>
       <w:pPr>
         <w:pStyle w:val="TM3"/>
+        <w:keepNext/>
         <w:tabs>
           <w:tab w:val="right" w:leader="dot" w:pos="10456"/>
         </w:tabs>
@@ -4640,6 +4702,7 @@
     <w:p>
       <w:pPr>
         <w:pStyle w:val="TM3"/>
+        <w:keepNext/>
         <w:tabs>
           <w:tab w:val="right" w:leader="dot" w:pos="10456"/>
         </w:tabs>
@@ -4701,6 +4764,7 @@
     <w:p>
       <w:pPr>
         <w:pStyle w:val="TM3"/>
+        <w:keepNext/>
         <w:tabs>
           <w:tab w:val="right" w:leader="dot" w:pos="10456"/>
         </w:tabs>
@@ -4762,6 +4826,7 @@
     <w:p>
       <w:pPr>
         <w:pStyle w:val="TM3"/>
+        <w:keepNext/>
         <w:tabs>
           <w:tab w:val="right" w:leader="dot" w:pos="10456"/>
         </w:tabs>
@@ -4823,6 +4888,7 @@
     <w:p>
       <w:pPr>
         <w:pStyle w:val="TM3"/>
+        <w:keepNext/>
         <w:tabs>
           <w:tab w:val="right" w:leader="dot" w:pos="10456"/>
         </w:tabs>
@@ -4884,6 +4950,7 @@
     <w:p>
       <w:pPr>
         <w:pStyle w:val="TM3"/>
+        <w:keepNext/>
         <w:tabs>
           <w:tab w:val="right" w:leader="dot" w:pos="10456"/>
         </w:tabs>
@@ -4945,6 +5012,7 @@
     <w:p>
       <w:pPr>
         <w:pStyle w:val="TM3"/>
+        <w:keepNext/>
         <w:tabs>
           <w:tab w:val="right" w:leader="dot" w:pos="10456"/>
         </w:tabs>
@@ -5006,6 +5074,7 @@
     <w:p>
       <w:pPr>
         <w:pStyle w:val="TM3"/>
+        <w:keepNext/>
         <w:tabs>
           <w:tab w:val="right" w:leader="dot" w:pos="10456"/>
         </w:tabs>
@@ -5067,6 +5136,7 @@
     <w:p>
       <w:pPr>
         <w:pStyle w:val="TM3"/>
+        <w:keepNext/>
         <w:tabs>
           <w:tab w:val="right" w:leader="dot" w:pos="10456"/>
         </w:tabs>
@@ -5128,6 +5198,7 @@
     <w:p>
       <w:pPr>
         <w:pStyle w:val="TM3"/>
+        <w:keepNext/>
         <w:tabs>
           <w:tab w:val="right" w:leader="dot" w:pos="10456"/>
         </w:tabs>
@@ -5189,6 +5260,7 @@
     <w:p>
       <w:pPr>
         <w:pStyle w:val="TM3"/>
+        <w:keepNext/>
         <w:tabs>
           <w:tab w:val="right" w:leader="dot" w:pos="10456"/>
         </w:tabs>
@@ -5250,6 +5322,7 @@
     <w:p>
       <w:pPr>
         <w:pStyle w:val="TM2"/>
+        <w:keepNext/>
         <w:tabs>
           <w:tab w:val="right" w:leader="dot" w:pos="10456"/>
         </w:tabs>
@@ -5311,6 +5384,7 @@
     <w:p>
       <w:pPr>
         <w:pStyle w:val="TM2"/>
+        <w:keepNext/>
         <w:tabs>
           <w:tab w:val="right" w:leader="dot" w:pos="10456"/>
         </w:tabs>
@@ -5372,6 +5446,7 @@
     <w:p>
       <w:pPr>
         <w:pStyle w:val="TM2"/>
+        <w:keepNext/>
         <w:tabs>
           <w:tab w:val="right" w:leader="dot" w:pos="10456"/>
         </w:tabs>
@@ -5433,6 +5508,7 @@
     <w:p>
       <w:pPr>
         <w:pStyle w:val="TM1"/>
+        <w:keepNext/>
         <w:tabs>
           <w:tab w:val="right" w:leader="dot" w:pos="10456"/>
         </w:tabs>
@@ -5494,6 +5570,7 @@
     <w:p>
       <w:pPr>
         <w:pStyle w:val="TM1"/>
+        <w:keepNext/>
         <w:tabs>
           <w:tab w:val="right" w:leader="dot" w:pos="10456"/>
         </w:tabs>
@@ -5555,6 +5632,7 @@
     <w:p>
       <w:pPr>
         <w:pStyle w:val="TM1"/>
+        <w:keepNext/>
         <w:tabs>
           <w:tab w:val="right" w:leader="dot" w:pos="10456"/>
         </w:tabs>
@@ -5633,6 +5711,7 @@
     <w:p>
       <w:pPr>
         <w:pStyle w:val="Titre1"/>
+        <w:keepNext/>
       </w:pPr>
       <w:bookmarkStart w:id="1" w:name="_Toc238481410"/>
       <w:r>
@@ -9012,23 +9091,6 @@
     <w:p>
       <w:pPr>
         <w:keepNext/>
-        <w:sectPr>
-          <w:headerReference w:type="even" r:id="rId14"/>
-          <w:headerReference w:type="default" r:id="rId15"/>
-          <w:footerReference w:type="even" r:id="rId16"/>
-          <w:footerReference w:type="default" r:id="rId17"/>
-          <w:headerReference w:type="first" r:id="rId18"/>
-          <w:footerReference w:type="first" r:id="rId19"/>
-          <w:pgSz w:w="16838" w:h="11906" w:orient="landscape"/>
-          <w:pgMar w:top="720" w:right="720" w:bottom="720" w:left="720" w:header="708" w:footer="708" w:gutter="0"/>
-          <w:cols w:space="708"/>
-          <w:docGrid w:linePitch="360"/>
-        </w:sectPr>
-      </w:pPr>
-    </w:p>
-    <w:p>
-      <w:pPr>
-        <w:keepNext/>
         <w:jc w:val="center"/>
       </w:pPr>
       <w:r>
@@ -9249,7 +9311,7 @@
         <w:lastRenderedPageBreak/>
         <w:drawing>
           <wp:inline distT="0" distB="0" distL="0" distR="0" wp14:anchorId="70D01C73" wp14:editId="7AE05D0A">
-            <wp:extent cx="9720000" cy="6031318"/>
+            <wp:extent cx="9540000" cy="5919626"/>
             <wp:effectExtent l="0" t="0" r="0" b="0"/>
             <wp:docPr id="1" name="Picture 1"/>
             <wp:cNvGraphicFramePr>
@@ -9271,7 +9333,7 @@
                   <pic:spPr>
                     <a:xfrm>
                       <a:off x="0" y="0"/>
-                      <a:ext cx="9720000" cy="6031318"/>
+                      <a:ext cx="9540000" cy="5919626"/>
                     </a:xfrm>
                     <a:prstGeom prst="rect">
                       <a:avLst/>
@@ -9506,18 +9568,6 @@
     <w:p>
       <w:pPr>
         <w:keepNext/>
-        <w:sectPr>
-          <w:pgSz w:w="16838" w:h="11906" w:orient="landscape"/>
-          <w:pgMar w:top="720" w:right="720" w:bottom="720" w:left="720" w:header="708" w:footer="708" w:gutter="0"/>
-          <w:cols w:space="708"/>
-          <w:titlePg/>
-          <w:docGrid w:linePitch="360"/>
-        </w:sectPr>
-      </w:pPr>
-    </w:p>
-    <w:p>
-      <w:pPr>
-        <w:keepNext/>
         <w:jc w:val="center"/>
       </w:pPr>
       <w:r>
@@ -9526,7 +9576,7 @@
         </w:rPr>
         <w:lastRenderedPageBreak/>
         <w:pict w14:anchorId="302CA6EE">
-          <v:shape id="Image 10" o:spid="_x0000_i1034" type="#_x0000_t75" style="width:765.6pt;height:499.2pt;visibility:visible;mso-wrap-style:square">
+          <v:shape id="Image 10" o:spid="_x0000_i1034" type="#_x0000_t75" style="width:630.37pt;height:411.02pt;visibility:visible;mso-wrap-style:square">
             <v:imagedata r:id="rId26" o:title=""/>
           </v:shape>
         </w:pict>
@@ -9549,18 +9599,6 @@
         <w:lastRenderedPageBreak/>
         <w:t>Figure 3.8 : Schéma relationnel de la base de données PostgreSQL</w:t>
       </w:r>
-    </w:p>
-    <w:p>
-      <w:pPr>
-        <w:jc w:val="center"/>
-        <w:sectPr>
-          <w:pgSz w:w="16838" w:h="11906" w:orient="landscape"/>
-          <w:pgMar w:top="1140" w:right="1140" w:bottom="1140" w:left="1140" w:header="708" w:footer="708" w:gutter="0"/>
-          <w:cols w:space="708"/>
-          <w:titlePg/>
-          <w:docGrid w:linePitch="360"/>
-        </w:sectPr>
-      </w:pPr>
     </w:p>
     <w:p>
       <w:pPr>

</xml_diff>